<commit_message>
PNAS submission changes and docs
</commit_message>
<xml_diff>
--- a/writing/2025-07-23_draft.docx
+++ b/writing/2025-07-23_draft.docx
@@ -276,13 +276,28 @@
         <w:t xml:space="preserve"> </w:t>
       </w:r>
       <w:r>
-        <w:t xml:space="preserve">Rising temperatures may increase the risk of chronic gut inflammation by reducing host tolerance of </w:t>
+        <w:t xml:space="preserve">Rising temperatures may increase the risk of chronic gut inflammation by reducing </w:t>
+      </w:r>
+      <w:r>
+        <w:t>the host's</w:t>
+      </w:r>
+      <w:r>
+        <w:t xml:space="preserve"> tolerance </w:t>
+      </w:r>
+      <w:r>
+        <w:t>to</w:t>
+      </w:r>
+      <w:r>
+        <w:t xml:space="preserve"> </w:t>
       </w:r>
       <w:r>
         <w:t xml:space="preserve">gut microbes, </w:t>
       </w:r>
       <w:r>
-        <w:t xml:space="preserve">and highlight a </w:t>
+        <w:t>highlighting</w:t>
+      </w:r>
+      <w:r>
+        <w:t xml:space="preserve"> a </w:t>
       </w:r>
       <w:r>
         <w:t>biologically plausible mechanism through which climate change threatens host resilience</w:t>
@@ -1655,7 +1670,13 @@
         <w:t xml:space="preserve">— relate to the gut microbiome, with findings often attributed to differences in host diet. However, no study has directly assessed the influence of temperature on the gut microbiome of a wild primate. </w:t>
       </w:r>
       <w:r>
-        <w:t>Examining the influence of natural temperature gradients on the gut microbiome of wild primates provides critical insight into how relatively unexplored abiotic factors shape host–microbiome dynamics in ecologically relevant contexts.</w:t>
+        <w:t xml:space="preserve">Examining the influence of natural temperature gradients on the gut microbiome of wild primates </w:t>
+      </w:r>
+      <w:r>
+        <w:t xml:space="preserve">can </w:t>
+      </w:r>
+      <w:r>
+        <w:t>provide critical insight into how relatively unexplored abiotic factors shape host–microbiome dynamics in ecologically relevant contexts.</w:t>
       </w:r>
     </w:p>
     <w:p>
@@ -1908,11 +1929,14 @@
         <w:t xml:space="preserve">. </w:t>
       </w:r>
       <w:r>
-        <w:t xml:space="preserve">These findings suggest that rising temperatures may compromise immune </w:t>
+        <w:t xml:space="preserve">These findings suggest that rising temperatures may compromise </w:t>
+      </w:r>
+      <w:r>
+        <w:t xml:space="preserve">hot </w:t>
       </w:r>
       <w:r>
         <w:lastRenderedPageBreak/>
-        <w:t xml:space="preserve">tolerance of gut microbes and highlight a </w:t>
+        <w:t xml:space="preserve">immune tolerance of gut microbes and highlight a </w:t>
       </w:r>
       <w:r>
         <w:t>biologically plausible mechanism through which climate change threatens host resilience</w:t>
@@ -1937,24 +1961,18 @@
         <w:rPr>
           <w:u w:val="single"/>
         </w:rPr>
-        <w:t xml:space="preserve">Temperature </w:t>
+        <w:t>Temperature predicts g</w:t>
       </w:r>
       <w:r>
         <w:rPr>
           <w:u w:val="single"/>
         </w:rPr>
-        <w:t>predicts g</w:t>
+        <w:t>ut microbiome</w:t>
       </w:r>
       <w:r>
         <w:rPr>
           <w:u w:val="single"/>
         </w:rPr>
-        <w:t>ut microbiome</w:t>
-      </w:r>
-      <w:r>
-        <w:rPr>
-          <w:u w:val="single"/>
-        </w:rPr>
         <w:t xml:space="preserve"> taxonomic composition and functional capacity</w:t>
       </w:r>
     </w:p>
@@ -1991,13 +2009,25 @@
         <w:t>component</w:t>
       </w:r>
       <w:r>
-        <w:t xml:space="preserve"> analysis to capture major axes of variation in community composition. For taxonomic community composition, the model including temperature provided the best fit (controlling for model complexity) across all community-level indices, accounting for 100% of the model weight for every principal </w:t>
+        <w:t xml:space="preserve"> analysis</w:t>
+      </w:r>
+      <w:r>
+        <w:t xml:space="preserve"> (PCA)</w:t>
+      </w:r>
+      <w:r>
+        <w:t xml:space="preserve"> to capture major axes of variation in community composition. For taxonomic community composition, the model including temperature provided the best fit (controlling for model complexity) across all community-level indices, accounting for 100% of the model weight for every principal </w:t>
       </w:r>
       <w:r>
         <w:t>component</w:t>
       </w:r>
       <w:r>
-        <w:t xml:space="preserve"> and alpha diversity metric (Fig. 1B). The strong relationship between temperature and principal </w:t>
+        <w:t xml:space="preserve"> and alpha diversity metric (Fig. 1B). The strong relationship between temperature and </w:t>
+      </w:r>
+      <w:r>
+        <w:t>p</w:t>
+      </w:r>
+      <w:r>
+        <w:t xml:space="preserve">rincipal </w:t>
       </w:r>
       <w:r>
         <w:t>components</w:t>
@@ -2041,21 +2071,7 @@
         <w:t>t</w:t>
       </w:r>
       <w:r>
-        <w:t xml:space="preserve"> and the total number of observed metabolic pathways, accounting for at least 96% of the model weight. In contrast, the baseline model provided the best fit for Shannon’s diversity, accounting for 77% of the model weight (Fig. 1D). Therefore, temperature was </w:t>
-      </w:r>
-      <w:commentRangeStart w:id="1"/>
-      <w:r>
-        <w:t>associated</w:t>
-      </w:r>
-      <w:commentRangeEnd w:id="1"/>
-      <w:r>
-        <w:rPr>
-          <w:rStyle w:val="CommentReference"/>
-        </w:rPr>
-        <w:commentReference w:id="1"/>
-      </w:r>
-      <w:r>
-        <w:t xml:space="preserve"> with shifts in individual metabolic pathways substantial enough to affect community-level beta diversity, but the relationship between temperature and functional alpha diversity was less clear. Temperature was negatively associated with the total number of unique pathways (Observed: </w:t>
+        <w:t xml:space="preserve"> and the total number of observed metabolic pathways, accounting for at least 96% of the model weight. In contrast, the baseline model provided the best fit for Shannon’s diversity, accounting for 77% of the model weight (Fig. 1D). Therefore, temperature was associated with shifts in individual metabolic pathways substantial enough to affect community-level beta diversity, but the relationship between temperature and functional alpha diversity was less clear. Temperature was negatively associated with the total number of unique pathways (Observed: </w:t>
       </w:r>
       <w:r>
         <w:t>β</w:t>
@@ -2079,21 +2095,7 @@
         <w:t>temp</w:t>
       </w:r>
       <w:r>
-        <w:t xml:space="preserve"> = -0.27) was much smaller, and the confidence intervals also included zero. (Fig. 1C). Together, these results </w:t>
-      </w:r>
-      <w:commentRangeStart w:id="2"/>
-      <w:r>
-        <w:t xml:space="preserve">suggest </w:t>
-      </w:r>
-      <w:commentRangeEnd w:id="2"/>
-      <w:r>
-        <w:rPr>
-          <w:rStyle w:val="CommentReference"/>
-        </w:rPr>
-        <w:commentReference w:id="2"/>
-      </w:r>
-      <w:r>
-        <w:t>that higher temperatures may reduce the number of unique metabolic pathways but are not associated with changes in pathway evenness.</w:t>
+        <w:t xml:space="preserve"> = -0.27) was much smaller, and the confidence intervals also included zero. (Fig. 1C). Together, these results suggest that higher temperatures may reduce the number of unique metabolic pathways but are not associated with changes in pathway evenness.</w:t>
       </w:r>
     </w:p>
     <w:p>
@@ -2209,10 +2211,7 @@
         <w:t>, and lipid remodeling pathways such as the mevalonate pathway and downstream isoprenoid lipid synthesis</w:t>
       </w:r>
       <w:r>
-        <w:t xml:space="preserve"> </w:t>
-      </w:r>
-      <w:r>
-        <w:t>(Fig 3A)</w:t>
+        <w:t xml:space="preserve"> (Fig 3A)</w:t>
       </w:r>
       <w:r>
         <w:t xml:space="preserve">, </w:t>
@@ -2536,22 +2535,16 @@
         <w:t xml:space="preserve">, </w:t>
       </w:r>
       <w:r>
-        <w:t xml:space="preserve">NADPH production, quinone synthesis, siderophore-mediated iron transport (Dhungana &amp; Crumbliss, 2005; Ying, 2008), and detoxification pathways for aromatic compounds and aldehydes (Kalapos, 1999). </w:t>
-      </w:r>
-      <w:r>
-        <w:t>In conjunction, we observed an increase in nucleotide and translation-associated metabolism pathways</w:t>
-      </w:r>
-      <w:r>
-        <w:t xml:space="preserve"> (Fig 3D),</w:t>
-      </w:r>
-      <w:r>
-        <w:t xml:space="preserve"> such as purine and pyrimidine de novo synthesis, nucleotide salvage and recycling </w:t>
+        <w:t>NADPH production, quinone synthesis, siderophore-mediated iron transport</w:t>
+      </w:r>
+      <w:r>
+        <w:t xml:space="preserve"> </w:t>
       </w:r>
       <w:r>
         <w:fldChar w:fldCharType="begin"/>
       </w:r>
       <w:r>
-        <w:instrText xml:space="preserve"> ADDIN ZOTERO_ITEM CSL_CITATION {"citationID":"VWKBgd91","properties":{"formattedCitation":"({\\i{}70}, {\\i{}71})","plainCitation":"(70, 71)","noteIndex":0},"citationItems":[{"id":3291,"uris":["http://zotero.org/users/13901503/items/6MPJ4SKF"],"itemData":{"id":3291,"type":"article-journal","abstract":"Most metabolic reactions are connected through either their utilization of nucleotides or their utilization of nucleotides or their regulation by these metabolites. In this review the biosynthetic pathways for pyrimidine and purine metabolism in lactic acid bacteria are described including the interconversion pathways, the formation of deoxyribonucleotides and the salvage pathways for use of exogenous precursors. The data for the enzymatic and the genetic regulation of these pathways are reviewed, as well as the gene organizations in diﬀerent lactic acid bacteria. Mutant phenotypes and methods for manipulation of nucleotide pools are also discussed. Our aim is to provide an overview of the physiology and genetics of nucleotide metabolism and its regulation that will facilitate the interpretation of data arising from genetics, metabolomics, proteomics, and transcriptomics in lactic acid bacteria.","container-title":"FEMS Microbiology Reviews","DOI":"10.1016/j.fmrre.2005.04.006","ISSN":"1574-6976","issue":"3","journalAbbreviation":"FEMS Microbiol Rev","language":"en","page":"555-590","source":"DOI.org (Crossref)","title":"Nucleotide metabolism and its control in lactic acid bacteria","volume":"29","author":[{"family":"Kilstrup","given":"Mogens"},{"family":"Hammer","given":"Karin"},{"family":"Ruhdal Jensen","given":"Peter"},{"family":"Martinussen","given":"Jan"}],"issued":{"date-parts":[["2005",8]]}}},{"id":3293,"uris":["http://zotero.org/users/13901503/items/ZVCXJZJX"],"itemData":{"id":3293,"type":"article-journal","abstract":"Nucleotides are required for a wide variety of biological processes and are constantly synthesized de novo in all cells. When cells proliferate, increased nucleotide synthesis is necessary for DNA replication and for RNA production to support protein synthesis at different stages of the cell cycle, during which these events are regulated at multiple levels. Therefore the synthesis of the precursor nucleotides is also strongly regulated at multiple levels. Nucleotide synthesis is an energy intensive process that uses multiple metabolic pathways across different cell compartments and several sources of carbon and nitrogen. The processes are regulated at the transcription level by a set of master transcription factors but also at the enzyme level by allosteric regulation and feedback inhibition. Here we review the cellular demands of nucleotide biosynthesis, their metabolic pathways and mechanisms of regulation during the cell cycle. The use of stable isotope tracers for delineating the biosynthetic routes of the multiple intersecting pathways and how these are quantitatively controlled under different conditions is also highlighted. Moreover, the importance of nucleotide synthesis for cell viability is discussed and how this may lead to potential new approaches to drug development in diseases such as cancer.","container-title":"Nucleic Acids Research","DOI":"10.1093/nar/gkv047","ISSN":"1362-4962, 0305-1048","issue":"4","language":"en","license":"http://creativecommons.org/licenses/by/4.0/","page":"2466-2485","source":"DOI.org (Crossref)","title":"Regulation of mammalian nucleotide metabolism and biosynthesis","volume":"43","author":[{"family":"Lane","given":"Andrew N"},{"family":"Fan","given":"Teresa W-M"}],"issued":{"date-parts":[["2015",2,27]]}}}],"schema":"https://github.com/citation-style-language/schema/raw/master/csl-citation.json"} </w:instrText>
+        <w:instrText xml:space="preserve"> ADDIN ZOTERO_ITEM CSL_CITATION {"citationID":"y82X9Nji","properties":{"formattedCitation":"({\\i{}70}, {\\i{}71})","plainCitation":"(70, 71)","noteIndex":0},"citationItems":[{"id":3234,"uris":["http://zotero.org/users/13901503/items/QMLXH9TP"],"itemData":{"id":3234,"type":"article-journal","abstract":"In this mini-review we present an environmental iron mobility/transport scheme consisting of inter-related controls, whereby the first coordination shell of iron modulates the iron redox potential (E1/2), and the oxidation state of iron controls the chemistry of the first coordination sphere and therefore the immediate chemical environment of the iron. Siderophores (microbially generated iron specific chelators) may be viewed as iron redox mediators. Siderophore chelation of environmental iron in a reduced (Fe(II)) oxidation state results in facile air oxidation of iron due to the negative redox potentials observed for Fe-siderophore complexes. This solubilizes the iron and locks it into a specific coordination environment, thereby preventing hydrolysis and precipitation. The high-spin Fe3+ → Fe+ electron transfer process may be viewed as a switch that controls the thermodynamic stability and kinetic lability of the first coordination shell. Reduction of iron(III)-siderophore complexes to iron(II)-siderophore complexes decreases thermodynamic stability, increases the rate of siderophore ligand exchange, and increases the ease of siderophore donor atom protonation, thus facilitating a rapid turnover of the first coordination shell. Results are presented for iron-siderophore pH and oxidation state dependent speciation studies that are relevant to environmental and microbial iron mobility and transport.","container-title":"Geomicrobiology Journal","DOI":"10.1080/01490450590945870","ISSN":"0149-0451","issue":"3-4","note":"publisher: Taylor &amp; Francis\n_eprint: https://doi.org/10.1080/01490450590945870","page":"87-98","source":"Taylor and Francis+NEJM","title":"Coordination Chemistry and Redox Processes in Siderophore-Mediated Iron Transport","volume":"22","author":[{"family":"Dhungana","given":"Suraj"},{"family":"Crumbliss","given":"Alvin L.","non-dropping-particle":"and"}],"issued":{"date-parts":[["2005",4,1]]}}},{"id":3239,"uris":["http://zotero.org/users/13901503/items/F8CEHMIS"],"itemData":{"id":3239,"type":"article-journal","abstract":"Accumulating evidence has suggested that NAD (including NAD؉ and NADH) and NADP (including NADP؉ and NADPH) could belong to the fundamental common mediators of various biological processes, including energy metabolism, mitochondrial functions, calcium homeostasis, antioxidation/generation of oxidative stress, gene expression, immunological functions, aging, and cell death: First, it is established that NAD mediates energy metabolism and mitochondrial functions; second, NADPH is a key component in cellular antioxidation systems; and NADH-dependent reactive oxygen species (ROS) generation from mitochondria and NADPH oxidase-dependent ROS generation are two critical mechanisms of ROS generation; third, cyclic ADP-ribose and several other molecules that are generated from NAD and NADP could mediate calcium homeostasis; fourth, NAD and NADP modulate multiple key factors in cell death, such as mitochondrial permeability transition, energy state, poly(ADP-ribose) polymerase-1, and apoptosis-inducing factor; and fifth, NAD and NADP profoundly affect aging-influencing factors such as oxidative stress and mitochondrial activities, and NADdependent sirtuins also mediate the aging process. Moreover, many recent studies have suggested novel paradigms of NAD and NADP metabolism. Future investigation into the metabolism and biological functions of NAD and NADP may expose fundamental properties of life, and suggest new strategies for treating diseases and slowing the aging process. Antioxid. Redox Signal. 10, 179–206.","container-title":"Antioxidants &amp; Redox Signaling","DOI":"10.1089/ars.2007.1672","ISSN":"1523-0864, 1557-7716","issue":"2","journalAbbreviation":"Antioxidants &amp; Redox Signaling","language":"en","page":"179-206","source":"DOI.org (Crossref)","title":"NAD&lt;sup&gt;+&lt;/sup&gt; /NADH and NADP&lt;sup&gt;+&lt;/sup&gt; /NADPH in Cellular Functions and Cell Death: Regulation and Biological Consequences","title-short":"NAD&lt;sup&gt;+&lt;/sup&gt; /NADH and NADP&lt;sup&gt;+&lt;/sup&gt; /NADPH in Cellular Functions and Cell Death","volume":"10","author":[{"family":"Ying","given":"Weihai"}],"issued":{"date-parts":[["2008",2]]}}}],"schema":"https://github.com/citation-style-language/schema/raw/master/csl-citation.json"} </w:instrText>
       </w:r>
       <w:r>
         <w:fldChar w:fldCharType="separate"/>
@@ -2583,8 +2576,80 @@
         <w:fldChar w:fldCharType="end"/>
       </w:r>
       <w:r>
+        <w:t>, and detoxification pathways for aromatic compounds and aldehydes</w:t>
+      </w:r>
+      <w:r>
+        <w:t xml:space="preserve"> </w:t>
+      </w:r>
+      <w:r>
+        <w:fldChar w:fldCharType="begin"/>
+      </w:r>
+      <w:r>
+        <w:instrText xml:space="preserve"> ADDIN ZOTERO_ITEM CSL_CITATION {"citationID":"G5HPTnWo","properties":{"formattedCitation":"({\\i{}72})","plainCitation":"(72)","noteIndex":0},"citationItems":[{"id":3232,"uris":["http://zotero.org/users/13901503/items/SDBLCJVJ"],"itemData":{"id":3232,"type":"article-journal","abstract":"Despite the growing interest towards methylglyoxal and glyoxalases their real role in metabolic network is still obscure. In the light of developments several reviews have been published in this field mainly dealing with only a narrow segment of this research area. In this article a trial is made to present a comprehensive overview of methylglyoxal research, extending discussion from chemistry to biological implications by reviewing some important characteristics of methylglyoxal metabolism and toxicity in a wide variety of species, and emphasizing the action of methylglyoxal on energy production, free radical generation and cell killing. Special attention is paid to the discussion of α-oxoaldehyde production in the environment as a potential risk factor and to the possible role of this α-dicarbonyl in diseases. Concerning the interaction of methylglyoxal with biological macromolecules (DNA, RNA, proteins) an earlier review (Kalapos, Toxicology Letters, 73, 1994, 3–24) means a supplementation to this paper, thus hoping the avoidance of unnecessary bombast. The paper arrives at the conclusion that since the early stage of evolution the function of methylglyoxalase pathway has been related to carbohydrate metabolism, but its significance has been changed over the thousands of years. Namely, at the beginning of evolution methylglyoxalase path was essential for the reductive citric acid cycle as an anaplerotic route, while in the extant metabolism it concerns with the detoxification of methylglyoxal and plays some regulatory role in triose-phosphate household. As there is a tight junction between methylglyoxal and carbohydrate metabolism its pathological role in the events of the development of diabetic complications emerges in a natural manner and further progress is hoped in this field. In contrast, significant advancement cannot be expected in relation to cancer research","container-title":"Toxicology Letters","DOI":"10.1016/S0378-4274(99)00160-5","ISSN":"0378-4274","issue":"3","journalAbbreviation":"Toxicology Letters","page":"145-175","source":"ScienceDirect","title":"Methylglyoxal in living organisms: Chemistry, biochemistry, toxicology and biological implications","title-short":"Methylglyoxal in living organisms","volume":"110","author":[{"family":"Kalapos","given":"Miklós Péter"}],"issued":{"date-parts":[["1999",11,22]]}}}],"schema":"https://github.com/citation-style-language/schema/raw/master/csl-citation.json"} </w:instrText>
+      </w:r>
+      <w:r>
+        <w:fldChar w:fldCharType="separate"/>
+      </w:r>
+      <w:r>
+        <w:t>(</w:t>
+      </w:r>
+      <w:r>
+        <w:rPr>
+          <w:i/>
+          <w:iCs/>
+        </w:rPr>
+        <w:t>72</w:t>
+      </w:r>
+      <w:r>
+        <w:t>)</w:t>
+      </w:r>
+      <w:r>
+        <w:fldChar w:fldCharType="end"/>
+      </w:r>
+      <w:r>
+        <w:t xml:space="preserve">. </w:t>
+      </w:r>
+      <w:r>
+        <w:t xml:space="preserve">In conjunction, we observed an increase in nucleotide and translation-associated metabolism pathways (Fig 3D), such as purine and pyrimidine de novo synthesis, nucleotide salvage and recycling </w:t>
+      </w:r>
+      <w:r>
+        <w:fldChar w:fldCharType="begin"/>
+      </w:r>
+      <w:r>
+        <w:instrText xml:space="preserve"> ADDIN ZOTERO_ITEM CSL_CITATION {"citationID":"VWKBgd91","properties":{"formattedCitation":"({\\i{}73}, {\\i{}74})","plainCitation":"(73, 74)","noteIndex":0},"citationItems":[{"id":3291,"uris":["http://zotero.org/users/13901503/items/6MPJ4SKF"],"itemData":{"id":3291,"type":"article-journal","abstract":"Most metabolic reactions are connected through either their utilization of nucleotides or their utilization of nucleotides or their regulation by these metabolites. In this review the biosynthetic pathways for pyrimidine and purine metabolism in lactic acid bacteria are described including the interconversion pathways, the formation of deoxyribonucleotides and the salvage pathways for use of exogenous precursors. The data for the enzymatic and the genetic regulation of these pathways are reviewed, as well as the gene organizations in diﬀerent lactic acid bacteria. Mutant phenotypes and methods for manipulation of nucleotide pools are also discussed. Our aim is to provide an overview of the physiology and genetics of nucleotide metabolism and its regulation that will facilitate the interpretation of data arising from genetics, metabolomics, proteomics, and transcriptomics in lactic acid bacteria.","container-title":"FEMS Microbiology Reviews","DOI":"10.1016/j.fmrre.2005.04.006","ISSN":"1574-6976","issue":"3","journalAbbreviation":"FEMS Microbiol Rev","language":"en","page":"555-590","source":"DOI.org (Crossref)","title":"Nucleotide metabolism and its control in lactic acid bacteria","volume":"29","author":[{"family":"Kilstrup","given":"Mogens"},{"family":"Hammer","given":"Karin"},{"family":"Ruhdal Jensen","given":"Peter"},{"family":"Martinussen","given":"Jan"}],"issued":{"date-parts":[["2005",8]]}}},{"id":3293,"uris":["http://zotero.org/users/13901503/items/ZVCXJZJX"],"itemData":{"id":3293,"type":"article-journal","abstract":"Nucleotides are required for a wide variety of biological processes and are constantly synthesized de novo in all cells. When cells proliferate, increased nucleotide synthesis is necessary for DNA replication and for RNA production to support protein synthesis at different stages of the cell cycle, during which these events are regulated at multiple levels. Therefore the synthesis of the precursor nucleotides is also strongly regulated at multiple levels. Nucleotide synthesis is an energy intensive process that uses multiple metabolic pathways across different cell compartments and several sources of carbon and nitrogen. The processes are regulated at the transcription level by a set of master transcription factors but also at the enzyme level by allosteric regulation and feedback inhibition. Here we review the cellular demands of nucleotide biosynthesis, their metabolic pathways and mechanisms of regulation during the cell cycle. The use of stable isotope tracers for delineating the biosynthetic routes of the multiple intersecting pathways and how these are quantitatively controlled under different conditions is also highlighted. Moreover, the importance of nucleotide synthesis for cell viability is discussed and how this may lead to potential new approaches to drug development in diseases such as cancer.","container-title":"Nucleic Acids Research","DOI":"10.1093/nar/gkv047","ISSN":"1362-4962, 0305-1048","issue":"4","language":"en","license":"http://creativecommons.org/licenses/by/4.0/","page":"2466-2485","source":"DOI.org (Crossref)","title":"Regulation of mammalian nucleotide metabolism and biosynthesis","volume":"43","author":[{"family":"Lane","given":"Andrew N"},{"family":"Fan","given":"Teresa W-M"}],"issued":{"date-parts":[["2015",2,27]]}}}],"schema":"https://github.com/citation-style-language/schema/raw/master/csl-citation.json"} </w:instrText>
+      </w:r>
+      <w:r>
+        <w:fldChar w:fldCharType="separate"/>
+      </w:r>
+      <w:r>
+        <w:t>(</w:t>
+      </w:r>
+      <w:r>
+        <w:rPr>
+          <w:i/>
+          <w:iCs/>
+        </w:rPr>
+        <w:t>73</w:t>
+      </w:r>
+      <w:r>
         <w:t xml:space="preserve">, </w:t>
       </w:r>
+      <w:r>
+        <w:rPr>
+          <w:i/>
+          <w:iCs/>
+        </w:rPr>
+        <w:t>74</w:t>
+      </w:r>
+      <w:r>
+        <w:t>)</w:t>
+      </w:r>
+      <w:r>
+        <w:fldChar w:fldCharType="end"/>
+      </w:r>
+      <w:r>
+        <w:t xml:space="preserve">, </w:t>
+      </w:r>
       <w:proofErr w:type="spellStart"/>
       <w:r>
         <w:t>queuosine</w:t>
@@ -2603,16 +2668,10 @@
         <w:t xml:space="preserve"> </w:t>
       </w:r>
       <w:r>
-        <w:t>(Vinayak &amp; Pathak, 2010)</w:t>
-      </w:r>
-      <w:r>
-        <w:t xml:space="preserve">. This coordinated increase in nucleotide and translation-associated metabolism may reflect the consequences of redox imbalance at high temperatures because the accumulation of ROS can lead to DNA damage </w:t>
-      </w:r>
-      <w:r>
         <w:fldChar w:fldCharType="begin"/>
       </w:r>
       <w:r>
-        <w:instrText xml:space="preserve"> ADDIN ZOTERO_ITEM CSL_CITATION {"citationID":"De7gRBET","properties":{"formattedCitation":"({\\i{}72})","plainCitation":"(72)","noteIndex":0},"citationItems":[{"id":3368,"uris":["http://zotero.org/users/13901503/items/R3YTNYU9"],"itemData":{"id":3368,"type":"article-journal","abstract":"Excess oxygen can disrupt the growth of most organisms, but the underlying mechanisms of damage have proved difficult to unravel. The model bacterium Escherichia coli represents the best understood organism in terms of the effects of and response to oxidative stress.Superoxide (O2−) and hydrogen peroxide (H2O2) are formed within cells when molecular oxygen (O2) adventitiously acquires electrons from the reduced cofactors of flavoproteins.Both O2− and H2O2 can oxidize the exposed Fe–S clusters of a family of dehydratases. This event destabilizes the clusters, and their consequent disintegration eliminates enzyme activity.O2− and H2O2 also inactivate a variety of non-redox enzymes that use single Fe2+ ions as catalytic cofactors.DNA is damaged when H2O2 reacts with the intracellular pool of unincorporated iron. The iron that is released from oxidized metalloproteins enlarges this pool and accelerates this process.The transcription factor OxyR detects modest increments in intracellular H2O2. It activates several responses that help preserve the activities of Fe–S and mononuclear metalloenzymes.The SoxRS system detects redox-active compounds that are released by plants and some bacteria. These compounds can generate toxic doses of O2−, and the SoxRS system acts primarily to minimize the amounts of these compounds inside the cell.Future studies should aim to determine whether the knowledge gained from studying oxidative stress in the facultative anaerobe E. coli is applicable to other organisms, such as strictly aerobic and microaerophilic bacteria.","container-title":"Nature Reviews Microbiology","DOI":"10.1038/nrmicro3032","ISSN":"1740-1534","issue":"7","journalAbbreviation":"Nat Rev Microbiol","language":"en","license":"2013 Springer Nature Limited","note":"publisher: Nature Publishing Group","page":"443-454","source":"www.nature.com","title":"The molecular mechanisms and physiological consequences of oxidative stress: lessons from a model bacterium","title-short":"The molecular mechanisms and physiological consequences of oxidative stress","volume":"11","author":[{"family":"Imlay","given":"James A."}],"issued":{"date-parts":[["2013",7]]}}}],"schema":"https://github.com/citation-style-language/schema/raw/master/csl-citation.json"} </w:instrText>
+        <w:instrText xml:space="preserve"> ADDIN ZOTERO_ITEM CSL_CITATION {"citationID":"myPXfqfe","properties":{"formattedCitation":"({\\i{}75})","plainCitation":"(75)","noteIndex":0},"citationItems":[{"id":3370,"uris":["http://zotero.org/users/13901503/items/M6A7QA65"],"itemData":{"id":3370,"type":"article-journal","abstract":"tRNAs possess a high content of modified nucleosides, which display an incredible structural variety. These modified nucleosides are conserved in their sequence and have important roles in tRNA functions. Most often, hypermodified nucleosides are found in the wobble position of tRNAs, which play a direct role in maintaining translational efficiency and fidelity, codon recognition, etc. One of such hypermodified base is queuine, which is a base analogue of guanine, found in the first anticodon position of specific tRNAs (tyrosine, histidine, aspartate and asparagine tRNAs). These tRNAs of the ‘Q-family’ originally contain guanine in the first position of anticodon, which is post-transcriptionally modified with queuine by an irreversible insertion during maturation. Queuine is ubiquitously present throughout the living system from prokaryotes to eukaryotes, including plants. Prokaryotes can synthesize queuine de novo by a complex biosynthetic pathway, whereas eukaryotes are unable to synthesize either the precursor or queuine. They utilize salvage system and acquire queuine as a nutrient factor from their diet or from intestinal microflora. The tRNAs of the Q-family are completely modified in terminally differentiated somatic cells. However, hypomodification of Q-tRNA (queuosine-modified tRNA) is closely associated with cell proliferation and malignancy. The precise mechanisms of queuine- and Q-tRNA-mediated action are still a mystery. Direct or indirect evidence suggests that queuine or Q-tRNA participates in many cellular functions, such as inhibition of cell proliferation, control of aerobic and anaerobic metabolism, bacterial virulence, etc. The role of Q-tRNA modification in cellular machinery and the signalling pathways involved therein is the focus of this review.","container-title":"Bioscience Reports","DOI":"10.1042/BSR20090057","ISSN":"0144-8463","issue":"2","journalAbbreviation":"Bioscience Reports","page":"135-148","source":"Silverchair","title":"Queuosine modification of tRNA: its divergent role in cellular machinery","title-short":"Queuosine modification of tRNA","volume":"30","author":[{"family":"Vinayak","given":"Manjula"},{"family":"Pathak","given":"Chandramani"}],"issued":{"date-parts":[["2009",11,23]]}}}],"schema":"https://github.com/citation-style-language/schema/raw/master/csl-citation.json"} </w:instrText>
       </w:r>
       <w:r>
         <w:fldChar w:fldCharType="separate"/>
@@ -2625,7 +2684,7 @@
           <w:i/>
           <w:iCs/>
         </w:rPr>
-        <w:t>72</w:t>
+        <w:t>75</w:t>
       </w:r>
       <w:r>
         <w:t>)</w:t>
@@ -2637,7 +2696,35 @@
         <w:t xml:space="preserve">. </w:t>
       </w:r>
       <w:r>
-        <w:t xml:space="preserve">However, </w:t>
+        <w:t xml:space="preserve">This coordinated increase in nucleotide and translation-associated metabolism may reflect the consequences of redox imbalance at high temperatures because the accumulation of ROS can lead to DNA damage </w:t>
+      </w:r>
+      <w:r>
+        <w:fldChar w:fldCharType="begin"/>
+      </w:r>
+      <w:r>
+        <w:instrText xml:space="preserve"> ADDIN ZOTERO_ITEM CSL_CITATION {"citationID":"De7gRBET","properties":{"formattedCitation":"({\\i{}76})","plainCitation":"(76)","noteIndex":0},"citationItems":[{"id":3368,"uris":["http://zotero.org/users/13901503/items/R3YTNYU9"],"itemData":{"id":3368,"type":"article-journal","abstract":"Excess oxygen can disrupt the growth of most organisms, but the underlying mechanisms of damage have proved difficult to unravel. The model bacterium Escherichia coli represents the best understood organism in terms of the effects of and response to oxidative stress.Superoxide (O2−) and hydrogen peroxide (H2O2) are formed within cells when molecular oxygen (O2) adventitiously acquires electrons from the reduced cofactors of flavoproteins.Both O2− and H2O2 can oxidize the exposed Fe–S clusters of a family of dehydratases. This event destabilizes the clusters, and their consequent disintegration eliminates enzyme activity.O2− and H2O2 also inactivate a variety of non-redox enzymes that use single Fe2+ ions as catalytic cofactors.DNA is damaged when H2O2 reacts with the intracellular pool of unincorporated iron. The iron that is released from oxidized metalloproteins enlarges this pool and accelerates this process.The transcription factor OxyR detects modest increments in intracellular H2O2. It activates several responses that help preserve the activities of Fe–S and mononuclear metalloenzymes.The SoxRS system detects redox-active compounds that are released by plants and some bacteria. These compounds can generate toxic doses of O2−, and the SoxRS system acts primarily to minimize the amounts of these compounds inside the cell.Future studies should aim to determine whether the knowledge gained from studying oxidative stress in the facultative anaerobe E. coli is applicable to other organisms, such as strictly aerobic and microaerophilic bacteria.","container-title":"Nature Reviews Microbiology","DOI":"10.1038/nrmicro3032","ISSN":"1740-1534","issue":"7","journalAbbreviation":"Nat Rev Microbiol","language":"en","license":"2013 Springer Nature Limited","note":"publisher: Nature Publishing Group","page":"443-454","source":"www.nature.com","title":"The molecular mechanisms and physiological consequences of oxidative stress: lessons from a model bacterium","title-short":"The molecular mechanisms and physiological consequences of oxidative stress","volume":"11","author":[{"family":"Imlay","given":"James A."}],"issued":{"date-parts":[["2013",7]]}}}],"schema":"https://github.com/citation-style-language/schema/raw/master/csl-citation.json"} </w:instrText>
+      </w:r>
+      <w:r>
+        <w:fldChar w:fldCharType="separate"/>
+      </w:r>
+      <w:r>
+        <w:t>(</w:t>
+      </w:r>
+      <w:r>
+        <w:rPr>
+          <w:i/>
+          <w:iCs/>
+        </w:rPr>
+        <w:t>76</w:t>
+      </w:r>
+      <w:r>
+        <w:t>)</w:t>
+      </w:r>
+      <w:r>
+        <w:fldChar w:fldCharType="end"/>
+      </w:r>
+      <w:r>
+        <w:t xml:space="preserve">. However, </w:t>
       </w:r>
       <w:r>
         <w:t xml:space="preserve">some pathways that support redox maintenance </w:t>
@@ -2658,7 +2745,7 @@
         <w:fldChar w:fldCharType="begin"/>
       </w:r>
       <w:r>
-        <w:instrText xml:space="preserve"> ADDIN ZOTERO_ITEM CSL_CITATION {"citationID":"RysgoECv","properties":{"formattedCitation":"({\\i{}73})","plainCitation":"(73)","noteIndex":0},"citationItems":[{"id":3337,"uris":["http://zotero.org/users/13901503/items/ZQRDCT8W"],"itemData":{"id":3337,"type":"article-journal","abstract":"One of the most alluring and fascinating molecules in the world of science and medicine is vitamin B12 (cobalamin), which was originally discovered as the anti pernicious anemia factor and whose enigmatic complex structure is matched only by the beguiling chemistry that it mediates. The biosynthesis of this essential nutrient is intricate, involved and, remarkably, confined to certain members of the prokaryotic world, seemingly never have to have made the eukaryotic transition. In humans, the vitamin is required in trace amounts (approximately 1 µg/day) to assist the actions of only two enzymes, methionine synthase and (R)-methylmalonyl-CoA mutase; yet commercially more than 10 t of B12 are produced each year from a number of bacterial species. The rich scientific history of vitamin B12 research, its biological functions and the pathways employed by bacteria for its de novo synthesis are described. Current strategies for the improvement of vitamin B12 production using modern biotechnological techniques are outlined.","container-title":"Applied Microbiology and Biotechnology","DOI":"10.1007/s00253-001-0902-7","ISSN":"1432-0614","issue":"3","journalAbbreviation":"Appl Microbiol Biotechnol","language":"en","license":"2001 Springer-Verlag","note":"Company: Springer\nDistributor: Springer\nInstitution: Springer\nLabel: Springer\nnumber: 3\npublisher: Springer-Verlag","page":"275-285","source":"link-springer-com.proxy.lib.umich.edu","title":"Microbial production of vitamin B12","volume":"58","author":[{"family":"Martens","given":"J.-H."},{"family":"Barg","given":"H."},{"family":"Warren","given":"M."},{"family":"Jahn","given":"D."}],"issued":{"date-parts":[["2002",3,1]]}}}],"schema":"https://github.com/citation-style-language/schema/raw/master/csl-citation.json"} </w:instrText>
+        <w:instrText xml:space="preserve"> ADDIN ZOTERO_ITEM CSL_CITATION {"citationID":"RysgoECv","properties":{"formattedCitation":"({\\i{}77})","plainCitation":"(77)","noteIndex":0},"citationItems":[{"id":3337,"uris":["http://zotero.org/users/13901503/items/ZQRDCT8W"],"itemData":{"id":3337,"type":"article-journal","abstract":"One of the most alluring and fascinating molecules in the world of science and medicine is vitamin B12 (cobalamin), which was originally discovered as the anti pernicious anemia factor and whose enigmatic complex structure is matched only by the beguiling chemistry that it mediates. The biosynthesis of this essential nutrient is intricate, involved and, remarkably, confined to certain members of the prokaryotic world, seemingly never have to have made the eukaryotic transition. In humans, the vitamin is required in trace amounts (approximately 1 µg/day) to assist the actions of only two enzymes, methionine synthase and (R)-methylmalonyl-CoA mutase; yet commercially more than 10 t of B12 are produced each year from a number of bacterial species. The rich scientific history of vitamin B12 research, its biological functions and the pathways employed by bacteria for its de novo synthesis are described. Current strategies for the improvement of vitamin B12 production using modern biotechnological techniques are outlined.","container-title":"Applied Microbiology and Biotechnology","DOI":"10.1007/s00253-001-0902-7","ISSN":"1432-0614","issue":"3","journalAbbreviation":"Appl Microbiol Biotechnol","language":"en","license":"2001 Springer-Verlag","note":"Company: Springer\nDistributor: Springer\nInstitution: Springer\nLabel: Springer\nnumber: 3\npublisher: Springer-Verlag","page":"275-285","source":"link-springer-com.proxy.lib.umich.edu","title":"Microbial production of vitamin B12","volume":"58","author":[{"family":"Martens","given":"J.-H."},{"family":"Barg","given":"H."},{"family":"Warren","given":"M."},{"family":"Jahn","given":"D."}],"issued":{"date-parts":[["2002",3,1]]}}}],"schema":"https://github.com/citation-style-language/schema/raw/master/csl-citation.json"} </w:instrText>
       </w:r>
       <w:r>
         <w:fldChar w:fldCharType="separate"/>
@@ -2671,7 +2758,7 @@
           <w:i/>
           <w:iCs/>
         </w:rPr>
-        <w:t>73</w:t>
+        <w:t>77</w:t>
       </w:r>
       <w:r>
         <w:t>)</w:t>
@@ -2686,7 +2773,7 @@
         <w:fldChar w:fldCharType="begin"/>
       </w:r>
       <w:r>
-        <w:instrText xml:space="preserve"> ADDIN ZOTERO_ITEM CSL_CITATION {"citationID":"RUb5pm3b","properties":{"formattedCitation":"({\\i{}74})","plainCitation":"(74)","noteIndex":0},"citationItems":[{"id":3246,"uris":["http://zotero.org/users/13901503/items/SBMSGALS"],"itemData":{"id":3246,"type":"article-journal","container-title":"Trends in Biochemical Sciences","DOI":"10.1016/j.tibs.2006.11.006","ISSN":"0968-0004","issue":"1","journalAbbreviation":"Trends in Biochemical Sciences","language":"English","note":"publisher: Elsevier\nPMID: 17161604","page":"12-19","source":"www-cell-com.proxy.lib.umich.edu","title":"NAD+ metabolism in health and disease","volume":"32","author":[{"family":"Belenky","given":"Peter"},{"family":"Bogan","given":"Katrina L."},{"family":"Brenner","given":"Charles"}],"issued":{"date-parts":[["2007",1,1]]}}}],"schema":"https://github.com/citation-style-language/schema/raw/master/csl-citation.json"} </w:instrText>
+        <w:instrText xml:space="preserve"> ADDIN ZOTERO_ITEM CSL_CITATION {"citationID":"RUb5pm3b","properties":{"formattedCitation":"({\\i{}78})","plainCitation":"(78)","noteIndex":0},"citationItems":[{"id":3246,"uris":["http://zotero.org/users/13901503/items/SBMSGALS"],"itemData":{"id":3246,"type":"article-journal","container-title":"Trends in Biochemical Sciences","DOI":"10.1016/j.tibs.2006.11.006","ISSN":"0968-0004","issue":"1","journalAbbreviation":"Trends in Biochemical Sciences","language":"English","note":"publisher: Elsevier\nPMID: 17161604","page":"12-19","source":"www-cell-com.proxy.lib.umich.edu","title":"NAD+ metabolism in health and disease","volume":"32","author":[{"family":"Belenky","given":"Peter"},{"family":"Bogan","given":"Katrina L."},{"family":"Brenner","given":"Charles"}],"issued":{"date-parts":[["2007",1,1]]}}}],"schema":"https://github.com/citation-style-language/schema/raw/master/csl-citation.json"} </w:instrText>
       </w:r>
       <w:r>
         <w:fldChar w:fldCharType="separate"/>
@@ -2699,7 +2786,7 @@
           <w:i/>
           <w:iCs/>
         </w:rPr>
-        <w:t>74</w:t>
+        <w:t>78</w:t>
       </w:r>
       <w:r>
         <w:t>)</w:t>
@@ -2714,7 +2801,7 @@
         <w:fldChar w:fldCharType="begin"/>
       </w:r>
       <w:r>
-        <w:instrText xml:space="preserve"> ADDIN ZOTERO_ITEM CSL_CITATION {"citationID":"CONirrgu","properties":{"formattedCitation":"({\\i{}75})","plainCitation":"(75)","noteIndex":0},"citationItems":[{"id":3334,"uris":["http://zotero.org/users/13901503/items/68BGK4TV"],"itemData":{"id":3334,"type":"article-journal","abstract":"Vitamin C, a reducing agent and antioxidant, is a cofactor in reactions catalyzed by Cu+-dependent monooxygenases and Fe2+-dependent dioxygenases. It is synthesized, in vertebrates having this capacity, from d-glucuronate. The latter is formed through direct hydrolysis of uridine diphosphate (UDP)-glucuronate by enzyme(s) bound to the endoplasmic reticulum membrane, sharing many properties with, and most likely identical to, UDP-glucuronosyltransferases. Non-glucuronidable xenobiotics (aminopyrine, metyrapone, chloretone and others) stimulate the enzymatic hydrolysis of UDP-glucuronate, accounting for their effect to increase vitamin C formation in vivo. Glucuronate is converted to l-gulonate by aldehyde reductase, an enzyme of the aldo-keto reductase superfamily. l-Gulonate is converted to l-gulonolactone by a lactonase identified as SMP30 or regucalcin, whose absence in mice leads to vitamin C deficiency. The last step in the pathway of vitamin C synthesis is the oxidation of l-gulonolactone to l-ascorbic acid by l-gulonolactone oxidase, an enzyme associated with the endoplasmic reticulum membrane and deficient in man, guinea pig and other species due to mutations in its gene. Another fate of glucuronate is its conversion to d-xylulose in a five-step pathway, the pentose pathway, involving identified oxidoreductases and an unknown decarboxylase. Semidehydroascorbate, a major oxidation product of vitamin C, is reconverted to ascorbate in the cytosol by cytochrome b5 reductase and thioredoxin reductase in reactions involving NADH and NADPH, respectively. Transmembrane electron transfer systems using ascorbate or NADH as electron donors serve to reduce semidehydroascorbate present in neuroendocrine secretory vesicles and in the extracellular medium. Dehydroascorbate, the fully oxidized form of vitamin C, is reduced spontaneously by glutathione, as well as enzymatically in reactions using glutathione or NADPH. The degradation of vitamin C in mammals is initiated by the hydrolysis of dehydroascorbate to 2,3-diketo-l-gulonate, which is spontaneously degraded to oxalate, CO2 and l-erythrulose. This is at variance with bacteria such as Escherichia coli, which have enzymatic degradation pathways for ascorbate and probably also dehydroascorbate.","container-title":"The FEBS Journal","DOI":"10.1111/j.1742-4658.2006.05607.x","ISSN":"1742-4658","issue":"1","language":"en","note":"_eprint: https://febs.onlinelibrary.wiley.com/doi/pdf/10.1111/j.1742-4658.2006.05607.x","page":"1-22","source":"Wiley Online Library","title":"Vitamin C","volume":"274","author":[{"family":"Linster","given":"Carole L."},{"family":"Van Schaftingen","given":"Emile"}],"issued":{"date-parts":[["2007"]]}}}],"schema":"https://github.com/citation-style-language/schema/raw/master/csl-citation.json"} </w:instrText>
+        <w:instrText xml:space="preserve"> ADDIN ZOTERO_ITEM CSL_CITATION {"citationID":"CONirrgu","properties":{"formattedCitation":"({\\i{}79})","plainCitation":"(79)","noteIndex":0},"citationItems":[{"id":3334,"uris":["http://zotero.org/users/13901503/items/68BGK4TV"],"itemData":{"id":3334,"type":"article-journal","abstract":"Vitamin C, a reducing agent and antioxidant, is a cofactor in reactions catalyzed by Cu+-dependent monooxygenases and Fe2+-dependent dioxygenases. It is synthesized, in vertebrates having this capacity, from d-glucuronate. The latter is formed through direct hydrolysis of uridine diphosphate (UDP)-glucuronate by enzyme(s) bound to the endoplasmic reticulum membrane, sharing many properties with, and most likely identical to, UDP-glucuronosyltransferases. Non-glucuronidable xenobiotics (aminopyrine, metyrapone, chloretone and others) stimulate the enzymatic hydrolysis of UDP-glucuronate, accounting for their effect to increase vitamin C formation in vivo. Glucuronate is converted to l-gulonate by aldehyde reductase, an enzyme of the aldo-keto reductase superfamily. l-Gulonate is converted to l-gulonolactone by a lactonase identified as SMP30 or regucalcin, whose absence in mice leads to vitamin C deficiency. The last step in the pathway of vitamin C synthesis is the oxidation of l-gulonolactone to l-ascorbic acid by l-gulonolactone oxidase, an enzyme associated with the endoplasmic reticulum membrane and deficient in man, guinea pig and other species due to mutations in its gene. Another fate of glucuronate is its conversion to d-xylulose in a five-step pathway, the pentose pathway, involving identified oxidoreductases and an unknown decarboxylase. Semidehydroascorbate, a major oxidation product of vitamin C, is reconverted to ascorbate in the cytosol by cytochrome b5 reductase and thioredoxin reductase in reactions involving NADH and NADPH, respectively. Transmembrane electron transfer systems using ascorbate or NADH as electron donors serve to reduce semidehydroascorbate present in neuroendocrine secretory vesicles and in the extracellular medium. Dehydroascorbate, the fully oxidized form of vitamin C, is reduced spontaneously by glutathione, as well as enzymatically in reactions using glutathione or NADPH. The degradation of vitamin C in mammals is initiated by the hydrolysis of dehydroascorbate to 2,3-diketo-l-gulonate, which is spontaneously degraded to oxalate, CO2 and l-erythrulose. This is at variance with bacteria such as Escherichia coli, which have enzymatic degradation pathways for ascorbate and probably also dehydroascorbate.","container-title":"The FEBS Journal","DOI":"10.1111/j.1742-4658.2006.05607.x","ISSN":"1742-4658","issue":"1","language":"en","note":"_eprint: https://febs.onlinelibrary.wiley.com/doi/pdf/10.1111/j.1742-4658.2006.05607.x","page":"1-22","source":"Wiley Online Library","title":"Vitamin C","volume":"274","author":[{"family":"Linster","given":"Carole L."},{"family":"Van Schaftingen","given":"Emile"}],"issued":{"date-parts":[["2007"]]}}}],"schema":"https://github.com/citation-style-language/schema/raw/master/csl-citation.json"} </w:instrText>
       </w:r>
       <w:r>
         <w:fldChar w:fldCharType="separate"/>
@@ -2727,7 +2814,7 @@
           <w:i/>
           <w:iCs/>
         </w:rPr>
-        <w:t>75</w:t>
+        <w:t>79</w:t>
       </w:r>
       <w:r>
         <w:t>)</w:t>
@@ -2736,7 +2823,10 @@
         <w:fldChar w:fldCharType="end"/>
       </w:r>
       <w:r>
-        <w:t xml:space="preserve">. This may reflect a compensatory effort from the microbiome to restore redox balance. </w:t>
+        <w:t xml:space="preserve">, which </w:t>
+      </w:r>
+      <w:r>
+        <w:t xml:space="preserve">may reflect a compensatory effort to restore redox balance. </w:t>
       </w:r>
     </w:p>
     <w:p>
@@ -2771,7 +2861,7 @@
         <w:fldChar w:fldCharType="begin"/>
       </w:r>
       <w:r>
-        <w:instrText xml:space="preserve"> ADDIN ZOTERO_ITEM CSL_CITATION {"citationID":"BKbHZJDj","properties":{"formattedCitation":"({\\i{}43}, {\\i{}76})","plainCitation":"(43, 76)","noteIndex":0},"citationItems":[{"id":3266,"uris":["http://zotero.org/users/13901503/items/ZX3K6GKV"],"itemData":{"id":3266,"type":"article-journal","abstract":"In mice, provision of butyrate—a short-chain fatty acid produced by commensal microorganisms during starch fermentation—facilitates extrathymic generation and differentiation of Foxp3+ regulatory T cells, demonstrating that metabolic by-products are sensed by cells of the immune system and affect the balance between pro- and anti-inflammatory cells.","container-title":"Nature","DOI":"10.1038/nature12726","ISSN":"1476-4687","issue":"7480","language":"en","license":"2013 Springer Nature Limited","note":"publisher: Nature Publishing Group","page":"451-455","source":"www.nature.com","title":"Metabolites produced by commensal bacteria promote peripheral regulatory T-cell generation","volume":"504","author":[{"family":"Arpaia","given":"Nicholas"},{"family":"Campbell","given":"Clarissa"},{"family":"Fan","given":"Xiying"},{"family":"Dikiy","given":"Stanislav"},{"family":"Veeken","given":"Joris","non-dropping-particle":"van der"},{"family":"deRoos","given":"Paul"},{"family":"Liu","given":"Hui"},{"family":"Cross","given":"Justin R."},{"family":"Pfeffer","given":"Klaus"},{"family":"Coffer","given":"Paul J."},{"family":"Rudensky","given":"Alexander Y."}],"issued":{"date-parts":[["2013",12]]}}},{"id":2208,"uris":["http://zotero.org/users/13901503/items/CGJLGGCV"],"itemData":{"id":2208,"type":"article-journal","abstract":"The short chain fatty acid butyrate promotes proliferation and survival of normal epithelial cells, but induces G1 or G2-M arrest in transformed cells, which is coupled to differentiation and apoptosis. Local administration of butyrate has been shown to ameliorate inflammation in ulcerative colitis; however, the precise mechanism of its anti-inflammatory activity is not known. IFN-γ is one of the principle cytokines secreted by lamina propria cells in inflamed mucosa and elevated levels of the transcription factor required for IFN-γ signaling, STAT1 (signal transducer and activator of transcription 1), are present in the colonic mucosa of patients with ulcerative colitis and Crohn's disease. Here we report that butyrate is a strong inhibitor of signaling by IFN-γ. We demonstrated that this short chain fatty acid inhibits IFN-γ-induced tyrosine and serine phosphorylation of STAT1. IFN-γ-induced JAK2 activation was inhibited by butyrate, implicating JAK2 as a target of butyrate action. Accordingly, STAT1 nuclear translocation and its DNA binding were completely inhibited in butyrate-treated cells. Transient transfection experiments using a reporter gene construct containing eight GAS sites (γ-activated sites) revealed that butyrate inhibits IFN-γ induced, STAT1-dependent, transcriptional activation. Proinflammatory cytokines, including IFN-γ, play an important role in the pathogenesis of inflammatory bowel disease, and abnormal activity of STAT1 is associated with human malignancies and intestinal inflammatory diseases. Thus, our data suggest that butyrate negatively regulates mucosal inflammation through the inhibition of IFN-γ/STAT1 signaling.","container-title":"Molecular Cancer Research","ISSN":"1541-7786","issue":"11","journalAbbreviation":"Molecular Cancer Research","page":"855-862","source":"Silverchair","title":"Inhibition of Interferon γ Signaling by the Short Chain Fatty Acid Butyrate1","volume":"1","author":[{"family":"Klampfer","given":"Lidija"},{"family":"Huang","given":"Jie"},{"family":"Sasazuki","given":"Takehiko"},{"family":"Shirasawa","given":"Senji"},{"family":"Augenlicht","given":"Leonard"}],"issued":{"date-parts":[["2003",9,1]]}}}],"schema":"https://github.com/citation-style-language/schema/raw/master/csl-citation.json"} </w:instrText>
+        <w:instrText xml:space="preserve"> ADDIN ZOTERO_ITEM CSL_CITATION {"citationID":"BKbHZJDj","properties":{"formattedCitation":"({\\i{}43}, {\\i{}80})","plainCitation":"(43, 80)","noteIndex":0},"citationItems":[{"id":3266,"uris":["http://zotero.org/users/13901503/items/ZX3K6GKV"],"itemData":{"id":3266,"type":"article-journal","abstract":"In mice, provision of butyrate—a short-chain fatty acid produced by commensal microorganisms during starch fermentation—facilitates extrathymic generation and differentiation of Foxp3+ regulatory T cells, demonstrating that metabolic by-products are sensed by cells of the immune system and affect the balance between pro- and anti-inflammatory cells.","container-title":"Nature","DOI":"10.1038/nature12726","ISSN":"1476-4687","issue":"7480","language":"en","license":"2013 Springer Nature Limited","note":"publisher: Nature Publishing Group","page":"451-455","source":"www.nature.com","title":"Metabolites produced by commensal bacteria promote peripheral regulatory T-cell generation","volume":"504","author":[{"family":"Arpaia","given":"Nicholas"},{"family":"Campbell","given":"Clarissa"},{"family":"Fan","given":"Xiying"},{"family":"Dikiy","given":"Stanislav"},{"family":"Veeken","given":"Joris","non-dropping-particle":"van der"},{"family":"deRoos","given":"Paul"},{"family":"Liu","given":"Hui"},{"family":"Cross","given":"Justin R."},{"family":"Pfeffer","given":"Klaus"},{"family":"Coffer","given":"Paul J."},{"family":"Rudensky","given":"Alexander Y."}],"issued":{"date-parts":[["2013",12]]}}},{"id":2208,"uris":["http://zotero.org/users/13901503/items/CGJLGGCV"],"itemData":{"id":2208,"type":"article-journal","abstract":"The short chain fatty acid butyrate promotes proliferation and survival of normal epithelial cells, but induces G1 or G2-M arrest in transformed cells, which is coupled to differentiation and apoptosis. Local administration of butyrate has been shown to ameliorate inflammation in ulcerative colitis; however, the precise mechanism of its anti-inflammatory activity is not known. IFN-γ is one of the principle cytokines secreted by lamina propria cells in inflamed mucosa and elevated levels of the transcription factor required for IFN-γ signaling, STAT1 (signal transducer and activator of transcription 1), are present in the colonic mucosa of patients with ulcerative colitis and Crohn's disease. Here we report that butyrate is a strong inhibitor of signaling by IFN-γ. We demonstrated that this short chain fatty acid inhibits IFN-γ-induced tyrosine and serine phosphorylation of STAT1. IFN-γ-induced JAK2 activation was inhibited by butyrate, implicating JAK2 as a target of butyrate action. Accordingly, STAT1 nuclear translocation and its DNA binding were completely inhibited in butyrate-treated cells. Transient transfection experiments using a reporter gene construct containing eight GAS sites (γ-activated sites) revealed that butyrate inhibits IFN-γ induced, STAT1-dependent, transcriptional activation. Proinflammatory cytokines, including IFN-γ, play an important role in the pathogenesis of inflammatory bowel disease, and abnormal activity of STAT1 is associated with human malignancies and intestinal inflammatory diseases. Thus, our data suggest that butyrate negatively regulates mucosal inflammation through the inhibition of IFN-γ/STAT1 signaling.","container-title":"Molecular Cancer Research","ISSN":"1541-7786","issue":"11","journalAbbreviation":"Molecular Cancer Research","page":"855-862","source":"Silverchair","title":"Inhibition of Interferon γ Signaling by the Short Chain Fatty Acid Butyrate1","volume":"1","author":[{"family":"Klampfer","given":"Lidija"},{"family":"Huang","given":"Jie"},{"family":"Sasazuki","given":"Takehiko"},{"family":"Shirasawa","given":"Senji"},{"family":"Augenlicht","given":"Leonard"}],"issued":{"date-parts":[["2003",9,1]]}}}],"schema":"https://github.com/citation-style-language/schema/raw/master/csl-citation.json"} </w:instrText>
       </w:r>
       <w:r>
         <w:fldChar w:fldCharType="separate"/>
@@ -2794,7 +2884,7 @@
           <w:i/>
           <w:iCs/>
         </w:rPr>
-        <w:t>76</w:t>
+        <w:t>80</w:t>
       </w:r>
       <w:r>
         <w:t>)</w:t>
@@ -2809,7 +2899,7 @@
         <w:fldChar w:fldCharType="begin"/>
       </w:r>
       <w:r>
-        <w:instrText xml:space="preserve"> ADDIN ZOTERO_ITEM CSL_CITATION {"citationID":"wYIcCrwU","properties":{"formattedCitation":"({\\i{}77})","plainCitation":"(77)","noteIndex":0},"citationItems":[{"id":3176,"uris":["http://zotero.org/users/13901503/items/HTMPX6GE"],"itemData":{"id":3176,"type":"article-journal","abstract":"Monocytes are a major population of circulating immune cells that play a crucial role in producing pro-inflammatory cytokines in the body. The actions of monocytes are known to be influenced by the combinations and concentrations of certain fatty acids (FAs) in blood and dietary fats. However, systemic comparisons of the effects of FAs on cytokine secretion by monocytes have not be performed. In this study, we compared how six saturated FAs (SFAs), two monounsaturated FAs (MUFAs), and seven polyunsaturated FAs (PUFAs) modulate human THP-1 monocyte secretion of TNF, IL-1β, and IL-6 in the absence or presence of lipopolysaccharide. SFAs generally stimulated resting THP-1 cells to secrete pro-inflammatory cytokines, with stearic acid being the most potent species. In contrast, MUFAs and PUFAs inhibited lipopolysaccharide-induced secretion of pro-inflammatory cytokines. Interestingly, the inhibitory potentials of MUFAs and PUFAs followed U-shaped (TNF and IL-1β) or inverted U-shaped (IL-6) dose–response curves. Among the MUFAs and PUFAs that were analyzed, docosahexaenoic acid (C22:6 n-3) exhibited the largest number of double bonds and was found to be the most potent anti-inflammatory compound. Together, our findings reveal that the chemical compositions and concentrations of dietary FAs are key factors in the intricate regulation of monocyte-mediated inflammation.","container-title":"Scientific Reports","DOI":"10.1038/s41598-023-32710-5","ISSN":"2045-2322","issue":"1","journalAbbreviation":"Sci Rep","language":"en","license":"2023 The Author(s)","note":"publisher: Nature Publishing Group","page":"5511","source":"www.nature.com","title":"Dietary fatty acids differentially affect secretion of pro-inflammatory cytokines in human THP-1 monocytes","volume":"13","author":[{"family":"Hung","given":"Hao-Chang"},{"family":"Tsai","given":"Sheng-Feng"},{"family":"Chou","given":"Hsuan-Wen"},{"family":"Tsai","given":"Ming-Jun"},{"family":"Hsu","given":"Pei-Ling"},{"family":"Kuo","given":"Yu-Min"}],"issued":{"date-parts":[["2023",4,4]]}}}],"schema":"https://github.com/citation-style-language/schema/raw/master/csl-citation.json"} </w:instrText>
+        <w:instrText xml:space="preserve"> ADDIN ZOTERO_ITEM CSL_CITATION {"citationID":"wYIcCrwU","properties":{"formattedCitation":"({\\i{}81})","plainCitation":"(81)","noteIndex":0},"citationItems":[{"id":3176,"uris":["http://zotero.org/users/13901503/items/HTMPX6GE"],"itemData":{"id":3176,"type":"article-journal","abstract":"Monocytes are a major population of circulating immune cells that play a crucial role in producing pro-inflammatory cytokines in the body. The actions of monocytes are known to be influenced by the combinations and concentrations of certain fatty acids (FAs) in blood and dietary fats. However, systemic comparisons of the effects of FAs on cytokine secretion by monocytes have not be performed. In this study, we compared how six saturated FAs (SFAs), two monounsaturated FAs (MUFAs), and seven polyunsaturated FAs (PUFAs) modulate human THP-1 monocyte secretion of TNF, IL-1β, and IL-6 in the absence or presence of lipopolysaccharide. SFAs generally stimulated resting THP-1 cells to secrete pro-inflammatory cytokines, with stearic acid being the most potent species. In contrast, MUFAs and PUFAs inhibited lipopolysaccharide-induced secretion of pro-inflammatory cytokines. Interestingly, the inhibitory potentials of MUFAs and PUFAs followed U-shaped (TNF and IL-1β) or inverted U-shaped (IL-6) dose–response curves. Among the MUFAs and PUFAs that were analyzed, docosahexaenoic acid (C22:6 n-3) exhibited the largest number of double bonds and was found to be the most potent anti-inflammatory compound. Together, our findings reveal that the chemical compositions and concentrations of dietary FAs are key factors in the intricate regulation of monocyte-mediated inflammation.","container-title":"Scientific Reports","DOI":"10.1038/s41598-023-32710-5","ISSN":"2045-2322","issue":"1","journalAbbreviation":"Sci Rep","language":"en","license":"2023 The Author(s)","note":"publisher: Nature Publishing Group","page":"5511","source":"www.nature.com","title":"Dietary fatty acids differentially affect secretion of pro-inflammatory cytokines in human THP-1 monocytes","volume":"13","author":[{"family":"Hung","given":"Hao-Chang"},{"family":"Tsai","given":"Sheng-Feng"},{"family":"Chou","given":"Hsuan-Wen"},{"family":"Tsai","given":"Ming-Jun"},{"family":"Hsu","given":"Pei-Ling"},{"family":"Kuo","given":"Yu-Min"}],"issued":{"date-parts":[["2023",4,4]]}}}],"schema":"https://github.com/citation-style-language/schema/raw/master/csl-citation.json"} </w:instrText>
       </w:r>
       <w:r>
         <w:fldChar w:fldCharType="separate"/>
@@ -2822,7 +2912,7 @@
           <w:i/>
           <w:iCs/>
         </w:rPr>
-        <w:t>77</w:t>
+        <w:t>81</w:t>
       </w:r>
       <w:r>
         <w:t>)</w:t>
@@ -2840,7 +2930,7 @@
         <w:fldChar w:fldCharType="begin"/>
       </w:r>
       <w:r>
-        <w:instrText xml:space="preserve"> ADDIN ZOTERO_ITEM CSL_CITATION {"citationID":"CTjLWKQl","properties":{"formattedCitation":"({\\i{}78})","plainCitation":"(78)","noteIndex":0},"citationItems":[{"id":3995,"uris":["http://zotero.org/users/13901503/items/3CHW39VH"],"itemData":{"id":3995,"type":"article-journal","abstract":"The intestinal epithelium is a rapidly self-renewing tissue; the rapid turnover prevents the invasion of pathogens and harmful components from the intestinal lumen, preventing inflammation and infectious diseases. Intestinal epithelial barrier function depends on the epithelial cell proliferation and junctions, as well as the state of the immune system in the lamina propria. Polyamines, particularly putrescine, spermidine, and spermine, are essential for many cell functions and play a crucial role in mammalian cellular homeostasis, such as that of cell growth, proliferation, differentiation, and maintenance, through multiple biological processes, including translation, transcription, and autophagy. Although the vital role of polyamines in normal intestinal epithelial cell growth and barrier function has been known since the 1980s, recent studies have provided new insights into this topic at the molecular level, such as eukaryotic initiation factor-5A hypusination and autophagy, with rapid advances in polyamine biology in normal cells using biological technologies. This review summarizes recent advances in our understanding of the role of polyamines in regulating normal, non-cancerous, intestinal epithelial barrier function, with a particular focus on intestinal epithelial renewal, cell junctions, and immune cell differentiation in the lamina propria.","container-title":"Seminars in Immunopathology","DOI":"10.1007/s00281-024-01035-4","ISSN":"1863-2300","issue":"1","journalAbbreviation":"Semin Immunopathol","language":"en","page":"9","source":"Springer Link","title":"Role of polyamines in intestinal mucosal barrier function","volume":"47","author":[{"family":"Nakamura","given":"Atsuo"},{"family":"Matsumoto","given":"Mitsuharu"}],"issued":{"date-parts":[["2025",1,21]]}}}],"schema":"https://github.com/citation-style-language/schema/raw/master/csl-citation.json"} </w:instrText>
+        <w:instrText xml:space="preserve"> ADDIN ZOTERO_ITEM CSL_CITATION {"citationID":"CTjLWKQl","properties":{"formattedCitation":"({\\i{}82})","plainCitation":"(82)","noteIndex":0},"citationItems":[{"id":3995,"uris":["http://zotero.org/users/13901503/items/3CHW39VH"],"itemData":{"id":3995,"type":"article-journal","abstract":"The intestinal epithelium is a rapidly self-renewing tissue; the rapid turnover prevents the invasion of pathogens and harmful components from the intestinal lumen, preventing inflammation and infectious diseases. Intestinal epithelial barrier function depends on the epithelial cell proliferation and junctions, as well as the state of the immune system in the lamina propria. Polyamines, particularly putrescine, spermidine, and spermine, are essential for many cell functions and play a crucial role in mammalian cellular homeostasis, such as that of cell growth, proliferation, differentiation, and maintenance, through multiple biological processes, including translation, transcription, and autophagy. Although the vital role of polyamines in normal intestinal epithelial cell growth and barrier function has been known since the 1980s, recent studies have provided new insights into this topic at the molecular level, such as eukaryotic initiation factor-5A hypusination and autophagy, with rapid advances in polyamine biology in normal cells using biological technologies. This review summarizes recent advances in our understanding of the role of polyamines in regulating normal, non-cancerous, intestinal epithelial barrier function, with a particular focus on intestinal epithelial renewal, cell junctions, and immune cell differentiation in the lamina propria.","container-title":"Seminars in Immunopathology","DOI":"10.1007/s00281-024-01035-4","ISSN":"1863-2300","issue":"1","journalAbbreviation":"Semin Immunopathol","language":"en","page":"9","source":"Springer Link","title":"Role of polyamines in intestinal mucosal barrier function","volume":"47","author":[{"family":"Nakamura","given":"Atsuo"},{"family":"Matsumoto","given":"Mitsuharu"}],"issued":{"date-parts":[["2025",1,21]]}}}],"schema":"https://github.com/citation-style-language/schema/raw/master/csl-citation.json"} </w:instrText>
       </w:r>
       <w:r>
         <w:fldChar w:fldCharType="separate"/>
@@ -2853,7 +2943,7 @@
           <w:i/>
           <w:iCs/>
         </w:rPr>
-        <w:t>78</w:t>
+        <w:t>82</w:t>
       </w:r>
       <w:r>
         <w:t>)</w:t>
@@ -2888,7 +2978,7 @@
         <w:fldChar w:fldCharType="begin"/>
       </w:r>
       <w:r>
-        <w:instrText xml:space="preserve"> ADDIN ZOTERO_ITEM CSL_CITATION {"citationID":"WbrfEbW1","properties":{"formattedCitation":"({\\i{}79})","plainCitation":"(79)","noteIndex":0},"citationItems":[{"id":3532,"uris":["http://zotero.org/users/13901503/items/X4GCYZZS"],"itemData":{"id":3532,"type":"article-journal","abstract":"Actions of symbiotic gut microbiota are in dynamic balance with the host’s organism to maintain homeostasis. Many different factors have an impact on this relationship, including bacterial metabolites. Several substrates for their synthesis have been established, including tryptophan, an exogenous amino acid. Many biological processes are influenced by the action of tryptophan and its endogenous metabolites, serotonin, and melatonin. Recent research findings also provide evidence that gut bacteria-derived metabolites of tryptophan share the biological effects of their precursor. Thus, this review aims to investigate the biological actions of indole-3-propionic acid (IPA), a gut microbiota-derived metabolite of tryptophan. We searched PUBMED and Google Scholar databases to identify pre-clinical and clinical studies evaluating the impact of IPA on the health and pathophysiology of the immune, nervous, gastrointestinal and cardiovascular system in mammals. IPA exhibits a similar impact on the energetic balance and cardiovascular system to its precursor, tryptophan. Additionally, IPA has a positive impact on a cellular level, by preventing oxidative stress injury, lipoperoxidation and inhibiting synthesis of proinflammatory cytokines. Its synthesis can be diminished in the presence of different risk factors of atherosclerosis. On the other hand, protective factors, such as the introduction of a Mediterranean diet, tend to increase its plasma concentration. IPA seems to be a promising new target, linking gut health with the cardiovascular system.","container-title":"International Journal of Molecular Sciences","DOI":"10.3390/ijms23031222","ISSN":"1422-0067","issue":"3","language":"en","license":"http://creativecommons.org/licenses/by/3.0/","note":"number: 3\npublisher: Multidisciplinary Digital Publishing Institute","page":"1222","source":"www.mdpi.com","title":"Biological Effects of Indole-3-Propionic Acid, a Gut Microbiota-Derived Metabolite, and Its Precursor Tryptophan in Mammals’ Health and Disease","volume":"23","author":[{"family":"Konopelski","given":"Piotr"},{"family":"Mogilnicka","given":"Izabella"}],"issued":{"date-parts":[["2022",1]]}}}],"schema":"https://github.com/citation-style-language/schema/raw/master/csl-citation.json"} </w:instrText>
+        <w:instrText xml:space="preserve"> ADDIN ZOTERO_ITEM CSL_CITATION {"citationID":"WbrfEbW1","properties":{"formattedCitation":"({\\i{}83})","plainCitation":"(83)","noteIndex":0},"citationItems":[{"id":3532,"uris":["http://zotero.org/users/13901503/items/X4GCYZZS"],"itemData":{"id":3532,"type":"article-journal","abstract":"Actions of symbiotic gut microbiota are in dynamic balance with the host’s organism to maintain homeostasis. Many different factors have an impact on this relationship, including bacterial metabolites. Several substrates for their synthesis have been established, including tryptophan, an exogenous amino acid. Many biological processes are influenced by the action of tryptophan and its endogenous metabolites, serotonin, and melatonin. Recent research findings also provide evidence that gut bacteria-derived metabolites of tryptophan share the biological effects of their precursor. Thus, this review aims to investigate the biological actions of indole-3-propionic acid (IPA), a gut microbiota-derived metabolite of tryptophan. We searched PUBMED and Google Scholar databases to identify pre-clinical and clinical studies evaluating the impact of IPA on the health and pathophysiology of the immune, nervous, gastrointestinal and cardiovascular system in mammals. IPA exhibits a similar impact on the energetic balance and cardiovascular system to its precursor, tryptophan. Additionally, IPA has a positive impact on a cellular level, by preventing oxidative stress injury, lipoperoxidation and inhibiting synthesis of proinflammatory cytokines. Its synthesis can be diminished in the presence of different risk factors of atherosclerosis. On the other hand, protective factors, such as the introduction of a Mediterranean diet, tend to increase its plasma concentration. IPA seems to be a promising new target, linking gut health with the cardiovascular system.","container-title":"International Journal of Molecular Sciences","DOI":"10.3390/ijms23031222","ISSN":"1422-0067","issue":"3","language":"en","license":"http://creativecommons.org/licenses/by/3.0/","note":"number: 3\npublisher: Multidisciplinary Digital Publishing Institute","page":"1222","source":"www.mdpi.com","title":"Biological Effects of Indole-3-Propionic Acid, a Gut Microbiota-Derived Metabolite, and Its Precursor Tryptophan in Mammals’ Health and Disease","volume":"23","author":[{"family":"Konopelski","given":"Piotr"},{"family":"Mogilnicka","given":"Izabella"}],"issued":{"date-parts":[["2022",1]]}}}],"schema":"https://github.com/citation-style-language/schema/raw/master/csl-citation.json"} </w:instrText>
       </w:r>
       <w:r>
         <w:fldChar w:fldCharType="separate"/>
@@ -2901,7 +2991,7 @@
           <w:i/>
           <w:iCs/>
         </w:rPr>
-        <w:t>79</w:t>
+        <w:t>83</w:t>
       </w:r>
       <w:r>
         <w:t>)</w:t>
@@ -2984,7 +3074,19 @@
       </w:pPr>
       <w:r>
         <w:lastRenderedPageBreak/>
-        <w:t xml:space="preserve">To assess if neopterin concentration is associated with the gut microbiome’s relationship with temperature, we compared the temperature model that included known predictors of microbiome composition plus temperature to a model that included the baseline predictors and an interaction effect between temperature and neopterin concentration (Fig 1S). For taxonomic composition, the interaction model provided the best fit (controlling for complexity) for every principal component, accounting for at least 98% of the model weight (Fig 3S). Principal component 1 was the only component with confidence intervals that did not include zero, but accounted for the greatest proportion of variance among all principal components. This result, along with the high model weight for every principal component, suggests that the relationship between temperature and beta diversity is associated with neopterin. In contrast, the temperature model provided the best fit for both alpha diversity metrics, accounting for at least 86% of the model weight. These results combined with the small effect sizes (Shannon </w:t>
+        <w:t xml:space="preserve">To assess if neopterin concentration is associated with the gut microbiome’s relationship with temperature, we compared the temperature model that included known predictors of microbiome composition plus temperature to a model that included the baseline predictors and an interaction effect between temperature and neopterin concentration (Fig 1S). For taxonomic composition, the interaction model provided the best fit (controlling for complexity) for every principal component, accounting for at least 98% of the model weight (Fig 3S). Principal </w:t>
+      </w:r>
+      <w:r>
+        <w:t>c</w:t>
+      </w:r>
+      <w:r>
+        <w:t>omponent 1 was the only component with confidence intervals that did not include zero, but accounted for the greatest proportion of variance among all principal components. This result, along with the high model weight for every principal component, suggests that the relationship between temperature and beta diversity is associated with neopterin. In contrast, the temperature model provided the best fit for both alpha diversity metrics, accounting for at least 86% of the model weight. These results</w:t>
+      </w:r>
+      <w:r>
+        <w:t>,</w:t>
+      </w:r>
+      <w:r>
+        <w:t xml:space="preserve"> combined with the small effect sizes (Shannon </w:t>
       </w:r>
       <w:r>
         <w:t>β</w:t>
@@ -3022,7 +3124,19 @@
         <w:ind w:firstLine="720"/>
       </w:pPr>
       <w:r>
-        <w:t xml:space="preserve">For metabolic functional composition, the interaction model provided the best fit for every principal component and observed pathways, accounting for at least 98% of the model weight, while the temperature model provided the best fit for Shannon’s diversity, accounting for 63% of the model weight (Fig 3S). Even though Principal component 3 was the only component where the confidence intervals did not include zero, the large effect sizes for all three components (PC1 </w:t>
+        <w:t xml:space="preserve">For metabolic functional composition, the interaction model provided the best fit for every principal component and observed pathways, accounting for at least 98% of the model weight, while the temperature model provided the best fit for Shannon’s diversity, accounting for 63% of the model weight (Fig 3S). Even though </w:t>
+      </w:r>
+      <w:r>
+        <w:t>p</w:t>
+      </w:r>
+      <w:r>
+        <w:t xml:space="preserve">rincipal </w:t>
+      </w:r>
+      <w:r>
+        <w:t>c</w:t>
+      </w:r>
+      <w:r>
+        <w:t xml:space="preserve">omponent 3 was the only component where the confidence intervals did not include zero, the large effect sizes for all three components (PC1 </w:t>
       </w:r>
       <w:r>
         <w:t>β</w:t>
@@ -3181,7 +3295,13 @@
         <w:t xml:space="preserve"> (6 taxa), </w:t>
       </w:r>
       <w:r>
-        <w:t>including</w:t>
+        <w:t xml:space="preserve">and </w:t>
+      </w:r>
+      <w:r>
+        <w:t>includ</w:t>
+      </w:r>
+      <w:r>
+        <w:t>ed</w:t>
       </w:r>
       <w:r>
         <w:t xml:space="preserve"> two known SCFA producers, </w:t>
@@ -3216,7 +3336,7 @@
         <w:fldChar w:fldCharType="begin"/>
       </w:r>
       <w:r>
-        <w:instrText xml:space="preserve"> ADDIN ZOTERO_ITEM CSL_CITATION {"citationID":"wESsU6it","properties":{"formattedCitation":"({\\i{}80}, {\\i{}81})","plainCitation":"(80, 81)","noteIndex":0},"citationItems":[{"id":2193,"uris":["http://zotero.org/users/13901503/items/TK9QBJNS"],"itemData":{"id":2193,"type":"article-journal","abstract":"Altered intestinal microbiota is associated with systemic and intestinal diseases, such as inflammatory bowel disease (IBD). Dysbiotic microbiota with enhanced proinflammatory capacity is characterized by depletion of anaerobic commensals, increased proportion of facultatively anaerobic bacteria, as well as reduced diversity and stability. In this study, we developed a high-throughput in vitro screening assay to isolate intestinal commensal bacteria with anti-inflammatory capacity from a healthy fecal microbiota transplantation donor. Freshly isolated gut bacteria were screened for their capacity to attenuate Escherichia coli lipopolysaccharide (LPS)-induced interleukin 8 (IL-8) release from HT-29 cells. The screen yielded a number of Bacteroides and Parabacteroides isolates, which were identified as P. distasonis, B. caccae, B. intestinalis, B. uniformis, B. fragilis, B. vulgatus and B. ovatus using whole genome sequencing. We observed that a cell-cell contact with the epithelium was not necessary to alleviate in vitro inflammation as spent culture media from the isolates were also effective and the anti-inflammatory action did not correlate with the enterocyte adherence capacity of the isolates. The anti-inflammatory isolates also exerted enterocyte monolayer reinforcing action and lacked essential genes to synthetize hexa-acylated, proinflammatory lipid A, part of LPS. Yet, the anti-inflammatory effector molecules remain to be identified. The Bacteroides strains isolated and characterized in this study have potential to be used as so-called next-generation probiotics.","container-title":"Nutrients","DOI":"10.3390/nu12040935","ISSN":"2072-6643","issue":"4","language":"en","license":"http://creativecommons.org/licenses/by/3.0/","note":"number: 4\npublisher: Multidisciplinary Digital Publishing Institute","page":"935","source":"www-mdpi-com.proxy.lib.umich.edu","title":"Isolation of Anti-Inflammatory and Epithelium Reinforcing Bacteroides and Parabacteroides Spp. from A Healthy Fecal Donor","volume":"12","author":[{"family":"Hiippala","given":"Kaisa"},{"family":"Kainulainen","given":"Veera"},{"family":"Suutarinen","given":"Maiju"},{"family":"Heini","given":"Tuomas"},{"family":"Bowers","given":"Jolene R."},{"family":"Jasso-Selles","given":"Daniel"},{"family":"Lemmer","given":"Darrin"},{"family":"Valentine","given":"Michael"},{"family":"Barnes","given":"Riley"},{"family":"Engelthaler","given":"David M."},{"family":"Satokari","given":"Reetta"}],"issued":{"date-parts":[["2020",4]]}}},{"id":2197,"uris":["http://zotero.org/users/13901503/items/QJXBZMS7"],"itemData":{"id":2197,"type":"article-journal","abstract":"&lt;p&gt;&lt;italic&gt;Alistipes&lt;/italic&gt; is a relatively new genus of bacteria isolated primarily from medical clinical samples, although at a low rate compared to other genus members of the &lt;italic&gt;Bacteroidetes&lt;/italic&gt; phylum, which are highly relevant in dysbiosis and disease. According to the taxonomy database at The National Center for Biotechnology Information, the genus consists of 13 species: &lt;italic&gt;Alistipes finegoldii, Alistipes putredinis, Alistipes onderdonkii, Alistipes shahii, Alistipes indistinctus, Alistipes senegalensis, Alistipes timonensis, Alistipes obesi, Alistipes ihumii, Alistipes inops, Alistipes megaguti, Alistipes provencensis&lt;/italic&gt;, and &lt;italic&gt;Alistipes massiliensis. Alistipes communis&lt;/italic&gt; and &lt;italic&gt;A. dispar&lt;/italic&gt;, and the subspecies &lt;italic&gt;A. Onderdonkii&lt;/italic&gt; subspecies vulgaris (vs. &lt;italic&gt;onderdonkii&lt;/italic&gt; subsp.) are the newest strains featured outside that list. Although typically isolated from the human gut microbiome various species of this genus have been isolated from patients suffering from appendicitis, and abdominal and rectal abscess. It is possible that as &lt;italic&gt;Alistipes&lt;/italic&gt; spp. emerge, their identification in clinical samples may be underrepresented as novel MS-TOF methods may not be fully capable to discriminate distinct species as separate since it will require the upgrading of MS-TOF identification databases. In terms of pathogenicity, there is contrasting evidence indicating that &lt;italic&gt;Alistipes&lt;/italic&gt; may have protective effects against some diseases, including liver fibrosis, colitis, cancer immunotherapy, and cardiovascular disease. In contrast, other studies indicate &lt;italic&gt;Alistipes&lt;/italic&gt; is pathogenic in colorectal cancer and is associated with mental signs of depression. Gut dysbiosis seems to play a role in determining the compositional abundance of &lt;italic&gt;Alistipes&lt;/italic&gt; in the feces (&lt;italic&gt;e.g&lt;/italic&gt;., in non-alcoholic steatohepatitis, hepatic encephalopathy, and liver fibrosis). Since &lt;italic&gt;Alistipes&lt;/italic&gt; is a relatively recent sub-branch genus of the &lt;italic&gt;Bacteroidetes&lt;/italic&gt; phylum, and since &lt;italic&gt;Bacteroidetes&lt;/italic&gt; are commonly associated with chronic intestinal inflammation, this narrative review illustrates emerging immunological and mechanistic implications by which &lt;italic&gt;Alistipes&lt;/italic&gt; spp. correlate with human health.&lt;/p&gt;","container-title":"Frontiers in Immunology","DOI":"10.3389/fimmu.2020.00906","ISSN":"1664-3224","journalAbbreviation":"Front. Immunol.","language":"English","note":"publisher: Frontiers","source":"Frontiers","title":"The Genus Alistipes: Gut Bacteria With Emerging Implications to Inflammation, Cancer, and Mental Health","title-short":"The Genus Alistipes","URL":"https://www.frontiersin.org/journals/immunology/articles/10.3389/fimmu.2020.00906/full","volume":"11","author":[{"family":"Parker","given":"Bianca J."},{"family":"Wearsch","given":"Pamela A."},{"family":"Veloo","given":"Alida C. M."},{"family":"Rodriguez-Palacios","given":"Alex"}],"accessed":{"date-parts":[["2025",3,31]]},"issued":{"date-parts":[["2020",6,9]]}}}],"schema":"https://github.com/citation-style-language/schema/raw/master/csl-citation.json"} </w:instrText>
+        <w:instrText xml:space="preserve"> ADDIN ZOTERO_ITEM CSL_CITATION {"citationID":"wESsU6it","properties":{"formattedCitation":"({\\i{}84}, {\\i{}85})","plainCitation":"(84, 85)","noteIndex":0},"citationItems":[{"id":2193,"uris":["http://zotero.org/users/13901503/items/TK9QBJNS"],"itemData":{"id":2193,"type":"article-journal","abstract":"Altered intestinal microbiota is associated with systemic and intestinal diseases, such as inflammatory bowel disease (IBD). Dysbiotic microbiota with enhanced proinflammatory capacity is characterized by depletion of anaerobic commensals, increased proportion of facultatively anaerobic bacteria, as well as reduced diversity and stability. In this study, we developed a high-throughput in vitro screening assay to isolate intestinal commensal bacteria with anti-inflammatory capacity from a healthy fecal microbiota transplantation donor. Freshly isolated gut bacteria were screened for their capacity to attenuate Escherichia coli lipopolysaccharide (LPS)-induced interleukin 8 (IL-8) release from HT-29 cells. The screen yielded a number of Bacteroides and Parabacteroides isolates, which were identified as P. distasonis, B. caccae, B. intestinalis, B. uniformis, B. fragilis, B. vulgatus and B. ovatus using whole genome sequencing. We observed that a cell-cell contact with the epithelium was not necessary to alleviate in vitro inflammation as spent culture media from the isolates were also effective and the anti-inflammatory action did not correlate with the enterocyte adherence capacity of the isolates. The anti-inflammatory isolates also exerted enterocyte monolayer reinforcing action and lacked essential genes to synthetize hexa-acylated, proinflammatory lipid A, part of LPS. Yet, the anti-inflammatory effector molecules remain to be identified. The Bacteroides strains isolated and characterized in this study have potential to be used as so-called next-generation probiotics.","container-title":"Nutrients","DOI":"10.3390/nu12040935","ISSN":"2072-6643","issue":"4","language":"en","license":"http://creativecommons.org/licenses/by/3.0/","note":"number: 4\npublisher: Multidisciplinary Digital Publishing Institute","page":"935","source":"www-mdpi-com.proxy.lib.umich.edu","title":"Isolation of Anti-Inflammatory and Epithelium Reinforcing Bacteroides and Parabacteroides Spp. from A Healthy Fecal Donor","volume":"12","author":[{"family":"Hiippala","given":"Kaisa"},{"family":"Kainulainen","given":"Veera"},{"family":"Suutarinen","given":"Maiju"},{"family":"Heini","given":"Tuomas"},{"family":"Bowers","given":"Jolene R."},{"family":"Jasso-Selles","given":"Daniel"},{"family":"Lemmer","given":"Darrin"},{"family":"Valentine","given":"Michael"},{"family":"Barnes","given":"Riley"},{"family":"Engelthaler","given":"David M."},{"family":"Satokari","given":"Reetta"}],"issued":{"date-parts":[["2020",4]]}}},{"id":2197,"uris":["http://zotero.org/users/13901503/items/QJXBZMS7"],"itemData":{"id":2197,"type":"article-journal","abstract":"&lt;p&gt;&lt;italic&gt;Alistipes&lt;/italic&gt; is a relatively new genus of bacteria isolated primarily from medical clinical samples, although at a low rate compared to other genus members of the &lt;italic&gt;Bacteroidetes&lt;/italic&gt; phylum, which are highly relevant in dysbiosis and disease. According to the taxonomy database at The National Center for Biotechnology Information, the genus consists of 13 species: &lt;italic&gt;Alistipes finegoldii, Alistipes putredinis, Alistipes onderdonkii, Alistipes shahii, Alistipes indistinctus, Alistipes senegalensis, Alistipes timonensis, Alistipes obesi, Alistipes ihumii, Alistipes inops, Alistipes megaguti, Alistipes provencensis&lt;/italic&gt;, and &lt;italic&gt;Alistipes massiliensis. Alistipes communis&lt;/italic&gt; and &lt;italic&gt;A. dispar&lt;/italic&gt;, and the subspecies &lt;italic&gt;A. Onderdonkii&lt;/italic&gt; subspecies vulgaris (vs. &lt;italic&gt;onderdonkii&lt;/italic&gt; subsp.) are the newest strains featured outside that list. Although typically isolated from the human gut microbiome various species of this genus have been isolated from patients suffering from appendicitis, and abdominal and rectal abscess. It is possible that as &lt;italic&gt;Alistipes&lt;/italic&gt; spp. emerge, their identification in clinical samples may be underrepresented as novel MS-TOF methods may not be fully capable to discriminate distinct species as separate since it will require the upgrading of MS-TOF identification databases. In terms of pathogenicity, there is contrasting evidence indicating that &lt;italic&gt;Alistipes&lt;/italic&gt; may have protective effects against some diseases, including liver fibrosis, colitis, cancer immunotherapy, and cardiovascular disease. In contrast, other studies indicate &lt;italic&gt;Alistipes&lt;/italic&gt; is pathogenic in colorectal cancer and is associated with mental signs of depression. Gut dysbiosis seems to play a role in determining the compositional abundance of &lt;italic&gt;Alistipes&lt;/italic&gt; in the feces (&lt;italic&gt;e.g&lt;/italic&gt;., in non-alcoholic steatohepatitis, hepatic encephalopathy, and liver fibrosis). Since &lt;italic&gt;Alistipes&lt;/italic&gt; is a relatively recent sub-branch genus of the &lt;italic&gt;Bacteroidetes&lt;/italic&gt; phylum, and since &lt;italic&gt;Bacteroidetes&lt;/italic&gt; are commonly associated with chronic intestinal inflammation, this narrative review illustrates emerging immunological and mechanistic implications by which &lt;italic&gt;Alistipes&lt;/italic&gt; spp. correlate with human health.&lt;/p&gt;","container-title":"Frontiers in Immunology","DOI":"10.3389/fimmu.2020.00906","ISSN":"1664-3224","journalAbbreviation":"Front. Immunol.","language":"English","note":"publisher: Frontiers","source":"Frontiers","title":"The Genus Alistipes: Gut Bacteria With Emerging Implications to Inflammation, Cancer, and Mental Health","title-short":"The Genus Alistipes","URL":"https://www.frontiersin.org/journals/immunology/articles/10.3389/fimmu.2020.00906/full","volume":"11","author":[{"family":"Parker","given":"Bianca J."},{"family":"Wearsch","given":"Pamela A."},{"family":"Veloo","given":"Alida C. M."},{"family":"Rodriguez-Palacios","given":"Alex"}],"accessed":{"date-parts":[["2025",3,31]]},"issued":{"date-parts":[["2020",6,9]]}}}],"schema":"https://github.com/citation-style-language/schema/raw/master/csl-citation.json"} </w:instrText>
       </w:r>
       <w:r>
         <w:fldChar w:fldCharType="separate"/>
@@ -3229,7 +3349,7 @@
           <w:i/>
           <w:iCs/>
         </w:rPr>
-        <w:t>80</w:t>
+        <w:t>84</w:t>
       </w:r>
       <w:r>
         <w:t xml:space="preserve">, </w:t>
@@ -3239,7 +3359,7 @@
           <w:i/>
           <w:iCs/>
         </w:rPr>
-        <w:t>81</w:t>
+        <w:t>85</w:t>
       </w:r>
       <w:r>
         <w:t>)</w:t>
@@ -3328,7 +3448,7 @@
         <w:fldChar w:fldCharType="begin"/>
       </w:r>
       <w:r>
-        <w:instrText xml:space="preserve"> ADDIN ZOTERO_ITEM CSL_CITATION {"citationID":"nc5nFo7O","properties":{"formattedCitation":"({\\i{}82}, {\\i{}83})","plainCitation":"(82, 83)","noteIndex":0},"citationItems":[{"id":3715,"uris":["http://zotero.org/users/13901503/items/6SAKEANZ"],"itemData":{"id":3715,"type":"article-journal","abstract":"Summary The human gut microbiota ferments dietary non-digestible carbohydrates into short-chain fatty acids (SCFA). These microbial products are utilized by the host and propionate and butyrate in particular exert a range of health-promoting functions. Here an overview of the metabolic pathways utilized by gut microbes to produce these two SCFA from dietary carbohydrates and from amino acids resulting from protein breakdown is provided. This overview emphasizes the important role played by cross-feeding of intermediary metabolites (in particular lactate, succinate and 1,2-propanediol) between different gut bacteria. The ecophysiology, including growth requirements and responses to environmental factors, of major propionate and butyrate producing bacteria are discussed in relation to dietary modulation of these metabolites. A detailed understanding of SCFA metabolism by the gut microbiota is necessary to underpin effective strategies to optimize SCFA supply to the host.","container-title":"Environmental Microbiology","DOI":"10.1111/1462-2920.13589","ISSN":"1462-2912","issue":"1","note":"publisher: John Wiley &amp; Sons, Ltd","page":"29-41","source":"enviromicro-journals-onlinelibrary-wiley-com.proxy.lib.umich.edu (Atypon)","title":"Formation of propionate and butyrate by the human colonic microbiota","volume":"19","author":[{"family":"Louis","given":"Petra"},{"family":"Flint","given":"Harry J."}],"issued":{"date-parts":[["2017",1]]}}},{"id":2168,"uris":["http://zotero.org/users/13901503/items/8KEM2KE5"],"itemData":{"id":2168,"type":"article-journal","abstract":"Phascolarctobacterium can produce short‑chain fatty acids, including acetate and propionate, and can be associated with the metabolic state and mood of the host. The present study investigated the colonization characteristics of Phascolarctobacterium faecium in healthy individuals &lt;1-80 years old in Southern China. A total of 150 fresh fecal samples were collected, and bacterial DNA was isolated from these samples for quantitative polymerase chain reaction analysis. Phascolarctobacterium faecium demonstrated a high colonization rate and abundant colonization in the human gastrointestinal tract. The colonization rate varied between 43.33‑93.33%, and the abundance of Phascolarctobacterium faecium ranged between 3.22‑5.76 log cells g‑1 (&lt;1 years old) and 3.06‑9.33 log cells g‑1 (&gt;1 year old). The permillage of Phascolarctobacterium faecium in total bacteria ranged between 0.004‑1.479. There was presence of Phascolarctobacterium faecium‑like bacteria in younger individuals with a gradual increase in the number of bacteria maintained at a high level with increasing ages (between 1 and 60 years old), but with a decrease in elderly individuals (&gt;60 years old). The results of the present study demonstrated that Phascolarctobacterium faecium is abundantly colonized in the human gastrointestinal tract.","container-title":"Experimental and Therapeutic Medicine","DOI":"10.3892/etm.2017.4878","ISSN":"1792-0981, 1792-1015","issue":"4","language":"en","page":"3122-3126","source":"DOI.org (Crossref)","title":"Phascolarctobacterium faecium abundant colonization in human gastrointestinal tract","volume":"14","author":[{"family":"Wu","given":"Feifan"},{"family":"Guo","given":"Xianfeng"},{"family":"Zhang","given":"Jiachun"},{"family":"Zhang","given":"Min"},{"family":"Ou","given":"Zihao"},{"family":"Peng","given":"Yongzheng"}],"issued":{"date-parts":[["2017",10]]}},"label":"page"}],"schema":"https://github.com/citation-style-language/schema/raw/master/csl-citation.json"} </w:instrText>
+        <w:instrText xml:space="preserve"> ADDIN ZOTERO_ITEM CSL_CITATION {"citationID":"nc5nFo7O","properties":{"formattedCitation":"({\\i{}86}, {\\i{}87})","plainCitation":"(86, 87)","noteIndex":0},"citationItems":[{"id":3715,"uris":["http://zotero.org/users/13901503/items/6SAKEANZ"],"itemData":{"id":3715,"type":"article-journal","abstract":"Summary The human gut microbiota ferments dietary non-digestible carbohydrates into short-chain fatty acids (SCFA). These microbial products are utilized by the host and propionate and butyrate in particular exert a range of health-promoting functions. Here an overview of the metabolic pathways utilized by gut microbes to produce these two SCFA from dietary carbohydrates and from amino acids resulting from protein breakdown is provided. This overview emphasizes the important role played by cross-feeding of intermediary metabolites (in particular lactate, succinate and 1,2-propanediol) between different gut bacteria. The ecophysiology, including growth requirements and responses to environmental factors, of major propionate and butyrate producing bacteria are discussed in relation to dietary modulation of these metabolites. A detailed understanding of SCFA metabolism by the gut microbiota is necessary to underpin effective strategies to optimize SCFA supply to the host.","container-title":"Environmental Microbiology","DOI":"10.1111/1462-2920.13589","ISSN":"1462-2912","issue":"1","note":"publisher: John Wiley &amp; Sons, Ltd","page":"29-41","source":"enviromicro-journals-onlinelibrary-wiley-com.proxy.lib.umich.edu (Atypon)","title":"Formation of propionate and butyrate by the human colonic microbiota","volume":"19","author":[{"family":"Louis","given":"Petra"},{"family":"Flint","given":"Harry J."}],"issued":{"date-parts":[["2017",1]]}}},{"id":2168,"uris":["http://zotero.org/users/13901503/items/8KEM2KE5"],"itemData":{"id":2168,"type":"article-journal","abstract":"Phascolarctobacterium can produce short‑chain fatty acids, including acetate and propionate, and can be associated with the metabolic state and mood of the host. The present study investigated the colonization characteristics of Phascolarctobacterium faecium in healthy individuals &lt;1-80 years old in Southern China. A total of 150 fresh fecal samples were collected, and bacterial DNA was isolated from these samples for quantitative polymerase chain reaction analysis. Phascolarctobacterium faecium demonstrated a high colonization rate and abundant colonization in the human gastrointestinal tract. The colonization rate varied between 43.33‑93.33%, and the abundance of Phascolarctobacterium faecium ranged between 3.22‑5.76 log cells g‑1 (&lt;1 years old) and 3.06‑9.33 log cells g‑1 (&gt;1 year old). The permillage of Phascolarctobacterium faecium in total bacteria ranged between 0.004‑1.479. There was presence of Phascolarctobacterium faecium‑like bacteria in younger individuals with a gradual increase in the number of bacteria maintained at a high level with increasing ages (between 1 and 60 years old), but with a decrease in elderly individuals (&gt;60 years old). The results of the present study demonstrated that Phascolarctobacterium faecium is abundantly colonized in the human gastrointestinal tract.","container-title":"Experimental and Therapeutic Medicine","DOI":"10.3892/etm.2017.4878","ISSN":"1792-0981, 1792-1015","issue":"4","language":"en","page":"3122-3126","source":"DOI.org (Crossref)","title":"Phascolarctobacterium faecium abundant colonization in human gastrointestinal tract","volume":"14","author":[{"family":"Wu","given":"Feifan"},{"family":"Guo","given":"Xianfeng"},{"family":"Zhang","given":"Jiachun"},{"family":"Zhang","given":"Min"},{"family":"Ou","given":"Zihao"},{"family":"Peng","given":"Yongzheng"}],"issued":{"date-parts":[["2017",10]]}},"label":"page"}],"schema":"https://github.com/citation-style-language/schema/raw/master/csl-citation.json"} </w:instrText>
       </w:r>
       <w:r>
         <w:fldChar w:fldCharType="separate"/>
@@ -3341,7 +3461,7 @@
           <w:i/>
           <w:iCs/>
         </w:rPr>
-        <w:t>82</w:t>
+        <w:t>86</w:t>
       </w:r>
       <w:r>
         <w:t xml:space="preserve">, </w:t>
@@ -3351,7 +3471,7 @@
           <w:i/>
           <w:iCs/>
         </w:rPr>
-        <w:t>83</w:t>
+        <w:t>87</w:t>
       </w:r>
       <w:r>
         <w:t>)</w:t>
@@ -3412,7 +3532,7 @@
           <w:rStyle w:val="Strong"/>
           <w:rFonts w:eastAsiaTheme="majorEastAsia"/>
         </w:rPr>
-        <w:instrText xml:space="preserve"> ADDIN ZOTERO_ITEM CSL_CITATION {"citationID":"o9UAt3dv","properties":{"formattedCitation":"({\\i{}84})","plainCitation":"(84)","noteIndex":0},"citationItems":[{"id":3984,"uris":["http://zotero.org/users/13901503/items/PFZ9P5R3"],"itemData":{"id":3984,"type":"article-journal","abstract":"Helicobacter pylori (HP) is a facultative anaerobic bacterium. HP is a normal flora having immunomodulatingproperties. This bacterium is an example of a microorganism inducing gastric cancer. Itscarcinogenicity depends on bacteria-host related factors. The proper understanding of the biology of HPinducing gastric cancer offers the potential strategy in the managing of HP rather than eradicating it. Inthis article, we try to summarize the biology of HP-induced gastric cancer and discuss the currentpharmacological approach to treat and prevent its carcinogenicity.","container-title":"Frontiers in Oncology","DOI":"10.3389/fonc.2019.00075","ISSN":"2234-943X","journalAbbreviation":"Front. Oncol.","language":"English","note":"publisher: Frontiers","source":"Frontiers","title":"The Possible Role of Helicobacter pylori in Gastric Cancer and Its Management","URL":"https://www.frontiersin.org/journals/oncology/articles/10.3389/fonc.2019.00075/full","volume":"9","author":[{"family":"Alfarouk","given":"Khalid O."},{"family":"Bashir","given":"Adil H. H."},{"family":"Aljarbou","given":"Ahmed N."},{"family":"Ramadan","given":"AbdelRahman M."},{"family":"Muddathir","given":"Abdel Khalig"},{"family":"AlHoufie","given":"Sari T. S."},{"family":"Hifny","given":"Abdelhamid"},{"family":"Elhassan","given":"Gamal O."},{"family":"Ibrahim","given":"Muntaser E."},{"family":"Alqahtani","given":"Saad S."},{"family":"AlSharari","given":"Shakir D."},{"family":"Supuran","given":"Claudiu T."},{"family":"Rauch","given":"Cyril"},{"family":"Cardone","given":"Rosa Angela"},{"family":"Reshkin","given":"Stephan J."},{"family":"Fais","given":"Stefano"},{"family":"Harguindey","given":"Salvador"}],"accessed":{"date-parts":[["2025",7,2]]},"issued":{"date-parts":[["2019",2,22]]}}}],"schema":"https://github.com/citation-style-language/schema/raw/master/csl-citation.json"} </w:instrText>
+        <w:instrText xml:space="preserve"> ADDIN ZOTERO_ITEM CSL_CITATION {"citationID":"o9UAt3dv","properties":{"formattedCitation":"({\\i{}88})","plainCitation":"(88)","noteIndex":0},"citationItems":[{"id":3984,"uris":["http://zotero.org/users/13901503/items/PFZ9P5R3"],"itemData":{"id":3984,"type":"article-journal","abstract":"Helicobacter pylori (HP) is a facultative anaerobic bacterium. HP is a normal flora having immunomodulatingproperties. This bacterium is an example of a microorganism inducing gastric cancer. Itscarcinogenicity depends on bacteria-host related factors. The proper understanding of the biology of HPinducing gastric cancer offers the potential strategy in the managing of HP rather than eradicating it. Inthis article, we try to summarize the biology of HP-induced gastric cancer and discuss the currentpharmacological approach to treat and prevent its carcinogenicity.","container-title":"Frontiers in Oncology","DOI":"10.3389/fonc.2019.00075","ISSN":"2234-943X","journalAbbreviation":"Front. Oncol.","language":"English","note":"publisher: Frontiers","source":"Frontiers","title":"The Possible Role of Helicobacter pylori in Gastric Cancer and Its Management","URL":"https://www.frontiersin.org/journals/oncology/articles/10.3389/fonc.2019.00075/full","volume":"9","author":[{"family":"Alfarouk","given":"Khalid O."},{"family":"Bashir","given":"Adil H. H."},{"family":"Aljarbou","given":"Ahmed N."},{"family":"Ramadan","given":"AbdelRahman M."},{"family":"Muddathir","given":"Abdel Khalig"},{"family":"AlHoufie","given":"Sari T. S."},{"family":"Hifny","given":"Abdelhamid"},{"family":"Elhassan","given":"Gamal O."},{"family":"Ibrahim","given":"Muntaser E."},{"family":"Alqahtani","given":"Saad S."},{"family":"AlSharari","given":"Shakir D."},{"family":"Supuran","given":"Claudiu T."},{"family":"Rauch","given":"Cyril"},{"family":"Cardone","given":"Rosa Angela"},{"family":"Reshkin","given":"Stephan J."},{"family":"Fais","given":"Stefano"},{"family":"Harguindey","given":"Salvador"}],"accessed":{"date-parts":[["2025",7,2]]},"issued":{"date-parts":[["2019",2,22]]}}}],"schema":"https://github.com/citation-style-language/schema/raw/master/csl-citation.json"} </w:instrText>
       </w:r>
       <w:r>
         <w:rPr>
@@ -3431,7 +3551,7 @@
           <w:i/>
           <w:iCs/>
         </w:rPr>
-        <w:t>84</w:t>
+        <w:t>88</w:t>
       </w:r>
       <w:r>
         <w:t>)</w:t>
@@ -3467,13 +3587,19 @@
         <w:t xml:space="preserve"> </w:t>
       </w:r>
       <w:r>
-        <w:t xml:space="preserve">temperature and the abundance of individual metabolic pathways. The interaction model provided a better fit for 65 out of 116 pathways tested, accounting for at least 50% of the model weight in each case (Table 4S). To interpret the interaction effect, we plotted the relationship between abundance and temperature across two discrete ranges of neopterin values. These results indicated the same two effects as the taxonomic analysis (1) where slopes decreased at higher neopterin (Fig 5A-C) and (2) where slopes increased at higher neopterin (Fig 5D &amp; E). The pathways that exhibited decreasing slopes show three distinct patterns: one where a positive slope changed to negative, another where a positive slope became less positive, and one where a negative slope became steeper. This group included pathways involved in anti-inflammatory signaling, including synthesis of monounsaturated fatty acids </w:t>
+        <w:t>temperature and the abundance of individual metabolic pathways. The interaction model provided a better fit for 65 out of 116 pathways tested, accounting for at least 50% of the model weight in each case (Table 4S). To interpret the interaction effect, we plotted the relationship between abundance and temperature across two discrete ranges of neopterin values. These results indicated the same two effects as the taxonomic analysis (1) where slopes decreased at higher neopterin (Fig 5A-C) and (2) where slopes increased at higher neopterin (Fig 5D &amp; E). The pathways that exhibited decreasing slopes show</w:t>
+      </w:r>
+      <w:r>
+        <w:t>ed</w:t>
+      </w:r>
+      <w:r>
+        <w:t xml:space="preserve"> three distinct patterns: one where a positive slope changed to negative, another where a positive slope became less positive, and one where a negative slope became steeper. This group included pathways involved in anti-inflammatory signaling, including synthesis of monounsaturated fatty acids </w:t>
       </w:r>
       <w:r>
         <w:fldChar w:fldCharType="begin"/>
       </w:r>
       <w:r>
-        <w:instrText xml:space="preserve"> ADDIN ZOTERO_ITEM CSL_CITATION {"citationID":"Yyg97aqJ","properties":{"formattedCitation":"({\\i{}77})","plainCitation":"(77)","noteIndex":0},"citationItems":[{"id":3176,"uris":["http://zotero.org/users/13901503/items/HTMPX6GE"],"itemData":{"id":3176,"type":"article-journal","abstract":"Monocytes are a major population of circulating immune cells that play a crucial role in producing pro-inflammatory cytokines in the body. The actions of monocytes are known to be influenced by the combinations and concentrations of certain fatty acids (FAs) in blood and dietary fats. However, systemic comparisons of the effects of FAs on cytokine secretion by monocytes have not be performed. In this study, we compared how six saturated FAs (SFAs), two monounsaturated FAs (MUFAs), and seven polyunsaturated FAs (PUFAs) modulate human THP-1 monocyte secretion of TNF, IL-1β, and IL-6 in the absence or presence of lipopolysaccharide. SFAs generally stimulated resting THP-1 cells to secrete pro-inflammatory cytokines, with stearic acid being the most potent species. In contrast, MUFAs and PUFAs inhibited lipopolysaccharide-induced secretion of pro-inflammatory cytokines. Interestingly, the inhibitory potentials of MUFAs and PUFAs followed U-shaped (TNF and IL-1β) or inverted U-shaped (IL-6) dose–response curves. Among the MUFAs and PUFAs that were analyzed, docosahexaenoic acid (C22:6 n-3) exhibited the largest number of double bonds and was found to be the most potent anti-inflammatory compound. Together, our findings reveal that the chemical compositions and concentrations of dietary FAs are key factors in the intricate regulation of monocyte-mediated inflammation.","container-title":"Scientific Reports","DOI":"10.1038/s41598-023-32710-5","ISSN":"2045-2322","issue":"1","journalAbbreviation":"Sci Rep","language":"en","license":"2023 The Author(s)","note":"publisher: Nature Publishing Group","page":"5511","source":"www.nature.com","title":"Dietary fatty acids differentially affect secretion of pro-inflammatory cytokines in human THP-1 monocytes","volume":"13","author":[{"family":"Hung","given":"Hao-Chang"},{"family":"Tsai","given":"Sheng-Feng"},{"family":"Chou","given":"Hsuan-Wen"},{"family":"Tsai","given":"Ming-Jun"},{"family":"Hsu","given":"Pei-Ling"},{"family":"Kuo","given":"Yu-Min"}],"issued":{"date-parts":[["2023",4,4]]}}}],"schema":"https://github.com/citation-style-language/schema/raw/master/csl-citation.json"} </w:instrText>
+        <w:instrText xml:space="preserve"> ADDIN ZOTERO_ITEM CSL_CITATION {"citationID":"Yyg97aqJ","properties":{"formattedCitation":"({\\i{}81})","plainCitation":"(81)","noteIndex":0},"citationItems":[{"id":3176,"uris":["http://zotero.org/users/13901503/items/HTMPX6GE"],"itemData":{"id":3176,"type":"article-journal","abstract":"Monocytes are a major population of circulating immune cells that play a crucial role in producing pro-inflammatory cytokines in the body. The actions of monocytes are known to be influenced by the combinations and concentrations of certain fatty acids (FAs) in blood and dietary fats. However, systemic comparisons of the effects of FAs on cytokine secretion by monocytes have not be performed. In this study, we compared how six saturated FAs (SFAs), two monounsaturated FAs (MUFAs), and seven polyunsaturated FAs (PUFAs) modulate human THP-1 monocyte secretion of TNF, IL-1β, and IL-6 in the absence or presence of lipopolysaccharide. SFAs generally stimulated resting THP-1 cells to secrete pro-inflammatory cytokines, with stearic acid being the most potent species. In contrast, MUFAs and PUFAs inhibited lipopolysaccharide-induced secretion of pro-inflammatory cytokines. Interestingly, the inhibitory potentials of MUFAs and PUFAs followed U-shaped (TNF and IL-1β) or inverted U-shaped (IL-6) dose–response curves. Among the MUFAs and PUFAs that were analyzed, docosahexaenoic acid (C22:6 n-3) exhibited the largest number of double bonds and was found to be the most potent anti-inflammatory compound. Together, our findings reveal that the chemical compositions and concentrations of dietary FAs are key factors in the intricate regulation of monocyte-mediated inflammation.","container-title":"Scientific Reports","DOI":"10.1038/s41598-023-32710-5","ISSN":"2045-2322","issue":"1","journalAbbreviation":"Sci Rep","language":"en","license":"2023 The Author(s)","note":"publisher: Nature Publishing Group","page":"5511","source":"www.nature.com","title":"Dietary fatty acids differentially affect secretion of pro-inflammatory cytokines in human THP-1 monocytes","volume":"13","author":[{"family":"Hung","given":"Hao-Chang"},{"family":"Tsai","given":"Sheng-Feng"},{"family":"Chou","given":"Hsuan-Wen"},{"family":"Tsai","given":"Ming-Jun"},{"family":"Hsu","given":"Pei-Ling"},{"family":"Kuo","given":"Yu-Min"}],"issued":{"date-parts":[["2023",4,4]]}}}],"schema":"https://github.com/citation-style-language/schema/raw/master/csl-citation.json"} </w:instrText>
       </w:r>
       <w:r>
         <w:fldChar w:fldCharType="separate"/>
@@ -3486,7 +3612,7 @@
           <w:i/>
           <w:iCs/>
         </w:rPr>
-        <w:t>77</w:t>
+        <w:t>81</w:t>
       </w:r>
       <w:r>
         <w:t>)</w:t>
@@ -3529,7 +3655,7 @@
           <w:rStyle w:val="Strong"/>
           <w:rFonts w:eastAsiaTheme="majorEastAsia"/>
         </w:rPr>
-        <w:instrText xml:space="preserve"> ADDIN ZOTERO_ITEM CSL_CITATION {"citationID":"yCxgcM3a","properties":{"formattedCitation":"({\\i{}85})","plainCitation":"(85)","noteIndex":0},"citationItems":[{"id":3707,"uris":["http://zotero.org/users/13901503/items/DINXISI6"],"itemData":{"id":3707,"type":"article-journal","abstract":"The microorganisms that inhabit the human gastrointestinal tract comprise a complex ecosystem with functions that significantly contribute to our systemic metabolism and have an impact on health and disease. In line with its importance, the human gastrointestinal microbiota has been extensively studied. Despite the fact that a significant part of the intestinal microorganisms has not yet been cultured, presently over 1000 different microbial species that can reside in the human gastrointestinal tract have been identified. This review provides a systematic overview and detailed references of the total of 1057 intestinal species of Eukarya (92), Archaea (8) and Bacteria (957), based on the phylogenetic framework of their small subunit ribosomal RNA gene sequences. Moreover, it unifies knowledge about the prevalence, abundance, stability, physiology, genetics and the association with human health of these gastrointestinal microorganisms, which is currently scattered over a vast amount of literature published in the last 150 years. This detailed physiological and genetic information is expected to be instrumental in advancing our knowledge of the gastrointestinal microbiota. Moreover, it opens avenues for future comparative and functional metagenomic and other high-throughput approaches that need a systematic and physiological basis to have an impact.","container-title":"FEMS Microbiology Reviews","DOI":"10.1111/1574-6976.12075","ISSN":"0168-6445","issue":"5","journalAbbreviation":"FEMS Microbiology Reviews","page":"996-1047","source":"Silverchair","title":"The first 1000 cultured species of the human gastrointestinal microbiota","volume":"38","author":[{"family":"Rajilić-Stojanović","given":"Mirjana"},{"family":"Vos","given":"Willem M.","non-dropping-particle":"de"}],"issued":{"date-parts":[["2014",9,1]]}}}],"schema":"https://github.com/citation-style-language/schema/raw/master/csl-citation.json"} </w:instrText>
+        <w:instrText xml:space="preserve"> ADDIN ZOTERO_ITEM CSL_CITATION {"citationID":"yCxgcM3a","properties":{"formattedCitation":"({\\i{}89})","plainCitation":"(89)","noteIndex":0},"citationItems":[{"id":3707,"uris":["http://zotero.org/users/13901503/items/DINXISI6"],"itemData":{"id":3707,"type":"article-journal","abstract":"The microorganisms that inhabit the human gastrointestinal tract comprise a complex ecosystem with functions that significantly contribute to our systemic metabolism and have an impact on health and disease. In line with its importance, the human gastrointestinal microbiota has been extensively studied. Despite the fact that a significant part of the intestinal microorganisms has not yet been cultured, presently over 1000 different microbial species that can reside in the human gastrointestinal tract have been identified. This review provides a systematic overview and detailed references of the total of 1057 intestinal species of Eukarya (92), Archaea (8) and Bacteria (957), based on the phylogenetic framework of their small subunit ribosomal RNA gene sequences. Moreover, it unifies knowledge about the prevalence, abundance, stability, physiology, genetics and the association with human health of these gastrointestinal microorganisms, which is currently scattered over a vast amount of literature published in the last 150 years. This detailed physiological and genetic information is expected to be instrumental in advancing our knowledge of the gastrointestinal microbiota. Moreover, it opens avenues for future comparative and functional metagenomic and other high-throughput approaches that need a systematic and physiological basis to have an impact.","container-title":"FEMS Microbiology Reviews","DOI":"10.1111/1574-6976.12075","ISSN":"0168-6445","issue":"5","journalAbbreviation":"FEMS Microbiology Reviews","page":"996-1047","source":"Silverchair","title":"The first 1000 cultured species of the human gastrointestinal microbiota","volume":"38","author":[{"family":"Rajilić-Stojanović","given":"Mirjana"},{"family":"Vos","given":"Willem M.","non-dropping-particle":"de"}],"issued":{"date-parts":[["2014",9,1]]}}}],"schema":"https://github.com/citation-style-language/schema/raw/master/csl-citation.json"} </w:instrText>
       </w:r>
       <w:r>
         <w:rPr>
@@ -3548,7 +3674,7 @@
           <w:i/>
           <w:iCs/>
         </w:rPr>
-        <w:t>85</w:t>
+        <w:t>89</w:t>
       </w:r>
       <w:r>
         <w:t>)</w:t>
@@ -3575,7 +3701,7 @@
         <w:fldChar w:fldCharType="begin"/>
       </w:r>
       <w:r>
-        <w:instrText xml:space="preserve"> ADDIN ZOTERO_ITEM CSL_CITATION {"citationID":"MREWhKrM","properties":{"formattedCitation":"({\\i{}86})","plainCitation":"(86)","noteIndex":0},"citationItems":[{"id":3666,"uris":["http://zotero.org/users/13901503/items/787C6UND"],"itemData":{"id":3666,"type":"article-journal","abstract":"&lt;p&gt;The glyoxylate shunt (GS) is a two-step metabolic pathway (isocitrate lyase, &lt;i&gt;aceA&lt;/i&gt;; and malate synthase, &lt;i&gt;glcB&lt;/i&gt;) that serves as an alternative to the tricarboxylic acid cycle. The GS bypasses the carbon dioxide-producing steps of the tricarboxylic acid cycle and is essential for acetate and fatty acid metabolism in bacteria. GS can be up-regulated under conditions of oxidative stress, antibiotic stress, and host infection, which implies that it plays important but poorly explored roles in stress defense and pathogenesis. In many bacterial species, including &lt;i&gt;Pseudomonas aeruginosa&lt;/i&gt;, &lt;i&gt;aceA&lt;/i&gt; and &lt;i&gt;glcB&lt;/i&gt; are not in an operon, unlike in &lt;i&gt;Escherichia coli&lt;/i&gt;. In &lt;i&gt;P. aeruginosa&lt;/i&gt;, we explored relationships between GS genes and growth, transcription profiles, and biofilm formation. Contrary to our expectations, deletion of &lt;i&gt;aceA&lt;/i&gt; in &lt;i&gt;P. aeruginosa&lt;/i&gt; improved cell growth under conditions of oxidative and antibiotic stress. Transcriptome data suggested that &lt;i&gt;aceA&lt;/i&gt; mutants underwent a metabolic shift toward aerobic denitrification; this was supported by additional evidence, including up-regulation of denitrification-related genes, decreased oxygen consumption without lowering ATP yield, increased production of denitrification intermediates (NO and N&lt;sub&gt;2&lt;/sub&gt;O), and increased cyanide resistance. The &lt;i&gt;aceA&lt;/i&gt; mutants also produced a thicker exopolysaccharide layer; that is, a phenotype consistent with aerobic denitrification. A bioinformatic survey across known bacterial genomes showed that only microorganisms capable of aerobic metabolism possess the glyoxylate shunt. This trend is consistent with the hypothesis that the GS plays a previously unrecognized role in allowing bacteria to tolerate oxidative stress.&lt;/p&gt;","container-title":"Journal of Biological Chemistry","DOI":"10.1074/jbc.M115.708149","ISSN":"0021-9258, 1083-351X","issue":"22","journalAbbreviation":"Journal of Biological Chemistry","language":"English","note":"publisher: Elsevier","page":"11928-11938","source":"www-jbc-org.proxy.lib.umich.edu","title":"Role of Glyoxylate Shunt in Oxidative Stress Response","volume":"291","author":[{"family":"Ahn","given":"Sungeun"},{"family":"Jung","given":"Jaejoon"},{"family":"Jang","given":"In-Ae"},{"family":"Madsen","given":"Eugene L."},{"family":"Park","given":"Woojun"}],"issued":{"date-parts":[["2016",5,27]]}}}],"schema":"https://github.com/citation-style-language/schema/raw/master/csl-citation.json"} </w:instrText>
+        <w:instrText xml:space="preserve"> ADDIN ZOTERO_ITEM CSL_CITATION {"citationID":"MREWhKrM","properties":{"formattedCitation":"({\\i{}90})","plainCitation":"(90)","noteIndex":0},"citationItems":[{"id":3666,"uris":["http://zotero.org/users/13901503/items/787C6UND"],"itemData":{"id":3666,"type":"article-journal","abstract":"&lt;p&gt;The glyoxylate shunt (GS) is a two-step metabolic pathway (isocitrate lyase, &lt;i&gt;aceA&lt;/i&gt;; and malate synthase, &lt;i&gt;glcB&lt;/i&gt;) that serves as an alternative to the tricarboxylic acid cycle. The GS bypasses the carbon dioxide-producing steps of the tricarboxylic acid cycle and is essential for acetate and fatty acid metabolism in bacteria. GS can be up-regulated under conditions of oxidative stress, antibiotic stress, and host infection, which implies that it plays important but poorly explored roles in stress defense and pathogenesis. In many bacterial species, including &lt;i&gt;Pseudomonas aeruginosa&lt;/i&gt;, &lt;i&gt;aceA&lt;/i&gt; and &lt;i&gt;glcB&lt;/i&gt; are not in an operon, unlike in &lt;i&gt;Escherichia coli&lt;/i&gt;. In &lt;i&gt;P. aeruginosa&lt;/i&gt;, we explored relationships between GS genes and growth, transcription profiles, and biofilm formation. Contrary to our expectations, deletion of &lt;i&gt;aceA&lt;/i&gt; in &lt;i&gt;P. aeruginosa&lt;/i&gt; improved cell growth under conditions of oxidative and antibiotic stress. Transcriptome data suggested that &lt;i&gt;aceA&lt;/i&gt; mutants underwent a metabolic shift toward aerobic denitrification; this was supported by additional evidence, including up-regulation of denitrification-related genes, decreased oxygen consumption without lowering ATP yield, increased production of denitrification intermediates (NO and N&lt;sub&gt;2&lt;/sub&gt;O), and increased cyanide resistance. The &lt;i&gt;aceA&lt;/i&gt; mutants also produced a thicker exopolysaccharide layer; that is, a phenotype consistent with aerobic denitrification. A bioinformatic survey across known bacterial genomes showed that only microorganisms capable of aerobic metabolism possess the glyoxylate shunt. This trend is consistent with the hypothesis that the GS plays a previously unrecognized role in allowing bacteria to tolerate oxidative stress.&lt;/p&gt;","container-title":"Journal of Biological Chemistry","DOI":"10.1074/jbc.M115.708149","ISSN":"0021-9258, 1083-351X","issue":"22","journalAbbreviation":"Journal of Biological Chemistry","language":"English","note":"publisher: Elsevier","page":"11928-11938","source":"www-jbc-org.proxy.lib.umich.edu","title":"Role of Glyoxylate Shunt in Oxidative Stress Response","volume":"291","author":[{"family":"Ahn","given":"Sungeun"},{"family":"Jung","given":"Jaejoon"},{"family":"Jang","given":"In-Ae"},{"family":"Madsen","given":"Eugene L."},{"family":"Park","given":"Woojun"}],"issued":{"date-parts":[["2016",5,27]]}}}],"schema":"https://github.com/citation-style-language/schema/raw/master/csl-citation.json"} </w:instrText>
       </w:r>
       <w:r>
         <w:fldChar w:fldCharType="separate"/>
@@ -3588,7 +3714,7 @@
           <w:i/>
           <w:iCs/>
         </w:rPr>
-        <w:t>86</w:t>
+        <w:t>90</w:t>
       </w:r>
       <w:r>
         <w:t>)</w:t>
@@ -3609,7 +3735,7 @@
         <w:fldChar w:fldCharType="begin"/>
       </w:r>
       <w:r>
-        <w:instrText xml:space="preserve"> ADDIN ZOTERO_ITEM CSL_CITATION {"citationID":"8lsfxZT8","properties":{"formattedCitation":"({\\i{}87})","plainCitation":"(87)","noteIndex":0},"citationItems":[{"id":3661,"uris":["http://zotero.org/users/13901503/items/7EH7QSRX"],"itemData":{"id":3661,"type":"article-journal","abstract":"Rubisco is the predominant enzymatic mechanism in the biosphere by which autotrophic bacteria, algae, and terrestrial plants fix CO2 into organic biomass via the Calvin–Benson–Basham reductive pentose phosphate pathway. Rubisco is not a perfect catalyst, suffering from low turnover rates, a low affinity for its CO2 substrate, and a competitive inhibition by O2 as an alternative substrate. As a consequence of changing environmental conditions over the past 3.5 billion years, with decreasing CO2 and increasing O2 in the atmosphere, Rubisco has evolved into multiple enzymatic forms with a range of kinetic properties, as well as co-evolving with CO2-concentrating mechanisms to cope with the different environmental contexts in which it must operate. The most dramatic evidence of this is the occurrence of multiple forms of Rubisco within autotrophic proteobacteria, where Forms II, IC, IBc, IAc, and IAq can be found either singly or in multiple combinations within a particular bacterial genome. Over the past few years there has been increasing availability of genomic sequence data for bacteria and this has allowed us to gain more extensive insights into the functional significance of this diversification. This paper is focused on summarizing what is known about the diversity of Rubisco forms, their kinetic properties, development of bacterial CO2-concentrating mechanisms, and correlations with metabolic flexibility and inorganic carbon environments in which proteobacteria perform various types of obligate and facultative chemo- and photoautotrophic CO2 fixation.","container-title":"Journal of Experimental Botany","DOI":"10.1093/jxb/erm297","ISSN":"0022-0957","issue":"7","journalAbbreviation":"Journal of Experimental Botany","page":"1525-1541","source":"Silverchair","title":"Multiple Rubisco forms in proteobacteria: their functional significance in relation to CO2 acquisition by the CBB cycle","title-short":"Multiple Rubisco forms in proteobacteria","volume":"59","author":[{"family":"Badger","given":"Murray Ronald"},{"family":"Bek","given":"Emily Jane"}],"issued":{"date-parts":[["2008",5,1]]}}}],"schema":"https://github.com/citation-style-language/schema/raw/master/csl-citation.json"} </w:instrText>
+        <w:instrText xml:space="preserve"> ADDIN ZOTERO_ITEM CSL_CITATION {"citationID":"8lsfxZT8","properties":{"formattedCitation":"({\\i{}91})","plainCitation":"(91)","noteIndex":0},"citationItems":[{"id":3661,"uris":["http://zotero.org/users/13901503/items/7EH7QSRX"],"itemData":{"id":3661,"type":"article-journal","abstract":"Rubisco is the predominant enzymatic mechanism in the biosphere by which autotrophic bacteria, algae, and terrestrial plants fix CO2 into organic biomass via the Calvin–Benson–Basham reductive pentose phosphate pathway. Rubisco is not a perfect catalyst, suffering from low turnover rates, a low affinity for its CO2 substrate, and a competitive inhibition by O2 as an alternative substrate. As a consequence of changing environmental conditions over the past 3.5 billion years, with decreasing CO2 and increasing O2 in the atmosphere, Rubisco has evolved into multiple enzymatic forms with a range of kinetic properties, as well as co-evolving with CO2-concentrating mechanisms to cope with the different environmental contexts in which it must operate. The most dramatic evidence of this is the occurrence of multiple forms of Rubisco within autotrophic proteobacteria, where Forms II, IC, IBc, IAc, and IAq can be found either singly or in multiple combinations within a particular bacterial genome. Over the past few years there has been increasing availability of genomic sequence data for bacteria and this has allowed us to gain more extensive insights into the functional significance of this diversification. This paper is focused on summarizing what is known about the diversity of Rubisco forms, their kinetic properties, development of bacterial CO2-concentrating mechanisms, and correlations with metabolic flexibility and inorganic carbon environments in which proteobacteria perform various types of obligate and facultative chemo- and photoautotrophic CO2 fixation.","container-title":"Journal of Experimental Botany","DOI":"10.1093/jxb/erm297","ISSN":"0022-0957","issue":"7","journalAbbreviation":"Journal of Experimental Botany","page":"1525-1541","source":"Silverchair","title":"Multiple Rubisco forms in proteobacteria: their functional significance in relation to CO2 acquisition by the CBB cycle","title-short":"Multiple Rubisco forms in proteobacteria","volume":"59","author":[{"family":"Badger","given":"Murray Ronald"},{"family":"Bek","given":"Emily Jane"}],"issued":{"date-parts":[["2008",5,1]]}}}],"schema":"https://github.com/citation-style-language/schema/raw/master/csl-citation.json"} </w:instrText>
       </w:r>
       <w:r>
         <w:fldChar w:fldCharType="separate"/>
@@ -3622,7 +3748,7 @@
           <w:i/>
           <w:iCs/>
         </w:rPr>
-        <w:t>87</w:t>
+        <w:t>91</w:t>
       </w:r>
       <w:r>
         <w:t>)</w:t>
@@ -3637,7 +3763,7 @@
         <w:fldChar w:fldCharType="begin"/>
       </w:r>
       <w:r>
-        <w:instrText xml:space="preserve"> ADDIN ZOTERO_ITEM CSL_CITATION {"citationID":"hub5pdYU","properties":{"formattedCitation":"({\\i{}88})","plainCitation":"(88)","noteIndex":0},"citationItems":[{"id":3665,"uris":["http://zotero.org/users/13901503/items/NVUGIX64"],"itemData":{"id":3665,"type":"article-journal","container-title":"Microbiology","DOI":"10.1099/mic.0.2007/006098-0","ISSN":"1350-0872, 1465-2080","issue":"6","language":"en","page":"1974-1980","source":"DOI.org (Crossref)","title":"Changes in the redox state and composition of the quinone pool of Escherichia coli during aerobic batch-culture growth","volume":"153","author":[{"family":"Bekker","given":"M"},{"family":"Kramer","given":"G"},{"family":"Hartog","given":"A. F"},{"family":"Wagner","given":"M. J"},{"family":"De Koster","given":"C. G"},{"family":"Hellingwerf","given":"K. J"},{"family":"Teixeira De Mattos","given":"M. J"}],"issued":{"date-parts":[["2007",6,1]]}}}],"schema":"https://github.com/citation-style-language/schema/raw/master/csl-citation.json"} </w:instrText>
+        <w:instrText xml:space="preserve"> ADDIN ZOTERO_ITEM CSL_CITATION {"citationID":"hub5pdYU","properties":{"formattedCitation":"({\\i{}92})","plainCitation":"(92)","noteIndex":0},"citationItems":[{"id":3665,"uris":["http://zotero.org/users/13901503/items/NVUGIX64"],"itemData":{"id":3665,"type":"article-journal","container-title":"Microbiology","DOI":"10.1099/mic.0.2007/006098-0","ISSN":"1350-0872, 1465-2080","issue":"6","language":"en","page":"1974-1980","source":"DOI.org (Crossref)","title":"Changes in the redox state and composition of the quinone pool of Escherichia coli during aerobic batch-culture growth","volume":"153","author":[{"family":"Bekker","given":"M"},{"family":"Kramer","given":"G"},{"family":"Hartog","given":"A. F"},{"family":"Wagner","given":"M. J"},{"family":"De Koster","given":"C. G"},{"family":"Hellingwerf","given":"K. J"},{"family":"Teixeira De Mattos","given":"M. J"}],"issued":{"date-parts":[["2007",6,1]]}}}],"schema":"https://github.com/citation-style-language/schema/raw/master/csl-citation.json"} </w:instrText>
       </w:r>
       <w:r>
         <w:fldChar w:fldCharType="separate"/>
@@ -3650,7 +3776,7 @@
           <w:i/>
           <w:iCs/>
         </w:rPr>
-        <w:t>88</w:t>
+        <w:t>92</w:t>
       </w:r>
       <w:r>
         <w:t>)</w:t>
@@ -3671,7 +3797,7 @@
         <w:fldChar w:fldCharType="begin"/>
       </w:r>
       <w:r>
-        <w:instrText xml:space="preserve"> ADDIN ZOTERO_ITEM CSL_CITATION {"citationID":"FvN60f2B","properties":{"formattedCitation":"({\\i{}89})","plainCitation":"(89)","noteIndex":0},"citationItems":[{"id":3712,"uris":["http://zotero.org/users/13901503/items/S8VNSY7N"],"itemData":{"id":3712,"type":"article-journal","abstract":"Enterobacterial common antigen (ECA) is a family-specific surface antigen shared by all members of the Enterobacteriaceae and is restricted to this family. It is found in freshly isolated wild-type strains as well as in laboratory strains like Escherichia coli K-12. The family specificity of ECA can be used for taxonomic and diagnostic purposes. ECA is located in the outer leaflet of the outer membrane. It is a glycophospholipid built up by an aminosugar heteropolymer linked to an l-glycerophosphatidyl residue. In a few rough mutants, in addition, the sugar chain can be bound to the complete lipopolysaccharide (LPS) core. Recently, for Shigella sonnei a lipid-free cyclic form of ECA was reported. The genetical determination of ECA is closely related to that of lipopolysaccharide. For biosynthesis of ECA and LPS partly the same sugar precursors and the same carrier lipid is used.","container-title":"FEMS Microbiology Reviews","DOI":"10.1111/j.1574-6968.1988.tb02743.x","ISSN":"0168-6445","issue":"3","journalAbbreviation":"FEMS Microbiology Reviews","page":"195-222","source":"Silverchair","title":"ECA, the enterobacterial common antigen*","volume":"4","author":[{"family":"Kuhn","given":"Hella-Monika"},{"family":"Meier-Dieter","given":"Ursula"},{"family":"Mayer","given":"Hubert"}],"issued":{"date-parts":[["1988",9,1]]}}}],"schema":"https://github.com/citation-style-language/schema/raw/master/csl-citation.json"} </w:instrText>
+        <w:instrText xml:space="preserve"> ADDIN ZOTERO_ITEM CSL_CITATION {"citationID":"FvN60f2B","properties":{"formattedCitation":"({\\i{}93})","plainCitation":"(93)","noteIndex":0},"citationItems":[{"id":3712,"uris":["http://zotero.org/users/13901503/items/S8VNSY7N"],"itemData":{"id":3712,"type":"article-journal","abstract":"Enterobacterial common antigen (ECA) is a family-specific surface antigen shared by all members of the Enterobacteriaceae and is restricted to this family. It is found in freshly isolated wild-type strains as well as in laboratory strains like Escherichia coli K-12. The family specificity of ECA can be used for taxonomic and diagnostic purposes. ECA is located in the outer leaflet of the outer membrane. It is a glycophospholipid built up by an aminosugar heteropolymer linked to an l-glycerophosphatidyl residue. In a few rough mutants, in addition, the sugar chain can be bound to the complete lipopolysaccharide (LPS) core. Recently, for Shigella sonnei a lipid-free cyclic form of ECA was reported. The genetical determination of ECA is closely related to that of lipopolysaccharide. For biosynthesis of ECA and LPS partly the same sugar precursors and the same carrier lipid is used.","container-title":"FEMS Microbiology Reviews","DOI":"10.1111/j.1574-6968.1988.tb02743.x","ISSN":"0168-6445","issue":"3","journalAbbreviation":"FEMS Microbiology Reviews","page":"195-222","source":"Silverchair","title":"ECA, the enterobacterial common antigen*","volume":"4","author":[{"family":"Kuhn","given":"Hella-Monika"},{"family":"Meier-Dieter","given":"Ursula"},{"family":"Mayer","given":"Hubert"}],"issued":{"date-parts":[["1988",9,1]]}}}],"schema":"https://github.com/citation-style-language/schema/raw/master/csl-citation.json"} </w:instrText>
       </w:r>
       <w:r>
         <w:fldChar w:fldCharType="separate"/>
@@ -3684,7 +3810,7 @@
           <w:i/>
           <w:iCs/>
         </w:rPr>
-        <w:t>89</w:t>
+        <w:t>93</w:t>
       </w:r>
       <w:r>
         <w:t>)</w:t>
@@ -3699,7 +3825,7 @@
         <w:fldChar w:fldCharType="begin"/>
       </w:r>
       <w:r>
-        <w:instrText xml:space="preserve"> ADDIN ZOTERO_ITEM CSL_CITATION {"citationID":"XLDjRCPa","properties":{"formattedCitation":"({\\i{}90})","plainCitation":"(90)","noteIndex":0},"citationItems":[{"id":3710,"uris":["http://zotero.org/users/13901503/items/7XBTXUWV"],"itemData":{"id":3710,"type":"article-journal","abstract":"Bacterial lipopolysaccharides (LPS) typically consist of a hydrophobic domain known as lipid A (or endotoxin), a nonrepeating “core” oligosaccharide, and a distal polysaccharide (or O-antigen). Recent genomic data have facilitated study of LPS assembly in diverse Gram-negative bacteria, many of which are human or plant pathogens, and have established the importance of lateral gene transfer in generating structural diversity of O-antigens. Many enzymes of lipid A biosynthesis like LpxC have been validated as targets for development of new antibiotics. Key genes for lipid A biosynthesis have unexpectedly also been found in higher plants, indicating that eukaryotic lipid A-like molecules may exist. Most significant has been the identification of the plasma membrane protein TLR4 as the lipid A signaling receptor of animal cells. TLR4 belongs to a family of innate immunity receptors that possess a large extracellular domain of leucine-rich repeats, a single trans-membrane segment, and a smaller cytoplasmic signaling region that engages the adaptor protein MyD88. The expanding knowledge of TLR4 specificity and its downstream signaling pathways should provide new opportunities for blocking inflammation associated with infection.","container-title":"Annual Review of Biochemistry","DOI":"10.1146/annurev.biochem.71.110601.135414","ISSN":"0066-4154","issue":"1","journalAbbreviation":"Annual Review of Biochemistry","language":"eng","note":"publisher: Annual Reviews Inc.","page":"635","source":"EBSCOhost","title":"Lipopolysaccharide endotoxins","volume":"71","author":[{"family":"Raetz","given":"Christian R. H."},{"family":"Whitfield","given":"Chris"}],"issued":{"date-parts":[["2002",7,1]]}}}],"schema":"https://github.com/citation-style-language/schema/raw/master/csl-citation.json"} </w:instrText>
+        <w:instrText xml:space="preserve"> ADDIN ZOTERO_ITEM CSL_CITATION {"citationID":"XLDjRCPa","properties":{"formattedCitation":"({\\i{}94})","plainCitation":"(94)","noteIndex":0},"citationItems":[{"id":3710,"uris":["http://zotero.org/users/13901503/items/7XBTXUWV"],"itemData":{"id":3710,"type":"article-journal","abstract":"Bacterial lipopolysaccharides (LPS) typically consist of a hydrophobic domain known as lipid A (or endotoxin), a nonrepeating “core” oligosaccharide, and a distal polysaccharide (or O-antigen). Recent genomic data have facilitated study of LPS assembly in diverse Gram-negative bacteria, many of which are human or plant pathogens, and have established the importance of lateral gene transfer in generating structural diversity of O-antigens. Many enzymes of lipid A biosynthesis like LpxC have been validated as targets for development of new antibiotics. Key genes for lipid A biosynthesis have unexpectedly also been found in higher plants, indicating that eukaryotic lipid A-like molecules may exist. Most significant has been the identification of the plasma membrane protein TLR4 as the lipid A signaling receptor of animal cells. TLR4 belongs to a family of innate immunity receptors that possess a large extracellular domain of leucine-rich repeats, a single trans-membrane segment, and a smaller cytoplasmic signaling region that engages the adaptor protein MyD88. The expanding knowledge of TLR4 specificity and its downstream signaling pathways should provide new opportunities for blocking inflammation associated with infection.","container-title":"Annual Review of Biochemistry","DOI":"10.1146/annurev.biochem.71.110601.135414","ISSN":"0066-4154","issue":"1","journalAbbreviation":"Annual Review of Biochemistry","language":"eng","note":"publisher: Annual Reviews Inc.","page":"635","source":"EBSCOhost","title":"Lipopolysaccharide endotoxins","volume":"71","author":[{"family":"Raetz","given":"Christian R. H."},{"family":"Whitfield","given":"Chris"}],"issued":{"date-parts":[["2002",7,1]]}}}],"schema":"https://github.com/citation-style-language/schema/raw/master/csl-citation.json"} </w:instrText>
       </w:r>
       <w:r>
         <w:fldChar w:fldCharType="separate"/>
@@ -3712,7 +3838,7 @@
           <w:i/>
           <w:iCs/>
         </w:rPr>
-        <w:t>90</w:t>
+        <w:t>94</w:t>
       </w:r>
       <w:r>
         <w:t>)</w:t>
@@ -3801,7 +3927,7 @@
         <w:fldChar w:fldCharType="begin"/>
       </w:r>
       <w:r>
-        <w:instrText xml:space="preserve"> ADDIN ZOTERO_ITEM CSL_CITATION {"citationID":"ie0Y7lhz","properties":{"formattedCitation":"({\\i{}91})","plainCitation":"(91)","noteIndex":0},"citationItems":[{"id":3239,"uris":["http://zotero.org/users/13901503/items/F8CEHMIS"],"itemData":{"id":3239,"type":"article-journal","abstract":"Accumulating evidence has suggested that NAD (including NAD؉ and NADH) and NADP (including NADP؉ and NADPH) could belong to the fundamental common mediators of various biological processes, including energy metabolism, mitochondrial functions, calcium homeostasis, antioxidation/generation of oxidative stress, gene expression, immunological functions, aging, and cell death: First, it is established that NAD mediates energy metabolism and mitochondrial functions; second, NADPH is a key component in cellular antioxidation systems; and NADH-dependent reactive oxygen species (ROS) generation from mitochondria and NADPH oxidase-dependent ROS generation are two critical mechanisms of ROS generation; third, cyclic ADP-ribose and several other molecules that are generated from NAD and NADP could mediate calcium homeostasis; fourth, NAD and NADP modulate multiple key factors in cell death, such as mitochondrial permeability transition, energy state, poly(ADP-ribose) polymerase-1, and apoptosis-inducing factor; and fifth, NAD and NADP profoundly affect aging-influencing factors such as oxidative stress and mitochondrial activities, and NADdependent sirtuins also mediate the aging process. Moreover, many recent studies have suggested novel paradigms of NAD and NADP metabolism. Future investigation into the metabolism and biological functions of NAD and NADP may expose fundamental properties of life, and suggest new strategies for treating diseases and slowing the aging process. Antioxid. Redox Signal. 10, 179–206.","container-title":"Antioxidants &amp; Redox Signaling","DOI":"10.1089/ars.2007.1672","ISSN":"1523-0864, 1557-7716","issue":"2","journalAbbreviation":"Antioxidants &amp; Redox Signaling","language":"en","page":"179-206","source":"DOI.org (Crossref)","title":"NAD&lt;sup&gt;+&lt;/sup&gt; /NADH and NADP&lt;sup&gt;+&lt;/sup&gt; /NADPH in Cellular Functions and Cell Death: Regulation and Biological Consequences","title-short":"NAD&lt;sup&gt;+&lt;/sup&gt; /NADH and NADP&lt;sup&gt;+&lt;/sup&gt; /NADPH in Cellular Functions and Cell Death","volume":"10","author":[{"family":"Ying","given":"Weihai"}],"issued":{"date-parts":[["2008",2]]}}}],"schema":"https://github.com/citation-style-language/schema/raw/master/csl-citation.json"} </w:instrText>
+        <w:instrText xml:space="preserve"> ADDIN ZOTERO_ITEM CSL_CITATION {"citationID":"ie0Y7lhz","properties":{"formattedCitation":"({\\i{}71})","plainCitation":"(71)","noteIndex":0},"citationItems":[{"id":3239,"uris":["http://zotero.org/users/13901503/items/F8CEHMIS"],"itemData":{"id":3239,"type":"article-journal","abstract":"Accumulating evidence has suggested that NAD (including NAD؉ and NADH) and NADP (including NADP؉ and NADPH) could belong to the fundamental common mediators of various biological processes, including energy metabolism, mitochondrial functions, calcium homeostasis, antioxidation/generation of oxidative stress, gene expression, immunological functions, aging, and cell death: First, it is established that NAD mediates energy metabolism and mitochondrial functions; second, NADPH is a key component in cellular antioxidation systems; and NADH-dependent reactive oxygen species (ROS) generation from mitochondria and NADPH oxidase-dependent ROS generation are two critical mechanisms of ROS generation; third, cyclic ADP-ribose and several other molecules that are generated from NAD and NADP could mediate calcium homeostasis; fourth, NAD and NADP modulate multiple key factors in cell death, such as mitochondrial permeability transition, energy state, poly(ADP-ribose) polymerase-1, and apoptosis-inducing factor; and fifth, NAD and NADP profoundly affect aging-influencing factors such as oxidative stress and mitochondrial activities, and NADdependent sirtuins also mediate the aging process. Moreover, many recent studies have suggested novel paradigms of NAD and NADP metabolism. Future investigation into the metabolism and biological functions of NAD and NADP may expose fundamental properties of life, and suggest new strategies for treating diseases and slowing the aging process. Antioxid. Redox Signal. 10, 179–206.","container-title":"Antioxidants &amp; Redox Signaling","DOI":"10.1089/ars.2007.1672","ISSN":"1523-0864, 1557-7716","issue":"2","journalAbbreviation":"Antioxidants &amp; Redox Signaling","language":"en","page":"179-206","source":"DOI.org (Crossref)","title":"NAD&lt;sup&gt;+&lt;/sup&gt; /NADH and NADP&lt;sup&gt;+&lt;/sup&gt; /NADPH in Cellular Functions and Cell Death: Regulation and Biological Consequences","title-short":"NAD&lt;sup&gt;+&lt;/sup&gt; /NADH and NADP&lt;sup&gt;+&lt;/sup&gt; /NADPH in Cellular Functions and Cell Death","volume":"10","author":[{"family":"Ying","given":"Weihai"}],"issued":{"date-parts":[["2008",2]]}}}],"schema":"https://github.com/citation-style-language/schema/raw/master/csl-citation.json"} </w:instrText>
       </w:r>
       <w:r>
         <w:fldChar w:fldCharType="separate"/>
@@ -3814,7 +3940,7 @@
           <w:i/>
           <w:iCs/>
         </w:rPr>
-        <w:t>91</w:t>
+        <w:t>71</w:t>
       </w:r>
       <w:r>
         <w:t>)</w:t>
@@ -3877,7 +4003,7 @@
         <w:fldChar w:fldCharType="begin"/>
       </w:r>
       <w:r>
-        <w:instrText xml:space="preserve"> ADDIN ZOTERO_ITEM CSL_CITATION {"citationID":"BOTDPuFp","properties":{"formattedCitation":"({\\i{}92})","plainCitation":"(92)","noteIndex":0},"citationItems":[{"id":1527,"uris":["http://zotero.org/users/13901503/items/2LNX23SB"],"itemData":{"id":1527,"type":"article-journal","abstract":"A dense and diverse microbial community inhabits the gut and many epithelial surfaces. Referred to as the microbiota, it co-evolved with the host and is beneficial for many host physiological processes. A major function of these symbiotic microorganisms is protection against pathogen colonization and overgrowth of indigenous pathobionts. Dysbiosis of the normal microbial community increases the risk of pathogen infection and overgrowth of harmful pathobionts. The protective mechanisms conferred by the microbiota are complex and include competitive microbial–microbial interactions and induction of host immune responses. Pathogens, in turn, have evolved multiple strategies to subvert colonization resistance conferred by the microbiota. Understanding the mechanisms by which microbial symbionts limit pathogen colonization should guide the development of new therapeutic approaches to prevent or treat disease.","container-title":"Nature Reviews Microbiology","DOI":"10.1038/s41579-022-00833-7","ISSN":"1740-1534","issue":"6","journalAbbreviation":"Nat Rev Microbiol","language":"en","license":"2022 Springer Nature Limited","note":"publisher: Nature Publishing Group","page":"347-360","source":"www.nature.com","title":"Microbiota-mediated colonization resistance: mechanisms and regulation","title-short":"Microbiota-mediated colonization resistance","volume":"21","author":[{"family":"Caballero-Flores","given":"Gustavo"},{"family":"Pickard","given":"Joseph M."},{"family":"Núñez","given":"Gabriel"}],"issued":{"date-parts":[["2023",6]]}}}],"schema":"https://github.com/citation-style-language/schema/raw/master/csl-citation.json"} </w:instrText>
+        <w:instrText xml:space="preserve"> ADDIN ZOTERO_ITEM CSL_CITATION {"citationID":"BOTDPuFp","properties":{"formattedCitation":"({\\i{}95})","plainCitation":"(95)","noteIndex":0},"citationItems":[{"id":1527,"uris":["http://zotero.org/users/13901503/items/2LNX23SB"],"itemData":{"id":1527,"type":"article-journal","abstract":"A dense and diverse microbial community inhabits the gut and many epithelial surfaces. Referred to as the microbiota, it co-evolved with the host and is beneficial for many host physiological processes. A major function of these symbiotic microorganisms is protection against pathogen colonization and overgrowth of indigenous pathobionts. Dysbiosis of the normal microbial community increases the risk of pathogen infection and overgrowth of harmful pathobionts. The protective mechanisms conferred by the microbiota are complex and include competitive microbial–microbial interactions and induction of host immune responses. Pathogens, in turn, have evolved multiple strategies to subvert colonization resistance conferred by the microbiota. Understanding the mechanisms by which microbial symbionts limit pathogen colonization should guide the development of new therapeutic approaches to prevent or treat disease.","container-title":"Nature Reviews Microbiology","DOI":"10.1038/s41579-022-00833-7","ISSN":"1740-1534","issue":"6","journalAbbreviation":"Nat Rev Microbiol","language":"en","license":"2022 Springer Nature Limited","note":"publisher: Nature Publishing Group","page":"347-360","source":"www.nature.com","title":"Microbiota-mediated colonization resistance: mechanisms and regulation","title-short":"Microbiota-mediated colonization resistance","volume":"21","author":[{"family":"Caballero-Flores","given":"Gustavo"},{"family":"Pickard","given":"Joseph M."},{"family":"Núñez","given":"Gabriel"}],"issued":{"date-parts":[["2023",6]]}}}],"schema":"https://github.com/citation-style-language/schema/raw/master/csl-citation.json"} </w:instrText>
       </w:r>
       <w:r>
         <w:fldChar w:fldCharType="separate"/>
@@ -3890,7 +4016,7 @@
           <w:i/>
           <w:iCs/>
         </w:rPr>
-        <w:t>92</w:t>
+        <w:t>95</w:t>
       </w:r>
       <w:r>
         <w:t>)</w:t>
@@ -3911,7 +4037,7 @@
         <w:fldChar w:fldCharType="begin"/>
       </w:r>
       <w:r>
-        <w:instrText xml:space="preserve"> ADDIN ZOTERO_ITEM CSL_CITATION {"citationID":"t7jhlu8l","properties":{"formattedCitation":"({\\i{}93})","plainCitation":"(93)","noteIndex":0},"citationItems":[{"id":1008,"uris":["http://zotero.org/users/13901503/items/5W73TYRF"],"itemData":{"id":1008,"type":"article-journal","abstract":"The human gut microbiome plays an important role in resisting colonization of the host by pathogens, but we lack the ability to predict which communities will be protective. We studied how human gut bacteria influence colonization of two major bacterial pathogens, both in vitro and in gnotobiotic mice. Whereas single species alone had negligible effects, colonization resistance greatly increased with community diversity. Moreover, this community-level resistance rested critically upon certain species being present. We explained these ecological patterns through the collective ability of resistant communities to consume nutrients that overlap with those used by the pathogen. Furthermore, we applied our findings to successfully predict communities that resist a novel target strain. Our work provides a reason why microbiome diversity is beneficial and suggests a route for the rational design of pathogen-resistant communities.","container-title":"Science","DOI":"10.1126/science.adj3502","issue":"6676","note":"publisher: American Association for the Advancement of Science","page":"eadj3502","source":"science.org (Atypon)","title":"Microbiome diversity protects against pathogens by nutrient blocking","volume":"382","author":[{"family":"Spragge","given":"Frances"},{"family":"Bakkeren","given":"Erik"},{"family":"Jahn","given":"Martin T."},{"family":"B. N. Araujo","given":"Elizete"},{"family":"Pearson","given":"Claire F."},{"family":"Wang","given":"Xuedan"},{"family":"Pankhurst","given":"Louise"},{"family":"Cunrath","given":"Olivier"},{"family":"Foster","given":"Kevin R."}],"issued":{"date-parts":[["2023",12,15]]}}}],"schema":"https://github.com/citation-style-language/schema/raw/master/csl-citation.json"} </w:instrText>
+        <w:instrText xml:space="preserve"> ADDIN ZOTERO_ITEM CSL_CITATION {"citationID":"t7jhlu8l","properties":{"formattedCitation":"({\\i{}96})","plainCitation":"(96)","noteIndex":0},"citationItems":[{"id":1008,"uris":["http://zotero.org/users/13901503/items/5W73TYRF"],"itemData":{"id":1008,"type":"article-journal","abstract":"The human gut microbiome plays an important role in resisting colonization of the host by pathogens, but we lack the ability to predict which communities will be protective. We studied how human gut bacteria influence colonization of two major bacterial pathogens, both in vitro and in gnotobiotic mice. Whereas single species alone had negligible effects, colonization resistance greatly increased with community diversity. Moreover, this community-level resistance rested critically upon certain species being present. We explained these ecological patterns through the collective ability of resistant communities to consume nutrients that overlap with those used by the pathogen. Furthermore, we applied our findings to successfully predict communities that resist a novel target strain. Our work provides a reason why microbiome diversity is beneficial and suggests a route for the rational design of pathogen-resistant communities.","container-title":"Science","DOI":"10.1126/science.adj3502","issue":"6676","note":"publisher: American Association for the Advancement of Science","page":"eadj3502","source":"science.org (Atypon)","title":"Microbiome diversity protects against pathogens by nutrient blocking","volume":"382","author":[{"family":"Spragge","given":"Frances"},{"family":"Bakkeren","given":"Erik"},{"family":"Jahn","given":"Martin T."},{"family":"B. N. Araujo","given":"Elizete"},{"family":"Pearson","given":"Claire F."},{"family":"Wang","given":"Xuedan"},{"family":"Pankhurst","given":"Louise"},{"family":"Cunrath","given":"Olivier"},{"family":"Foster","given":"Kevin R."}],"issued":{"date-parts":[["2023",12,15]]}}}],"schema":"https://github.com/citation-style-language/schema/raw/master/csl-citation.json"} </w:instrText>
       </w:r>
       <w:r>
         <w:fldChar w:fldCharType="separate"/>
@@ -3924,7 +4050,7 @@
           <w:i/>
           <w:iCs/>
         </w:rPr>
-        <w:t>93</w:t>
+        <w:t>96</w:t>
       </w:r>
       <w:r>
         <w:t>)</w:t>
@@ -4004,7 +4130,7 @@
         <w:fldChar w:fldCharType="begin"/>
       </w:r>
       <w:r>
-        <w:instrText xml:space="preserve"> ADDIN ZOTERO_ITEM CSL_CITATION {"citationID":"niRie4ap","properties":{"formattedCitation":"({\\i{}94})","plainCitation":"(94)","noteIndex":0},"citationItems":[{"id":1477,"uris":["http://zotero.org/users/13901503/items/HC276HZJ"],"itemData":{"id":1477,"type":"article-journal","abstract":"Antibiotic treatment disrupts the native intestinal microbiota and favours infection with and the proliferation of antibiotic-resistant intestinal pathogens. Clinically important antibiotic-resistant pathogens include vancomycin-resistant Enterococcus spp., various Enterobacteriaceae and Clostridium difficile.The intestinal microbiota influences the development, the maintenance and the function of the innate and adaptive immune systems. Host immune function is decreased in the intestines following antibiotic therapy, and antibiotic-treated hosts are susceptible to intestinal infection.Microbiota-derived bacterial populations and products that enhance immune defence against intestinal pathogens are being identified. However, the precise bacterial sources of many immunomodulatory molecules remain unclear and, conversely, the molecular mechanisms by which most probiotics restore immunity have yet to be elucidated.In addition to indirectly enhancing colonization resistance by stimulating host immune defences, bacterial populations can directly suppress intestinal pathogens by competitive exclusion and by antimicrobial activities. The commensal populations that are responsible for direct antagonism of pathogens and indirect, immune-mediated colonization resistance may be closely related and difficult to distinguish.Microbiota-derived bacterial populations and products, a subset of which enhance immune defence, can also promote intestinal inflammation, whereas other microbiota components restrain effector responses and promote tolerance.Manipulation of the intestinal microbiota to prevent and to treat some intestinal infections, such as C. difficile, shows promise in human patients and animal models of infection. However, the specific contributions of the individual bacterial populations that constitute the consortia transferred in such studies remain mostly undefined.","container-title":"Nature Reviews Immunology","DOI":"10.1038/nri3535","ISSN":"1474-1741","issue":"11","journalAbbreviation":"Nat Rev Immunol","language":"en","license":"2013 Springer Nature Limited","note":"publisher: Nature Publishing Group","page":"790-801","source":"www.nature.com","title":"Microbiota-mediated colonization resistance against intestinal pathogens","volume":"13","author":[{"family":"Buffie","given":"Charlie G."},{"family":"Pamer","given":"Eric G."}],"issued":{"date-parts":[["2013",11]]}}}],"schema":"https://github.com/citation-style-language/schema/raw/master/csl-citation.json"} </w:instrText>
+        <w:instrText xml:space="preserve"> ADDIN ZOTERO_ITEM CSL_CITATION {"citationID":"niRie4ap","properties":{"formattedCitation":"({\\i{}97})","plainCitation":"(97)","noteIndex":0},"citationItems":[{"id":1477,"uris":["http://zotero.org/users/13901503/items/HC276HZJ"],"itemData":{"id":1477,"type":"article-journal","abstract":"Antibiotic treatment disrupts the native intestinal microbiota and favours infection with and the proliferation of antibiotic-resistant intestinal pathogens. Clinically important antibiotic-resistant pathogens include vancomycin-resistant Enterococcus spp., various Enterobacteriaceae and Clostridium difficile.The intestinal microbiota influences the development, the maintenance and the function of the innate and adaptive immune systems. Host immune function is decreased in the intestines following antibiotic therapy, and antibiotic-treated hosts are susceptible to intestinal infection.Microbiota-derived bacterial populations and products that enhance immune defence against intestinal pathogens are being identified. However, the precise bacterial sources of many immunomodulatory molecules remain unclear and, conversely, the molecular mechanisms by which most probiotics restore immunity have yet to be elucidated.In addition to indirectly enhancing colonization resistance by stimulating host immune defences, bacterial populations can directly suppress intestinal pathogens by competitive exclusion and by antimicrobial activities. The commensal populations that are responsible for direct antagonism of pathogens and indirect, immune-mediated colonization resistance may be closely related and difficult to distinguish.Microbiota-derived bacterial populations and products, a subset of which enhance immune defence, can also promote intestinal inflammation, whereas other microbiota components restrain effector responses and promote tolerance.Manipulation of the intestinal microbiota to prevent and to treat some intestinal infections, such as C. difficile, shows promise in human patients and animal models of infection. However, the specific contributions of the individual bacterial populations that constitute the consortia transferred in such studies remain mostly undefined.","container-title":"Nature Reviews Immunology","DOI":"10.1038/nri3535","ISSN":"1474-1741","issue":"11","journalAbbreviation":"Nat Rev Immunol","language":"en","license":"2013 Springer Nature Limited","note":"publisher: Nature Publishing Group","page":"790-801","source":"www.nature.com","title":"Microbiota-mediated colonization resistance against intestinal pathogens","volume":"13","author":[{"family":"Buffie","given":"Charlie G."},{"family":"Pamer","given":"Eric G."}],"issued":{"date-parts":[["2013",11]]}}}],"schema":"https://github.com/citation-style-language/schema/raw/master/csl-citation.json"} </w:instrText>
       </w:r>
       <w:r>
         <w:fldChar w:fldCharType="separate"/>
@@ -4017,7 +4143,7 @@
           <w:i/>
           <w:iCs/>
         </w:rPr>
-        <w:t>94</w:t>
+        <w:t>97</w:t>
       </w:r>
       <w:r>
         <w:t>)</w:t>
@@ -4039,7 +4165,7 @@
         <w:fldChar w:fldCharType="begin"/>
       </w:r>
       <w:r>
-        <w:instrText xml:space="preserve"> ADDIN ZOTERO_ITEM CSL_CITATION {"citationID":"hwQmyei2","properties":{"formattedCitation":"({\\i{}95})","plainCitation":"(95)","noteIndex":0},"citationItems":[{"id":3181,"uris":["http://zotero.org/users/13901503/items/N5RMCRXY"],"itemData":{"id":3181,"type":"article-journal","abstract":"Microbial communities often exhibit incredible taxonomic diversity, raising questions regarding the mechanisms enabling species coexistence and the role of this diversity in community functioning. On the one hand, many coexisting but taxonomically distinct microorganisms can encode the same energy-yielding metabolic functions, and this functional redundancy contrasts with the expectation that species should occupy distinct metabolic niches. On the other hand, the identity of taxa encoding each function can vary substantially across space or time with little effect on the function, and this taxonomic variability is frequently thought to result from ecological drift between equivalent organisms. Here, we synthesize the powerful paradigm emerging from these two patterns, connecting the roles of function, functional redundancy and taxonomy in microbial systems. We conclude that both patterns are unlikely to be the result of ecological drift, but are inevitable emergent properties of open microbial systems resulting mainly from biotic interactions and environmental and spatial processes.","container-title":"Nature Ecology &amp; Evolution","DOI":"10.1038/s41559-018-0519-1","ISSN":"2397-334X","issue":"6","journalAbbreviation":"Nat Ecol Evol","language":"en","license":"2018 The Author(s)","note":"publisher: Nature Publishing Group","page":"936-943","source":"www-nature-com.proxy.lib.umich.edu","title":"Function and functional redundancy in microbial systems","volume":"2","author":[{"family":"Louca","given":"Stilianos"},{"family":"Polz","given":"Martin F."},{"family":"Mazel","given":"Florent"},{"family":"Albright","given":"Michaeline B. N."},{"family":"Huber","given":"Julie A."},{"family":"O’Connor","given":"Mary I."},{"family":"Ackermann","given":"Martin"},{"family":"Hahn","given":"Aria S."},{"family":"Srivastava","given":"Diane S."},{"family":"Crowe","given":"Sean A."},{"family":"Doebeli","given":"Michael"},{"family":"Parfrey","given":"Laura Wegener"}],"issued":{"date-parts":[["2018",6]]}}}],"schema":"https://github.com/citation-style-language/schema/raw/master/csl-citation.json"} </w:instrText>
+        <w:instrText xml:space="preserve"> ADDIN ZOTERO_ITEM CSL_CITATION {"citationID":"hwQmyei2","properties":{"formattedCitation":"({\\i{}98})","plainCitation":"(98)","noteIndex":0},"citationItems":[{"id":3181,"uris":["http://zotero.org/users/13901503/items/N5RMCRXY"],"itemData":{"id":3181,"type":"article-journal","abstract":"Microbial communities often exhibit incredible taxonomic diversity, raising questions regarding the mechanisms enabling species coexistence and the role of this diversity in community functioning. On the one hand, many coexisting but taxonomically distinct microorganisms can encode the same energy-yielding metabolic functions, and this functional redundancy contrasts with the expectation that species should occupy distinct metabolic niches. On the other hand, the identity of taxa encoding each function can vary substantially across space or time with little effect on the function, and this taxonomic variability is frequently thought to result from ecological drift between equivalent organisms. Here, we synthesize the powerful paradigm emerging from these two patterns, connecting the roles of function, functional redundancy and taxonomy in microbial systems. We conclude that both patterns are unlikely to be the result of ecological drift, but are inevitable emergent properties of open microbial systems resulting mainly from biotic interactions and environmental and spatial processes.","container-title":"Nature Ecology &amp; Evolution","DOI":"10.1038/s41559-018-0519-1","ISSN":"2397-334X","issue":"6","journalAbbreviation":"Nat Ecol Evol","language":"en","license":"2018 The Author(s)","note":"publisher: Nature Publishing Group","page":"936-943","source":"www-nature-com.proxy.lib.umich.edu","title":"Function and functional redundancy in microbial systems","volume":"2","author":[{"family":"Louca","given":"Stilianos"},{"family":"Polz","given":"Martin F."},{"family":"Mazel","given":"Florent"},{"family":"Albright","given":"Michaeline B. N."},{"family":"Huber","given":"Julie A."},{"family":"O’Connor","given":"Mary I."},{"family":"Ackermann","given":"Martin"},{"family":"Hahn","given":"Aria S."},{"family":"Srivastava","given":"Diane S."},{"family":"Crowe","given":"Sean A."},{"family":"Doebeli","given":"Michael"},{"family":"Parfrey","given":"Laura Wegener"}],"issued":{"date-parts":[["2018",6]]}}}],"schema":"https://github.com/citation-style-language/schema/raw/master/csl-citation.json"} </w:instrText>
       </w:r>
       <w:r>
         <w:fldChar w:fldCharType="separate"/>
@@ -4052,7 +4178,7 @@
           <w:i/>
           <w:iCs/>
         </w:rPr>
-        <w:t>95</w:t>
+        <w:t>98</w:t>
       </w:r>
       <w:r>
         <w:t>)</w:t>
@@ -4082,7 +4208,7 @@
         <w:fldChar w:fldCharType="begin"/>
       </w:r>
       <w:r>
-        <w:instrText xml:space="preserve"> ADDIN ZOTERO_ITEM CSL_CITATION {"citationID":"08yGUd4c","properties":{"formattedCitation":"({\\i{}37}, {\\i{}96})","plainCitation":"(37, 96)","noteIndex":0},"citationItems":[{"id":3980,"uris":["http://zotero.org/users/13901503/items/D55I9RZZ"],"itemData":{"id":3980,"type":"article-journal","abstract":"SUMMARYCampylobacter jejuni infection is one of the most widespread infectious diseases of the last century. The incidence and prevalence of campylobacteriosis have increased in both developed and developing countries over the last 10 years. The dramatic increase in North America, Europe, and Australia is alarming, and data from parts of Africa, Asia, and the Middle East indicate that campylobacteriosis is endemic in these areas, especially in children. In addition to C. jejuni, there is increasing recognition of the clinical importance of emerging Campylobacter species, including Campylobacter concisus and Campylobacter ureolyticus. Poultry is a major reservoir and source of transmission of campylobacteriosis to humans. Other risk factors include consumption of animal products and water, contact with animals, and international travel. Strategic implementation of multifaceted biocontrol measures to reduce the transmission of this group of pathogens is paramount for public health. Overall, campylobacteriosis is still one of the most important infectious diseases that is likely to challenge global health in the years to come. This review provides a comprehensive overview of the global epidemiology, transmission, and clinical relevance of Campylobacter infection.","container-title":"Clinical Microbiology Reviews","DOI":"10.1128/cmr.00006-15","issue":"3","note":"publisher: American Society for Microbiology","page":"687-720","source":"journals-asm-org.proxy.lib.umich.edu (Atypon)","title":"Global Epidemiology of Campylobacter Infection","volume":"28","author":[{"family":"Kaakoush","given":"Nadeem O."},{"family":"Castaño-Rodríguez","given":"Natalia"},{"family":"Mitchell","given":"Hazel M."},{"family":"Man","given":"Si Ming"}],"issued":{"date-parts":[["2015",6,10]]}}},{"id":3636,"uris":["http://zotero.org/users/13901503/items/26FYIIWM"],"itemData":{"id":3636,"type":"article-journal","abstract":"Recent advances in sequencing techniques, applied to the study of microbial communities, have provided compelling evidence that the mammalian intestinal tract harbors a complex microbial community whose composition is a critical determinant of host health in the context of metabolism and inflammation. Given that an imbalanced gut microbiota often arises from a sustained increase in abundance of the phylum Proteobacteria, the natural human gut flora normally contains only a minor proportion of this phylum. Here, we review studies that explored the association between an abnormal expansion of Proteobacteria and a compromised ability to maintain a balanced gut microbial community. We also propose that an increased prevalence of Proteobacteria is a potential diagnostic signature of dysbiosis and risk of disease.","container-title":"Trends in Biotechnology","DOI":"10.1016/j.tibtech.2015.06.011","ISSN":"0167-7799","issue":"9","journalAbbreviation":"Trends in Biotechnology","page":"496-503","source":"ScienceDirect","title":"&lt;i&gt;Proteobacteria&lt;/i&gt;: microbial signature of dysbiosis in gut microbiota","title-short":"&lt;i&gt;Proteobacteria&lt;/i&gt;","volume":"33","author":[{"family":"Shin","given":"Na-Ri"},{"family":"Whon","given":"Tae Woong"},{"family":"Bae","given":"Jin-Woo"}],"issued":{"date-parts":[["2015",9,1]]}}}],"schema":"https://github.com/citation-style-language/schema/raw/master/csl-citation.json"} </w:instrText>
+        <w:instrText xml:space="preserve"> ADDIN ZOTERO_ITEM CSL_CITATION {"citationID":"08yGUd4c","properties":{"formattedCitation":"({\\i{}37}, {\\i{}99})","plainCitation":"(37, 99)","noteIndex":0},"citationItems":[{"id":3980,"uris":["http://zotero.org/users/13901503/items/D55I9RZZ"],"itemData":{"id":3980,"type":"article-journal","abstract":"SUMMARYCampylobacter jejuni infection is one of the most widespread infectious diseases of the last century. The incidence and prevalence of campylobacteriosis have increased in both developed and developing countries over the last 10 years. The dramatic increase in North America, Europe, and Australia is alarming, and data from parts of Africa, Asia, and the Middle East indicate that campylobacteriosis is endemic in these areas, especially in children. In addition to C. jejuni, there is increasing recognition of the clinical importance of emerging Campylobacter species, including Campylobacter concisus and Campylobacter ureolyticus. Poultry is a major reservoir and source of transmission of campylobacteriosis to humans. Other risk factors include consumption of animal products and water, contact with animals, and international travel. Strategic implementation of multifaceted biocontrol measures to reduce the transmission of this group of pathogens is paramount for public health. Overall, campylobacteriosis is still one of the most important infectious diseases that is likely to challenge global health in the years to come. This review provides a comprehensive overview of the global epidemiology, transmission, and clinical relevance of Campylobacter infection.","container-title":"Clinical Microbiology Reviews","DOI":"10.1128/cmr.00006-15","issue":"3","note":"publisher: American Society for Microbiology","page":"687-720","source":"journals-asm-org.proxy.lib.umich.edu (Atypon)","title":"Global Epidemiology of Campylobacter Infection","volume":"28","author":[{"family":"Kaakoush","given":"Nadeem O."},{"family":"Castaño-Rodríguez","given":"Natalia"},{"family":"Mitchell","given":"Hazel M."},{"family":"Man","given":"Si Ming"}],"issued":{"date-parts":[["2015",6,10]]}}},{"id":3636,"uris":["http://zotero.org/users/13901503/items/26FYIIWM"],"itemData":{"id":3636,"type":"article-journal","abstract":"Recent advances in sequencing techniques, applied to the study of microbial communities, have provided compelling evidence that the mammalian intestinal tract harbors a complex microbial community whose composition is a critical determinant of host health in the context of metabolism and inflammation. Given that an imbalanced gut microbiota often arises from a sustained increase in abundance of the phylum Proteobacteria, the natural human gut flora normally contains only a minor proportion of this phylum. Here, we review studies that explored the association between an abnormal expansion of Proteobacteria and a compromised ability to maintain a balanced gut microbial community. We also propose that an increased prevalence of Proteobacteria is a potential diagnostic signature of dysbiosis and risk of disease.","container-title":"Trends in Biotechnology","DOI":"10.1016/j.tibtech.2015.06.011","ISSN":"0167-7799","issue":"9","journalAbbreviation":"Trends in Biotechnology","page":"496-503","source":"ScienceDirect","title":"&lt;i&gt;Proteobacteria&lt;/i&gt;: microbial signature of dysbiosis in gut microbiota","title-short":"&lt;i&gt;Proteobacteria&lt;/i&gt;","volume":"33","author":[{"family":"Shin","given":"Na-Ri"},{"family":"Whon","given":"Tae Woong"},{"family":"Bae","given":"Jin-Woo"}],"issued":{"date-parts":[["2015",9,1]]}}}],"schema":"https://github.com/citation-style-language/schema/raw/master/csl-citation.json"} </w:instrText>
       </w:r>
       <w:r>
         <w:fldChar w:fldCharType="separate"/>
@@ -4105,7 +4231,7 @@
           <w:i/>
           <w:iCs/>
         </w:rPr>
-        <w:t>96</w:t>
+        <w:t>99</w:t>
       </w:r>
       <w:r>
         <w:t>)</w:t>
@@ -4122,13 +4248,22 @@
         <w:ind w:firstLine="720"/>
       </w:pPr>
       <w:r>
-        <w:t xml:space="preserve">Metabolic restructuring in response to rising temperatures suggests that the gut microbiome undergoes functional shifts that may support community stability. For example, the increase in lipid synthesis and remodeling pathways could reflect cytoplasmic membrane restructuring, a process bacteria use to preserve membrane stability at high temperatures </w:t>
+        <w:t>Metabolic restructuring in response to rising temperatures suggests that the gut microbiome undergoes functional shifts that may support community stability. For example, the increase in lipid synthesis and remodeling pathways</w:t>
+      </w:r>
+      <w:r>
+        <w:t xml:space="preserve"> (</w:t>
+      </w:r>
+      <w:r>
+        <w:t>Fig 3A)</w:t>
+      </w:r>
+      <w:r>
+        <w:t xml:space="preserve"> could reflect cytoplasmic membrane restructuring, a process bacteria use to preserve membrane stability at high temperatures </w:t>
       </w:r>
       <w:r>
         <w:fldChar w:fldCharType="begin"/>
       </w:r>
       <w:r>
-        <w:instrText xml:space="preserve"> ADDIN ZOTERO_ITEM CSL_CITATION {"citationID":"SIOKOfLi","properties":{"formattedCitation":"({\\i{}62}, {\\i{}97})","plainCitation":"(62, 97)","noteIndex":0},"citationItems":[{"id":3378,"uris":["http://zotero.org/users/13901503/items/TZK8TZFH"],"itemData":{"id":3378,"type":"article-journal","container-title":"Journal of Bacteriology","DOI":"10.1128/jb.186.20.6681-6688.2004","issue":"20","note":"publisher: American Society for Microbiology","page":"6681-6688","source":"journals.asm.org (Atypon)","title":"Control of Membrane Lipid Fluidity by Molecular Thermosensors","volume":"186","author":[{"family":"Mansilla","given":"María C."},{"family":"Cybulski","given":"Larisa E."},{"family":"Albanesi","given":"Daniela"},{"family":"Mendoza","given":"Diego","non-dropping-particle":"de"}],"issued":{"date-parts":[["2004",10,15]]}}},{"id":3394,"uris":["http://zotero.org/users/13901503/items/BQ657FYY"],"itemData":{"id":3394,"type":"article-journal","container-title":"Proceedings of the National Academy of Sciences","issue":"38","journalAbbreviation":"PNAS","language":"en","note":"DOI: 10.1073/pnas.1515607112","page":"11971–11976","title":"Hopanoids as functional analogues of cholesterol in bacterial membranes","volume":"112","author":[{"family":"Sáenz","given":"James"}],"issued":{"date-parts":[["2015"]]}}}],"schema":"https://github.com/citation-style-language/schema/raw/master/csl-citation.json"} </w:instrText>
+        <w:instrText xml:space="preserve"> ADDIN ZOTERO_ITEM CSL_CITATION {"citationID":"SIOKOfLi","properties":{"formattedCitation":"({\\i{}62}, {\\i{}100})","plainCitation":"(62, 100)","noteIndex":0},"citationItems":[{"id":3378,"uris":["http://zotero.org/users/13901503/items/TZK8TZFH"],"itemData":{"id":3378,"type":"article-journal","container-title":"Journal of Bacteriology","DOI":"10.1128/jb.186.20.6681-6688.2004","issue":"20","note":"publisher: American Society for Microbiology","page":"6681-6688","source":"journals.asm.org (Atypon)","title":"Control of Membrane Lipid Fluidity by Molecular Thermosensors","volume":"186","author":[{"family":"Mansilla","given":"María C."},{"family":"Cybulski","given":"Larisa E."},{"family":"Albanesi","given":"Daniela"},{"family":"Mendoza","given":"Diego","non-dropping-particle":"de"}],"issued":{"date-parts":[["2004",10,15]]}}},{"id":3394,"uris":["http://zotero.org/users/13901503/items/BQ657FYY"],"itemData":{"id":3394,"type":"article-journal","container-title":"Proceedings of the National Academy of Sciences","issue":"38","journalAbbreviation":"PNAS","language":"en","note":"DOI: 10.1073/pnas.1515607112","page":"11971–11976","title":"Hopanoids as functional analogues of cholesterol in bacterial membranes","volume":"112","author":[{"family":"Sáenz","given":"James"}],"issued":{"date-parts":[["2015"]]}}}],"schema":"https://github.com/citation-style-language/schema/raw/master/csl-citation.json"} </w:instrText>
       </w:r>
       <w:r>
         <w:fldChar w:fldCharType="separate"/>
@@ -4151,7 +4286,7 @@
           <w:i/>
           <w:iCs/>
         </w:rPr>
-        <w:t>97</w:t>
+        <w:t>100</w:t>
       </w:r>
       <w:r>
         <w:t>)</w:t>
@@ -4160,7 +4295,10 @@
         <w:fldChar w:fldCharType="end"/>
       </w:r>
       <w:r>
-        <w:t xml:space="preserve">(Fig 3A). However, these changes may be insufficient to maintain membrane integrity during extended periods of high temperatures because the observed decline in lipid catabolism and recycling pathways likely compromises membrane repair mechanisms </w:t>
+        <w:t>.</w:t>
+      </w:r>
+      <w:r>
+        <w:t xml:space="preserve"> However, these changes may be insufficient to maintain membrane integrity during extended periods of high temperatures because the observed decline in lipid catabolism and recycling pathways likely compromises membrane repair mechanisms </w:t>
       </w:r>
       <w:r>
         <w:fldChar w:fldCharType="begin"/>
@@ -4200,7 +4338,7 @@
         <w:fldChar w:fldCharType="begin"/>
       </w:r>
       <w:r>
-        <w:instrText xml:space="preserve"> ADDIN ZOTERO_ITEM CSL_CITATION {"citationID":"XWxqevTe","properties":{"formattedCitation":"({\\i{}22}, {\\i{}98})","plainCitation":"(22, 98)","noteIndex":0},"citationItems":[{"id":3717,"uris":["http://zotero.org/users/13901503/items/UEK27R7E"],"itemData":{"id":3717,"type":"article-journal","abstract":"In recent years there has been enormous interest in researching oxidative stress. Reactive oxygen species (ROS) are derived from the metabolism of oxygen as by-products of cell respiration, and are continuously produced in all aerobic organisms. Oxidative stress occurs as a consequence of an imbalance between ROS production and the available antioxidant defence against them. Nowadays, a variety of diseases and degenerative processes such as cancer, Alzheimer’s and autoimmune diseases are mediated by oxidative stress. Heat stress was suggested to be an environmental factor responsible for stimulating ROS production because of similarities in responses observed following heat stress compared with that occurring following exposure to oxidative stress. This manuscript describes the main mitochondrial sources of ROS and the antioxidant defences involved to prevent oxidative damage in all the mitochondrial compartments. It also deals with discussions concerning the cytotoxic effect of heat stress, mitochondrial heat-induced alterations, as well as heat shock protein (HSP) expression as a defence mechanism.","container-title":"International Journal of Hyperthermia","DOI":"10.3109/02656736.2014.971446","ISSN":"0265-6736","issue":"7","note":"publisher: Taylor &amp; Francis\n_eprint: https://doi.org/10.3109/02656736.2014.971446\nPMID: 25354680","page":"513-523","source":"Taylor and Francis+NEJM","title":"Reactive oxygen species, heat stress and oxidative-induced mitochondrial damage. A review","volume":"30","author":[{"family":"Belhadj Slimen","given":"Imen"},{"family":"Taha","given":"Najar"},{"family":"Abdeljelil","given":"Ghram"},{"family":"Hajer","given":"Dabbebi"},{"family":"Moncef","given":"Ben Mrad"},{"family":"Manef","given":"Abdrabbah"}],"issued":{"date-parts":[["2014",11,1]]}}},{"id":3669,"uris":["http://zotero.org/users/13901503/items/BF6XKP7S"],"itemData":{"id":3669,"type":"article-journal","abstract":"The stress responses and possible oxidative damage in plasma, liver and heart were investigated in broiler chickens acutely exposed to high temperature. Eighty 5-week old broiler chickens were exposed to 32°C for 6h. The extent of lipid peroxidation, activities of superoxide dismutase and total antioxidant power in plasma, liver and heart tissues were investigated. Meanwhile, the blood metabolites such as glucose, urate, triiodothyronine, thyroxine, corticosterone, ceruloplasmin and creatine kinase were measured before and after 3 and 6h of heat exposure. The results showed that oxidative stress could be induced in 5-week old broiler chickens by acute heat exposure (32°C, 6h). The results suggest that the elevated body temperature can induce the metabolic changes that are involved in the induction of oxidative stress. The liver is more susceptible to oxidative stress than heart during acute heat exposure in broiler chickens. The oxidative stress should be considered as part of the stress response of broiler chickens to heat exposure.","container-title":"Comparative Biochemistry and Physiology Part A: Molecular &amp; Integrative Physiology","DOI":"10.1016/j.cbpa.2006.01.032","ISSN":"1095-6433","issue":"1","journalAbbreviation":"Comparative Biochemistry and Physiology Part A: Molecular &amp; Integrative Physiology","page":"11-17","source":"ScienceDirect","title":"Acute heat stress induces oxidative stress in broiler chickens","volume":"144","author":[{"family":"Lin","given":"Hai"},{"family":"Decuypere","given":"Eddy"},{"family":"Buyse","given":"Johan"}],"issued":{"date-parts":[["2006",5,1]]}}}],"schema":"https://github.com/citation-style-language/schema/raw/master/csl-citation.json"} </w:instrText>
+        <w:instrText xml:space="preserve"> ADDIN ZOTERO_ITEM CSL_CITATION {"citationID":"XWxqevTe","properties":{"formattedCitation":"({\\i{}22}, {\\i{}101})","plainCitation":"(22, 101)","noteIndex":0},"citationItems":[{"id":3717,"uris":["http://zotero.org/users/13901503/items/UEK27R7E"],"itemData":{"id":3717,"type":"article-journal","abstract":"In recent years there has been enormous interest in researching oxidative stress. Reactive oxygen species (ROS) are derived from the metabolism of oxygen as by-products of cell respiration, and are continuously produced in all aerobic organisms. Oxidative stress occurs as a consequence of an imbalance between ROS production and the available antioxidant defence against them. Nowadays, a variety of diseases and degenerative processes such as cancer, Alzheimer’s and autoimmune diseases are mediated by oxidative stress. Heat stress was suggested to be an environmental factor responsible for stimulating ROS production because of similarities in responses observed following heat stress compared with that occurring following exposure to oxidative stress. This manuscript describes the main mitochondrial sources of ROS and the antioxidant defences involved to prevent oxidative damage in all the mitochondrial compartments. It also deals with discussions concerning the cytotoxic effect of heat stress, mitochondrial heat-induced alterations, as well as heat shock protein (HSP) expression as a defence mechanism.","container-title":"International Journal of Hyperthermia","DOI":"10.3109/02656736.2014.971446","ISSN":"0265-6736","issue":"7","note":"publisher: Taylor &amp; Francis\n_eprint: https://doi.org/10.3109/02656736.2014.971446\nPMID: 25354680","page":"513-523","source":"Taylor and Francis+NEJM","title":"Reactive oxygen species, heat stress and oxidative-induced mitochondrial damage. A review","volume":"30","author":[{"family":"Belhadj Slimen","given":"Imen"},{"family":"Taha","given":"Najar"},{"family":"Abdeljelil","given":"Ghram"},{"family":"Hajer","given":"Dabbebi"},{"family":"Moncef","given":"Ben Mrad"},{"family":"Manef","given":"Abdrabbah"}],"issued":{"date-parts":[["2014",11,1]]}}},{"id":3669,"uris":["http://zotero.org/users/13901503/items/BF6XKP7S"],"itemData":{"id":3669,"type":"article-journal","abstract":"The stress responses and possible oxidative damage in plasma, liver and heart were investigated in broiler chickens acutely exposed to high temperature. Eighty 5-week old broiler chickens were exposed to 32°C for 6h. The extent of lipid peroxidation, activities of superoxide dismutase and total antioxidant power in plasma, liver and heart tissues were investigated. Meanwhile, the blood metabolites such as glucose, urate, triiodothyronine, thyroxine, corticosterone, ceruloplasmin and creatine kinase were measured before and after 3 and 6h of heat exposure. The results showed that oxidative stress could be induced in 5-week old broiler chickens by acute heat exposure (32°C, 6h). The results suggest that the elevated body temperature can induce the metabolic changes that are involved in the induction of oxidative stress. The liver is more susceptible to oxidative stress than heart during acute heat exposure in broiler chickens. The oxidative stress should be considered as part of the stress response of broiler chickens to heat exposure.","container-title":"Comparative Biochemistry and Physiology Part A: Molecular &amp; Integrative Physiology","DOI":"10.1016/j.cbpa.2006.01.032","ISSN":"1095-6433","issue":"1","journalAbbreviation":"Comparative Biochemistry and Physiology Part A: Molecular &amp; Integrative Physiology","page":"11-17","source":"ScienceDirect","title":"Acute heat stress induces oxidative stress in broiler chickens","volume":"144","author":[{"family":"Lin","given":"Hai"},{"family":"Decuypere","given":"Eddy"},{"family":"Buyse","given":"Johan"}],"issued":{"date-parts":[["2006",5,1]]}}}],"schema":"https://github.com/citation-style-language/schema/raw/master/csl-citation.json"} </w:instrText>
       </w:r>
       <w:r>
         <w:fldChar w:fldCharType="separate"/>
@@ -4223,7 +4361,7 @@
           <w:i/>
           <w:iCs/>
         </w:rPr>
-        <w:t>98</w:t>
+        <w:t>101</w:t>
       </w:r>
       <w:r>
         <w:t>)</w:t>
@@ -4244,7 +4382,22 @@
         <w:t xml:space="preserve"> </w:t>
       </w:r>
       <w:r>
-        <w:t>and the decline in aerobic pathways likely reflect a response to maintain energy production under changing oxygen gradients due to redirected blood flow during heat exposure (Fig 3B)</w:t>
+        <w:t>and the decline in aerobic pathways</w:t>
+      </w:r>
+      <w:r>
+        <w:t xml:space="preserve"> </w:t>
+      </w:r>
+      <w:r>
+        <w:t>(Fig 3B</w:t>
+      </w:r>
+      <w:r>
+        <w:t>)</w:t>
+      </w:r>
+      <w:r>
+        <w:t xml:space="preserve"> likely reflect a response to maintain energy production under changing oxygen gradients due to redirected blood flow during heat exposure</w:t>
+      </w:r>
+      <w:r>
+        <w:t xml:space="preserve"> </w:t>
       </w:r>
       <w:r>
         <w:fldChar w:fldCharType="begin"/>
@@ -4302,7 +4455,7 @@
         <w:fldChar w:fldCharType="begin"/>
       </w:r>
       <w:r>
-        <w:instrText xml:space="preserve"> ADDIN ZOTERO_ITEM CSL_CITATION {"citationID":"mHntz9tf","properties":{"formattedCitation":"({\\i{}99}, {\\i{}100})","plainCitation":"(99, 100)","noteIndex":0},"citationItems":[{"id":3719,"uris":["http://zotero.org/users/13901503/items/ZGBKX69N"],"itemData":{"id":3719,"type":"article-journal","abstract":"Antibiotic treatment disturbs the commensal microbiota and is often followed by infection with enteric pathogens such as Salmonella typhimurium and Clostridium difficile; pathogen expansion is fuelled by antibiotic-driven accumulation of commensal-liberated host mucosal carbohydrates.","container-title":"Nature","DOI":"10.1038/nature12503","ISSN":"1476-4687","issue":"7469","language":"en","license":"2013 Springer Nature Limited","note":"publisher: Nature Publishing Group","page":"96-99","source":"www-nature-com.proxy.lib.umich.edu","title":"Microbiota-liberated host sugars facilitate post-antibiotic expansion of enteric pathogens","volume":"502","author":[{"family":"Ng","given":"Katharine M."},{"family":"Ferreyra","given":"Jessica A."},{"family":"Higginbottom","given":"Steven K."},{"family":"Lynch","given":"Jonathan B."},{"family":"Kashyap","given":"Purna C."},{"family":"Gopinath","given":"Smita"},{"family":"Naidu","given":"Natasha"},{"family":"Choudhury","given":"Biswa"},{"family":"Weimer","given":"Bart C."},{"family":"Monack","given":"Denise M."},{"family":"Sonnenburg","given":"Justin L."}],"issued":{"date-parts":[["2013",10]]}}},{"id":3721,"uris":["http://zotero.org/users/13901503/items/EJEGJAPG"],"itemData":{"id":3721,"type":"article-journal","abstract":"The gut microbiota has diverse and essential roles in host metabolism, development of the immune system and as resistance to pathogen colonization. Perturbations of the gut microbiota, termed gut dysbiosis, are commonly observed in diseases involving inflammation in the gut, including inflammatory bowel disease, infection, colorectal cancer and food allergies. Importantly, the inflamed microenvironment in the gut is particularly conducive to blooms of Enterobacteriaceae, which acquire fitness benefits while other families of symbiotic bacteria succumb to environmental changes inflicted by inflammation. Here we summarize studies that examined factors in the inflamed gut that contribute to blooms of Enterobacterieaceae, and highlight potential approaches to restrict Enterobacterial blooms in treating diseases that are otherwise complicated by overgrowth of virulent Enterobacterial species in the gut.","container-title":"Mucosal Immunology","DOI":"10.1038/mi.2016.75","ISSN":"1933-0219","issue":"1","journalAbbreviation":"Mucosal Immunology","page":"18-26","source":"ScienceDirect","title":"Mechanisms of inflammation-driven bacterial dysbiosis in the gut","volume":"10","author":[{"family":"Zeng","given":"M. Y."},{"family":"Inohara","given":"N."},{"family":"Nuñez","given":"G."}],"issued":{"date-parts":[["2017",1,1]]}}}],"schema":"https://github.com/citation-style-language/schema/raw/master/csl-citation.json"} </w:instrText>
+        <w:instrText xml:space="preserve"> ADDIN ZOTERO_ITEM CSL_CITATION {"citationID":"mHntz9tf","properties":{"formattedCitation":"({\\i{}102}, {\\i{}103})","plainCitation":"(102, 103)","noteIndex":0},"citationItems":[{"id":3719,"uris":["http://zotero.org/users/13901503/items/ZGBKX69N"],"itemData":{"id":3719,"type":"article-journal","abstract":"Antibiotic treatment disturbs the commensal microbiota and is often followed by infection with enteric pathogens such as Salmonella typhimurium and Clostridium difficile; pathogen expansion is fuelled by antibiotic-driven accumulation of commensal-liberated host mucosal carbohydrates.","container-title":"Nature","DOI":"10.1038/nature12503","ISSN":"1476-4687","issue":"7469","language":"en","license":"2013 Springer Nature Limited","note":"publisher: Nature Publishing Group","page":"96-99","source":"www-nature-com.proxy.lib.umich.edu","title":"Microbiota-liberated host sugars facilitate post-antibiotic expansion of enteric pathogens","volume":"502","author":[{"family":"Ng","given":"Katharine M."},{"family":"Ferreyra","given":"Jessica A."},{"family":"Higginbottom","given":"Steven K."},{"family":"Lynch","given":"Jonathan B."},{"family":"Kashyap","given":"Purna C."},{"family":"Gopinath","given":"Smita"},{"family":"Naidu","given":"Natasha"},{"family":"Choudhury","given":"Biswa"},{"family":"Weimer","given":"Bart C."},{"family":"Monack","given":"Denise M."},{"family":"Sonnenburg","given":"Justin L."}],"issued":{"date-parts":[["2013",10]]}}},{"id":3721,"uris":["http://zotero.org/users/13901503/items/EJEGJAPG"],"itemData":{"id":3721,"type":"article-journal","abstract":"The gut microbiota has diverse and essential roles in host metabolism, development of the immune system and as resistance to pathogen colonization. Perturbations of the gut microbiota, termed gut dysbiosis, are commonly observed in diseases involving inflammation in the gut, including inflammatory bowel disease, infection, colorectal cancer and food allergies. Importantly, the inflamed microenvironment in the gut is particularly conducive to blooms of Enterobacteriaceae, which acquire fitness benefits while other families of symbiotic bacteria succumb to environmental changes inflicted by inflammation. Here we summarize studies that examined factors in the inflamed gut that contribute to blooms of Enterobacterieaceae, and highlight potential approaches to restrict Enterobacterial blooms in treating diseases that are otherwise complicated by overgrowth of virulent Enterobacterial species in the gut.","container-title":"Mucosal Immunology","DOI":"10.1038/mi.2016.75","ISSN":"1933-0219","issue":"1","journalAbbreviation":"Mucosal Immunology","page":"18-26","source":"ScienceDirect","title":"Mechanisms of inflammation-driven bacterial dysbiosis in the gut","volume":"10","author":[{"family":"Zeng","given":"M. Y."},{"family":"Inohara","given":"N."},{"family":"Nuñez","given":"G."}],"issued":{"date-parts":[["2017",1,1]]}}}],"schema":"https://github.com/citation-style-language/schema/raw/master/csl-citation.json"} </w:instrText>
       </w:r>
       <w:r>
         <w:fldChar w:fldCharType="separate"/>
@@ -4315,7 +4468,7 @@
           <w:i/>
           <w:iCs/>
         </w:rPr>
-        <w:t>99</w:t>
+        <w:t>102</w:t>
       </w:r>
       <w:r>
         <w:t xml:space="preserve">, </w:t>
@@ -4325,7 +4478,7 @@
           <w:i/>
           <w:iCs/>
         </w:rPr>
-        <w:t>100</w:t>
+        <w:t>103</w:t>
       </w:r>
       <w:r>
         <w:t>)</w:t>
@@ -4378,7 +4531,7 @@
         <w:fldChar w:fldCharType="begin"/>
       </w:r>
       <w:r>
-        <w:instrText xml:space="preserve"> ADDIN ZOTERO_ITEM CSL_CITATION {"citationID":"GyT07F19","properties":{"formattedCitation":"({\\i{}101})","plainCitation":"(101)","noteIndex":0},"citationItems":[{"id":3688,"uris":["http://zotero.org/users/13901503/items/45UWS9R3"],"itemData":{"id":3688,"type":"article-journal","container-title":"Cell Metabolism","DOI":"10.1016/j.cmet.2011.02.018","ISSN":"1550-4131","issue":"5","journalAbbreviation":"Cell Metabolism","language":"English","note":"publisher: Elsevier\nPMID: 21531334","page":"517-526","source":"www.cell.com","title":"The Microbiome and Butyrate Regulate Energy Metabolism and Autophagy in the Mammalian Colon","volume":"13","author":[{"family":"Donohoe","given":"Dallas R."},{"family":"Garge","given":"Nikhil"},{"family":"Zhang","given":"Xinxin"},{"family":"Sun","given":"Wei"},{"family":"O'Connell","given":"Thomas M."},{"family":"Bunger","given":"Maureen K."},{"family":"Bultman","given":"Scott J."}],"issued":{"date-parts":[["2011",5,4]]}}}],"schema":"https://github.com/citation-style-language/schema/raw/master/csl-citation.json"} </w:instrText>
+        <w:instrText xml:space="preserve"> ADDIN ZOTERO_ITEM CSL_CITATION {"citationID":"GyT07F19","properties":{"formattedCitation":"({\\i{}104})","plainCitation":"(104)","noteIndex":0},"citationItems":[{"id":3688,"uris":["http://zotero.org/users/13901503/items/45UWS9R3"],"itemData":{"id":3688,"type":"article-journal","container-title":"Cell Metabolism","DOI":"10.1016/j.cmet.2011.02.018","ISSN":"1550-4131","issue":"5","journalAbbreviation":"Cell Metabolism","language":"English","note":"publisher: Elsevier\nPMID: 21531334","page":"517-526","source":"www.cell.com","title":"The Microbiome and Butyrate Regulate Energy Metabolism and Autophagy in the Mammalian Colon","volume":"13","author":[{"family":"Donohoe","given":"Dallas R."},{"family":"Garge","given":"Nikhil"},{"family":"Zhang","given":"Xinxin"},{"family":"Sun","given":"Wei"},{"family":"O'Connell","given":"Thomas M."},{"family":"Bunger","given":"Maureen K."},{"family":"Bultman","given":"Scott J."}],"issued":{"date-parts":[["2011",5,4]]}}}],"schema":"https://github.com/citation-style-language/schema/raw/master/csl-citation.json"} </w:instrText>
       </w:r>
       <w:r>
         <w:fldChar w:fldCharType="separate"/>
@@ -4391,7 +4544,7 @@
           <w:i/>
           <w:iCs/>
         </w:rPr>
-        <w:t>101</w:t>
+        <w:t>104</w:t>
       </w:r>
       <w:r>
         <w:t>)</w:t>
@@ -4595,7 +4748,7 @@
         <w:fldChar w:fldCharType="begin"/>
       </w:r>
       <w:r>
-        <w:instrText xml:space="preserve"> ADDIN ZOTERO_ITEM CSL_CITATION {"citationID":"25zGiPQC","properties":{"formattedCitation":"({\\i{}102}, {\\i{}103})","plainCitation":"(102, 103)","noteIndex":0},"citationItems":[{"id":2229,"uris":["http://zotero.org/users/13901503/items/J3568CMW"],"itemData":{"id":2229,"type":"article-journal","abstract":"We investigated the changes in the faecal microbial population of the hindgut of farmed Atlantic salmon fed two commercial diets (A and B) over a 10-month period. At each sampling round, hindgut contents of 40 fish (20 per diet) were pooled according to diet and cultivated on selective agar. The functional status of all microbiota was assessed against 48 substrates using the PhPlate generalized microplate, which also yielded a metabolic capacity (MC) value for each microbiota. Virulence gene profiles of each microbiota were also investigated. The number of different bacterial groups between two diets varied slightly and increased as water temperature peaked at 18.5°C during summer. This however, was associated with an increase in Vibrio numbers and a decrease in lactic acid bacterial numbers. A shift in the functional status of gut microbiota was observed as temperature increased, which was coupled with a decrease in the MC-value of the microbiota in both diets. Of the 35 virulence genes tested from total DNA extract of the microbiota, only cdt and east1 were detected. Results indicate that temperature is the main driver of changes to the gut microbiota in farmed Tasmanian Atlantic salmon receiving these two diets.","container-title":"Aquaculture Research","DOI":"10.1111/are.12522","ISSN":"1365-2109","issue":"2","language":"en","license":"© 2014 John Wiley &amp; Sons Ltd","note":"_eprint: https://onlinelibrary.wiley.com/doi/pdf/10.1111/are.12522","page":"660-672","source":"Wiley Online Library","title":"The effect of diet and environmental temperature on the faecal microbiota of farmed Tasmanian Atlantic Salmon (almo salar L.)","volume":"47","author":[{"family":"Neuman","given":"Christina"},{"family":"Hatje","given":"Eva"},{"family":"Zarkasi","given":"Kamarul Z"},{"family":"Smullen","given":"Richard"},{"family":"Bowman","given":"John P"},{"family":"Katouli","given":"Mohammad"}],"issued":{"date-parts":[["2016"]]}}},{"id":2232,"uris":["http://zotero.org/users/13901503/items/TL348YX4"],"itemData":{"id":2232,"type":"article-journal","abstract":"Gut microbiota plays a determining role in the health status of the host. In general, a beneficial bacterial community, associated with a greater metabolic capacity and wellbeing, shows high values of species richness and relative abundance. Because environmental temperature is a regulating factor in fish physiological and metabolic processes, it is very important to understand the effect of environmental temperature on diversity and richness of gut microbiota in poikilothermic organisms. This study analysed the reciprocal diet-temperature correlations in the faecal microbiota diversity in Seriola lalandi. Juveniles were acclimated at 20 °C and 26 °C for 30 days; in addition, the fish were fed three diets with three levels of lipid inclusion (7%, 14% and 21%). Faecal microbiota in S. lalandi was characterized using the high-throughput sequencing approach based on the V3 region of the 16S rRNA gene. The most abundant phyla identified in this study were Proteobacteria, Actinobacteria, Bacteroidetes and Firmicutes. A significant change was observed in faecal microbiota in relation to acclimation temperature. The results indicated that species richness was modified in relation to the environmental temperatures; the Operational Taxonomic Units (OTUs) identified in fish acclimated at 26 °C belonged to the families Pseudomonadacea, Alcaligenaceae and Microbacteriaceae whereas those identified at 20 °C were Micavibrio, Comamonadaceae and Saprospiraceae. Furthermore, significant differences were observed between the OTUs identified in the dietary treatments, in which Actinobacteria (7% lipid), Gammaproteobacteria (14% lipid), Betaproteobacteria (21% lipid), and Flavobacteria (skretting diet) were the phyla preferentially identified from each treatment. The results obtained in this study demonstrated the importance of environmental temperature to maintain a balance in intestinal microbiota, as well as the effects of diet composition on proliferation of different microbial groups with respect to thermal induction.","container-title":"Aquaculture","DOI":"10.1016/j.aquaculture.2018.07.065","ISSN":"0044-8486","journalAbbreviation":"Aquaculture","page":"269-277","source":"ScienceDirect","title":"Effect of temperature and dietary lipid proportion on gut microbiota in yellowtail kingfish &lt;i&gt;Seriola lalandi&lt;/i&gt; juveniles","volume":"497","author":[{"family":"Soriano","given":"Ernesto Larios"},{"family":"Ramírez","given":"Dariel Tovar"},{"family":"Araujo","given":"Denise Re"},{"family":"Gómez-Gil","given":"Bruno"},{"family":"Castro","given":"Leonardo Ibarra"},{"family":"Sánchez","given":"Clara Galindo"}],"issued":{"date-parts":[["2018",12,1]]}}}],"schema":"https://github.com/citation-style-language/schema/raw/master/csl-citation.json"} </w:instrText>
+        <w:instrText xml:space="preserve"> ADDIN ZOTERO_ITEM CSL_CITATION {"citationID":"25zGiPQC","properties":{"formattedCitation":"({\\i{}105}, {\\i{}106})","plainCitation":"(105, 106)","noteIndex":0},"citationItems":[{"id":2229,"uris":["http://zotero.org/users/13901503/items/J3568CMW"],"itemData":{"id":2229,"type":"article-journal","abstract":"We investigated the changes in the faecal microbial population of the hindgut of farmed Atlantic salmon fed two commercial diets (A and B) over a 10-month period. At each sampling round, hindgut contents of 40 fish (20 per diet) were pooled according to diet and cultivated on selective agar. The functional status of all microbiota was assessed against 48 substrates using the PhPlate generalized microplate, which also yielded a metabolic capacity (MC) value for each microbiota. Virulence gene profiles of each microbiota were also investigated. The number of different bacterial groups between two diets varied slightly and increased as water temperature peaked at 18.5°C during summer. This however, was associated with an increase in Vibrio numbers and a decrease in lactic acid bacterial numbers. A shift in the functional status of gut microbiota was observed as temperature increased, which was coupled with a decrease in the MC-value of the microbiota in both diets. Of the 35 virulence genes tested from total DNA extract of the microbiota, only cdt and east1 were detected. Results indicate that temperature is the main driver of changes to the gut microbiota in farmed Tasmanian Atlantic salmon receiving these two diets.","container-title":"Aquaculture Research","DOI":"10.1111/are.12522","ISSN":"1365-2109","issue":"2","language":"en","license":"© 2014 John Wiley &amp; Sons Ltd","note":"_eprint: https://onlinelibrary.wiley.com/doi/pdf/10.1111/are.12522","page":"660-672","source":"Wiley Online Library","title":"The effect of diet and environmental temperature on the faecal microbiota of farmed Tasmanian Atlantic Salmon (almo salar L.)","volume":"47","author":[{"family":"Neuman","given":"Christina"},{"family":"Hatje","given":"Eva"},{"family":"Zarkasi","given":"Kamarul Z"},{"family":"Smullen","given":"Richard"},{"family":"Bowman","given":"John P"},{"family":"Katouli","given":"Mohammad"}],"issued":{"date-parts":[["2016"]]}}},{"id":2232,"uris":["http://zotero.org/users/13901503/items/TL348YX4"],"itemData":{"id":2232,"type":"article-journal","abstract":"Gut microbiota plays a determining role in the health status of the host. In general, a beneficial bacterial community, associated with a greater metabolic capacity and wellbeing, shows high values of species richness and relative abundance. Because environmental temperature is a regulating factor in fish physiological and metabolic processes, it is very important to understand the effect of environmental temperature on diversity and richness of gut microbiota in poikilothermic organisms. This study analysed the reciprocal diet-temperature correlations in the faecal microbiota diversity in Seriola lalandi. Juveniles were acclimated at 20 °C and 26 °C for 30 days; in addition, the fish were fed three diets with three levels of lipid inclusion (7%, 14% and 21%). Faecal microbiota in S. lalandi was characterized using the high-throughput sequencing approach based on the V3 region of the 16S rRNA gene. The most abundant phyla identified in this study were Proteobacteria, Actinobacteria, Bacteroidetes and Firmicutes. A significant change was observed in faecal microbiota in relation to acclimation temperature. The results indicated that species richness was modified in relation to the environmental temperatures; the Operational Taxonomic Units (OTUs) identified in fish acclimated at 26 °C belonged to the families Pseudomonadacea, Alcaligenaceae and Microbacteriaceae whereas those identified at 20 °C were Micavibrio, Comamonadaceae and Saprospiraceae. Furthermore, significant differences were observed between the OTUs identified in the dietary treatments, in which Actinobacteria (7% lipid), Gammaproteobacteria (14% lipid), Betaproteobacteria (21% lipid), and Flavobacteria (skretting diet) were the phyla preferentially identified from each treatment. The results obtained in this study demonstrated the importance of environmental temperature to maintain a balance in intestinal microbiota, as well as the effects of diet composition on proliferation of different microbial groups with respect to thermal induction.","container-title":"Aquaculture","DOI":"10.1016/j.aquaculture.2018.07.065","ISSN":"0044-8486","journalAbbreviation":"Aquaculture","page":"269-277","source":"ScienceDirect","title":"Effect of temperature and dietary lipid proportion on gut microbiota in yellowtail kingfish &lt;i&gt;Seriola lalandi&lt;/i&gt; juveniles","volume":"497","author":[{"family":"Soriano","given":"Ernesto Larios"},{"family":"Ramírez","given":"Dariel Tovar"},{"family":"Araujo","given":"Denise Re"},{"family":"Gómez-Gil","given":"Bruno"},{"family":"Castro","given":"Leonardo Ibarra"},{"family":"Sánchez","given":"Clara Galindo"}],"issued":{"date-parts":[["2018",12,1]]}}}],"schema":"https://github.com/citation-style-language/schema/raw/master/csl-citation.json"} </w:instrText>
       </w:r>
       <w:r>
         <w:fldChar w:fldCharType="separate"/>
@@ -4608,7 +4761,7 @@
           <w:i/>
           <w:iCs/>
         </w:rPr>
-        <w:t>102</w:t>
+        <w:t>105</w:t>
       </w:r>
       <w:r>
         <w:t xml:space="preserve">, </w:t>
@@ -4618,7 +4771,7 @@
           <w:i/>
           <w:iCs/>
         </w:rPr>
-        <w:t>103</w:t>
+        <w:t>106</w:t>
       </w:r>
       <w:r>
         <w:t>)</w:t>
@@ -4699,7 +4852,7 @@
         <w:fldChar w:fldCharType="begin"/>
       </w:r>
       <w:r>
-        <w:instrText xml:space="preserve"> ADDIN ZOTERO_ITEM CSL_CITATION {"citationID":"QftC6azE","properties":{"formattedCitation":"({\\i{}104})","plainCitation":"(104)","noteIndex":0},"citationItems":[{"id":1959,"uris":["http://zotero.org/users/13901503/items/ZXQ5TW3X"],"itemData":{"id":1959,"type":"article-journal","abstract":"Summary Numerous studies have investigated the effects of diet, phylogeny and immune status on the gut microbial communities of animals. Most of these studies are conducted on endotherms, especially mammals, which maintain constant body temperature in the face of environmental temperature variability. However, the majority of animals and vertebrates are ectotherms, which often experience fluctuations in body temperature as a result of their environment. While there have been several studies investigating the gut microbial diversity of ectotherms, we lack an understanding of how environmental temperature affects these communities. Here, we used high-throughput sequencing to inventory the gut microbial communities of tadpoles exposed to cool (18°C) or warm (28°C) temperature treatments. We found that temperature significantly impacted the community structure and membership of the tadpole gut. Specifically, tadpoles in the warm treatment exhibited higher abundances of the phylum Planctomycetes and the genus Mycobacterium. These results may be due to the direct effects of temperature, or mediated through changes in host physiology. Given that environmental temperatures are expected to increase due to global climate change, understanding the effects of temperature on the diversity and function of gut microbial communities is critical.","container-title":"Environmental Microbiology","DOI":"10.1111/1462-2920.13255","ISSN":"1462-2912","issue":"5","note":"publisher: John Wiley &amp; Sons, Ltd","page":"1561-1565","source":"enviromicro-journals-onlinelibrary-wiley-com.proxy.lib.umich.edu (Atypon)","title":"Effects of environmental temperature on the gut microbial communities of tadpoles","volume":"18","author":[{"family":"Kohl","given":"Kevin D."},{"family":"Yahn","given":"Jeremiah"}],"issued":{"date-parts":[["2016",5]]}}}],"schema":"https://github.com/citation-style-language/schema/raw/master/csl-citation.json"} </w:instrText>
+        <w:instrText xml:space="preserve"> ADDIN ZOTERO_ITEM CSL_CITATION {"citationID":"QftC6azE","properties":{"formattedCitation":"({\\i{}107})","plainCitation":"(107)","noteIndex":0},"citationItems":[{"id":1959,"uris":["http://zotero.org/users/13901503/items/ZXQ5TW3X"],"itemData":{"id":1959,"type":"article-journal","abstract":"Summary Numerous studies have investigated the effects of diet, phylogeny and immune status on the gut microbial communities of animals. Most of these studies are conducted on endotherms, especially mammals, which maintain constant body temperature in the face of environmental temperature variability. However, the majority of animals and vertebrates are ectotherms, which often experience fluctuations in body temperature as a result of their environment. While there have been several studies investigating the gut microbial diversity of ectotherms, we lack an understanding of how environmental temperature affects these communities. Here, we used high-throughput sequencing to inventory the gut microbial communities of tadpoles exposed to cool (18°C) or warm (28°C) temperature treatments. We found that temperature significantly impacted the community structure and membership of the tadpole gut. Specifically, tadpoles in the warm treatment exhibited higher abundances of the phylum Planctomycetes and the genus Mycobacterium. These results may be due to the direct effects of temperature, or mediated through changes in host physiology. Given that environmental temperatures are expected to increase due to global climate change, understanding the effects of temperature on the diversity and function of gut microbial communities is critical.","container-title":"Environmental Microbiology","DOI":"10.1111/1462-2920.13255","ISSN":"1462-2912","issue":"5","note":"publisher: John Wiley &amp; Sons, Ltd","page":"1561-1565","source":"enviromicro-journals-onlinelibrary-wiley-com.proxy.lib.umich.edu (Atypon)","title":"Effects of environmental temperature on the gut microbial communities of tadpoles","volume":"18","author":[{"family":"Kohl","given":"Kevin D."},{"family":"Yahn","given":"Jeremiah"}],"issued":{"date-parts":[["2016",5]]}}}],"schema":"https://github.com/citation-style-language/schema/raw/master/csl-citation.json"} </w:instrText>
       </w:r>
       <w:r>
         <w:fldChar w:fldCharType="separate"/>
@@ -4712,7 +4865,7 @@
           <w:i/>
           <w:iCs/>
         </w:rPr>
-        <w:t>104</w:t>
+        <w:t>107</w:t>
       </w:r>
       <w:r>
         <w:t>)</w:t>
@@ -4759,7 +4912,13 @@
         <w:fldChar w:fldCharType="end"/>
       </w:r>
       <w:r>
-        <w:t xml:space="preserve">. Although direct markers of redox balance are needed to assess the gut’s redox environment, the observed decline in redox-maintenance pathways suggests that rising temperatures impair microbial antioxidant capacity, which can disrupt the redox environment </w:t>
+        <w:t>. Although direct markers of redox balance are needed to assess the gut’s redox environment, the observed decline in redox-maintenance pathways</w:t>
+      </w:r>
+      <w:r>
+        <w:t xml:space="preserve"> (Fig 3C)</w:t>
+      </w:r>
+      <w:r>
+        <w:t xml:space="preserve"> suggests that rising temperatures impair microbial antioxidant capacity, which can disrupt the redox environment </w:t>
       </w:r>
       <w:r>
         <w:fldChar w:fldCharType="begin"/>
@@ -4797,13 +4956,19 @@
         <w:fldChar w:fldCharType="end"/>
       </w:r>
       <w:r>
-        <w:t xml:space="preserve">. We also observe an increase in DNA repair pathways that suggests cellular damage from the accumulation of ROS </w:t>
+        <w:t>. We also observe an increase in DNA repair pathways</w:t>
+      </w:r>
+      <w:r>
+        <w:t xml:space="preserve"> (Fig 3D)</w:t>
+      </w:r>
+      <w:r>
+        <w:t xml:space="preserve"> that suggests cellular damage from the accumulation of ROS </w:t>
       </w:r>
       <w:r>
         <w:fldChar w:fldCharType="begin"/>
       </w:r>
       <w:r>
-        <w:instrText xml:space="preserve"> ADDIN ZOTERO_ITEM CSL_CITATION {"citationID":"6OoDTMXc","properties":{"formattedCitation":"({\\i{}72})","plainCitation":"(72)","noteIndex":0},"citationItems":[{"id":3368,"uris":["http://zotero.org/users/13901503/items/R3YTNYU9"],"itemData":{"id":3368,"type":"article-journal","abstract":"Excess oxygen can disrupt the growth of most organisms, but the underlying mechanisms of damage have proved difficult to unravel. The model bacterium Escherichia coli represents the best understood organism in terms of the effects of and response to oxidative stress.Superoxide (O2−) and hydrogen peroxide (H2O2) are formed within cells when molecular oxygen (O2) adventitiously acquires electrons from the reduced cofactors of flavoproteins.Both O2− and H2O2 can oxidize the exposed Fe–S clusters of a family of dehydratases. This event destabilizes the clusters, and their consequent disintegration eliminates enzyme activity.O2− and H2O2 also inactivate a variety of non-redox enzymes that use single Fe2+ ions as catalytic cofactors.DNA is damaged when H2O2 reacts with the intracellular pool of unincorporated iron. The iron that is released from oxidized metalloproteins enlarges this pool and accelerates this process.The transcription factor OxyR detects modest increments in intracellular H2O2. It activates several responses that help preserve the activities of Fe–S and mononuclear metalloenzymes.The SoxRS system detects redox-active compounds that are released by plants and some bacteria. These compounds can generate toxic doses of O2−, and the SoxRS system acts primarily to minimize the amounts of these compounds inside the cell.Future studies should aim to determine whether the knowledge gained from studying oxidative stress in the facultative anaerobe E. coli is applicable to other organisms, such as strictly aerobic and microaerophilic bacteria.","container-title":"Nature Reviews Microbiology","DOI":"10.1038/nrmicro3032","ISSN":"1740-1534","issue":"7","journalAbbreviation":"Nat Rev Microbiol","language":"en","license":"2013 Springer Nature Limited","note":"publisher: Nature Publishing Group","page":"443-454","source":"www.nature.com","title":"The molecular mechanisms and physiological consequences of oxidative stress: lessons from a model bacterium","title-short":"The molecular mechanisms and physiological consequences of oxidative stress","volume":"11","author":[{"family":"Imlay","given":"James A."}],"issued":{"date-parts":[["2013",7]]}}}],"schema":"https://github.com/citation-style-language/schema/raw/master/csl-citation.json"} </w:instrText>
+        <w:instrText xml:space="preserve"> ADDIN ZOTERO_ITEM CSL_CITATION {"citationID":"6OoDTMXc","properties":{"formattedCitation":"({\\i{}76})","plainCitation":"(76)","noteIndex":0},"citationItems":[{"id":3368,"uris":["http://zotero.org/users/13901503/items/R3YTNYU9"],"itemData":{"id":3368,"type":"article-journal","abstract":"Excess oxygen can disrupt the growth of most organisms, but the underlying mechanisms of damage have proved difficult to unravel. The model bacterium Escherichia coli represents the best understood organism in terms of the effects of and response to oxidative stress.Superoxide (O2−) and hydrogen peroxide (H2O2) are formed within cells when molecular oxygen (O2) adventitiously acquires electrons from the reduced cofactors of flavoproteins.Both O2− and H2O2 can oxidize the exposed Fe–S clusters of a family of dehydratases. This event destabilizes the clusters, and their consequent disintegration eliminates enzyme activity.O2− and H2O2 also inactivate a variety of non-redox enzymes that use single Fe2+ ions as catalytic cofactors.DNA is damaged when H2O2 reacts with the intracellular pool of unincorporated iron. The iron that is released from oxidized metalloproteins enlarges this pool and accelerates this process.The transcription factor OxyR detects modest increments in intracellular H2O2. It activates several responses that help preserve the activities of Fe–S and mononuclear metalloenzymes.The SoxRS system detects redox-active compounds that are released by plants and some bacteria. These compounds can generate toxic doses of O2−, and the SoxRS system acts primarily to minimize the amounts of these compounds inside the cell.Future studies should aim to determine whether the knowledge gained from studying oxidative stress in the facultative anaerobe E. coli is applicable to other organisms, such as strictly aerobic and microaerophilic bacteria.","container-title":"Nature Reviews Microbiology","DOI":"10.1038/nrmicro3032","ISSN":"1740-1534","issue":"7","journalAbbreviation":"Nat Rev Microbiol","language":"en","license":"2013 Springer Nature Limited","note":"publisher: Nature Publishing Group","page":"443-454","source":"www.nature.com","title":"The molecular mechanisms and physiological consequences of oxidative stress: lessons from a model bacterium","title-short":"The molecular mechanisms and physiological consequences of oxidative stress","volume":"11","author":[{"family":"Imlay","given":"James A."}],"issued":{"date-parts":[["2013",7]]}}}],"schema":"https://github.com/citation-style-language/schema/raw/master/csl-citation.json"} </w:instrText>
       </w:r>
       <w:r>
         <w:fldChar w:fldCharType="separate"/>
@@ -4816,7 +4981,7 @@
           <w:i/>
           <w:iCs/>
         </w:rPr>
-        <w:t>72</w:t>
+        <w:t>76</w:t>
       </w:r>
       <w:r>
         <w:t>)</w:t>
@@ -4825,7 +4990,7 @@
         <w:fldChar w:fldCharType="end"/>
       </w:r>
       <w:r>
-        <w:t xml:space="preserve">(Fig 3 C &amp; D). Together, these results </w:t>
+        <w:t xml:space="preserve">. Together, these results </w:t>
       </w:r>
       <w:r>
         <w:lastRenderedPageBreak/>
@@ -4883,7 +5048,7 @@
         <w:fldChar w:fldCharType="begin"/>
       </w:r>
       <w:r>
-        <w:instrText xml:space="preserve"> ADDIN ZOTERO_ITEM CSL_CITATION {"citationID":"xhoCHL1h","properties":{"formattedCitation":"({\\i{}105}, {\\i{}106})","plainCitation":"(105, 106)","noteIndex":0},"citationItems":[{"id":545,"uris":["http://zotero.org/users/13901503/items/DK9CP8XR"],"itemData":{"id":545,"type":"article-journal","abstract":"We examined thermoregulatory behaviors in a wild population of white-faced capuchins (Cebus capucinus) inhabiting a highly seasonal dry forest in Santa Rosa National Park (SRNP), Costa Rica. The dry season in SRNP lasts </w:instrText>
+        <w:instrText xml:space="preserve"> ADDIN ZOTERO_ITEM CSL_CITATION {"citationID":"xhoCHL1h","properties":{"formattedCitation":"({\\i{}108}, {\\i{}109})","plainCitation":"(108, 109)","noteIndex":0},"citationItems":[{"id":545,"uris":["http://zotero.org/users/13901503/items/DK9CP8XR"],"itemData":{"id":545,"type":"article-journal","abstract":"We examined thermoregulatory behaviors in a wild population of white-faced capuchins (Cebus capucinus) inhabiting a highly seasonal dry forest in Santa Rosa National Park (SRNP), Costa Rica. The dry season in SRNP lasts </w:instrText>
       </w:r>
       <w:r>
         <w:rPr>
@@ -4905,7 +5070,7 @@
           <w:i/>
           <w:iCs/>
         </w:rPr>
-        <w:t>105</w:t>
+        <w:t>108</w:t>
       </w:r>
       <w:r>
         <w:t xml:space="preserve">, </w:t>
@@ -4915,7 +5080,7 @@
           <w:i/>
           <w:iCs/>
         </w:rPr>
-        <w:t>106</w:t>
+        <w:t>109</w:t>
       </w:r>
       <w:r>
         <w:t>)</w:t>
@@ -4941,7 +5106,7 @@
         <w:fldChar w:fldCharType="begin"/>
       </w:r>
       <w:r>
-        <w:instrText xml:space="preserve"> ADDIN ZOTERO_ITEM CSL_CITATION {"citationID":"rUdKSzFd","properties":{"formattedCitation":"({\\i{}42}, {\\i{}76})","plainCitation":"(42, 76)","noteIndex":0},"citationItems":[{"id":3266,"uris":["http://zotero.org/users/13901503/items/ZX3K6GKV"],"itemData":{"id":3266,"type":"article-journal","abstract":"In mice, provision of butyrate—a short-chain fatty acid produced by commensal microorganisms during starch fermentation—facilitates extrathymic generation and differentiation of Foxp3+ regulatory T cells, demonstrating that metabolic by-products are sensed by cells of the immune system and affect the balance between pro- and anti-inflammatory cells.","container-title":"Nature","DOI":"10.1038/nature12726","ISSN":"1476-4687","issue":"7480","language":"en","license":"2013 Springer Nature Limited","note":"publisher: Nature Publishing Group","page":"451-455","source":"www.nature.com","title":"Metabolites produced by commensal bacteria promote peripheral regulatory T-cell generation","volume":"504","author":[{"family":"Arpaia","given":"Nicholas"},{"family":"Campbell","given":"Clarissa"},{"family":"Fan","given":"Xiying"},{"family":"Dikiy","given":"Stanislav"},{"family":"Veeken","given":"Joris","non-dropping-particle":"van der"},{"family":"deRoos","given":"Paul"},{"family":"Liu","given":"Hui"},{"family":"Cross","given":"Justin R."},{"family":"Pfeffer","given":"Klaus"},{"family":"Coffer","given":"Paul J."},{"family":"Rudensky","given":"Alexander Y."}],"issued":{"date-parts":[["2013",12]]}}},{"id":3264,"uris":["http://zotero.org/users/13901503/items/8XXJ4CBR"],"itemData":{"id":3264,"type":"article-journal","abstract":"The gut microbial metabolite butyrate is shown to induce the differentiation of colonic T regulatory cells in mice and to ameliorate the development of colitis; it also increases histone H3 acetylation at the Foxp3 promoter.","container-title":"Nature","DOI":"10.1038/nature12721","ISSN":"1476-4687","issue":"7480","language":"en","license":"2013 Springer Nature Limited","note":"publisher: Nature Publishing Group","page":"446-450","source":"www.nature.com","title":"Commensal microbe-derived butyrate induces the differentiation of colonic regulatory T cells","volume":"504","author":[{"family":"Furusawa","given":"Yukihiro"},{"family":"Obata","given":"Yuuki"},{"family":"Fukuda","given":"Shinji"},{"family":"Endo","given":"Takaho A."},{"family":"Nakato","given":"Gaku"},{"family":"Takahashi","given":"Daisuke"},{"family":"Nakanishi","given":"Yumiko"},{"family":"Uetake","given":"Chikako"},{"family":"Kato","given":"Keiko"},{"family":"Kato","given":"Tamotsu"},{"family":"Takahashi","given":"Masumi"},{"family":"Fukuda","given":"Noriko N."},{"family":"Murakami","given":"Shinnosuke"},{"family":"Miyauchi","given":"Eiji"},{"family":"Hino","given":"Shingo"},{"family":"Atarashi","given":"Koji"},{"family":"Onawa","given":"Satoshi"},{"family":"Fujimura","given":"Yumiko"},{"family":"Lockett","given":"Trevor"},{"family":"Clarke","given":"Julie M."},{"family":"Topping","given":"David L."},{"family":"Tomita","given":"Masaru"},{"family":"Hori","given":"Shohei"},{"family":"Ohara","given":"Osamu"},{"family":"Morita","given":"Tatsuya"},{"family":"Koseki","given":"Haruhiko"},{"family":"Kikuchi","given":"Jun"},{"family":"Honda","given":"Kenya"},{"family":"Hase","given":"Koji"},{"family":"Ohno","given":"Hiroshi"}],"issued":{"date-parts":[["2013",12]]}}}],"schema":"https://github.com/citation-style-language/schema/raw/master/csl-citation.json"} </w:instrText>
+        <w:instrText xml:space="preserve"> ADDIN ZOTERO_ITEM CSL_CITATION {"citationID":"rUdKSzFd","properties":{"formattedCitation":"({\\i{}42}, {\\i{}80})","plainCitation":"(42, 80)","noteIndex":0},"citationItems":[{"id":3266,"uris":["http://zotero.org/users/13901503/items/ZX3K6GKV"],"itemData":{"id":3266,"type":"article-journal","abstract":"In mice, provision of butyrate—a short-chain fatty acid produced by commensal microorganisms during starch fermentation—facilitates extrathymic generation and differentiation of Foxp3+ regulatory T cells, demonstrating that metabolic by-products are sensed by cells of the immune system and affect the balance between pro- and anti-inflammatory cells.","container-title":"Nature","DOI":"10.1038/nature12726","ISSN":"1476-4687","issue":"7480","language":"en","license":"2013 Springer Nature Limited","note":"publisher: Nature Publishing Group","page":"451-455","source":"www.nature.com","title":"Metabolites produced by commensal bacteria promote peripheral regulatory T-cell generation","volume":"504","author":[{"family":"Arpaia","given":"Nicholas"},{"family":"Campbell","given":"Clarissa"},{"family":"Fan","given":"Xiying"},{"family":"Dikiy","given":"Stanislav"},{"family":"Veeken","given":"Joris","non-dropping-particle":"van der"},{"family":"deRoos","given":"Paul"},{"family":"Liu","given":"Hui"},{"family":"Cross","given":"Justin R."},{"family":"Pfeffer","given":"Klaus"},{"family":"Coffer","given":"Paul J."},{"family":"Rudensky","given":"Alexander Y."}],"issued":{"date-parts":[["2013",12]]}}},{"id":3264,"uris":["http://zotero.org/users/13901503/items/8XXJ4CBR"],"itemData":{"id":3264,"type":"article-journal","abstract":"The gut microbial metabolite butyrate is shown to induce the differentiation of colonic T regulatory cells in mice and to ameliorate the development of colitis; it also increases histone H3 acetylation at the Foxp3 promoter.","container-title":"Nature","DOI":"10.1038/nature12721","ISSN":"1476-4687","issue":"7480","language":"en","license":"2013 Springer Nature Limited","note":"publisher: Nature Publishing Group","page":"446-450","source":"www.nature.com","title":"Commensal microbe-derived butyrate induces the differentiation of colonic regulatory T cells","volume":"504","author":[{"family":"Furusawa","given":"Yukihiro"},{"family":"Obata","given":"Yuuki"},{"family":"Fukuda","given":"Shinji"},{"family":"Endo","given":"Takaho A."},{"family":"Nakato","given":"Gaku"},{"family":"Takahashi","given":"Daisuke"},{"family":"Nakanishi","given":"Yumiko"},{"family":"Uetake","given":"Chikako"},{"family":"Kato","given":"Keiko"},{"family":"Kato","given":"Tamotsu"},{"family":"Takahashi","given":"Masumi"},{"family":"Fukuda","given":"Noriko N."},{"family":"Murakami","given":"Shinnosuke"},{"family":"Miyauchi","given":"Eiji"},{"family":"Hino","given":"Shingo"},{"family":"Atarashi","given":"Koji"},{"family":"Onawa","given":"Satoshi"},{"family":"Fujimura","given":"Yumiko"},{"family":"Lockett","given":"Trevor"},{"family":"Clarke","given":"Julie M."},{"family":"Topping","given":"David L."},{"family":"Tomita","given":"Masaru"},{"family":"Hori","given":"Shohei"},{"family":"Ohara","given":"Osamu"},{"family":"Morita","given":"Tatsuya"},{"family":"Koseki","given":"Haruhiko"},{"family":"Kikuchi","given":"Jun"},{"family":"Honda","given":"Kenya"},{"family":"Hase","given":"Koji"},{"family":"Ohno","given":"Hiroshi"}],"issued":{"date-parts":[["2013",12]]}}}],"schema":"https://github.com/citation-style-language/schema/raw/master/csl-citation.json"} </w:instrText>
       </w:r>
       <w:r>
         <w:fldChar w:fldCharType="separate"/>
@@ -4964,7 +5129,7 @@
           <w:i/>
           <w:iCs/>
         </w:rPr>
-        <w:t>76</w:t>
+        <w:t>80</w:t>
       </w:r>
       <w:r>
         <w:t>)</w:t>
@@ -4979,7 +5144,7 @@
         <w:fldChar w:fldCharType="begin"/>
       </w:r>
       <w:r>
-        <w:instrText xml:space="preserve"> ADDIN ZOTERO_ITEM CSL_CITATION {"citationID":"5WMcbnWb","properties":{"formattedCitation":"({\\i{}43}, {\\i{}77})","plainCitation":"(43, 77)","noteIndex":0},"citationItems":[{"id":3176,"uris":["http://zotero.org/users/13901503/items/HTMPX6GE"],"itemData":{"id":3176,"type":"article-journal","abstract":"Monocytes are a major population of circulating immune cells that play a crucial role in producing pro-inflammatory cytokines in the body. The actions of monocytes are known to be influenced by the combinations and concentrations of certain fatty acids (FAs) in blood and dietary fats. However, systemic comparisons of the effects of FAs on cytokine secretion by monocytes have not be performed. In this study, we compared how six saturated FAs (SFAs), two monounsaturated FAs (MUFAs), and seven polyunsaturated FAs (PUFAs) modulate human THP-1 monocyte secretion of TNF, IL-1β, and IL-6 in the absence or presence of lipopolysaccharide. SFAs generally stimulated resting THP-1 cells to secrete pro-inflammatory cytokines, with stearic acid being the most potent species. In contrast, MUFAs and PUFAs inhibited lipopolysaccharide-induced secretion of pro-inflammatory cytokines. Interestingly, the inhibitory potentials of MUFAs and PUFAs followed U-shaped (TNF and IL-1β) or inverted U-shaped (IL-6) dose–response curves. Among the MUFAs and PUFAs that were analyzed, docosahexaenoic acid (C22:6 n-3) exhibited the largest number of double bonds and was found to be the most potent anti-inflammatory compound. Together, our findings reveal that the chemical compositions and concentrations of dietary FAs are key factors in the intricate regulation of monocyte-mediated inflammation.","container-title":"Scientific Reports","DOI":"10.1038/s41598-023-32710-5","ISSN":"2045-2322","issue":"1","journalAbbreviation":"Sci Rep","language":"en","license":"2023 The Author(s)","note":"publisher: Nature Publishing Group","page":"5511","source":"www.nature.com","title":"Dietary fatty acids differentially affect secretion of pro-inflammatory cytokines in human THP-1 monocytes","volume":"13","author":[{"family":"Hung","given":"Hao-Chang"},{"family":"Tsai","given":"Sheng-Feng"},{"family":"Chou","given":"Hsuan-Wen"},{"family":"Tsai","given":"Ming-Jun"},{"family":"Hsu","given":"Pei-Ling"},{"family":"Kuo","given":"Yu-Min"}],"issued":{"date-parts":[["2023",4,4]]}}},{"id":2208,"uris":["http://zotero.org/users/13901503/items/CGJLGGCV"],"itemData":{"id":2208,"type":"article-journal","abstract":"The short chain fatty acid butyrate promotes proliferation and survival of normal epithelial cells, but induces G1 or G2-M arrest in transformed cells, which is coupled to differentiation and apoptosis. Local administration of butyrate has been shown to ameliorate inflammation in ulcerative colitis; however, the precise mechanism of its anti-inflammatory activity is not known. IFN-γ is one of the principle cytokines secreted by lamina propria cells in inflamed mucosa and elevated levels of the transcription factor required for IFN-γ signaling, STAT1 (signal transducer and activator of transcription 1), are present in the colonic mucosa of patients with ulcerative colitis and Crohn's disease. Here we report that butyrate is a strong inhibitor of signaling by IFN-γ. We demonstrated that this short chain fatty acid inhibits IFN-γ-induced tyrosine and serine phosphorylation of STAT1. IFN-γ-induced JAK2 activation was inhibited by butyrate, implicating JAK2 as a target of butyrate action. Accordingly, STAT1 nuclear translocation and its DNA binding were completely inhibited in butyrate-treated cells. Transient transfection experiments using a reporter gene construct containing eight GAS sites (γ-activated sites) revealed that butyrate inhibits IFN-γ induced, STAT1-dependent, transcriptional activation. Proinflammatory cytokines, including IFN-γ, play an important role in the pathogenesis of inflammatory bowel disease, and abnormal activity of STAT1 is associated with human malignancies and intestinal inflammatory diseases. Thus, our data suggest that butyrate negatively regulates mucosal inflammation through the inhibition of IFN-γ/STAT1 signaling.","container-title":"Molecular Cancer Research","ISSN":"1541-7786","issue":"11","journalAbbreviation":"Molecular Cancer Research","page":"855-862","source":"Silverchair","title":"Inhibition of Interferon γ Signaling by the Short Chain Fatty Acid Butyrate1","volume":"1","author":[{"family":"Klampfer","given":"Lidija"},{"family":"Huang","given":"Jie"},{"family":"Sasazuki","given":"Takehiko"},{"family":"Shirasawa","given":"Senji"},{"family":"Augenlicht","given":"Leonard"}],"issued":{"date-parts":[["2003",9,1]]}}}],"schema":"https://github.com/citation-style-language/schema/raw/master/csl-citation.json"} </w:instrText>
+        <w:instrText xml:space="preserve"> ADDIN ZOTERO_ITEM CSL_CITATION {"citationID":"5WMcbnWb","properties":{"formattedCitation":"({\\i{}43}, {\\i{}81})","plainCitation":"(43, 81)","noteIndex":0},"citationItems":[{"id":3176,"uris":["http://zotero.org/users/13901503/items/HTMPX6GE"],"itemData":{"id":3176,"type":"article-journal","abstract":"Monocytes are a major population of circulating immune cells that play a crucial role in producing pro-inflammatory cytokines in the body. The actions of monocytes are known to be influenced by the combinations and concentrations of certain fatty acids (FAs) in blood and dietary fats. However, systemic comparisons of the effects of FAs on cytokine secretion by monocytes have not be performed. In this study, we compared how six saturated FAs (SFAs), two monounsaturated FAs (MUFAs), and seven polyunsaturated FAs (PUFAs) modulate human THP-1 monocyte secretion of TNF, IL-1β, and IL-6 in the absence or presence of lipopolysaccharide. SFAs generally stimulated resting THP-1 cells to secrete pro-inflammatory cytokines, with stearic acid being the most potent species. In contrast, MUFAs and PUFAs inhibited lipopolysaccharide-induced secretion of pro-inflammatory cytokines. Interestingly, the inhibitory potentials of MUFAs and PUFAs followed U-shaped (TNF and IL-1β) or inverted U-shaped (IL-6) dose–response curves. Among the MUFAs and PUFAs that were analyzed, docosahexaenoic acid (C22:6 n-3) exhibited the largest number of double bonds and was found to be the most potent anti-inflammatory compound. Together, our findings reveal that the chemical compositions and concentrations of dietary FAs are key factors in the intricate regulation of monocyte-mediated inflammation.","container-title":"Scientific Reports","DOI":"10.1038/s41598-023-32710-5","ISSN":"2045-2322","issue":"1","journalAbbreviation":"Sci Rep","language":"en","license":"2023 The Author(s)","note":"publisher: Nature Publishing Group","page":"5511","source":"www.nature.com","title":"Dietary fatty acids differentially affect secretion of pro-inflammatory cytokines in human THP-1 monocytes","volume":"13","author":[{"family":"Hung","given":"Hao-Chang"},{"family":"Tsai","given":"Sheng-Feng"},{"family":"Chou","given":"Hsuan-Wen"},{"family":"Tsai","given":"Ming-Jun"},{"family":"Hsu","given":"Pei-Ling"},{"family":"Kuo","given":"Yu-Min"}],"issued":{"date-parts":[["2023",4,4]]}}},{"id":2208,"uris":["http://zotero.org/users/13901503/items/CGJLGGCV"],"itemData":{"id":2208,"type":"article-journal","abstract":"The short chain fatty acid butyrate promotes proliferation and survival of normal epithelial cells, but induces G1 or G2-M arrest in transformed cells, which is coupled to differentiation and apoptosis. Local administration of butyrate has been shown to ameliorate inflammation in ulcerative colitis; however, the precise mechanism of its anti-inflammatory activity is not known. IFN-γ is one of the principle cytokines secreted by lamina propria cells in inflamed mucosa and elevated levels of the transcription factor required for IFN-γ signaling, STAT1 (signal transducer and activator of transcription 1), are present in the colonic mucosa of patients with ulcerative colitis and Crohn's disease. Here we report that butyrate is a strong inhibitor of signaling by IFN-γ. We demonstrated that this short chain fatty acid inhibits IFN-γ-induced tyrosine and serine phosphorylation of STAT1. IFN-γ-induced JAK2 activation was inhibited by butyrate, implicating JAK2 as a target of butyrate action. Accordingly, STAT1 nuclear translocation and its DNA binding were completely inhibited in butyrate-treated cells. Transient transfection experiments using a reporter gene construct containing eight GAS sites (γ-activated sites) revealed that butyrate inhibits IFN-γ induced, STAT1-dependent, transcriptional activation. Proinflammatory cytokines, including IFN-γ, play an important role in the pathogenesis of inflammatory bowel disease, and abnormal activity of STAT1 is associated with human malignancies and intestinal inflammatory diseases. Thus, our data suggest that butyrate negatively regulates mucosal inflammation through the inhibition of IFN-γ/STAT1 signaling.","container-title":"Molecular Cancer Research","ISSN":"1541-7786","issue":"11","journalAbbreviation":"Molecular Cancer Research","page":"855-862","source":"Silverchair","title":"Inhibition of Interferon γ Signaling by the Short Chain Fatty Acid Butyrate1","volume":"1","author":[{"family":"Klampfer","given":"Lidija"},{"family":"Huang","given":"Jie"},{"family":"Sasazuki","given":"Takehiko"},{"family":"Shirasawa","given":"Senji"},{"family":"Augenlicht","given":"Leonard"}],"issued":{"date-parts":[["2003",9,1]]}}}],"schema":"https://github.com/citation-style-language/schema/raw/master/csl-citation.json"} </w:instrText>
       </w:r>
       <w:r>
         <w:fldChar w:fldCharType="separate"/>
@@ -5002,7 +5167,7 @@
           <w:i/>
           <w:iCs/>
         </w:rPr>
-        <w:t>77</w:t>
+        <w:t>81</w:t>
       </w:r>
       <w:r>
         <w:t>)</w:t>
@@ -5029,7 +5194,7 @@
         <w:fldChar w:fldCharType="begin"/>
       </w:r>
       <w:r>
-        <w:instrText xml:space="preserve"> ADDIN ZOTERO_ITEM CSL_CITATION {"citationID":"1C9evp4M","properties":{"formattedCitation":"({\\i{}107})","plainCitation":"(107)","noteIndex":0},"citationItems":[{"id":3724,"uris":["http://zotero.org/users/13901503/items/IM2TT9E8"],"itemData":{"id":3724,"type":"article-journal","abstract":"Reactive oxygen species (ROS) include superoxide, hydrogen peroxide, singlet oxygen, ozone, hypohalous acids and organic peroxides. They interact with and share some of the actions of other classes of small, reactive, endogenous signalling molecules — reactive nitrogen species such as NO• and NO2•; H2S or its anion, HS−; and carbon monoxide.ROS can both promote and prevent cell death, cancer, ageing and inflammation. For example, ROS mediate inflammasome activation, but patients with chronic granulomatous disease, who lack a functional form of a principal ROS-producing enzyme, NADPH oxidase 2 (NOX2), demonstrate considerable susceptibility to infection, as well as non-resolving inflammation.The numerous enzymatic sources of ROS include mitochondria and multiple isoforms of NOXs. The first NOX, now called NOX2, was discovered in neutrophils, but NOXs contribute to signal transduction in diverse cell types. ROS are produced following B and T cell receptor stimulation and can dictate whether T cell activation is fostered or impeded.Many antioxidant systems contribute to the regulation of ROS, including superoxide dismutases, catalases and the enzymes of the glutathione redox cycle, which reflects the widespread functional effects of ROS.Reactions involving ROS demonstrate atomic rather than molecular specificity. That is, ROS preferentially react with certain types of atoms and most readily with a subset of those atoms, but the atomic targets of ROS are distributed in many different macromolecules. For example, ROS preferentially react with the sulphur atom in some but not other cysteine residues; the cysteine thiols that are most susceptible include many that participate in enzyme active sites, such as in phosphatases. This kind of specificity equips ROS to influence many different signalling pathways simultaneously.The immunosuppressive capacity of myeloid-derived suppressor cells and regulatory T cells results in part from their production of ROS. Tumour cells also produce ROS, which can contribute to their immunosuppressive and metastatic potential.","container-title":"Nature Reviews Immunology","DOI":"10.1038/nri3423","ISSN":"1474-1741","issue":"5","journalAbbreviation":"Nat Rev Immunol","language":"en","license":"2013 Springer Nature Limited","note":"publisher: Nature Publishing Group","page":"349-361","source":"www-nature-com.proxy.lib.umich.edu","title":"Beyond oxidative stress: an immunologist's guide to reactive oxygen species","title-short":"Beyond oxidative stress","volume":"13","author":[{"family":"Nathan","given":"Carl"},{"family":"Cunningham-Bussel","given":"Amy"}],"issued":{"date-parts":[["2013",5]]}}}],"schema":"https://github.com/citation-style-language/schema/raw/master/csl-citation.json"} </w:instrText>
+        <w:instrText xml:space="preserve"> ADDIN ZOTERO_ITEM CSL_CITATION {"citationID":"1C9evp4M","properties":{"formattedCitation":"({\\i{}110})","plainCitation":"(110)","noteIndex":0},"citationItems":[{"id":3724,"uris":["http://zotero.org/users/13901503/items/IM2TT9E8"],"itemData":{"id":3724,"type":"article-journal","abstract":"Reactive oxygen species (ROS) include superoxide, hydrogen peroxide, singlet oxygen, ozone, hypohalous acids and organic peroxides. They interact with and share some of the actions of other classes of small, reactive, endogenous signalling molecules — reactive nitrogen species such as NO• and NO2•; H2S or its anion, HS−; and carbon monoxide.ROS can both promote and prevent cell death, cancer, ageing and inflammation. For example, ROS mediate inflammasome activation, but patients with chronic granulomatous disease, who lack a functional form of a principal ROS-producing enzyme, NADPH oxidase 2 (NOX2), demonstrate considerable susceptibility to infection, as well as non-resolving inflammation.The numerous enzymatic sources of ROS include mitochondria and multiple isoforms of NOXs. The first NOX, now called NOX2, was discovered in neutrophils, but NOXs contribute to signal transduction in diverse cell types. ROS are produced following B and T cell receptor stimulation and can dictate whether T cell activation is fostered or impeded.Many antioxidant systems contribute to the regulation of ROS, including superoxide dismutases, catalases and the enzymes of the glutathione redox cycle, which reflects the widespread functional effects of ROS.Reactions involving ROS demonstrate atomic rather than molecular specificity. That is, ROS preferentially react with certain types of atoms and most readily with a subset of those atoms, but the atomic targets of ROS are distributed in many different macromolecules. For example, ROS preferentially react with the sulphur atom in some but not other cysteine residues; the cysteine thiols that are most susceptible include many that participate in enzyme active sites, such as in phosphatases. This kind of specificity equips ROS to influence many different signalling pathways simultaneously.The immunosuppressive capacity of myeloid-derived suppressor cells and regulatory T cells results in part from their production of ROS. Tumour cells also produce ROS, which can contribute to their immunosuppressive and metastatic potential.","container-title":"Nature Reviews Immunology","DOI":"10.1038/nri3423","ISSN":"1474-1741","issue":"5","journalAbbreviation":"Nat Rev Immunol","language":"en","license":"2013 Springer Nature Limited","note":"publisher: Nature Publishing Group","page":"349-361","source":"www-nature-com.proxy.lib.umich.edu","title":"Beyond oxidative stress: an immunologist's guide to reactive oxygen species","title-short":"Beyond oxidative stress","volume":"13","author":[{"family":"Nathan","given":"Carl"},{"family":"Cunningham-Bussel","given":"Amy"}],"issued":{"date-parts":[["2013",5]]}}}],"schema":"https://github.com/citation-style-language/schema/raw/master/csl-citation.json"} </w:instrText>
       </w:r>
       <w:r>
         <w:fldChar w:fldCharType="separate"/>
@@ -5042,7 +5207,7 @@
           <w:i/>
           <w:iCs/>
         </w:rPr>
-        <w:t>107</w:t>
+        <w:t>110</w:t>
       </w:r>
       <w:r>
         <w:t>)</w:t>
@@ -5063,7 +5228,7 @@
         <w:fldChar w:fldCharType="begin"/>
       </w:r>
       <w:r>
-        <w:instrText xml:space="preserve"> ADDIN ZOTERO_ITEM CSL_CITATION {"citationID":"ZVo4Iuph","properties":{"formattedCitation":"({\\i{}108}, {\\i{}109})","plainCitation":"(108, 109)","noteIndex":0},"citationItems":[{"id":3497,"uris":["http://zotero.org/users/13901503/items/RMY7RJ4R"],"itemData":{"id":3497,"type":"article-journal","abstract":"Inflammatory bowel disease (IBD) is a long-term, progressive, and recurrent intestinal inflammatory disorder. The pathogenic mechanisms of IBD are multifaceted and associated with oxidative stress, unbalanced gut microbiota, and aberrant immune response. Indeed, oxidative stress can affect the progression and development of IBD by regulating the homeostasis of the gut microbiota and immune response. Therefore, redox-targeted therapy is a promising treatment option for IBD. Recent evidence has verified that Chinese herbal medicine (CHM)-derived polyphenols, natural antioxidants, are able to maintain redox equilibrium in the intestinal tract to prevent abnormal gut microbiota and radical inflammatory responses. Here, we provide a comprehensive perspective for implementing natural antioxidants as potential IBD candidate medications. In addition, we demonstrate novel technologies and stratagems for promoting the antioxidative properties of CHM-derived polyphenols, including novel delivery systems, chemical modifications, and combination strategies.","container-title":"Antioxidants","DOI":"10.3390/antiox12040967","ISSN":"2076-3921","issue":"4","language":"en","license":"http://creativecommons.org/licenses/by/3.0/","note":"number: 4\npublisher: Multidisciplinary Digital Publishing Institute","page":"967","source":"www-mdpi-com.proxy.lib.umich.edu","title":"Oxidative Stress, Inflammation, Gut Dysbiosis: What Can Polyphenols Do in Inflammatory Bowel Disease?","title-short":"Oxidative Stress, Inflammation, Gut Dysbiosis","volume":"12","author":[{"family":"Li","given":"Lei"},{"family":"Peng","given":"Peilan"},{"family":"Ding","given":"Ning"},{"family":"Jia","given":"Wenhui"},{"family":"Huang","given":"Canhua"},{"family":"Tang","given":"Yong"}],"issued":{"date-parts":[["2023",4]]}}},{"id":3251,"uris":["http://zotero.org/users/13901503/items/RA2W4N37"],"itemData":{"id":3251,"type":"article-journal","abstract":"Gut dysbiosis, resulting from an imbalance in the gut microbiome, can induce excessive production of reactive oxygen species (ROS), leading to inflammation, DNA damage, activation of the immune system, and epigenetic alterations of critical genes involved in the metabolic pathways. Gut dysbiosis-induced inflammation can also disrupt the gut barrier integrity and increase intestinal permeability, which allows gut-derived toxic products to enter the liver and systemic circulation, further triggering oxidative stress, inflammation, and epigenetic alterations associated with metabolic diseases. However, specific gut-derived metabolites, such as short-chain fatty acids (SCFAs), lactate, and vitamins, can modulate oxidative stress and the immune system through epigenetic mechanisms, thereby improving metabolic function. Gut microbiota and diet-induced metabolic diseases, such as obesity, insulin resistance, dyslipidemia, and hypertension, can transfer to the next generation, involving epigenetic mechanisms. In this review, we will introduce the key epigenetic alterations that, along with gut dysbiosis and ROS, are engaged in developing metabolic diseases. Finally, we will discuss potential therapeutic interventions such as dietary modifications, prebiotics, probiotics, postbiotics, and fecal microbiota transplantation, which may reduce oxidative stress and inflammation associated with metabolic syndrome by altering gut microbiota and epigenetic alterations. In summary, this review highlights the crucial role of gut microbiota dysbiosis, oxidative stress, and inflammation in the pathogenesis of metabolic diseases, with a particular focus on epigenetic alterations (including histone modifications, DNA methylomics, and RNA interference) and potential interventions that may prevent or improve metabolic diseases.","container-title":"Antioxidants","DOI":"10.3390/antiox13080985","ISSN":"2076-3921","issue":"8","language":"en","license":"http://creativecommons.org/licenses/by/3.0/","note":"number: 8\npublisher: Multidisciplinary Digital Publishing Institute","page":"985","source":"www-mdpi-com.proxy.lib.umich.edu","title":"Gut Microbiota Dysbiosis, Oxidative Stress, Inflammation, and Epigenetic Alterations in Metabolic Diseases","volume":"13","author":[{"family":"Mostafavi Abdolmaleky","given":"Hamid"},{"family":"Zhou","given":"Jin-Rong"}],"issued":{"date-parts":[["2024",8]]}}}],"schema":"https://github.com/citation-style-language/schema/raw/master/csl-citation.json"} </w:instrText>
+        <w:instrText xml:space="preserve"> ADDIN ZOTERO_ITEM CSL_CITATION {"citationID":"ZVo4Iuph","properties":{"formattedCitation":"({\\i{}111}, {\\i{}112})","plainCitation":"(111, 112)","noteIndex":0},"citationItems":[{"id":3497,"uris":["http://zotero.org/users/13901503/items/RMY7RJ4R"],"itemData":{"id":3497,"type":"article-journal","abstract":"Inflammatory bowel disease (IBD) is a long-term, progressive, and recurrent intestinal inflammatory disorder. The pathogenic mechanisms of IBD are multifaceted and associated with oxidative stress, unbalanced gut microbiota, and aberrant immune response. Indeed, oxidative stress can affect the progression and development of IBD by regulating the homeostasis of the gut microbiota and immune response. Therefore, redox-targeted therapy is a promising treatment option for IBD. Recent evidence has verified that Chinese herbal medicine (CHM)-derived polyphenols, natural antioxidants, are able to maintain redox equilibrium in the intestinal tract to prevent abnormal gut microbiota and radical inflammatory responses. Here, we provide a comprehensive perspective for implementing natural antioxidants as potential IBD candidate medications. In addition, we demonstrate novel technologies and stratagems for promoting the antioxidative properties of CHM-derived polyphenols, including novel delivery systems, chemical modifications, and combination strategies.","container-title":"Antioxidants","DOI":"10.3390/antiox12040967","ISSN":"2076-3921","issue":"4","language":"en","license":"http://creativecommons.org/licenses/by/3.0/","note":"number: 4\npublisher: Multidisciplinary Digital Publishing Institute","page":"967","source":"www-mdpi-com.proxy.lib.umich.edu","title":"Oxidative Stress, Inflammation, Gut Dysbiosis: What Can Polyphenols Do in Inflammatory Bowel Disease?","title-short":"Oxidative Stress, Inflammation, Gut Dysbiosis","volume":"12","author":[{"family":"Li","given":"Lei"},{"family":"Peng","given":"Peilan"},{"family":"Ding","given":"Ning"},{"family":"Jia","given":"Wenhui"},{"family":"Huang","given":"Canhua"},{"family":"Tang","given":"Yong"}],"issued":{"date-parts":[["2023",4]]}}},{"id":3251,"uris":["http://zotero.org/users/13901503/items/RA2W4N37"],"itemData":{"id":3251,"type":"article-journal","abstract":"Gut dysbiosis, resulting from an imbalance in the gut microbiome, can induce excessive production of reactive oxygen species (ROS), leading to inflammation, DNA damage, activation of the immune system, and epigenetic alterations of critical genes involved in the metabolic pathways. Gut dysbiosis-induced inflammation can also disrupt the gut barrier integrity and increase intestinal permeability, which allows gut-derived toxic products to enter the liver and systemic circulation, further triggering oxidative stress, inflammation, and epigenetic alterations associated with metabolic diseases. However, specific gut-derived metabolites, such as short-chain fatty acids (SCFAs), lactate, and vitamins, can modulate oxidative stress and the immune system through epigenetic mechanisms, thereby improving metabolic function. Gut microbiota and diet-induced metabolic diseases, such as obesity, insulin resistance, dyslipidemia, and hypertension, can transfer to the next generation, involving epigenetic mechanisms. In this review, we will introduce the key epigenetic alterations that, along with gut dysbiosis and ROS, are engaged in developing metabolic diseases. Finally, we will discuss potential therapeutic interventions such as dietary modifications, prebiotics, probiotics, postbiotics, and fecal microbiota transplantation, which may reduce oxidative stress and inflammation associated with metabolic syndrome by altering gut microbiota and epigenetic alterations. In summary, this review highlights the crucial role of gut microbiota dysbiosis, oxidative stress, and inflammation in the pathogenesis of metabolic diseases, with a particular focus on epigenetic alterations (including histone modifications, DNA methylomics, and RNA interference) and potential interventions that may prevent or improve metabolic diseases.","container-title":"Antioxidants","DOI":"10.3390/antiox13080985","ISSN":"2076-3921","issue":"8","language":"en","license":"http://creativecommons.org/licenses/by/3.0/","note":"number: 8\npublisher: Multidisciplinary Digital Publishing Institute","page":"985","source":"www-mdpi-com.proxy.lib.umich.edu","title":"Gut Microbiota Dysbiosis, Oxidative Stress, Inflammation, and Epigenetic Alterations in Metabolic Diseases","volume":"13","author":[{"family":"Mostafavi Abdolmaleky","given":"Hamid"},{"family":"Zhou","given":"Jin-Rong"}],"issued":{"date-parts":[["2024",8]]}}}],"schema":"https://github.com/citation-style-language/schema/raw/master/csl-citation.json"} </w:instrText>
       </w:r>
       <w:r>
         <w:fldChar w:fldCharType="separate"/>
@@ -5076,7 +5241,7 @@
           <w:i/>
           <w:iCs/>
         </w:rPr>
-        <w:t>108</w:t>
+        <w:t>111</w:t>
       </w:r>
       <w:r>
         <w:t xml:space="preserve">, </w:t>
@@ -5086,7 +5251,7 @@
           <w:i/>
           <w:iCs/>
         </w:rPr>
-        <w:t>109</w:t>
+        <w:t>112</w:t>
       </w:r>
       <w:r>
         <w:t>)</w:t>
@@ -5188,7 +5353,7 @@
           <w:i/>
           <w:iCs/>
         </w:rPr>
-        <w:instrText xml:space="preserve"> ADDIN ZOTERO_ITEM CSL_CITATION {"citationID":"56Usf7sy","properties":{"formattedCitation":"({\\i{}80}, {\\i{}81})","plainCitation":"(80, 81)","noteIndex":0},"citationItems":[{"id":2193,"uris":["http://zotero.org/users/13901503/items/TK9QBJNS"],"itemData":{"id":2193,"type":"article-journal","abstract":"Altered intestinal microbiota is associated with systemic and intestinal diseases, such as inflammatory bowel disease (IBD). Dysbiotic microbiota with enhanced proinflammatory capacity is characterized by depletion of anaerobic commensals, increased proportion of facultatively anaerobic bacteria, as well as reduced diversity and stability. In this study, we developed a high-throughput in vitro screening assay to isolate intestinal commensal bacteria with anti-inflammatory capacity from a healthy fecal microbiota transplantation donor. Freshly isolated gut bacteria were screened for their capacity to attenuate Escherichia coli lipopolysaccharide (LPS)-induced interleukin 8 (IL-8) release from HT-29 cells. The screen yielded a number of Bacteroides and Parabacteroides isolates, which were identified as P. distasonis, B. caccae, B. intestinalis, B. uniformis, B. fragilis, B. vulgatus and B. ovatus using whole genome sequencing. We observed that a cell-cell contact with the epithelium was not necessary to alleviate in vitro inflammation as spent culture media from the isolates were also effective and the anti-inflammatory action did not correlate with the enterocyte adherence capacity of the isolates. The anti-inflammatory isolates also exerted enterocyte monolayer reinforcing action and lacked essential genes to synthetize hexa-acylated, proinflammatory lipid A, part of LPS. Yet, the anti-inflammatory effector molecules remain to be identified. The Bacteroides strains isolated and characterized in this study have potential to be used as so-called next-generation probiotics.","container-title":"Nutrients","DOI":"10.3390/nu12040935","ISSN":"2072-6643","issue":"4","language":"en","license":"http://creativecommons.org/licenses/by/3.0/","note":"number: 4\npublisher: Multidisciplinary Digital Publishing Institute","page":"935","source":"www-mdpi-com.proxy.lib.umich.edu","title":"Isolation of Anti-Inflammatory and Epithelium Reinforcing Bacteroides and Parabacteroides Spp. from A Healthy Fecal Donor","volume":"12","author":[{"family":"Hiippala","given":"Kaisa"},{"family":"Kainulainen","given":"Veera"},{"family":"Suutarinen","given":"Maiju"},{"family":"Heini","given":"Tuomas"},{"family":"Bowers","given":"Jolene R."},{"family":"Jasso-Selles","given":"Daniel"},{"family":"Lemmer","given":"Darrin"},{"family":"Valentine","given":"Michael"},{"family":"Barnes","given":"Riley"},{"family":"Engelthaler","given":"David M."},{"family":"Satokari","given":"Reetta"}],"issued":{"date-parts":[["2020",4]]}}},{"id":2197,"uris":["http://zotero.org/users/13901503/items/QJXBZMS7"],"itemData":{"id":2197,"type":"article-journal","abstract":"&lt;p&gt;&lt;italic&gt;Alistipes&lt;/italic&gt; is a relatively new genus of bacteria isolated primarily from medical clinical samples, although at a low rate compared to other genus members of the &lt;italic&gt;Bacteroidetes&lt;/italic&gt; phylum, which are highly relevant in dysbiosis and disease. According to the taxonomy database at The National Center for Biotechnology Information, the genus consists of 13 species: &lt;italic&gt;Alistipes finegoldii, Alistipes putredinis, Alistipes onderdonkii, Alistipes shahii, Alistipes indistinctus, Alistipes senegalensis, Alistipes timonensis, Alistipes obesi, Alistipes ihumii, Alistipes inops, Alistipes megaguti, Alistipes provencensis&lt;/italic&gt;, and &lt;italic&gt;Alistipes massiliensis. Alistipes communis&lt;/italic&gt; and &lt;italic&gt;A. dispar&lt;/italic&gt;, and the subspecies &lt;italic&gt;A. Onderdonkii&lt;/italic&gt; subspecies vulgaris (vs. &lt;italic&gt;onderdonkii&lt;/italic&gt; subsp.) are the newest strains featured outside that list. Although typically isolated from the human gut microbiome various species of this genus have been isolated from patients suffering from appendicitis, and abdominal and rectal abscess. It is possible that as &lt;italic&gt;Alistipes&lt;/italic&gt; spp. emerge, their identification in clinical samples may be underrepresented as novel MS-TOF methods may not be fully capable to discriminate distinct species as separate since it will require the upgrading of MS-TOF identification databases. In terms of pathogenicity, there is contrasting evidence indicating that &lt;italic&gt;Alistipes&lt;/italic&gt; may have protective effects against some diseases, including liver fibrosis, colitis, cancer immunotherapy, and cardiovascular disease. In contrast, other studies indicate &lt;italic&gt;Alistipes&lt;/italic&gt; is pathogenic in colorectal cancer and is associated with mental signs of depression. Gut dysbiosis seems to play a role in determining the compositional abundance of &lt;italic&gt;Alistipes&lt;/italic&gt; in the feces (&lt;italic&gt;e.g&lt;/italic&gt;., in non-alcoholic steatohepatitis, hepatic encephalopathy, and liver fibrosis). Since &lt;italic&gt;Alistipes&lt;/italic&gt; is a relatively recent sub-branch genus of the &lt;italic&gt;Bacteroidetes&lt;/italic&gt; phylum, and since &lt;italic&gt;Bacteroidetes&lt;/italic&gt; are commonly associated with chronic intestinal inflammation, this narrative review illustrates emerging immunological and mechanistic implications by which &lt;italic&gt;Alistipes&lt;/italic&gt; spp. correlate with human health.&lt;/p&gt;","container-title":"Frontiers in Immunology","DOI":"10.3389/fimmu.2020.00906","ISSN":"1664-3224","journalAbbreviation":"Front. Immunol.","language":"English","note":"publisher: Frontiers","source":"Frontiers","title":"The Genus Alistipes: Gut Bacteria With Emerging Implications to Inflammation, Cancer, and Mental Health","title-short":"The Genus Alistipes","URL":"https://www.frontiersin.org/journals/immunology/articles/10.3389/fimmu.2020.00906/full","volume":"11","author":[{"family":"Parker","given":"Bianca J."},{"family":"Wearsch","given":"Pamela A."},{"family":"Veloo","given":"Alida C. M."},{"family":"Rodriguez-Palacios","given":"Alex"}],"accessed":{"date-parts":[["2025",3,31]]},"issued":{"date-parts":[["2020",6,9]]}}}],"schema":"https://github.com/citation-style-language/schema/raw/master/csl-citation.json"} </w:instrText>
+        <w:instrText xml:space="preserve"> ADDIN ZOTERO_ITEM CSL_CITATION {"citationID":"56Usf7sy","properties":{"formattedCitation":"({\\i{}84}, {\\i{}85})","plainCitation":"(84, 85)","noteIndex":0},"citationItems":[{"id":2193,"uris":["http://zotero.org/users/13901503/items/TK9QBJNS"],"itemData":{"id":2193,"type":"article-journal","abstract":"Altered intestinal microbiota is associated with systemic and intestinal diseases, such as inflammatory bowel disease (IBD). Dysbiotic microbiota with enhanced proinflammatory capacity is characterized by depletion of anaerobic commensals, increased proportion of facultatively anaerobic bacteria, as well as reduced diversity and stability. In this study, we developed a high-throughput in vitro screening assay to isolate intestinal commensal bacteria with anti-inflammatory capacity from a healthy fecal microbiota transplantation donor. Freshly isolated gut bacteria were screened for their capacity to attenuate Escherichia coli lipopolysaccharide (LPS)-induced interleukin 8 (IL-8) release from HT-29 cells. The screen yielded a number of Bacteroides and Parabacteroides isolates, which were identified as P. distasonis, B. caccae, B. intestinalis, B. uniformis, B. fragilis, B. vulgatus and B. ovatus using whole genome sequencing. We observed that a cell-cell contact with the epithelium was not necessary to alleviate in vitro inflammation as spent culture media from the isolates were also effective and the anti-inflammatory action did not correlate with the enterocyte adherence capacity of the isolates. The anti-inflammatory isolates also exerted enterocyte monolayer reinforcing action and lacked essential genes to synthetize hexa-acylated, proinflammatory lipid A, part of LPS. Yet, the anti-inflammatory effector molecules remain to be identified. The Bacteroides strains isolated and characterized in this study have potential to be used as so-called next-generation probiotics.","container-title":"Nutrients","DOI":"10.3390/nu12040935","ISSN":"2072-6643","issue":"4","language":"en","license":"http://creativecommons.org/licenses/by/3.0/","note":"number: 4\npublisher: Multidisciplinary Digital Publishing Institute","page":"935","source":"www-mdpi-com.proxy.lib.umich.edu","title":"Isolation of Anti-Inflammatory and Epithelium Reinforcing Bacteroides and Parabacteroides Spp. from A Healthy Fecal Donor","volume":"12","author":[{"family":"Hiippala","given":"Kaisa"},{"family":"Kainulainen","given":"Veera"},{"family":"Suutarinen","given":"Maiju"},{"family":"Heini","given":"Tuomas"},{"family":"Bowers","given":"Jolene R."},{"family":"Jasso-Selles","given":"Daniel"},{"family":"Lemmer","given":"Darrin"},{"family":"Valentine","given":"Michael"},{"family":"Barnes","given":"Riley"},{"family":"Engelthaler","given":"David M."},{"family":"Satokari","given":"Reetta"}],"issued":{"date-parts":[["2020",4]]}}},{"id":2197,"uris":["http://zotero.org/users/13901503/items/QJXBZMS7"],"itemData":{"id":2197,"type":"article-journal","abstract":"&lt;p&gt;&lt;italic&gt;Alistipes&lt;/italic&gt; is a relatively new genus of bacteria isolated primarily from medical clinical samples, although at a low rate compared to other genus members of the &lt;italic&gt;Bacteroidetes&lt;/italic&gt; phylum, which are highly relevant in dysbiosis and disease. According to the taxonomy database at The National Center for Biotechnology Information, the genus consists of 13 species: &lt;italic&gt;Alistipes finegoldii, Alistipes putredinis, Alistipes onderdonkii, Alistipes shahii, Alistipes indistinctus, Alistipes senegalensis, Alistipes timonensis, Alistipes obesi, Alistipes ihumii, Alistipes inops, Alistipes megaguti, Alistipes provencensis&lt;/italic&gt;, and &lt;italic&gt;Alistipes massiliensis. Alistipes communis&lt;/italic&gt; and &lt;italic&gt;A. dispar&lt;/italic&gt;, and the subspecies &lt;italic&gt;A. Onderdonkii&lt;/italic&gt; subspecies vulgaris (vs. &lt;italic&gt;onderdonkii&lt;/italic&gt; subsp.) are the newest strains featured outside that list. Although typically isolated from the human gut microbiome various species of this genus have been isolated from patients suffering from appendicitis, and abdominal and rectal abscess. It is possible that as &lt;italic&gt;Alistipes&lt;/italic&gt; spp. emerge, their identification in clinical samples may be underrepresented as novel MS-TOF methods may not be fully capable to discriminate distinct species as separate since it will require the upgrading of MS-TOF identification databases. In terms of pathogenicity, there is contrasting evidence indicating that &lt;italic&gt;Alistipes&lt;/italic&gt; may have protective effects against some diseases, including liver fibrosis, colitis, cancer immunotherapy, and cardiovascular disease. In contrast, other studies indicate &lt;italic&gt;Alistipes&lt;/italic&gt; is pathogenic in colorectal cancer and is associated with mental signs of depression. Gut dysbiosis seems to play a role in determining the compositional abundance of &lt;italic&gt;Alistipes&lt;/italic&gt; in the feces (&lt;italic&gt;e.g&lt;/italic&gt;., in non-alcoholic steatohepatitis, hepatic encephalopathy, and liver fibrosis). Since &lt;italic&gt;Alistipes&lt;/italic&gt; is a relatively recent sub-branch genus of the &lt;italic&gt;Bacteroidetes&lt;/italic&gt; phylum, and since &lt;italic&gt;Bacteroidetes&lt;/italic&gt; are commonly associated with chronic intestinal inflammation, this narrative review illustrates emerging immunological and mechanistic implications by which &lt;italic&gt;Alistipes&lt;/italic&gt; spp. correlate with human health.&lt;/p&gt;","container-title":"Frontiers in Immunology","DOI":"10.3389/fimmu.2020.00906","ISSN":"1664-3224","journalAbbreviation":"Front. Immunol.","language":"English","note":"publisher: Frontiers","source":"Frontiers","title":"The Genus Alistipes: Gut Bacteria With Emerging Implications to Inflammation, Cancer, and Mental Health","title-short":"The Genus Alistipes","URL":"https://www.frontiersin.org/journals/immunology/articles/10.3389/fimmu.2020.00906/full","volume":"11","author":[{"family":"Parker","given":"Bianca J."},{"family":"Wearsch","given":"Pamela A."},{"family":"Veloo","given":"Alida C. M."},{"family":"Rodriguez-Palacios","given":"Alex"}],"accessed":{"date-parts":[["2025",3,31]]},"issued":{"date-parts":[["2020",6,9]]}}}],"schema":"https://github.com/citation-style-language/schema/raw/master/csl-citation.json"} </w:instrText>
       </w:r>
       <w:r>
         <w:rPr>
@@ -5205,7 +5370,7 @@
           <w:i/>
           <w:iCs/>
         </w:rPr>
-        <w:t>80</w:t>
+        <w:t>84</w:t>
       </w:r>
       <w:r>
         <w:t xml:space="preserve">, </w:t>
@@ -5215,7 +5380,7 @@
           <w:i/>
           <w:iCs/>
         </w:rPr>
-        <w:t>81</w:t>
+        <w:t>85</w:t>
       </w:r>
       <w:r>
         <w:t>)</w:t>
@@ -5295,7 +5460,7 @@
         <w:fldChar w:fldCharType="begin"/>
       </w:r>
       <w:r>
-        <w:instrText xml:space="preserve"> ADDIN ZOTERO_ITEM CSL_CITATION {"citationID":"mhDvr5M0","properties":{"formattedCitation":"({\\i{}77})","plainCitation":"(77)","noteIndex":0},"citationItems":[{"id":3176,"uris":["http://zotero.org/users/13901503/items/HTMPX6GE"],"itemData":{"id":3176,"type":"article-journal","abstract":"Monocytes are a major population of circulating immune cells that play a crucial role in producing pro-inflammatory cytokines in the body. The actions of monocytes are known to be influenced by the combinations and concentrations of certain fatty acids (FAs) in blood and dietary fats. However, systemic comparisons of the effects of FAs on cytokine secretion by monocytes have not be performed. In this study, we compared how six saturated FAs (SFAs), two monounsaturated FAs (MUFAs), and seven polyunsaturated FAs (PUFAs) modulate human THP-1 monocyte secretion of TNF, IL-1β, and IL-6 in the absence or presence of lipopolysaccharide. SFAs generally stimulated resting THP-1 cells to secrete pro-inflammatory cytokines, with stearic acid being the most potent species. In contrast, MUFAs and PUFAs inhibited lipopolysaccharide-induced secretion of pro-inflammatory cytokines. Interestingly, the inhibitory potentials of MUFAs and PUFAs followed U-shaped (TNF and IL-1β) or inverted U-shaped (IL-6) dose–response curves. Among the MUFAs and PUFAs that were analyzed, docosahexaenoic acid (C22:6 n-3) exhibited the largest number of double bonds and was found to be the most potent anti-inflammatory compound. Together, our findings reveal that the chemical compositions and concentrations of dietary FAs are key factors in the intricate regulation of monocyte-mediated inflammation.","container-title":"Scientific Reports","DOI":"10.1038/s41598-023-32710-5","ISSN":"2045-2322","issue":"1","journalAbbreviation":"Sci Rep","language":"en","license":"2023 The Author(s)","note":"publisher: Nature Publishing Group","page":"5511","source":"www.nature.com","title":"Dietary fatty acids differentially affect secretion of pro-inflammatory cytokines in human THP-1 monocytes","volume":"13","author":[{"family":"Hung","given":"Hao-Chang"},{"family":"Tsai","given":"Sheng-Feng"},{"family":"Chou","given":"Hsuan-Wen"},{"family":"Tsai","given":"Ming-Jun"},{"family":"Hsu","given":"Pei-Ling"},{"family":"Kuo","given":"Yu-Min"}],"issued":{"date-parts":[["2023",4,4]]}}}],"schema":"https://github.com/citation-style-language/schema/raw/master/csl-citation.json"} </w:instrText>
+        <w:instrText xml:space="preserve"> ADDIN ZOTERO_ITEM CSL_CITATION {"citationID":"mhDvr5M0","properties":{"formattedCitation":"({\\i{}81})","plainCitation":"(81)","noteIndex":0},"citationItems":[{"id":3176,"uris":["http://zotero.org/users/13901503/items/HTMPX6GE"],"itemData":{"id":3176,"type":"article-journal","abstract":"Monocytes are a major population of circulating immune cells that play a crucial role in producing pro-inflammatory cytokines in the body. The actions of monocytes are known to be influenced by the combinations and concentrations of certain fatty acids (FAs) in blood and dietary fats. However, systemic comparisons of the effects of FAs on cytokine secretion by monocytes have not be performed. In this study, we compared how six saturated FAs (SFAs), two monounsaturated FAs (MUFAs), and seven polyunsaturated FAs (PUFAs) modulate human THP-1 monocyte secretion of TNF, IL-1β, and IL-6 in the absence or presence of lipopolysaccharide. SFAs generally stimulated resting THP-1 cells to secrete pro-inflammatory cytokines, with stearic acid being the most potent species. In contrast, MUFAs and PUFAs inhibited lipopolysaccharide-induced secretion of pro-inflammatory cytokines. Interestingly, the inhibitory potentials of MUFAs and PUFAs followed U-shaped (TNF and IL-1β) or inverted U-shaped (IL-6) dose–response curves. Among the MUFAs and PUFAs that were analyzed, docosahexaenoic acid (C22:6 n-3) exhibited the largest number of double bonds and was found to be the most potent anti-inflammatory compound. Together, our findings reveal that the chemical compositions and concentrations of dietary FAs are key factors in the intricate regulation of monocyte-mediated inflammation.","container-title":"Scientific Reports","DOI":"10.1038/s41598-023-32710-5","ISSN":"2045-2322","issue":"1","journalAbbreviation":"Sci Rep","language":"en","license":"2023 The Author(s)","note":"publisher: Nature Publishing Group","page":"5511","source":"www.nature.com","title":"Dietary fatty acids differentially affect secretion of pro-inflammatory cytokines in human THP-1 monocytes","volume":"13","author":[{"family":"Hung","given":"Hao-Chang"},{"family":"Tsai","given":"Sheng-Feng"},{"family":"Chou","given":"Hsuan-Wen"},{"family":"Tsai","given":"Ming-Jun"},{"family":"Hsu","given":"Pei-Ling"},{"family":"Kuo","given":"Yu-Min"}],"issued":{"date-parts":[["2023",4,4]]}}}],"schema":"https://github.com/citation-style-language/schema/raw/master/csl-citation.json"} </w:instrText>
       </w:r>
       <w:r>
         <w:fldChar w:fldCharType="separate"/>
@@ -5308,7 +5473,7 @@
           <w:i/>
           <w:iCs/>
         </w:rPr>
-        <w:t>77</w:t>
+        <w:t>81</w:t>
       </w:r>
       <w:r>
         <w:t>)</w:t>
@@ -5329,7 +5494,7 @@
         <w:fldChar w:fldCharType="begin"/>
       </w:r>
       <w:r>
-        <w:instrText xml:space="preserve"> ADDIN ZOTERO_ITEM CSL_CITATION {"citationID":"0vbqoJY6","properties":{"formattedCitation":"({\\i{}110}, {\\i{}111})","plainCitation":"(110, 111)","noteIndex":0},"citationItems":[{"id":3659,"uris":["http://zotero.org/users/13901503/items/WFUC2V8A"],"itemData":{"id":3659,"type":"article-journal","abstract":"A pathway for the production of aromatic amino acid metabolites in Clostridium sporogenes is described; modulation of serum levels of these metabolites in gnotobiotic mice affects intestinal permeability and systemic immunity.","container-title":"Nature","DOI":"10.1038/nature24661","ISSN":"1476-4687","issue":"7682","language":"en","license":"2017 Macmillan Publishers Limited, part of Springer Nature. All rights reserved.","note":"publisher: Nature Publishing Group","page":"648-652","source":"www-nature-com.proxy.lib.umich.edu","title":"A gut bacterial pathway metabolizes aromatic amino acids into nine circulating metabolites","volume":"551","author":[{"family":"Dodd","given":"Dylan"},{"family":"Spitzer","given":"Matthew H."},{"family":"Van Treuren","given":"William"},{"family":"Merrill","given":"Bryan D."},{"family":"Hryckowian","given":"Andrew J."},{"family":"Higginbottom","given":"Steven K."},{"family":"Le","given":"Anthony"},{"family":"Cowan","given":"Tina M."},{"family":"Nolan","given":"Garry P."},{"family":"Fischbach","given":"Michael A."},{"family":"Sonnenburg","given":"Justin L."}],"issued":{"date-parts":[["2017",11]]}}},{"id":3657,"uris":["http://zotero.org/users/13901503/items/6BWMVY9X"],"itemData":{"id":3657,"type":"article-journal","container-title":"Immunity","DOI":"10.1016/j.immuni.2013.08.003","ISSN":"1074-7613","issue":"2","journalAbbreviation":"Immunity","language":"English","note":"publisher: Elsevier","page":"372-385","source":"www-cell-com.proxy.lib.umich.edu","title":"Tryptophan Catabolites from Microbiota Engage Aryl Hydrocarbon Receptor and Balance Mucosal Reactivity via Interleukin-22","volume":"39","author":[{"family":"Zelante","given":"Teresa"},{"family":"Iannitti","given":"Rossana G."},{"family":"Cunha","given":"Cristina"},{"family":"De Luca","given":"Antonella"},{"family":"Giovannini","given":"Gloria"},{"family":"Pieraccini","given":"Giuseppe"},{"family":"Zecchi","given":"Riccardo"},{"family":"D’Angelo","given":"Carmen"},{"family":"Massi-Benedetti","given":"Cristina"},{"family":"Fallarino","given":"Francesca"},{"family":"Carvalho","given":"Agostinho"},{"family":"Puccetti","given":"Paolo"},{"family":"Romani","given":"Luigina"}],"issued":{"date-parts":[["2013",8,22]]}}}],"schema":"https://github.com/citation-style-language/schema/raw/master/csl-citation.json"} </w:instrText>
+        <w:instrText xml:space="preserve"> ADDIN ZOTERO_ITEM CSL_CITATION {"citationID":"0vbqoJY6","properties":{"formattedCitation":"({\\i{}113}, {\\i{}114})","plainCitation":"(113, 114)","noteIndex":0},"citationItems":[{"id":3659,"uris":["http://zotero.org/users/13901503/items/WFUC2V8A"],"itemData":{"id":3659,"type":"article-journal","abstract":"A pathway for the production of aromatic amino acid metabolites in Clostridium sporogenes is described; modulation of serum levels of these metabolites in gnotobiotic mice affects intestinal permeability and systemic immunity.","container-title":"Nature","DOI":"10.1038/nature24661","ISSN":"1476-4687","issue":"7682","language":"en","license":"2017 Macmillan Publishers Limited, part of Springer Nature. All rights reserved.","note":"publisher: Nature Publishing Group","page":"648-652","source":"www-nature-com.proxy.lib.umich.edu","title":"A gut bacterial pathway metabolizes aromatic amino acids into nine circulating metabolites","volume":"551","author":[{"family":"Dodd","given":"Dylan"},{"family":"Spitzer","given":"Matthew H."},{"family":"Van Treuren","given":"William"},{"family":"Merrill","given":"Bryan D."},{"family":"Hryckowian","given":"Andrew J."},{"family":"Higginbottom","given":"Steven K."},{"family":"Le","given":"Anthony"},{"family":"Cowan","given":"Tina M."},{"family":"Nolan","given":"Garry P."},{"family":"Fischbach","given":"Michael A."},{"family":"Sonnenburg","given":"Justin L."}],"issued":{"date-parts":[["2017",11]]}}},{"id":3657,"uris":["http://zotero.org/users/13901503/items/6BWMVY9X"],"itemData":{"id":3657,"type":"article-journal","container-title":"Immunity","DOI":"10.1016/j.immuni.2013.08.003","ISSN":"1074-7613","issue":"2","journalAbbreviation":"Immunity","language":"English","note":"publisher: Elsevier","page":"372-385","source":"www-cell-com.proxy.lib.umich.edu","title":"Tryptophan Catabolites from Microbiota Engage Aryl Hydrocarbon Receptor and Balance Mucosal Reactivity via Interleukin-22","volume":"39","author":[{"family":"Zelante","given":"Teresa"},{"family":"Iannitti","given":"Rossana G."},{"family":"Cunha","given":"Cristina"},{"family":"De Luca","given":"Antonella"},{"family":"Giovannini","given":"Gloria"},{"family":"Pieraccini","given":"Giuseppe"},{"family":"Zecchi","given":"Riccardo"},{"family":"D’Angelo","given":"Carmen"},{"family":"Massi-Benedetti","given":"Cristina"},{"family":"Fallarino","given":"Francesca"},{"family":"Carvalho","given":"Agostinho"},{"family":"Puccetti","given":"Paolo"},{"family":"Romani","given":"Luigina"}],"issued":{"date-parts":[["2013",8,22]]}}}],"schema":"https://github.com/citation-style-language/schema/raw/master/csl-citation.json"} </w:instrText>
       </w:r>
       <w:r>
         <w:fldChar w:fldCharType="separate"/>
@@ -5342,7 +5507,7 @@
           <w:i/>
           <w:iCs/>
         </w:rPr>
-        <w:t>110</w:t>
+        <w:t>113</w:t>
       </w:r>
       <w:r>
         <w:t xml:space="preserve">, </w:t>
@@ -5352,7 +5517,7 @@
           <w:i/>
           <w:iCs/>
         </w:rPr>
-        <w:t>111</w:t>
+        <w:t>114</w:t>
       </w:r>
       <w:r>
         <w:t>)</w:t>
@@ -5482,7 +5647,7 @@
           <w:rStyle w:val="Strong"/>
           <w:rFonts w:eastAsiaTheme="majorEastAsia"/>
         </w:rPr>
-        <w:instrText xml:space="preserve"> ADDIN ZOTERO_ITEM CSL_CITATION {"citationID":"M9J7IkJO","properties":{"formattedCitation":"({\\i{}85})","plainCitation":"(85)","noteIndex":0},"citationItems":[{"id":3707,"uris":["http://zotero.org/users/13901503/items/DINXISI6"],"itemData":{"id":3707,"type":"article-journal","abstract":"The microorganisms that inhabit the human gastrointestinal tract comprise a complex ecosystem with functions that significantly contribute to our systemic metabolism and have an impact on health and disease. In line with its importance, the human gastrointestinal microbiota has been extensively studied. Despite the fact that a significant part of the intestinal microorganisms has not yet been cultured, presently over 1000 different microbial species that can reside in the human gastrointestinal tract have been identified. This review provides a systematic overview and detailed references of the total of 1057 intestinal species of Eukarya (92), Archaea (8) and Bacteria (957), based on the phylogenetic framework of their small subunit ribosomal RNA gene sequences. Moreover, it unifies knowledge about the prevalence, abundance, stability, physiology, genetics and the association with human health of these gastrointestinal microorganisms, which is currently scattered over a vast amount of literature published in the last 150 years. This detailed physiological and genetic information is expected to be instrumental in advancing our knowledge of the gastrointestinal microbiota. Moreover, it opens avenues for future comparative and functional metagenomic and other high-throughput approaches that need a systematic and physiological basis to have an impact.","container-title":"FEMS Microbiology Reviews","DOI":"10.1111/1574-6976.12075","ISSN":"0168-6445","issue":"5","journalAbbreviation":"FEMS Microbiology Reviews","page":"996-1047","source":"Silverchair","title":"The first 1000 cultured species of the human gastrointestinal microbiota","volume":"38","author":[{"family":"Rajilić-Stojanović","given":"Mirjana"},{"family":"Vos","given":"Willem M.","non-dropping-particle":"de"}],"issued":{"date-parts":[["2014",9,1]]}}}],"schema":"https://github.com/citation-style-language/schema/raw/master/csl-citation.json"} </w:instrText>
+        <w:instrText xml:space="preserve"> ADDIN ZOTERO_ITEM CSL_CITATION {"citationID":"M9J7IkJO","properties":{"formattedCitation":"({\\i{}89})","plainCitation":"(89)","noteIndex":0},"citationItems":[{"id":3707,"uris":["http://zotero.org/users/13901503/items/DINXISI6"],"itemData":{"id":3707,"type":"article-journal","abstract":"The microorganisms that inhabit the human gastrointestinal tract comprise a complex ecosystem with functions that significantly contribute to our systemic metabolism and have an impact on health and disease. In line with its importance, the human gastrointestinal microbiota has been extensively studied. Despite the fact that a significant part of the intestinal microorganisms has not yet been cultured, presently over 1000 different microbial species that can reside in the human gastrointestinal tract have been identified. This review provides a systematic overview and detailed references of the total of 1057 intestinal species of Eukarya (92), Archaea (8) and Bacteria (957), based on the phylogenetic framework of their small subunit ribosomal RNA gene sequences. Moreover, it unifies knowledge about the prevalence, abundance, stability, physiology, genetics and the association with human health of these gastrointestinal microorganisms, which is currently scattered over a vast amount of literature published in the last 150 years. This detailed physiological and genetic information is expected to be instrumental in advancing our knowledge of the gastrointestinal microbiota. Moreover, it opens avenues for future comparative and functional metagenomic and other high-throughput approaches that need a systematic and physiological basis to have an impact.","container-title":"FEMS Microbiology Reviews","DOI":"10.1111/1574-6976.12075","ISSN":"0168-6445","issue":"5","journalAbbreviation":"FEMS Microbiology Reviews","page":"996-1047","source":"Silverchair","title":"The first 1000 cultured species of the human gastrointestinal microbiota","volume":"38","author":[{"family":"Rajilić-Stojanović","given":"Mirjana"},{"family":"Vos","given":"Willem M.","non-dropping-particle":"de"}],"issued":{"date-parts":[["2014",9,1]]}}}],"schema":"https://github.com/citation-style-language/schema/raw/master/csl-citation.json"} </w:instrText>
       </w:r>
       <w:r>
         <w:rPr>
@@ -5501,7 +5666,7 @@
           <w:i/>
           <w:iCs/>
         </w:rPr>
-        <w:t>85</w:t>
+        <w:t>89</w:t>
       </w:r>
       <w:r>
         <w:t>)</w:t>
@@ -5575,7 +5740,7 @@
         <w:fldChar w:fldCharType="begin"/>
       </w:r>
       <w:r>
-        <w:instrText xml:space="preserve"> ADDIN ZOTERO_ITEM CSL_CITATION {"citationID":"PvilTIb8","properties":{"formattedCitation":"({\\i{}86}, {\\i{}87})","plainCitation":"(86, 87)","noteIndex":0},"citationItems":[{"id":3666,"uris":["http://zotero.org/users/13901503/items/787C6UND"],"itemData":{"id":3666,"type":"article-journal","abstract":"&lt;p&gt;The glyoxylate shunt (GS) is a two-step metabolic pathway (isocitrate lyase, &lt;i&gt;aceA&lt;/i&gt;; and malate synthase, &lt;i&gt;glcB&lt;/i&gt;) that serves as an alternative to the tricarboxylic acid cycle. The GS bypasses the carbon dioxide-producing steps of the tricarboxylic acid cycle and is essential for acetate and fatty acid metabolism in bacteria. GS can be up-regulated under conditions of oxidative stress, antibiotic stress, and host infection, which implies that it plays important but poorly explored roles in stress defense and pathogenesis. In many bacterial species, including &lt;i&gt;Pseudomonas aeruginosa&lt;/i&gt;, &lt;i&gt;aceA&lt;/i&gt; and &lt;i&gt;glcB&lt;/i&gt; are not in an operon, unlike in &lt;i&gt;Escherichia coli&lt;/i&gt;. In &lt;i&gt;P. aeruginosa&lt;/i&gt;, we explored relationships between GS genes and growth, transcription profiles, and biofilm formation. Contrary to our expectations, deletion of &lt;i&gt;aceA&lt;/i&gt; in &lt;i&gt;P. aeruginosa&lt;/i&gt; improved cell growth under conditions of oxidative and antibiotic stress. Transcriptome data suggested that &lt;i&gt;aceA&lt;/i&gt; mutants underwent a metabolic shift toward aerobic denitrification; this was supported by additional evidence, including up-regulation of denitrification-related genes, decreased oxygen consumption without lowering ATP yield, increased production of denitrification intermediates (NO and N&lt;sub&gt;2&lt;/sub&gt;O), and increased cyanide resistance. The &lt;i&gt;aceA&lt;/i&gt; mutants also produced a thicker exopolysaccharide layer; that is, a phenotype consistent with aerobic denitrification. A bioinformatic survey across known bacterial genomes showed that only microorganisms capable of aerobic metabolism possess the glyoxylate shunt. This trend is consistent with the hypothesis that the GS plays a previously unrecognized role in allowing bacteria to tolerate oxidative stress.&lt;/p&gt;","container-title":"Journal of Biological Chemistry","DOI":"10.1074/jbc.M115.708149","ISSN":"0021-9258, 1083-351X","issue":"22","journalAbbreviation":"Journal of Biological Chemistry","language":"English","note":"publisher: Elsevier","page":"11928-11938","source":"www-jbc-org.proxy.lib.umich.edu","title":"Role of Glyoxylate Shunt in Oxidative Stress Response","volume":"291","author":[{"family":"Ahn","given":"Sungeun"},{"family":"Jung","given":"Jaejoon"},{"family":"Jang","given":"In-Ae"},{"family":"Madsen","given":"Eugene L."},{"family":"Park","given":"Woojun"}],"issued":{"date-parts":[["2016",5,27]]}}},{"id":3661,"uris":["http://zotero.org/users/13901503/items/7EH7QSRX"],"itemData":{"id":3661,"type":"article-journal","abstract":"Rubisco is the predominant enzymatic mechanism in the biosphere by which autotrophic bacteria, algae, and terrestrial plants fix CO2 into organic biomass via the Calvin–Benson–Basham reductive pentose phosphate pathway. Rubisco is not a perfect catalyst, suffering from low turnover rates, a low affinity for its CO2 substrate, and a competitive inhibition by O2 as an alternative substrate. As a consequence of changing environmental conditions over the past 3.5 billion years, with decreasing CO2 and increasing O2 in the atmosphere, Rubisco has evolved into multiple enzymatic forms with a range of kinetic properties, as well as co-evolving with CO2-concentrating mechanisms to cope with the different environmental contexts in which it must operate. The most dramatic evidence of this is the occurrence of multiple forms of Rubisco within autotrophic proteobacteria, where Forms II, IC, IBc, IAc, and IAq can be found either singly or in multiple combinations within a particular bacterial genome. Over the past few years there has been increasing availability of genomic sequence data for bacteria and this has allowed us to gain more extensive insights into the functional significance of this diversification. This paper is focused on summarizing what is known about the diversity of Rubisco forms, their kinetic properties, development of bacterial CO2-concentrating mechanisms, and correlations with metabolic flexibility and inorganic carbon environments in which proteobacteria perform various types of obligate and facultative chemo- and photoautotrophic CO2 fixation.","container-title":"Journal of Experimental Botany","DOI":"10.1093/jxb/erm297","ISSN":"0022-0957","issue":"7","journalAbbreviation":"Journal of Experimental Botany","page":"1525-1541","source":"Silverchair","title":"Multiple Rubisco forms in proteobacteria: their functional significance in relation to CO2 acquisition by the CBB cycle","title-short":"Multiple Rubisco forms in proteobacteria","volume":"59","author":[{"family":"Badger","given":"Murray Ronald"},{"family":"Bek","given":"Emily Jane"}],"issued":{"date-parts":[["2008",5,1]]}}}],"schema":"https://github.com/citation-style-language/schema/raw/master/csl-citation.json"} </w:instrText>
+        <w:instrText xml:space="preserve"> ADDIN ZOTERO_ITEM CSL_CITATION {"citationID":"PvilTIb8","properties":{"formattedCitation":"({\\i{}90}, {\\i{}91})","plainCitation":"(90, 91)","noteIndex":0},"citationItems":[{"id":3666,"uris":["http://zotero.org/users/13901503/items/787C6UND"],"itemData":{"id":3666,"type":"article-journal","abstract":"&lt;p&gt;The glyoxylate shunt (GS) is a two-step metabolic pathway (isocitrate lyase, &lt;i&gt;aceA&lt;/i&gt;; and malate synthase, &lt;i&gt;glcB&lt;/i&gt;) that serves as an alternative to the tricarboxylic acid cycle. The GS bypasses the carbon dioxide-producing steps of the tricarboxylic acid cycle and is essential for acetate and fatty acid metabolism in bacteria. GS can be up-regulated under conditions of oxidative stress, antibiotic stress, and host infection, which implies that it plays important but poorly explored roles in stress defense and pathogenesis. In many bacterial species, including &lt;i&gt;Pseudomonas aeruginosa&lt;/i&gt;, &lt;i&gt;aceA&lt;/i&gt; and &lt;i&gt;glcB&lt;/i&gt; are not in an operon, unlike in &lt;i&gt;Escherichia coli&lt;/i&gt;. In &lt;i&gt;P. aeruginosa&lt;/i&gt;, we explored relationships between GS genes and growth, transcription profiles, and biofilm formation. Contrary to our expectations, deletion of &lt;i&gt;aceA&lt;/i&gt; in &lt;i&gt;P. aeruginosa&lt;/i&gt; improved cell growth under conditions of oxidative and antibiotic stress. Transcriptome data suggested that &lt;i&gt;aceA&lt;/i&gt; mutants underwent a metabolic shift toward aerobic denitrification; this was supported by additional evidence, including up-regulation of denitrification-related genes, decreased oxygen consumption without lowering ATP yield, increased production of denitrification intermediates (NO and N&lt;sub&gt;2&lt;/sub&gt;O), and increased cyanide resistance. The &lt;i&gt;aceA&lt;/i&gt; mutants also produced a thicker exopolysaccharide layer; that is, a phenotype consistent with aerobic denitrification. A bioinformatic survey across known bacterial genomes showed that only microorganisms capable of aerobic metabolism possess the glyoxylate shunt. This trend is consistent with the hypothesis that the GS plays a previously unrecognized role in allowing bacteria to tolerate oxidative stress.&lt;/p&gt;","container-title":"Journal of Biological Chemistry","DOI":"10.1074/jbc.M115.708149","ISSN":"0021-9258, 1083-351X","issue":"22","journalAbbreviation":"Journal of Biological Chemistry","language":"English","note":"publisher: Elsevier","page":"11928-11938","source":"www-jbc-org.proxy.lib.umich.edu","title":"Role of Glyoxylate Shunt in Oxidative Stress Response","volume":"291","author":[{"family":"Ahn","given":"Sungeun"},{"family":"Jung","given":"Jaejoon"},{"family":"Jang","given":"In-Ae"},{"family":"Madsen","given":"Eugene L."},{"family":"Park","given":"Woojun"}],"issued":{"date-parts":[["2016",5,27]]}}},{"id":3661,"uris":["http://zotero.org/users/13901503/items/7EH7QSRX"],"itemData":{"id":3661,"type":"article-journal","abstract":"Rubisco is the predominant enzymatic mechanism in the biosphere by which autotrophic bacteria, algae, and terrestrial plants fix CO2 into organic biomass via the Calvin–Benson–Basham reductive pentose phosphate pathway. Rubisco is not a perfect catalyst, suffering from low turnover rates, a low affinity for its CO2 substrate, and a competitive inhibition by O2 as an alternative substrate. As a consequence of changing environmental conditions over the past 3.5 billion years, with decreasing CO2 and increasing O2 in the atmosphere, Rubisco has evolved into multiple enzymatic forms with a range of kinetic properties, as well as co-evolving with CO2-concentrating mechanisms to cope with the different environmental contexts in which it must operate. The most dramatic evidence of this is the occurrence of multiple forms of Rubisco within autotrophic proteobacteria, where Forms II, IC, IBc, IAc, and IAq can be found either singly or in multiple combinations within a particular bacterial genome. Over the past few years there has been increasing availability of genomic sequence data for bacteria and this has allowed us to gain more extensive insights into the functional significance of this diversification. This paper is focused on summarizing what is known about the diversity of Rubisco forms, their kinetic properties, development of bacterial CO2-concentrating mechanisms, and correlations with metabolic flexibility and inorganic carbon environments in which proteobacteria perform various types of obligate and facultative chemo- and photoautotrophic CO2 fixation.","container-title":"Journal of Experimental Botany","DOI":"10.1093/jxb/erm297","ISSN":"0022-0957","issue":"7","journalAbbreviation":"Journal of Experimental Botany","page":"1525-1541","source":"Silverchair","title":"Multiple Rubisco forms in proteobacteria: their functional significance in relation to CO2 acquisition by the CBB cycle","title-short":"Multiple Rubisco forms in proteobacteria","volume":"59","author":[{"family":"Badger","given":"Murray Ronald"},{"family":"Bek","given":"Emily Jane"}],"issued":{"date-parts":[["2008",5,1]]}}}],"schema":"https://github.com/citation-style-language/schema/raw/master/csl-citation.json"} </w:instrText>
       </w:r>
       <w:r>
         <w:fldChar w:fldCharType="separate"/>
@@ -5588,7 +5753,7 @@
           <w:i/>
           <w:iCs/>
         </w:rPr>
-        <w:t>86</w:t>
+        <w:t>90</w:t>
       </w:r>
       <w:r>
         <w:t xml:space="preserve">, </w:t>
@@ -5598,7 +5763,7 @@
           <w:i/>
           <w:iCs/>
         </w:rPr>
-        <w:t>87</w:t>
+        <w:t>91</w:t>
       </w:r>
       <w:r>
         <w:t>)</w:t>
@@ -5613,7 +5778,7 @@
         <w:fldChar w:fldCharType="begin"/>
       </w:r>
       <w:r>
-        <w:instrText xml:space="preserve"> ADDIN ZOTERO_ITEM CSL_CITATION {"citationID":"Fk5o5734","properties":{"formattedCitation":"({\\i{}88})","plainCitation":"(88)","noteIndex":0},"citationItems":[{"id":3665,"uris":["http://zotero.org/users/13901503/items/NVUGIX64"],"itemData":{"id":3665,"type":"article-journal","container-title":"Microbiology","DOI":"10.1099/mic.0.2007/006098-0","ISSN":"1350-0872, 1465-2080","issue":"6","language":"en","page":"1974-1980","source":"DOI.org (Crossref)","title":"Changes in the redox state and composition of the quinone pool of Escherichia coli during aerobic batch-culture growth","volume":"153","author":[{"family":"Bekker","given":"M"},{"family":"Kramer","given":"G"},{"family":"Hartog","given":"A. F"},{"family":"Wagner","given":"M. J"},{"family":"De Koster","given":"C. G"},{"family":"Hellingwerf","given":"K. J"},{"family":"Teixeira De Mattos","given":"M. J"}],"issued":{"date-parts":[["2007",6,1]]}}}],"schema":"https://github.com/citation-style-language/schema/raw/master/csl-citation.json"} </w:instrText>
+        <w:instrText xml:space="preserve"> ADDIN ZOTERO_ITEM CSL_CITATION {"citationID":"Fk5o5734","properties":{"formattedCitation":"({\\i{}92})","plainCitation":"(92)","noteIndex":0},"citationItems":[{"id":3665,"uris":["http://zotero.org/users/13901503/items/NVUGIX64"],"itemData":{"id":3665,"type":"article-journal","container-title":"Microbiology","DOI":"10.1099/mic.0.2007/006098-0","ISSN":"1350-0872, 1465-2080","issue":"6","language":"en","page":"1974-1980","source":"DOI.org (Crossref)","title":"Changes in the redox state and composition of the quinone pool of Escherichia coli during aerobic batch-culture growth","volume":"153","author":[{"family":"Bekker","given":"M"},{"family":"Kramer","given":"G"},{"family":"Hartog","given":"A. F"},{"family":"Wagner","given":"M. J"},{"family":"De Koster","given":"C. G"},{"family":"Hellingwerf","given":"K. J"},{"family":"Teixeira De Mattos","given":"M. J"}],"issued":{"date-parts":[["2007",6,1]]}}}],"schema":"https://github.com/citation-style-language/schema/raw/master/csl-citation.json"} </w:instrText>
       </w:r>
       <w:r>
         <w:fldChar w:fldCharType="separate"/>
@@ -5626,7 +5791,7 @@
           <w:i/>
           <w:iCs/>
         </w:rPr>
-        <w:t>88</w:t>
+        <w:t>92</w:t>
       </w:r>
       <w:r>
         <w:t>)</w:t>
@@ -5657,7 +5822,7 @@
         <w:fldChar w:fldCharType="begin"/>
       </w:r>
       <w:r>
-        <w:instrText xml:space="preserve"> ADDIN ZOTERO_ITEM CSL_CITATION {"citationID":"run2xhG6","properties":{"formattedCitation":"({\\i{}89})","plainCitation":"(89)","noteIndex":0},"citationItems":[{"id":3712,"uris":["http://zotero.org/users/13901503/items/S8VNSY7N"],"itemData":{"id":3712,"type":"article-journal","abstract":"Enterobacterial common antigen (ECA) is a family-specific surface antigen shared by all members of the Enterobacteriaceae and is restricted to this family. It is found in freshly isolated wild-type strains as well as in laboratory strains like Escherichia coli K-12. The family specificity of ECA can be used for taxonomic and diagnostic purposes. ECA is located in the outer leaflet of the outer membrane. It is a glycophospholipid built up by an aminosugar heteropolymer linked to an l-glycerophosphatidyl residue. In a few rough mutants, in addition, the sugar chain can be bound to the complete lipopolysaccharide (LPS) core. Recently, for Shigella sonnei a lipid-free cyclic form of ECA was reported. The genetical determination of ECA is closely related to that of lipopolysaccharide. For biosynthesis of ECA and LPS partly the same sugar precursors and the same carrier lipid is used.","container-title":"FEMS Microbiology Reviews","DOI":"10.1111/j.1574-6968.1988.tb02743.x","ISSN":"0168-6445","issue":"3","journalAbbreviation":"FEMS Microbiology Reviews","page":"195-222","source":"Silverchair","title":"ECA, the enterobacterial common antigen*","volume":"4","author":[{"family":"Kuhn","given":"Hella-Monika"},{"family":"Meier-Dieter","given":"Ursula"},{"family":"Mayer","given":"Hubert"}],"issued":{"date-parts":[["1988",9,1]]}}}],"schema":"https://github.com/citation-style-language/schema/raw/master/csl-citation.json"} </w:instrText>
+        <w:instrText xml:space="preserve"> ADDIN ZOTERO_ITEM CSL_CITATION {"citationID":"run2xhG6","properties":{"formattedCitation":"({\\i{}93})","plainCitation":"(93)","noteIndex":0},"citationItems":[{"id":3712,"uris":["http://zotero.org/users/13901503/items/S8VNSY7N"],"itemData":{"id":3712,"type":"article-journal","abstract":"Enterobacterial common antigen (ECA) is a family-specific surface antigen shared by all members of the Enterobacteriaceae and is restricted to this family. It is found in freshly isolated wild-type strains as well as in laboratory strains like Escherichia coli K-12. The family specificity of ECA can be used for taxonomic and diagnostic purposes. ECA is located in the outer leaflet of the outer membrane. It is a glycophospholipid built up by an aminosugar heteropolymer linked to an l-glycerophosphatidyl residue. In a few rough mutants, in addition, the sugar chain can be bound to the complete lipopolysaccharide (LPS) core. Recently, for Shigella sonnei a lipid-free cyclic form of ECA was reported. The genetical determination of ECA is closely related to that of lipopolysaccharide. For biosynthesis of ECA and LPS partly the same sugar precursors and the same carrier lipid is used.","container-title":"FEMS Microbiology Reviews","DOI":"10.1111/j.1574-6968.1988.tb02743.x","ISSN":"0168-6445","issue":"3","journalAbbreviation":"FEMS Microbiology Reviews","page":"195-222","source":"Silverchair","title":"ECA, the enterobacterial common antigen*","volume":"4","author":[{"family":"Kuhn","given":"Hella-Monika"},{"family":"Meier-Dieter","given":"Ursula"},{"family":"Mayer","given":"Hubert"}],"issued":{"date-parts":[["1988",9,1]]}}}],"schema":"https://github.com/citation-style-language/schema/raw/master/csl-citation.json"} </w:instrText>
       </w:r>
       <w:r>
         <w:fldChar w:fldCharType="separate"/>
@@ -5670,7 +5835,7 @@
           <w:i/>
           <w:iCs/>
         </w:rPr>
-        <w:t>89</w:t>
+        <w:t>93</w:t>
       </w:r>
       <w:r>
         <w:t>)</w:t>
@@ -5691,7 +5856,7 @@
         <w:fldChar w:fldCharType="begin"/>
       </w:r>
       <w:r>
-        <w:instrText xml:space="preserve"> ADDIN ZOTERO_ITEM CSL_CITATION {"citationID":"EGWGOe9I","properties":{"formattedCitation":"({\\i{}90})","plainCitation":"(90)","noteIndex":0},"citationItems":[{"id":3710,"uris":["http://zotero.org/users/13901503/items/7XBTXUWV"],"itemData":{"id":3710,"type":"article-journal","abstract":"Bacterial lipopolysaccharides (LPS) typically consist of a hydrophobic domain known as lipid A (or endotoxin), a nonrepeating “core” oligosaccharide, and a distal polysaccharide (or O-antigen). Recent genomic data have facilitated study of LPS assembly in diverse Gram-negative bacteria, many of which are human or plant pathogens, and have established the importance of lateral gene transfer in generating structural diversity of O-antigens. Many enzymes of lipid A biosynthesis like LpxC have been validated as targets for development of new antibiotics. Key genes for lipid A biosynthesis have unexpectedly also been found in higher plants, indicating that eukaryotic lipid A-like molecules may exist. Most significant has been the identification of the plasma membrane protein TLR4 as the lipid A signaling receptor of animal cells. TLR4 belongs to a family of innate immunity receptors that possess a large extracellular domain of leucine-rich repeats, a single trans-membrane segment, and a smaller cytoplasmic signaling region that engages the adaptor protein MyD88. The expanding knowledge of TLR4 specificity and its downstream signaling pathways should provide new opportunities for blocking inflammation associated with infection.","container-title":"Annual Review of Biochemistry","DOI":"10.1146/annurev.biochem.71.110601.135414","ISSN":"0066-4154","issue":"1","journalAbbreviation":"Annual Review of Biochemistry","language":"eng","note":"publisher: Annual Reviews Inc.","page":"635","source":"EBSCOhost","title":"Lipopolysaccharide endotoxins","volume":"71","author":[{"family":"Raetz","given":"Christian R. H."},{"family":"Whitfield","given":"Chris"}],"issued":{"date-parts":[["2002",7,1]]}}}],"schema":"https://github.com/citation-style-language/schema/raw/master/csl-citation.json"} </w:instrText>
+        <w:instrText xml:space="preserve"> ADDIN ZOTERO_ITEM CSL_CITATION {"citationID":"EGWGOe9I","properties":{"formattedCitation":"({\\i{}94})","plainCitation":"(94)","noteIndex":0},"citationItems":[{"id":3710,"uris":["http://zotero.org/users/13901503/items/7XBTXUWV"],"itemData":{"id":3710,"type":"article-journal","abstract":"Bacterial lipopolysaccharides (LPS) typically consist of a hydrophobic domain known as lipid A (or endotoxin), a nonrepeating “core” oligosaccharide, and a distal polysaccharide (or O-antigen). Recent genomic data have facilitated study of LPS assembly in diverse Gram-negative bacteria, many of which are human or plant pathogens, and have established the importance of lateral gene transfer in generating structural diversity of O-antigens. Many enzymes of lipid A biosynthesis like LpxC have been validated as targets for development of new antibiotics. Key genes for lipid A biosynthesis have unexpectedly also been found in higher plants, indicating that eukaryotic lipid A-like molecules may exist. Most significant has been the identification of the plasma membrane protein TLR4 as the lipid A signaling receptor of animal cells. TLR4 belongs to a family of innate immunity receptors that possess a large extracellular domain of leucine-rich repeats, a single trans-membrane segment, and a smaller cytoplasmic signaling region that engages the adaptor protein MyD88. The expanding knowledge of TLR4 specificity and its downstream signaling pathways should provide new opportunities for blocking inflammation associated with infection.","container-title":"Annual Review of Biochemistry","DOI":"10.1146/annurev.biochem.71.110601.135414","ISSN":"0066-4154","issue":"1","journalAbbreviation":"Annual Review of Biochemistry","language":"eng","note":"publisher: Annual Reviews Inc.","page":"635","source":"EBSCOhost","title":"Lipopolysaccharide endotoxins","volume":"71","author":[{"family":"Raetz","given":"Christian R. H."},{"family":"Whitfield","given":"Chris"}],"issued":{"date-parts":[["2002",7,1]]}}}],"schema":"https://github.com/citation-style-language/schema/raw/master/csl-citation.json"} </w:instrText>
       </w:r>
       <w:r>
         <w:fldChar w:fldCharType="separate"/>
@@ -5704,7 +5869,7 @@
           <w:i/>
           <w:iCs/>
         </w:rPr>
-        <w:t>90</w:t>
+        <w:t>94</w:t>
       </w:r>
       <w:r>
         <w:t>)</w:t>
@@ -5754,7 +5919,7 @@
         <w:fldChar w:fldCharType="begin"/>
       </w:r>
       <w:r>
-        <w:instrText xml:space="preserve"> ADDIN ZOTERO_ITEM CSL_CITATION {"citationID":"cZJ2yfWg","properties":{"formattedCitation":"({\\i{}112})","plainCitation":"(112)","noteIndex":0},"citationItems":[{"id":3644,"uris":["http://zotero.org/users/13901503/items/GZ2VQ6TK"],"itemData":{"id":3644,"type":"article-journal","abstract":"Abstract: Helicobacter pylori (H. pylori) has been considered as an important pathogen of gastroduodenal inflammation and gastric carcinogenesis. However, the pathogenic mechanisms including H. pylori-induced apoptosis and subsequent molecular mechanisms have not been clarified yet. The present study examined the role of Bcl-2 and its relation to NF-κB in H. pylori-induced apoptosis in human gastric epithelial AGS cells. AGS cells were cultured in the presence of H. pylori, at a bacterium/cell ratio of 300:1, for the determination of apoptosis, NF-κB activation with IkBa degradation, and Bcl-2 level. AGS cells were transfected with a control vector (pCMV cells) or a full-length human Bcl-2 expression vector (Bcl-2 cells). H. pylori-induced apoptosis and NF-κB activation were compared in the wild-type cells and the transfected cells. As a result, H. pylori increased apoptotic cells with chromatin condensation and reduced Bcl-2 levels, which were accompanied with NF-κB activation. H. pylori induced sixfold increase in the number of apoptotic cells in wild-type cells and pCMV cells. H. pylori-induced increment of apoptotic cells were relatively lower in Bcl-2 cells than pCMV cells. H. pylori-induced NF-κB activation and IkBa degradation were not different in the wild-type cells, pCMV cells, and Bcl-2 cells. In conclusion, the reduced gastric Bcl-2 level may be the main pathogenic mechanism of H. pylori-induced apoptosis in gastric epithelial cells.","container-title":"Annals of the New York Academy of Sciences","DOI":"10.1196/annals.1299.106","ISSN":"1749-6632","issue":"1","language":"en","note":"_eprint: https://onlinelibrary.wiley.com/doi/pdf/10.1196/annals.1299.106","page":"568-572","source":"Wiley Online Library","title":"NF-κB and Bcl-2 in Helicobacter pylori-Induced Apoptosis in Gastric Epithelial Cells","volume":"1010","author":[{"family":"Chu","given":"Sang Hui"},{"family":"Lim","given":"Joo Weon"},{"family":"Kim","given":"Kyung Hwan"},{"family":"Kim","given":"Hyeyoung"}],"issued":{"date-parts":[["2003"]]}}}],"schema":"https://github.com/citation-style-language/schema/raw/master/csl-citation.json"} </w:instrText>
+        <w:instrText xml:space="preserve"> ADDIN ZOTERO_ITEM CSL_CITATION {"citationID":"cZJ2yfWg","properties":{"formattedCitation":"({\\i{}115})","plainCitation":"(115)","noteIndex":0},"citationItems":[{"id":3644,"uris":["http://zotero.org/users/13901503/items/GZ2VQ6TK"],"itemData":{"id":3644,"type":"article-journal","abstract":"Abstract: Helicobacter pylori (H. pylori) has been considered as an important pathogen of gastroduodenal inflammation and gastric carcinogenesis. However, the pathogenic mechanisms including H. pylori-induced apoptosis and subsequent molecular mechanisms have not been clarified yet. The present study examined the role of Bcl-2 and its relation to NF-κB in H. pylori-induced apoptosis in human gastric epithelial AGS cells. AGS cells were cultured in the presence of H. pylori, at a bacterium/cell ratio of 300:1, for the determination of apoptosis, NF-κB activation with IkBa degradation, and Bcl-2 level. AGS cells were transfected with a control vector (pCMV cells) or a full-length human Bcl-2 expression vector (Bcl-2 cells). H. pylori-induced apoptosis and NF-κB activation were compared in the wild-type cells and the transfected cells. As a result, H. pylori increased apoptotic cells with chromatin condensation and reduced Bcl-2 levels, which were accompanied with NF-κB activation. H. pylori induced sixfold increase in the number of apoptotic cells in wild-type cells and pCMV cells. H. pylori-induced increment of apoptotic cells were relatively lower in Bcl-2 cells than pCMV cells. H. pylori-induced NF-κB activation and IkBa degradation were not different in the wild-type cells, pCMV cells, and Bcl-2 cells. In conclusion, the reduced gastric Bcl-2 level may be the main pathogenic mechanism of H. pylori-induced apoptosis in gastric epithelial cells.","container-title":"Annals of the New York Academy of Sciences","DOI":"10.1196/annals.1299.106","ISSN":"1749-6632","issue":"1","language":"en","note":"_eprint: https://onlinelibrary.wiley.com/doi/pdf/10.1196/annals.1299.106","page":"568-572","source":"Wiley Online Library","title":"NF-κB and Bcl-2 in Helicobacter pylori-Induced Apoptosis in Gastric Epithelial Cells","volume":"1010","author":[{"family":"Chu","given":"Sang Hui"},{"family":"Lim","given":"Joo Weon"},{"family":"Kim","given":"Kyung Hwan"},{"family":"Kim","given":"Hyeyoung"}],"issued":{"date-parts":[["2003"]]}}}],"schema":"https://github.com/citation-style-language/schema/raw/master/csl-citation.json"} </w:instrText>
       </w:r>
       <w:r>
         <w:fldChar w:fldCharType="separate"/>
@@ -5767,7 +5932,7 @@
           <w:i/>
           <w:iCs/>
         </w:rPr>
-        <w:t>112</w:t>
+        <w:t>115</w:t>
       </w:r>
       <w:r>
         <w:t>)</w:t>
@@ -5789,7 +5954,7 @@
       <w:r>
         <w:t xml:space="preserve">Taken together, these findings provide robust support for a </w:t>
       </w:r>
-      <w:bookmarkStart w:id="3" w:name="_Hlk200366020"/>
+      <w:bookmarkStart w:id="1" w:name="_Hlk200366020"/>
       <w:r>
         <w:t xml:space="preserve">heat-induced physiological cascade that affects microbiome composition and disrupts </w:t>
       </w:r>
@@ -5799,7 +5964,7 @@
       <w:r>
         <w:t xml:space="preserve">immune homeostasis </w:t>
       </w:r>
-      <w:bookmarkEnd w:id="3"/>
+      <w:bookmarkEnd w:id="1"/>
       <w:r>
         <w:t>(Fig. 3F). The interaction effect reveal</w:t>
       </w:r>
@@ -5834,7 +5999,7 @@
         <w:fldChar w:fldCharType="begin"/>
       </w:r>
       <w:r>
-        <w:instrText xml:space="preserve"> ADDIN ZOTERO_ITEM CSL_CITATION {"citationID":"ubaxrLzX","properties":{"formattedCitation":"({\\i{}83})","plainCitation":"(83)","noteIndex":0},"citationItems":[{"id":2168,"uris":["http://zotero.org/users/13901503/items/8KEM2KE5"],"itemData":{"id":2168,"type":"article-journal","abstract":"Phascolarctobacterium can produce short‑chain fatty acids, including acetate and propionate, and can be associated with the metabolic state and mood of the host. The present study investigated the colonization characteristics of Phascolarctobacterium faecium in healthy individuals &lt;1-80 years old in Southern China. A total of 150 fresh fecal samples were collected, and bacterial DNA was isolated from these samples for quantitative polymerase chain reaction analysis. Phascolarctobacterium faecium demonstrated a high colonization rate and abundant colonization in the human gastrointestinal tract. The colonization rate varied between 43.33‑93.33%, and the abundance of Phascolarctobacterium faecium ranged between 3.22‑5.76 log cells g‑1 (&lt;1 years old) and 3.06‑9.33 log cells g‑1 (&gt;1 year old). The permillage of Phascolarctobacterium faecium in total bacteria ranged between 0.004‑1.479. There was presence of Phascolarctobacterium faecium‑like bacteria in younger individuals with a gradual increase in the number of bacteria maintained at a high level with increasing ages (between 1 and 60 years old), but with a decrease in elderly individuals (&gt;60 years old). The results of the present study demonstrated that Phascolarctobacterium faecium is abundantly colonized in the human gastrointestinal tract.","container-title":"Experimental and Therapeutic Medicine","DOI":"10.3892/etm.2017.4878","ISSN":"1792-0981, 1792-1015","issue":"4","language":"en","page":"3122-3126","source":"DOI.org (Crossref)","title":"Phascolarctobacterium faecium abundant colonization in human gastrointestinal tract","volume":"14","author":[{"family":"Wu","given":"Feifan"},{"family":"Guo","given":"Xianfeng"},{"family":"Zhang","given":"Jiachun"},{"family":"Zhang","given":"Min"},{"family":"Ou","given":"Zihao"},{"family":"Peng","given":"Yongzheng"}],"issued":{"date-parts":[["2017",10]]}}}],"schema":"https://github.com/citation-style-language/schema/raw/master/csl-citation.json"} </w:instrText>
+        <w:instrText xml:space="preserve"> ADDIN ZOTERO_ITEM CSL_CITATION {"citationID":"ubaxrLzX","properties":{"formattedCitation":"({\\i{}87})","plainCitation":"(87)","noteIndex":0},"citationItems":[{"id":2168,"uris":["http://zotero.org/users/13901503/items/8KEM2KE5"],"itemData":{"id":2168,"type":"article-journal","abstract":"Phascolarctobacterium can produce short‑chain fatty acids, including acetate and propionate, and can be associated with the metabolic state and mood of the host. The present study investigated the colonization characteristics of Phascolarctobacterium faecium in healthy individuals &lt;1-80 years old in Southern China. A total of 150 fresh fecal samples were collected, and bacterial DNA was isolated from these samples for quantitative polymerase chain reaction analysis. Phascolarctobacterium faecium demonstrated a high colonization rate and abundant colonization in the human gastrointestinal tract. The colonization rate varied between 43.33‑93.33%, and the abundance of Phascolarctobacterium faecium ranged between 3.22‑5.76 log cells g‑1 (&lt;1 years old) and 3.06‑9.33 log cells g‑1 (&gt;1 year old). The permillage of Phascolarctobacterium faecium in total bacteria ranged between 0.004‑1.479. There was presence of Phascolarctobacterium faecium‑like bacteria in younger individuals with a gradual increase in the number of bacteria maintained at a high level with increasing ages (between 1 and 60 years old), but with a decrease in elderly individuals (&gt;60 years old). The results of the present study demonstrated that Phascolarctobacterium faecium is abundantly colonized in the human gastrointestinal tract.","container-title":"Experimental and Therapeutic Medicine","DOI":"10.3892/etm.2017.4878","ISSN":"1792-0981, 1792-1015","issue":"4","language":"en","page":"3122-3126","source":"DOI.org (Crossref)","title":"Phascolarctobacterium faecium abundant colonization in human gastrointestinal tract","volume":"14","author":[{"family":"Wu","given":"Feifan"},{"family":"Guo","given":"Xianfeng"},{"family":"Zhang","given":"Jiachun"},{"family":"Zhang","given":"Min"},{"family":"Ou","given":"Zihao"},{"family":"Peng","given":"Yongzheng"}],"issued":{"date-parts":[["2017",10]]}}}],"schema":"https://github.com/citation-style-language/schema/raw/master/csl-citation.json"} </w:instrText>
       </w:r>
       <w:r>
         <w:fldChar w:fldCharType="separate"/>
@@ -5847,7 +6012,7 @@
           <w:i/>
           <w:iCs/>
         </w:rPr>
-        <w:t>83</w:t>
+        <w:t>87</w:t>
       </w:r>
       <w:r>
         <w:t>)</w:t>
@@ -5879,7 +6044,7 @@
           <w:rStyle w:val="Emphasis"/>
           <w:rFonts w:eastAsiaTheme="majorEastAsia"/>
         </w:rPr>
-        <w:instrText xml:space="preserve"> ADDIN ZOTERO_ITEM CSL_CITATION {"citationID":"ppO23vVe","properties":{"formattedCitation":"({\\i{}82})","plainCitation":"(82)","noteIndex":0},"citationItems":[{"id":3715,"uris":["http://zotero.org/users/13901503/items/6SAKEANZ"],"itemData":{"id":3715,"type":"article-journal","abstract":"Summary The human gut microbiota ferments dietary non-digestible carbohydrates into short-chain fatty acids (SCFA). These microbial products are utilized by the host and propionate and butyrate in particular exert a range of health-promoting functions. Here an overview of the metabolic pathways utilized by gut microbes to produce these two SCFA from dietary carbohydrates and from amino acids resulting from protein breakdown is provided. This overview emphasizes the important role played by cross-feeding of intermediary metabolites (in particular lactate, succinate and 1,2-propanediol) between different gut bacteria. The ecophysiology, including growth requirements and responses to environmental factors, of major propionate and butyrate producing bacteria are discussed in relation to dietary modulation of these metabolites. A detailed understanding of SCFA metabolism by the gut microbiota is necessary to underpin effective strategies to optimize SCFA supply to the host.","container-title":"Environmental Microbiology","DOI":"10.1111/1462-2920.13589","ISSN":"1462-2912","issue":"1","note":"publisher: John Wiley &amp; Sons, Ltd","page":"29-41","source":"enviromicro-journals-onlinelibrary-wiley-com.proxy.lib.umich.edu (Atypon)","title":"Formation of propionate and butyrate by the human colonic microbiota","volume":"19","author":[{"family":"Louis","given":"Petra"},{"family":"Flint","given":"Harry J."}],"issued":{"date-parts":[["2017",1]]}}}],"schema":"https://github.com/citation-style-language/schema/raw/master/csl-citation.json"} </w:instrText>
+        <w:instrText xml:space="preserve"> ADDIN ZOTERO_ITEM CSL_CITATION {"citationID":"ppO23vVe","properties":{"formattedCitation":"({\\i{}86})","plainCitation":"(86)","noteIndex":0},"citationItems":[{"id":3715,"uris":["http://zotero.org/users/13901503/items/6SAKEANZ"],"itemData":{"id":3715,"type":"article-journal","abstract":"Summary The human gut microbiota ferments dietary non-digestible carbohydrates into short-chain fatty acids (SCFA). These microbial products are utilized by the host and propionate and butyrate in particular exert a range of health-promoting functions. Here an overview of the metabolic pathways utilized by gut microbes to produce these two SCFA from dietary carbohydrates and from amino acids resulting from protein breakdown is provided. This overview emphasizes the important role played by cross-feeding of intermediary metabolites (in particular lactate, succinate and 1,2-propanediol) between different gut bacteria. The ecophysiology, including growth requirements and responses to environmental factors, of major propionate and butyrate producing bacteria are discussed in relation to dietary modulation of these metabolites. A detailed understanding of SCFA metabolism by the gut microbiota is necessary to underpin effective strategies to optimize SCFA supply to the host.","container-title":"Environmental Microbiology","DOI":"10.1111/1462-2920.13589","ISSN":"1462-2912","issue":"1","note":"publisher: John Wiley &amp; Sons, Ltd","page":"29-41","source":"enviromicro-journals-onlinelibrary-wiley-com.proxy.lib.umich.edu (Atypon)","title":"Formation of propionate and butyrate by the human colonic microbiota","volume":"19","author":[{"family":"Louis","given":"Petra"},{"family":"Flint","given":"Harry J."}],"issued":{"date-parts":[["2017",1]]}}}],"schema":"https://github.com/citation-style-language/schema/raw/master/csl-citation.json"} </w:instrText>
       </w:r>
       <w:r>
         <w:rPr>
@@ -5898,7 +6063,7 @@
           <w:i/>
           <w:iCs/>
         </w:rPr>
-        <w:t>82</w:t>
+        <w:t>86</w:t>
       </w:r>
       <w:r>
         <w:t>)</w:t>
@@ -5993,7 +6158,7 @@
         <w:fldChar w:fldCharType="begin"/>
       </w:r>
       <w:r>
-        <w:instrText xml:space="preserve"> ADDIN ZOTERO_ITEM CSL_CITATION {"citationID":"lcfhCYZs","properties":{"formattedCitation":"({\\i{}91})","plainCitation":"(91)","noteIndex":0},"citationItems":[{"id":3239,"uris":["http://zotero.org/users/13901503/items/F8CEHMIS"],"itemData":{"id":3239,"type":"article-journal","abstract":"Accumulating evidence has suggested that NAD (including NAD؉ and NADH) and NADP (including NADP؉ and NADPH) could belong to the fundamental common mediators of various biological processes, including energy metabolism, mitochondrial functions, calcium homeostasis, antioxidation/generation of oxidative stress, gene expression, immunological functions, aging, and cell death: First, it is established that NAD mediates energy metabolism and mitochondrial functions; second, NADPH is a key component in cellular antioxidation systems; and NADH-dependent reactive oxygen species (ROS) generation from mitochondria and NADPH oxidase-dependent ROS generation are two critical mechanisms of ROS generation; third, cyclic ADP-ribose and several other molecules that are generated from NAD and NADP could mediate calcium homeostasis; fourth, NAD and NADP modulate multiple key factors in cell death, such as mitochondrial permeability transition, energy state, poly(ADP-ribose) polymerase-1, and apoptosis-inducing factor; and fifth, NAD and NADP profoundly affect aging-influencing factors such as oxidative stress and mitochondrial activities, and NADdependent sirtuins also mediate the aging process. Moreover, many recent studies have suggested novel paradigms of NAD and NADP metabolism. Future investigation into the metabolism and biological functions of NAD and NADP may expose fundamental properties of life, and suggest new strategies for treating diseases and slowing the aging process. Antioxid. Redox Signal. 10, 179–206.","container-title":"Antioxidants &amp; Redox Signaling","DOI":"10.1089/ars.2007.1672","ISSN":"1523-0864, 1557-7716","issue":"2","journalAbbreviation":"Antioxidants &amp; Redox Signaling","language":"en","page":"179-206","source":"DOI.org (Crossref)","title":"NAD&lt;sup&gt;+&lt;/sup&gt; /NADH and NADP&lt;sup&gt;+&lt;/sup&gt; /NADPH in Cellular Functions and Cell Death: Regulation and Biological Consequences","title-short":"NAD&lt;sup&gt;+&lt;/sup&gt; /NADH and NADP&lt;sup&gt;+&lt;/sup&gt; /NADPH in Cellular Functions and Cell Death","volume":"10","author":[{"family":"Ying","given":"Weihai"}],"issued":{"date-parts":[["2008",2]]}}}],"schema":"https://github.com/citation-style-language/schema/raw/master/csl-citation.json"} </w:instrText>
+        <w:instrText xml:space="preserve"> ADDIN ZOTERO_ITEM CSL_CITATION {"citationID":"lcfhCYZs","properties":{"formattedCitation":"({\\i{}71})","plainCitation":"(71)","noteIndex":0},"citationItems":[{"id":3239,"uris":["http://zotero.org/users/13901503/items/F8CEHMIS"],"itemData":{"id":3239,"type":"article-journal","abstract":"Accumulating evidence has suggested that NAD (including NAD؉ and NADH) and NADP (including NADP؉ and NADPH) could belong to the fundamental common mediators of various biological processes, including energy metabolism, mitochondrial functions, calcium homeostasis, antioxidation/generation of oxidative stress, gene expression, immunological functions, aging, and cell death: First, it is established that NAD mediates energy metabolism and mitochondrial functions; second, NADPH is a key component in cellular antioxidation systems; and NADH-dependent reactive oxygen species (ROS) generation from mitochondria and NADPH oxidase-dependent ROS generation are two critical mechanisms of ROS generation; third, cyclic ADP-ribose and several other molecules that are generated from NAD and NADP could mediate calcium homeostasis; fourth, NAD and NADP modulate multiple key factors in cell death, such as mitochondrial permeability transition, energy state, poly(ADP-ribose) polymerase-1, and apoptosis-inducing factor; and fifth, NAD and NADP profoundly affect aging-influencing factors such as oxidative stress and mitochondrial activities, and NADdependent sirtuins also mediate the aging process. Moreover, many recent studies have suggested novel paradigms of NAD and NADP metabolism. Future investigation into the metabolism and biological functions of NAD and NADP may expose fundamental properties of life, and suggest new strategies for treating diseases and slowing the aging process. Antioxid. Redox Signal. 10, 179–206.","container-title":"Antioxidants &amp; Redox Signaling","DOI":"10.1089/ars.2007.1672","ISSN":"1523-0864, 1557-7716","issue":"2","journalAbbreviation":"Antioxidants &amp; Redox Signaling","language":"en","page":"179-206","source":"DOI.org (Crossref)","title":"NAD&lt;sup&gt;+&lt;/sup&gt; /NADH and NADP&lt;sup&gt;+&lt;/sup&gt; /NADPH in Cellular Functions and Cell Death: Regulation and Biological Consequences","title-short":"NAD&lt;sup&gt;+&lt;/sup&gt; /NADH and NADP&lt;sup&gt;+&lt;/sup&gt; /NADPH in Cellular Functions and Cell Death","volume":"10","author":[{"family":"Ying","given":"Weihai"}],"issued":{"date-parts":[["2008",2]]}}}],"schema":"https://github.com/citation-style-language/schema/raw/master/csl-citation.json"} </w:instrText>
       </w:r>
       <w:r>
         <w:fldChar w:fldCharType="separate"/>
@@ -6006,7 +6171,7 @@
           <w:i/>
           <w:iCs/>
         </w:rPr>
-        <w:t>91</w:t>
+        <w:t>71</w:t>
       </w:r>
       <w:r>
         <w:t>)</w:t>
@@ -6066,28 +6231,19 @@
         <w:t xml:space="preserve">If prolonged, these shifts could reduce host tolerance toward gut microbes and increase the risk of chronic gut inflammation. Our findings </w:t>
       </w:r>
       <w:r>
-        <w:t xml:space="preserve">provide some of the earliest evidence that </w:t>
-      </w:r>
-      <w:r>
-        <w:t>heat stress is reflected in the gut microbiome of wild endotherm</w:t>
-      </w:r>
-      <w:r>
-        <w:t xml:space="preserve">s, </w:t>
-      </w:r>
-      <w:r>
-        <w:t xml:space="preserve">offering crucial insight into how rising temperatures may </w:t>
-      </w:r>
-      <w:r>
-        <w:t>disrupt</w:t>
-      </w:r>
-      <w:r>
-        <w:t xml:space="preserve"> host-microbiome relationships and threaten wild</w:t>
-      </w:r>
-      <w:r>
-        <w:t xml:space="preserve"> animals under </w:t>
-      </w:r>
-      <w:r>
-        <w:t>climate change.</w:t>
+        <w:t xml:space="preserve">provide some of the earliest evidence </w:t>
+      </w:r>
+      <w:r>
+        <w:t>of</w:t>
+      </w:r>
+      <w:r>
+        <w:t xml:space="preserve"> heat stress reflected in the gut microbiome of wild endotherms, offering crucial insight into how rising temperatures may disrupt host-microbiome relationships and threaten </w:t>
+      </w:r>
+      <w:r>
+        <w:t>species resilience</w:t>
+      </w:r>
+      <w:r>
+        <w:t xml:space="preserve"> under climate change.</w:t>
       </w:r>
     </w:p>
     <w:p/>
@@ -6187,7 +6343,7 @@
         <w:fldChar w:fldCharType="begin"/>
       </w:r>
       <w:r>
-        <w:instrText xml:space="preserve"> ADDIN ZOTERO_ITEM CSL_CITATION {"citationID":"LCB9ZKPz","properties":{"formattedCitation":"({\\i{}113})","plainCitation":"(113)","noteIndex":0},"citationItems":[{"id":559,"uris":["http://zotero.org/users/13901503/items/Z3E2X5D7"],"itemData":{"id":559,"type":"article-journal","abstract":"Across the globe, primates are threatened by human activities. This is especially true for species found in tropical dry forests, which remain largely unprotected. Our ability to predict primate abundance in the face of human activity depends on different species' sensitivities as well as on the characteristics of the forest itself. We studied plant and primate distribution and abundance in the Taboga Forest, a 516-ha tropical dry forest surrounded by agricultural fields in northwestern Costa Rica. We found that the density of white-faced capuchins (Cebus capucinus) at Taboga is 2–6 times higher than reported for other long-term white-faced capuchin sites. Using plant transects, we also found relatively high species richness, diversity, and equitability compared with other tropical dry forests. Edge transects (i.e., within 100 m from the forest boundary) differed from interior transects in two ways: (a) tree species associated with dry forest succession were well-established in the edge and (b) canopy cover in the edge was maintained year-round, while the interior forest was deciduous. Sighting rates for capuchins were higher near water sources but did not vary between the edge and interior forest. For comparison, we also found the same to be true for the only other primate in the Taboga Forest, mantled howler monkeys (Alouatta palliata). Year-round access to water might explain why some primate species can flourish even alongside anthropogenic disturbance. Forest fragments like Taboga may support high densities of some species because they provide a mosaic of habitats and key resources that buffer adverse ecological conditions.","container-title":"American Journal of Primatology","DOI":"10.1002/ajp.23096","ISSN":"1098-2345","issue":"2","language":"en","license":"© 2020 Wiley Periodicals, Inc.","note":"_eprint: https://onlinelibrary.wiley.com/doi/pdf/10.1002/ajp.23096","page":"e23096","source":"Wiley Online Library","title":"High density of white-faced capuchins (Cebus capucinus) and habitat quality in the Taboga Forest of Costa Rica","volume":"82","author":[{"family":"Tinsley Johnson","given":"Elizabeth"},{"family":"Benítez","given":"Marcela E."},{"family":"Fuentes","given":"Alexander"},{"family":"McLean","given":"Celia R."},{"family":"Norford","given":"Ariek B."},{"family":"Ordoñez","given":"Juan Carlos"},{"family":"Beehner","given":"Jacinta C."},{"family":"Bergman","given":"Thore J."}],"issued":{"date-parts":[["2020"]]}}}],"schema":"https://github.com/citation-style-language/schema/raw/master/csl-citation.json"} </w:instrText>
+        <w:instrText xml:space="preserve"> ADDIN ZOTERO_ITEM CSL_CITATION {"citationID":"LCB9ZKPz","properties":{"formattedCitation":"({\\i{}116})","plainCitation":"(116)","noteIndex":0},"citationItems":[{"id":559,"uris":["http://zotero.org/users/13901503/items/Z3E2X5D7"],"itemData":{"id":559,"type":"article-journal","abstract":"Across the globe, primates are threatened by human activities. This is especially true for species found in tropical dry forests, which remain largely unprotected. Our ability to predict primate abundance in the face of human activity depends on different species' sensitivities as well as on the characteristics of the forest itself. We studied plant and primate distribution and abundance in the Taboga Forest, a 516-ha tropical dry forest surrounded by agricultural fields in northwestern Costa Rica. We found that the density of white-faced capuchins (Cebus capucinus) at Taboga is 2–6 times higher than reported for other long-term white-faced capuchin sites. Using plant transects, we also found relatively high species richness, diversity, and equitability compared with other tropical dry forests. Edge transects (i.e., within 100 m from the forest boundary) differed from interior transects in two ways: (a) tree species associated with dry forest succession were well-established in the edge and (b) canopy cover in the edge was maintained year-round, while the interior forest was deciduous. Sighting rates for capuchins were higher near water sources but did not vary between the edge and interior forest. For comparison, we also found the same to be true for the only other primate in the Taboga Forest, mantled howler monkeys (Alouatta palliata). Year-round access to water might explain why some primate species can flourish even alongside anthropogenic disturbance. Forest fragments like Taboga may support high densities of some species because they provide a mosaic of habitats and key resources that buffer adverse ecological conditions.","container-title":"American Journal of Primatology","DOI":"10.1002/ajp.23096","ISSN":"1098-2345","issue":"2","language":"en","license":"© 2020 Wiley Periodicals, Inc.","note":"_eprint: https://onlinelibrary.wiley.com/doi/pdf/10.1002/ajp.23096","page":"e23096","source":"Wiley Online Library","title":"High density of white-faced capuchins (Cebus capucinus) and habitat quality in the Taboga Forest of Costa Rica","volume":"82","author":[{"family":"Tinsley Johnson","given":"Elizabeth"},{"family":"Benítez","given":"Marcela E."},{"family":"Fuentes","given":"Alexander"},{"family":"McLean","given":"Celia R."},{"family":"Norford","given":"Ariek B."},{"family":"Ordoñez","given":"Juan Carlos"},{"family":"Beehner","given":"Jacinta C."},{"family":"Bergman","given":"Thore J."}],"issued":{"date-parts":[["2020"]]}}}],"schema":"https://github.com/citation-style-language/schema/raw/master/csl-citation.json"} </w:instrText>
       </w:r>
       <w:r>
         <w:fldChar w:fldCharType="separate"/>
@@ -6200,7 +6356,7 @@
           <w:i/>
           <w:iCs/>
         </w:rPr>
-        <w:t>113</w:t>
+        <w:t>116</w:t>
       </w:r>
       <w:r>
         <w:t>)</w:t>
@@ -6313,7 +6469,7 @@
         <w:rPr>
           <w:bCs/>
         </w:rPr>
-        <w:instrText xml:space="preserve"> ADDIN ZOTERO_ITEM CSL_CITATION {"citationID":"AqOs0Bp6","properties":{"formattedCitation":"({\\i{}114})","plainCitation":"(114)","noteIndex":0},"citationItems":[{"id":1721,"uris":["http://zotero.org/users/13901503/items/EFIJNSWE"],"itemData":{"id":1721,"type":"article-journal","abstract":"Metagenomic analyses have indicated that the female bladder harbors an indigenous microbiota. However, there are few cultured reference strains with sequenced genomes available for functional and experimental analyses. Here we isolate and genome-sequence 149 bacterial strains from catheterized urine of 77 women. This culture collection spans 78 species, representing approximately two thirds of the bacterial diversity within the sampled bladders, including Proteobacteria, Actinobacteria, and Firmicutes. Detailed genomic and functional comparison of the bladder microbiota to the gastrointestinal and vaginal microbiotas demonstrates similar vaginal and bladder microbiota, with functional capacities that are distinct from those observed in the gastrointestinal microbiota. Whole-genome phylogenetic analysis of bacterial strains isolated from the vagina and bladder in the same women identifies highly similar Escherichia coli, Streptococcus anginosus, Lactobacillus iners, and Lactobacillus crispatus, suggesting an interlinked female urogenital microbiota that is not only limited to pathogens but is also characteristic of health-associated commensals.","container-title":"Nature Communications","DOI":"10.1038/s41467-018-03968-5","ISSN":"2041-1723","issue":"1","journalAbbreviation":"Nat Commun","language":"en","license":"2018 The Author(s)","note":"publisher: Nature Publishing Group","page":"1557","source":"www-nature-com.proxy.lib.umich.edu","title":"Culturing of female bladder bacteria reveals an interconnected urogenital microbiota","volume":"9","author":[{"family":"Thomas-White","given":"Krystal"},{"family":"Forster","given":"Samuel C."},{"family":"Kumar","given":"Nitin"},{"family":"Van Kuiken","given":"Michelle"},{"family":"Putonti","given":"Catherine"},{"family":"Stares","given":"Mark D."},{"family":"Hilt","given":"Evann E."},{"family":"Price","given":"Travis K."},{"family":"Wolfe","given":"Alan J."},{"family":"Lawley","given":"Trevor D."}],"issued":{"date-parts":[["2018",4,19]]}}}],"schema":"https://github.com/citation-style-language/schema/raw/master/csl-citation.json"} </w:instrText>
+        <w:instrText xml:space="preserve"> ADDIN ZOTERO_ITEM CSL_CITATION {"citationID":"AqOs0Bp6","properties":{"formattedCitation":"({\\i{}117})","plainCitation":"(117)","noteIndex":0},"citationItems":[{"id":1721,"uris":["http://zotero.org/users/13901503/items/EFIJNSWE"],"itemData":{"id":1721,"type":"article-journal","abstract":"Metagenomic analyses have indicated that the female bladder harbors an indigenous microbiota. However, there are few cultured reference strains with sequenced genomes available for functional and experimental analyses. Here we isolate and genome-sequence 149 bacterial strains from catheterized urine of 77 women. This culture collection spans 78 species, representing approximately two thirds of the bacterial diversity within the sampled bladders, including Proteobacteria, Actinobacteria, and Firmicutes. Detailed genomic and functional comparison of the bladder microbiota to the gastrointestinal and vaginal microbiotas demonstrates similar vaginal and bladder microbiota, with functional capacities that are distinct from those observed in the gastrointestinal microbiota. Whole-genome phylogenetic analysis of bacterial strains isolated from the vagina and bladder in the same women identifies highly similar Escherichia coli, Streptococcus anginosus, Lactobacillus iners, and Lactobacillus crispatus, suggesting an interlinked female urogenital microbiota that is not only limited to pathogens but is also characteristic of health-associated commensals.","container-title":"Nature Communications","DOI":"10.1038/s41467-018-03968-5","ISSN":"2041-1723","issue":"1","journalAbbreviation":"Nat Commun","language":"en","license":"2018 The Author(s)","note":"publisher: Nature Publishing Group","page":"1557","source":"www-nature-com.proxy.lib.umich.edu","title":"Culturing of female bladder bacteria reveals an interconnected urogenital microbiota","volume":"9","author":[{"family":"Thomas-White","given":"Krystal"},{"family":"Forster","given":"Samuel C."},{"family":"Kumar","given":"Nitin"},{"family":"Van Kuiken","given":"Michelle"},{"family":"Putonti","given":"Catherine"},{"family":"Stares","given":"Mark D."},{"family":"Hilt","given":"Evann E."},{"family":"Price","given":"Travis K."},{"family":"Wolfe","given":"Alan J."},{"family":"Lawley","given":"Trevor D."}],"issued":{"date-parts":[["2018",4,19]]}}}],"schema":"https://github.com/citation-style-language/schema/raw/master/csl-citation.json"} </w:instrText>
       </w:r>
       <w:r>
         <w:rPr>
@@ -6329,7 +6485,7 @@
           <w:i/>
           <w:iCs/>
         </w:rPr>
-        <w:t>114</w:t>
+        <w:t>117</w:t>
       </w:r>
       <w:r>
         <w:t>)</w:t>
@@ -6359,7 +6515,7 @@
         <w:rPr>
           <w:bCs/>
         </w:rPr>
-        <w:instrText xml:space="preserve"> ADDIN ZOTERO_ITEM CSL_CITATION {"citationID":"OT0mvtJ3","properties":{"formattedCitation":"({\\i{}115})","plainCitation":"(115)","noteIndex":0},"citationItems":[{"id":564,"uris":["http://zotero.org/users/13901503/items/C7T2JIHZ"],"itemData":{"id":564,"type":"article-journal","abstract":"Objectives The physical condition of females depends on access to resources, which vary over space and time. Assessing variation in physical condition can help identify factors affecting reproductive success, but noninvasive measurement is difficult in wild animals. Creatinine concentration relative to the specific gravity (i.e., density) of urine has promise for noninvasively quantifying the relative muscle mass (RMM) of wild primates. We verified the relationship between these urinary parameters for wild white-faced capuchin monkeys, and assessed temporal changes in the RMM of females across groups and between periods of high and low resource abundance. Materials and Methods We collected urine from 25 adult females in three groups across varying seasons at Sector Santa Rosa, Costa Rica. We measured the specific gravity and creatinine concentration of 692 samples and the effect of specific gravity on creatinine concentration. We used the residuals of this relationship to measure effects of group and season using mixed-effects models. Results Specific gravity significantly predicted creatinine concentration. Season, group membership and the interaction between these variables were significant predictors of residual creatinine variation. Specifically, RMM was higher during months with high fruit energy density, lower in one social group, and less variable among females in the smallest group. Discussion Our findings suggest that specific gravity and creatinine may be used as urinary parameters to make inferences about the RMM of capuchins. Using this technique, we infer that females experienced changes in muscle mass according to variation in resource energy availability and social group variation.","container-title":"American Journal of Physical Anthropology","DOI":"10.1002/ajpa.23239","ISSN":"1096-8644","issue":"4","language":"en","license":"© 2017 Wiley Periodicals, Inc.","note":"_eprint: https://onlinelibrary.wiley.com/doi/pdf/10.1002/ajpa.23239","page":"707-715","source":"Wiley Online Library","title":"Using urinary parameters to estimate seasonal variation in the physical condition of female white-faced capuchin monkeys (Cebus capucinus imitator)","volume":"163","author":[{"family":"Bergstrom","given":"Mackenzie L."},{"family":"Emery Thompson","given":"Melissa"},{"family":"Melin","given":"Amanda D."},{"family":"Fedigan","given":"Linda M."}],"issued":{"date-parts":[["2017"]]}}}],"schema":"https://github.com/citation-style-language/schema/raw/master/csl-citation.json"} </w:instrText>
+        <w:instrText xml:space="preserve"> ADDIN ZOTERO_ITEM CSL_CITATION {"citationID":"OT0mvtJ3","properties":{"formattedCitation":"({\\i{}118})","plainCitation":"(118)","noteIndex":0},"citationItems":[{"id":564,"uris":["http://zotero.org/users/13901503/items/C7T2JIHZ"],"itemData":{"id":564,"type":"article-journal","abstract":"Objectives The physical condition of females depends on access to resources, which vary over space and time. Assessing variation in physical condition can help identify factors affecting reproductive success, but noninvasive measurement is difficult in wild animals. Creatinine concentration relative to the specific gravity (i.e., density) of urine has promise for noninvasively quantifying the relative muscle mass (RMM) of wild primates. We verified the relationship between these urinary parameters for wild white-faced capuchin monkeys, and assessed temporal changes in the RMM of females across groups and between periods of high and low resource abundance. Materials and Methods We collected urine from 25 adult females in three groups across varying seasons at Sector Santa Rosa, Costa Rica. We measured the specific gravity and creatinine concentration of 692 samples and the effect of specific gravity on creatinine concentration. We used the residuals of this relationship to measure effects of group and season using mixed-effects models. Results Specific gravity significantly predicted creatinine concentration. Season, group membership and the interaction between these variables were significant predictors of residual creatinine variation. Specifically, RMM was higher during months with high fruit energy density, lower in one social group, and less variable among females in the smallest group. Discussion Our findings suggest that specific gravity and creatinine may be used as urinary parameters to make inferences about the RMM of capuchins. Using this technique, we infer that females experienced changes in muscle mass according to variation in resource energy availability and social group variation.","container-title":"American Journal of Physical Anthropology","DOI":"10.1002/ajpa.23239","ISSN":"1096-8644","issue":"4","language":"en","license":"© 2017 Wiley Periodicals, Inc.","note":"_eprint: https://onlinelibrary.wiley.com/doi/pdf/10.1002/ajpa.23239","page":"707-715","source":"Wiley Online Library","title":"Using urinary parameters to estimate seasonal variation in the physical condition of female white-faced capuchin monkeys (Cebus capucinus imitator)","volume":"163","author":[{"family":"Bergstrom","given":"Mackenzie L."},{"family":"Emery Thompson","given":"Melissa"},{"family":"Melin","given":"Amanda D."},{"family":"Fedigan","given":"Linda M."}],"issued":{"date-parts":[["2017"]]}}}],"schema":"https://github.com/citation-style-language/schema/raw/master/csl-citation.json"} </w:instrText>
       </w:r>
       <w:r>
         <w:rPr>
@@ -6375,7 +6531,7 @@
           <w:i/>
           <w:iCs/>
         </w:rPr>
-        <w:t>115</w:t>
+        <w:t>118</w:t>
       </w:r>
       <w:r>
         <w:t>)</w:t>
@@ -6455,7 +6611,7 @@
         <w:rPr>
           <w:bCs/>
         </w:rPr>
-        <w:instrText xml:space="preserve"> ADDIN ZOTERO_ITEM CSL_CITATION {"citationID":"9aAKfPlg","properties":{"formattedCitation":"({\\i{}116})","plainCitation":"(116)","noteIndex":0},"citationItems":[{"id":1716,"uris":["http://zotero.org/users/13901503/items/KXGKM98Y"],"itemData":{"id":1716,"type":"article-journal","abstract":"Hormone laboratories located “on-site” where field studies are being conducted have a number of advantages. On-site laboratories allow hormone analyses to proceed in near-real-time, minimize logistics of sample permits/shipping, contribute to in-country capacity-building, and (our focus here) facilitate cross-site collaboration through shared methods and a shared laboratory. Here we provide proof-of-concept that an on-site hormone laboratory (the Taboga Field Laboratory, located in the Taboga Forest Reserve, Costa Rica) can successfully run endocrine analyses in a remote location. Using fecal samples from wild white-faced capuchins (Cebus imitator) from three Costa Rican forests, we validate the extraction and analysis of four steroid hormones (glucocorticoids, testosterone, estradiol, progesterone) across six assays (DetectX® and ISWE, all from Arbor Assays). Additionally, as the first collaboration across three long-term, wild capuchin field sites (Lomas Barbudal, Santa Rosa, Taboga) involving local Costa Rican collaborators, this laboratory can serve as a future hub for collaborative exchange.","container-title":"General and Comparative Endocrinology","DOI":"10.1016/j.ygcen.2022.114109","ISSN":"0016-6480","journalAbbreviation":"General and Comparative Endocrinology","page":"114109","source":"ScienceDirect","title":"Using an on-site laboratory for fecal steroid analysis in wild white-faced capuchins","volume":"329","author":[{"family":"Beehner","given":"Jacinta C."},{"family":"Alfaro","given":"José"},{"family":"Allen","given":"Cloe"},{"family":"Benítez","given":"Marcela E."},{"family":"Bergman","given":"Thore J."},{"family":"Buehler","given":"Margaret S."},{"family":"Carrera","given":"Sofia C."},{"family":"Chester","given":"Emily M."},{"family":"Deschner","given":"Tobias"},{"family":"Fuentes","given":"Alexander"},{"family":"Gault","given":"Colleen M."},{"family":"Godoy","given":"Irene"},{"family":"Jack","given":"Katharine M."},{"family":"Kim","given":"Justin D."},{"family":"Kolinski","given":"Lev"},{"family":"Kulick","given":"Nelle K."},{"family":"Losch","given":"Teera"},{"family":"Ordoñez","given":"Juan Carlos"},{"family":"Perry","given":"Susan E."},{"family":"Pinto","given":"Fernando"},{"family":"Reilly","given":"Olivia T."},{"family":"Johnson","given":"Elizabeth Tinsley"},{"family":"Wasserman","given":"Michael D."}],"issued":{"date-parts":[["2022",12,1]]}}}],"schema":"https://github.com/citation-style-language/schema/raw/master/csl-citation.json"} </w:instrText>
+        <w:instrText xml:space="preserve"> ADDIN ZOTERO_ITEM CSL_CITATION {"citationID":"9aAKfPlg","properties":{"formattedCitation":"({\\i{}119})","plainCitation":"(119)","noteIndex":0},"citationItems":[{"id":1716,"uris":["http://zotero.org/users/13901503/items/KXGKM98Y"],"itemData":{"id":1716,"type":"article-journal","abstract":"Hormone laboratories located “on-site” where field studies are being conducted have a number of advantages. On-site laboratories allow hormone analyses to proceed in near-real-time, minimize logistics of sample permits/shipping, contribute to in-country capacity-building, and (our focus here) facilitate cross-site collaboration through shared methods and a shared laboratory. Here we provide proof-of-concept that an on-site hormone laboratory (the Taboga Field Laboratory, located in the Taboga Forest Reserve, Costa Rica) can successfully run endocrine analyses in a remote location. Using fecal samples from wild white-faced capuchins (Cebus imitator) from three Costa Rican forests, we validate the extraction and analysis of four steroid hormones (glucocorticoids, testosterone, estradiol, progesterone) across six assays (DetectX® and ISWE, all from Arbor Assays). Additionally, as the first collaboration across three long-term, wild capuchin field sites (Lomas Barbudal, Santa Rosa, Taboga) involving local Costa Rican collaborators, this laboratory can serve as a future hub for collaborative exchange.","container-title":"General and Comparative Endocrinology","DOI":"10.1016/j.ygcen.2022.114109","ISSN":"0016-6480","journalAbbreviation":"General and Comparative Endocrinology","page":"114109","source":"ScienceDirect","title":"Using an on-site laboratory for fecal steroid analysis in wild white-faced capuchins","volume":"329","author":[{"family":"Beehner","given":"Jacinta C."},{"family":"Alfaro","given":"José"},{"family":"Allen","given":"Cloe"},{"family":"Benítez","given":"Marcela E."},{"family":"Bergman","given":"Thore J."},{"family":"Buehler","given":"Margaret S."},{"family":"Carrera","given":"Sofia C."},{"family":"Chester","given":"Emily M."},{"family":"Deschner","given":"Tobias"},{"family":"Fuentes","given":"Alexander"},{"family":"Gault","given":"Colleen M."},{"family":"Godoy","given":"Irene"},{"family":"Jack","given":"Katharine M."},{"family":"Kim","given":"Justin D."},{"family":"Kolinski","given":"Lev"},{"family":"Kulick","given":"Nelle K."},{"family":"Losch","given":"Teera"},{"family":"Ordoñez","given":"Juan Carlos"},{"family":"Perry","given":"Susan E."},{"family":"Pinto","given":"Fernando"},{"family":"Reilly","given":"Olivia T."},{"family":"Johnson","given":"Elizabeth Tinsley"},{"family":"Wasserman","given":"Michael D."}],"issued":{"date-parts":[["2022",12,1]]}}}],"schema":"https://github.com/citation-style-language/schema/raw/master/csl-citation.json"} </w:instrText>
       </w:r>
       <w:r>
         <w:rPr>
@@ -6471,7 +6627,7 @@
           <w:i/>
           <w:iCs/>
         </w:rPr>
-        <w:t>116</w:t>
+        <w:t>119</w:t>
       </w:r>
       <w:r>
         <w:t>)</w:t>
@@ -6570,7 +6726,7 @@
         <w:fldChar w:fldCharType="begin"/>
       </w:r>
       <w:r>
-        <w:instrText xml:space="preserve"> ADDIN ZOTERO_ITEM CSL_CITATION {"citationID":"hpeAEVbe","properties":{"formattedCitation":"({\\i{}117})","plainCitation":"(117)","noteIndex":0},"citationItems":[{"id":590,"uris":["http://zotero.org/users/13901503/items/V8828FH9"],"itemData":{"id":590,"type":"article-journal","container-title":"Revista de Biología Tropical","ISSN":"0034-7744","issue":"3-4","language":"en","note":"publisher: http://creativecommons.org/licenses/by/3.0","page":"1021-1034","source":"SciELO","title":"Changes in composition and structure of a tropical dry forest following intermittent Cattle grazing","volume":"50","author":[{"family":"Stern","given":"Margaret"},{"family":"Quesada","given":"Mauricio"},{"family":"Stoner","given":"Kathryn E."}],"issued":{"date-parts":[["2002",12]]}}}],"schema":"https://github.com/citation-style-language/schema/raw/master/csl-citation.json"} </w:instrText>
+        <w:instrText xml:space="preserve"> ADDIN ZOTERO_ITEM CSL_CITATION {"citationID":"hpeAEVbe","properties":{"formattedCitation":"({\\i{}120})","plainCitation":"(120)","noteIndex":0},"citationItems":[{"id":590,"uris":["http://zotero.org/users/13901503/items/V8828FH9"],"itemData":{"id":590,"type":"article-journal","container-title":"Revista de Biología Tropical","ISSN":"0034-7744","issue":"3-4","language":"en","note":"publisher: http://creativecommons.org/licenses/by/3.0","page":"1021-1034","source":"SciELO","title":"Changes in composition and structure of a tropical dry forest following intermittent Cattle grazing","volume":"50","author":[{"family":"Stern","given":"Margaret"},{"family":"Quesada","given":"Mauricio"},{"family":"Stoner","given":"Kathryn E."}],"issued":{"date-parts":[["2002",12]]}}}],"schema":"https://github.com/citation-style-language/schema/raw/master/csl-citation.json"} </w:instrText>
       </w:r>
       <w:r>
         <w:fldChar w:fldCharType="separate"/>
@@ -6583,7 +6739,7 @@
           <w:i/>
           <w:iCs/>
         </w:rPr>
-        <w:t>117</w:t>
+        <w:t>120</w:t>
       </w:r>
       <w:r>
         <w:t>)</w:t>
@@ -6733,7 +6889,7 @@
         <w:fldChar w:fldCharType="begin"/>
       </w:r>
       <w:r>
-        <w:instrText xml:space="preserve"> ADDIN ZOTERO_ITEM CSL_CITATION {"citationID":"cjbmKZII","properties":{"formattedCitation":"({\\i{}118})","plainCitation":"(118)","noteIndex":0},"citationItems":[{"id":267,"uris":["http://zotero.org/users/13901503/items/PQLSPHRJ"],"itemData":{"id":267,"type":"article-journal","abstract":"Non-invasive health monitoring is advantageous for wild and captive primate populations because it reduces the need for traditional invasive techniques (i.e. anesthetization) that can be stressful and potentially harmful for individuals. The biomarker neopterin is an emerging tool in primatology to measure immune activation and immunosenescence, however, most neopterin studies have focused on catarrhine species with little comparative work examining neopterin and health in platyrrhines. To address this gap, we validated a commercially available enzyme-linked immunosorbent assay (ELISA) to measure urinary neopterin in two types of capuchin monkeys, a wild population of white-faced capuchins (Cebus imitator) and a socially housed captive colony of tufted capuchins (Sapajus apella). We analytically validated methods for measuring urinary neopterin in two capuchin populations and demonstrated that two commonly-used methods to control for urine concentration –creatinine and specific gravity (SG)– produced highly concordant results. We also biologically validated these methods by examining variation in neopterin levels based on environment (captive and wild) and age, and changes in levels associated with immune-response. We found that neopterin increased after immune perturbation (rabies vaccine booster), varied by environmental condition, and mirrored expected trends in immune system ontogeny. Our results improve understanding of the innate immune system in platyrrhine species and suggest neopterin may be useful for non-invasive health monitoring in both captive and wild primates.","container-title":"Frontiers in Veterinary Science","DOI":"10.3389/fvets.2022.918036","ISSN":"2297-1769","journalAbbreviation":"Front. Vet. Sci.","language":"English","note":"publisher: Frontiers","source":"Frontiers","title":"Validating Urinary Neopterin as a Biomarker of Immune Response in Captive and Wild Capuchin Monkeys","URL":"https://www.frontiersin.org/articles/10.3389/fvets.2022.918036","volume":"9","author":[{"family":"Lucore","given":"Jordan M."},{"family":"Marshall","given":"Andrew J."},{"family":"Brosnan","given":"Sarah F."},{"family":"Benítez","given":"Marcela E."}],"accessed":{"date-parts":[["2024",4,1]]},"issued":{"date-parts":[["2022",7,13]]}}}],"schema":"https://github.com/citation-style-language/schema/raw/master/csl-citation.json"} </w:instrText>
+        <w:instrText xml:space="preserve"> ADDIN ZOTERO_ITEM CSL_CITATION {"citationID":"cjbmKZII","properties":{"formattedCitation":"({\\i{}121})","plainCitation":"(121)","noteIndex":0},"citationItems":[{"id":267,"uris":["http://zotero.org/users/13901503/items/PQLSPHRJ"],"itemData":{"id":267,"type":"article-journal","abstract":"Non-invasive health monitoring is advantageous for wild and captive primate populations because it reduces the need for traditional invasive techniques (i.e. anesthetization) that can be stressful and potentially harmful for individuals. The biomarker neopterin is an emerging tool in primatology to measure immune activation and immunosenescence, however, most neopterin studies have focused on catarrhine species with little comparative work examining neopterin and health in platyrrhines. To address this gap, we validated a commercially available enzyme-linked immunosorbent assay (ELISA) to measure urinary neopterin in two types of capuchin monkeys, a wild population of white-faced capuchins (Cebus imitator) and a socially housed captive colony of tufted capuchins (Sapajus apella). We analytically validated methods for measuring urinary neopterin in two capuchin populations and demonstrated that two commonly-used methods to control for urine concentration –creatinine and specific gravity (SG)– produced highly concordant results. We also biologically validated these methods by examining variation in neopterin levels based on environment (captive and wild) and age, and changes in levels associated with immune-response. We found that neopterin increased after immune perturbation (rabies vaccine booster), varied by environmental condition, and mirrored expected trends in immune system ontogeny. Our results improve understanding of the innate immune system in platyrrhine species and suggest neopterin may be useful for non-invasive health monitoring in both captive and wild primates.","container-title":"Frontiers in Veterinary Science","DOI":"10.3389/fvets.2022.918036","ISSN":"2297-1769","journalAbbreviation":"Front. Vet. Sci.","language":"English","note":"publisher: Frontiers","source":"Frontiers","title":"Validating Urinary Neopterin as a Biomarker of Immune Response in Captive and Wild Capuchin Monkeys","URL":"https://www.frontiersin.org/articles/10.3389/fvets.2022.918036","volume":"9","author":[{"family":"Lucore","given":"Jordan M."},{"family":"Marshall","given":"Andrew J."},{"family":"Brosnan","given":"Sarah F."},{"family":"Benítez","given":"Marcela E."}],"accessed":{"date-parts":[["2024",4,1]]},"issued":{"date-parts":[["2022",7,13]]}}}],"schema":"https://github.com/citation-style-language/schema/raw/master/csl-citation.json"} </w:instrText>
       </w:r>
       <w:r>
         <w:fldChar w:fldCharType="separate"/>
@@ -6746,7 +6902,7 @@
           <w:i/>
           <w:iCs/>
         </w:rPr>
-        <w:t>118</w:t>
+        <w:t>121</w:t>
       </w:r>
       <w:r>
         <w:t>)</w:t>
@@ -6773,7 +6929,7 @@
         <w:fldChar w:fldCharType="begin"/>
       </w:r>
       <w:r>
-        <w:instrText xml:space="preserve"> ADDIN ZOTERO_ITEM CSL_CITATION {"citationID":"mwRM5DGT","properties":{"formattedCitation":"({\\i{}8}, {\\i{}118})","plainCitation":"(8, 118)","noteIndex":0},"citationItems":[{"id":267,"uris":["http://zotero.org/users/13901503/items/PQLSPHRJ"],"itemData":{"id":267,"type":"article-journal","abstract":"Non-invasive health monitoring is advantageous for wild and captive primate populations because it reduces the need for traditional invasive techniques (i.e. anesthetization) that can be stressful and potentially harmful for individuals. The biomarker neopterin is an emerging tool in primatology to measure immune activation and immunosenescence, however, most neopterin studies have focused on catarrhine species with little comparative work examining neopterin and health in platyrrhines. To address this gap, we validated a commercially available enzyme-linked immunosorbent assay (ELISA) to measure urinary neopterin in two types of capuchin monkeys, a wild population of white-faced capuchins (Cebus imitator) and a socially housed captive colony of tufted capuchins (Sapajus apella). We analytically validated methods for measuring urinary neopterin in two capuchin populations and demonstrated that two commonly-used methods to control for urine concentration –creatinine and specific gravity (SG)– produced highly concordant results. We also biologically validated these methods by examining variation in neopterin levels based on environment (captive and wild) and age, and changes in levels associated with immune-response. We found that neopterin increased after immune perturbation (rabies vaccine booster), varied by environmental condition, and mirrored expected trends in immune system ontogeny. Our results improve understanding of the innate immune system in platyrrhine species and suggest neopterin may be useful for non-invasive health monitoring in both captive and wild primates.","container-title":"Frontiers in Veterinary Science","DOI":"10.3389/fvets.2022.918036","ISSN":"2297-1769","journalAbbreviation":"Front. Vet. Sci.","language":"English","note":"publisher: Frontiers","source":"Frontiers","title":"Validating Urinary Neopterin as a Biomarker of Immune Response in Captive and Wild Capuchin Monkeys","URL":"https://www.frontiersin.org/articles/10.3389/fvets.2022.918036","volume":"9","author":[{"family":"Lucore","given":"Jordan M."},{"family":"Marshall","given":"Andrew J."},{"family":"Brosnan","given":"Sarah F."},{"family":"Benítez","given":"Marcela E."}],"accessed":{"date-parts":[["2024",4,1]]},"issued":{"date-parts":[["2022",7,13]]}}},{"id":1689,"uris":["http://zotero.org/users/13901503/items/2TJCS3UQ"],"itemData":{"id":1689,"type":"article-journal","abstract":"Rising temperatures due to climate change are predicted to threaten the persistence of wild animals, but there is little evidence that climate change has pushed species beyond their thermal tolerance. The immune system is an ideal avenue to assess the effects of climate change because immune performance is sensitive to changes in temperature and immune competency can affect reproductive success. We investigate the effect of rising temperatures on a biomarker of nonspecific immune performance in a wild population of capuchin monkeys and provide compelling evidence that immune performance is associated with ambient temperature. Critically, we found that immune performance in young individuals is more sensitive to high temperatures compared to other age groups. Coupled with evidence of rising temperatures in the region, our results offer insight into how climate change will affect the immune system of wild mammals.","container-title":"Science Advances","DOI":"10.1126/sciadv.adq6629","issue":"48","note":"publisher: American Association for the Advancement of Science","page":"eadq6629","source":"www-science-org.proxy.lib.umich.edu (Atypon)","title":"High temperatures are associated with decreased immune system performance in a wild primate","volume":"10","author":[{"family":"Lucore","given":"Jordan M."},{"family":"Beehner","given":"Jacinta C."},{"family":"White","given":"Amy F."},{"family":"Sinclair","given":"Lorena F."},{"family":"Martins","given":"Vasco Alexandre"},{"family":"Kovalaskas","given":"Sarah A."},{"family":"Ordoñez","given":"Juan Carlos"},{"family":"Bergman","given":"Thore J."},{"family":"Benítez","given":"Marcela E."},{"family":"Marshall","given":"Andrew J."}],"issued":{"date-parts":[["2024",11,29]]}}}],"schema":"https://github.com/citation-style-language/schema/raw/master/csl-citation.json"} </w:instrText>
+        <w:instrText xml:space="preserve"> ADDIN ZOTERO_ITEM CSL_CITATION {"citationID":"mwRM5DGT","properties":{"formattedCitation":"({\\i{}8}, {\\i{}121})","plainCitation":"(8, 121)","noteIndex":0},"citationItems":[{"id":267,"uris":["http://zotero.org/users/13901503/items/PQLSPHRJ"],"itemData":{"id":267,"type":"article-journal","abstract":"Non-invasive health monitoring is advantageous for wild and captive primate populations because it reduces the need for traditional invasive techniques (i.e. anesthetization) that can be stressful and potentially harmful for individuals. The biomarker neopterin is an emerging tool in primatology to measure immune activation and immunosenescence, however, most neopterin studies have focused on catarrhine species with little comparative work examining neopterin and health in platyrrhines. To address this gap, we validated a commercially available enzyme-linked immunosorbent assay (ELISA) to measure urinary neopterin in two types of capuchin monkeys, a wild population of white-faced capuchins (Cebus imitator) and a socially housed captive colony of tufted capuchins (Sapajus apella). We analytically validated methods for measuring urinary neopterin in two capuchin populations and demonstrated that two commonly-used methods to control for urine concentration –creatinine and specific gravity (SG)– produced highly concordant results. We also biologically validated these methods by examining variation in neopterin levels based on environment (captive and wild) and age, and changes in levels associated with immune-response. We found that neopterin increased after immune perturbation (rabies vaccine booster), varied by environmental condition, and mirrored expected trends in immune system ontogeny. Our results improve understanding of the innate immune system in platyrrhine species and suggest neopterin may be useful for non-invasive health monitoring in both captive and wild primates.","container-title":"Frontiers in Veterinary Science","DOI":"10.3389/fvets.2022.918036","ISSN":"2297-1769","journalAbbreviation":"Front. Vet. Sci.","language":"English","note":"publisher: Frontiers","source":"Frontiers","title":"Validating Urinary Neopterin as a Biomarker of Immune Response in Captive and Wild Capuchin Monkeys","URL":"https://www.frontiersin.org/articles/10.3389/fvets.2022.918036","volume":"9","author":[{"family":"Lucore","given":"Jordan M."},{"family":"Marshall","given":"Andrew J."},{"family":"Brosnan","given":"Sarah F."},{"family":"Benítez","given":"Marcela E."}],"accessed":{"date-parts":[["2024",4,1]]},"issued":{"date-parts":[["2022",7,13]]}}},{"id":1689,"uris":["http://zotero.org/users/13901503/items/2TJCS3UQ"],"itemData":{"id":1689,"type":"article-journal","abstract":"Rising temperatures due to climate change are predicted to threaten the persistence of wild animals, but there is little evidence that climate change has pushed species beyond their thermal tolerance. The immune system is an ideal avenue to assess the effects of climate change because immune performance is sensitive to changes in temperature and immune competency can affect reproductive success. We investigate the effect of rising temperatures on a biomarker of nonspecific immune performance in a wild population of capuchin monkeys and provide compelling evidence that immune performance is associated with ambient temperature. Critically, we found that immune performance in young individuals is more sensitive to high temperatures compared to other age groups. Coupled with evidence of rising temperatures in the region, our results offer insight into how climate change will affect the immune system of wild mammals.","container-title":"Science Advances","DOI":"10.1126/sciadv.adq6629","issue":"48","note":"publisher: American Association for the Advancement of Science","page":"eadq6629","source":"www-science-org.proxy.lib.umich.edu (Atypon)","title":"High temperatures are associated with decreased immune system performance in a wild primate","volume":"10","author":[{"family":"Lucore","given":"Jordan M."},{"family":"Beehner","given":"Jacinta C."},{"family":"White","given":"Amy F."},{"family":"Sinclair","given":"Lorena F."},{"family":"Martins","given":"Vasco Alexandre"},{"family":"Kovalaskas","given":"Sarah A."},{"family":"Ordoñez","given":"Juan Carlos"},{"family":"Bergman","given":"Thore J."},{"family":"Benítez","given":"Marcela E."},{"family":"Marshall","given":"Andrew J."}],"issued":{"date-parts":[["2024",11,29]]}}}],"schema":"https://github.com/citation-style-language/schema/raw/master/csl-citation.json"} </w:instrText>
       </w:r>
       <w:r>
         <w:fldChar w:fldCharType="separate"/>
@@ -6796,7 +6952,7 @@
           <w:i/>
           <w:iCs/>
         </w:rPr>
-        <w:t>118</w:t>
+        <w:t>121</w:t>
       </w:r>
       <w:r>
         <w:t>)</w:t>
@@ -6931,7 +7087,7 @@
         <w:fldChar w:fldCharType="begin"/>
       </w:r>
       <w:r>
-        <w:instrText xml:space="preserve"> ADDIN ZOTERO_ITEM CSL_CITATION {"citationID":"GSwb9QQA","properties":{"formattedCitation":"({\\i{}119}\\uc0\\u8211{}{\\i{}121})","plainCitation":"(119–121)","noteIndex":0},"citationItems":[{"id":34,"uris":["http://zotero.org/users/13901503/items/QZVE8E7B"],"itemData":{"id":34,"type":"article-journal","abstract":"Understanding the mechanisms by which organisms respond to environmental change is critical to conservation biology. Recent research indicates that the gut microbiome may mediate mammalian responses to the environment and can be used as a biomarker to understand host ecological strategies. Here, we explore the relationship between the gut microbiome, host dietary niche, and potential resilience to habitat alteration using two closely related, sympatric non-human primate species: the tufted gray langur (Semnopithecus priam) and the purple-faced langur (Semnopithecus vetulus). The gray langur is suspected to be a habitat generalist less perturbed by anthropogenic disturbance, while the purple-faced langur is suspected to be a specialist more sensitive to disturbance. To test these characterizations, we assessed the gut microbiome using 16S rRNA gene amplicon sequencing of fecal samples collected from Kaludiyapokuna Forest Reserve, Sri Lanka (gray langur n = 50 samples, purple-faced langur n = 7 samples). Our results demonstrate that despite strong gut microbial similarities, gray langurs had a more diverse gut microbiome that harbored Prevotella and Akkermansia, taxa involved in starch degradation, while the purple-faced langur gut microbiome harbored Roseburia, Clostridium, and Ruminococcus, taxa involved in processing plant structural carbohydrates. Compared to related species in other locations, both Sri Lankan langurs harbored more pathogenic bacteria. These differences suggest that gray langurs have more generalist diets, making them more resilient to anthropogenic change, but also indicate that they are not impervious to human encroachment. Our findings suggest that microbiome analyses are an important tool for langur ecology and conservation, and should be integrated into ongoing studies.","container-title":"Biotropica","DOI":"10.1111/btp.12805","ISSN":"1744-7429","issue":"5","language":"en","license":"© 2020 The Association for Tropical Biology and Conservation","note":"_eprint: https://onlinelibrary.wiley.com/doi/pdf/10.1111/btp.12805","page":"981-990","source":"Wiley Online Library","title":"Gut microbiome, diet, and conservation of endangered langurs in Sri Lanka","volume":"52","author":[{"family":"Amato","given":"Katherine R."},{"family":"Kuthyar","given":"Sahana"},{"family":"Ekanayake-Weber","given":"Marcy"},{"family":"Salmi","given":"Roberta"},{"family":"Snyder-Mackler","given":"Noah"},{"family":"Wijayathunga","given":"Lasanthi"},{"family":"Vandercone","given":"Rajnish"},{"family":"Lu","given":"Amy"}],"issued":{"date-parts":[["2020"]]}}},{"id":1646,"uris":["http://zotero.org/users/13901503/items/MBVK2BP9"],"itemData":{"id":1646,"type":"article-journal","abstract":"The genus Saguinus represents a successful radiation of over 20 species of small-bodied New World monkeys. Studies of the tamarin diet indicate that insects and small vertebrates account for </w:instrText>
+        <w:instrText xml:space="preserve"> ADDIN ZOTERO_ITEM CSL_CITATION {"citationID":"GSwb9QQA","properties":{"formattedCitation":"({\\i{}122}\\uc0\\u8211{}{\\i{}124})","plainCitation":"(122–124)","noteIndex":0},"citationItems":[{"id":34,"uris":["http://zotero.org/users/13901503/items/QZVE8E7B"],"itemData":{"id":34,"type":"article-journal","abstract":"Understanding the mechanisms by which organisms respond to environmental change is critical to conservation biology. Recent research indicates that the gut microbiome may mediate mammalian responses to the environment and can be used as a biomarker to understand host ecological strategies. Here, we explore the relationship between the gut microbiome, host dietary niche, and potential resilience to habitat alteration using two closely related, sympatric non-human primate species: the tufted gray langur (Semnopithecus priam) and the purple-faced langur (Semnopithecus vetulus). The gray langur is suspected to be a habitat generalist less perturbed by anthropogenic disturbance, while the purple-faced langur is suspected to be a specialist more sensitive to disturbance. To test these characterizations, we assessed the gut microbiome using 16S rRNA gene amplicon sequencing of fecal samples collected from Kaludiyapokuna Forest Reserve, Sri Lanka (gray langur n = 50 samples, purple-faced langur n = 7 samples). Our results demonstrate that despite strong gut microbial similarities, gray langurs had a more diverse gut microbiome that harbored Prevotella and Akkermansia, taxa involved in starch degradation, while the purple-faced langur gut microbiome harbored Roseburia, Clostridium, and Ruminococcus, taxa involved in processing plant structural carbohydrates. Compared to related species in other locations, both Sri Lankan langurs harbored more pathogenic bacteria. These differences suggest that gray langurs have more generalist diets, making them more resilient to anthropogenic change, but also indicate that they are not impervious to human encroachment. Our findings suggest that microbiome analyses are an important tool for langur ecology and conservation, and should be integrated into ongoing studies.","container-title":"Biotropica","DOI":"10.1111/btp.12805","ISSN":"1744-7429","issue":"5","language":"en","license":"© 2020 The Association for Tropical Biology and Conservation","note":"_eprint: https://onlinelibrary.wiley.com/doi/pdf/10.1111/btp.12805","page":"981-990","source":"Wiley Online Library","title":"Gut microbiome, diet, and conservation of endangered langurs in Sri Lanka","volume":"52","author":[{"family":"Amato","given":"Katherine R."},{"family":"Kuthyar","given":"Sahana"},{"family":"Ekanayake-Weber","given":"Marcy"},{"family":"Salmi","given":"Roberta"},{"family":"Snyder-Mackler","given":"Noah"},{"family":"Wijayathunga","given":"Lasanthi"},{"family":"Vandercone","given":"Rajnish"},{"family":"Lu","given":"Amy"}],"issued":{"date-parts":[["2020"]]}}},{"id":1646,"uris":["http://zotero.org/users/13901503/items/MBVK2BP9"],"itemData":{"id":1646,"type":"article-journal","abstract":"The genus Saguinus represents a successful radiation of over 20 species of small-bodied New World monkeys. Studies of the tamarin diet indicate that insects and small vertebrates account for </w:instrText>
       </w:r>
       <w:r>
         <w:rPr>
@@ -6962,7 +7118,7 @@
           <w:i/>
           <w:iCs/>
         </w:rPr>
-        <w:t>119</w:t>
+        <w:t>122</w:t>
       </w:r>
       <w:r>
         <w:t>–</w:t>
@@ -6972,7 +7128,7 @@
           <w:i/>
           <w:iCs/>
         </w:rPr>
-        <w:t>121</w:t>
+        <w:t>124</w:t>
       </w:r>
       <w:r>
         <w:t>)</w:t>
@@ -7020,7 +7176,7 @@
       <w:r>
         <w:t>(</w:t>
       </w:r>
-      <w:hyperlink r:id="rId9" w:history="1">
+      <w:hyperlink r:id="rId5" w:history="1">
         <w:r>
           <w:rPr>
             <w:rStyle w:val="Hyperlink"/>
@@ -7038,7 +7194,7 @@
         <w:fldChar w:fldCharType="begin"/>
       </w:r>
       <w:r>
-        <w:instrText xml:space="preserve"> ADDIN ZOTERO_ITEM CSL_CITATION {"citationID":"AIswTiIH","properties":{"formattedCitation":"({\\i{}122})","plainCitation":"(122)","noteIndex":0},"citationItems":[{"id":1652,"uris":["http://zotero.org/users/13901503/items/HTTZHT5K"],"itemData":{"id":1652,"type":"article-journal","abstract":"Sources of error and bias in PCR amplification of microbial samples for 16S rRNA gene sequencing are systematically evaluated, and best-practice recommendations for reliable amplification are made.","container-title":"Nature Biotechnology","DOI":"10.1038/nbt.3601","ISSN":"1546-1696","issue":"9","journalAbbreviation":"Nat Biotechnol","language":"en","license":"2016 Springer Nature America, Inc.","note":"publisher: Nature Publishing Group","page":"942-949","source":"www-nature-com.proxy.lib.umich.edu","title":"Systematic improvement of amplicon marker gene methods for increased accuracy in microbiome studies","volume":"34","author":[{"family":"Gohl","given":"Daryl M."},{"family":"Vangay","given":"Pajau"},{"family":"Garbe","given":"John"},{"family":"MacLean","given":"Allison"},{"family":"Hauge","given":"Adam"},{"family":"Becker","given":"Aaron"},{"family":"Gould","given":"Trevor J."},{"family":"Clayton","given":"Jonathan B."},{"family":"Johnson","given":"Timothy J."},{"family":"Hunter","given":"Ryan"},{"family":"Knights","given":"Dan"},{"family":"Beckman","given":"Kenneth B."}],"issued":{"date-parts":[["2016",9]]}}}],"schema":"https://github.com/citation-style-language/schema/raw/master/csl-citation.json"} </w:instrText>
+        <w:instrText xml:space="preserve"> ADDIN ZOTERO_ITEM CSL_CITATION {"citationID":"AIswTiIH","properties":{"formattedCitation":"({\\i{}125})","plainCitation":"(125)","noteIndex":0},"citationItems":[{"id":1652,"uris":["http://zotero.org/users/13901503/items/HTTZHT5K"],"itemData":{"id":1652,"type":"article-journal","abstract":"Sources of error and bias in PCR amplification of microbial samples for 16S rRNA gene sequencing are systematically evaluated, and best-practice recommendations for reliable amplification are made.","container-title":"Nature Biotechnology","DOI":"10.1038/nbt.3601","ISSN":"1546-1696","issue":"9","journalAbbreviation":"Nat Biotechnol","language":"en","license":"2016 Springer Nature America, Inc.","note":"publisher: Nature Publishing Group","page":"942-949","source":"www-nature-com.proxy.lib.umich.edu","title":"Systematic improvement of amplicon marker gene methods for increased accuracy in microbiome studies","volume":"34","author":[{"family":"Gohl","given":"Daryl M."},{"family":"Vangay","given":"Pajau"},{"family":"Garbe","given":"John"},{"family":"MacLean","given":"Allison"},{"family":"Hauge","given":"Adam"},{"family":"Becker","given":"Aaron"},{"family":"Gould","given":"Trevor J."},{"family":"Clayton","given":"Jonathan B."},{"family":"Johnson","given":"Timothy J."},{"family":"Hunter","given":"Ryan"},{"family":"Knights","given":"Dan"},{"family":"Beckman","given":"Kenneth B."}],"issued":{"date-parts":[["2016",9]]}}}],"schema":"https://github.com/citation-style-language/schema/raw/master/csl-citation.json"} </w:instrText>
       </w:r>
       <w:r>
         <w:fldChar w:fldCharType="separate"/>
@@ -7051,7 +7207,7 @@
           <w:i/>
           <w:iCs/>
         </w:rPr>
-        <w:t>122</w:t>
+        <w:t>125</w:t>
       </w:r>
       <w:r>
         <w:t>)</w:t>
@@ -7066,7 +7222,7 @@
         <w:fldChar w:fldCharType="begin"/>
       </w:r>
       <w:r>
-        <w:instrText xml:space="preserve"> ADDIN ZOTERO_ITEM CSL_CITATION {"citationID":"ZrmMCAjM","properties":{"formattedCitation":"({\\i{}123})","plainCitation":"(123)","noteIndex":0},"citationItems":[{"id":676,"uris":["http://zotero.org/users/13901503/items/JGY397VL"],"itemData":{"id":676,"type":"article-journal","abstract":"Changes in reproductive status influence energy and nutrient requirements in female primates. The gut microbiota may buffer changes in energy demands, with shifts in community composition increasing the energy production potential of the gut during pregnancy and lactation. In this study, we examine changes in the gut microbiome of wild, female white-faced capuchins (Cebus capucinus) across different reproductive states. Fecal samples (n = 39) were collected from five adult females over the course of a year. Gut microbial community composition was assessed using 16S rRNA gene sequences, and PICRUSt was used to make metagenomic functional predictions. We found a significant relationship between reproductive state and both the structure and predicted function of the gut microbiome, neither of which were associated with host diet. For example, the relative abundance of Firmicutes was significantly lower in lactating females compared with cycling females; the relative abundance of Actinobacteria was significantly higher in pregnant females compared with lactating females, and there was a trend toward higher relative abundances of Proteobacteria in pregnant females compared with cycling females. The results of this study suggest that, in addition to behavioral and dietary adaptions, the gut microbiota may play a role in allowing female primates to meet their changing energetic needs during reproduction. Further studies of the “microbial reproductive ecology” of primates will help advance our understanding of gut microbial contributions to primate energetics.","container-title":"American Journal of Primatology","DOI":"10.1002/ajp.22896","ISSN":"1098-2345","issue":"8","language":"en","license":"© 2018 Wiley Periodicals, Inc.","note":"_eprint: https://onlinelibrary.wiley.com/doi/pdf/10.1002/ajp.22896","page":"e22896","source":"Wiley Online Library","title":"The microbial reproductive ecology of white-faced capuchins (Cebus capucinus)","volume":"80","author":[{"family":"Mallott","given":"Elizabeth K."},{"family":"Amato","given":"Katherine R."}],"issued":{"date-parts":[["2018"]]}}}],"schema":"https://github.com/citation-style-language/schema/raw/master/csl-citation.json"} </w:instrText>
+        <w:instrText xml:space="preserve"> ADDIN ZOTERO_ITEM CSL_CITATION {"citationID":"ZrmMCAjM","properties":{"formattedCitation":"({\\i{}126})","plainCitation":"(126)","noteIndex":0},"citationItems":[{"id":676,"uris":["http://zotero.org/users/13901503/items/JGY397VL"],"itemData":{"id":676,"type":"article-journal","abstract":"Changes in reproductive status influence energy and nutrient requirements in female primates. The gut microbiota may buffer changes in energy demands, with shifts in community composition increasing the energy production potential of the gut during pregnancy and lactation. In this study, we examine changes in the gut microbiome of wild, female white-faced capuchins (Cebus capucinus) across different reproductive states. Fecal samples (n = 39) were collected from five adult females over the course of a year. Gut microbial community composition was assessed using 16S rRNA gene sequences, and PICRUSt was used to make metagenomic functional predictions. We found a significant relationship between reproductive state and both the structure and predicted function of the gut microbiome, neither of which were associated with host diet. For example, the relative abundance of Firmicutes was significantly lower in lactating females compared with cycling females; the relative abundance of Actinobacteria was significantly higher in pregnant females compared with lactating females, and there was a trend toward higher relative abundances of Proteobacteria in pregnant females compared with cycling females. The results of this study suggest that, in addition to behavioral and dietary adaptions, the gut microbiota may play a role in allowing female primates to meet their changing energetic needs during reproduction. Further studies of the “microbial reproductive ecology” of primates will help advance our understanding of gut microbial contributions to primate energetics.","container-title":"American Journal of Primatology","DOI":"10.1002/ajp.22896","ISSN":"1098-2345","issue":"8","language":"en","license":"© 2018 Wiley Periodicals, Inc.","note":"_eprint: https://onlinelibrary.wiley.com/doi/pdf/10.1002/ajp.22896","page":"e22896","source":"Wiley Online Library","title":"The microbial reproductive ecology of white-faced capuchins (Cebus capucinus)","volume":"80","author":[{"family":"Mallott","given":"Elizabeth K."},{"family":"Amato","given":"Katherine R."}],"issued":{"date-parts":[["2018"]]}}}],"schema":"https://github.com/citation-style-language/schema/raw/master/csl-citation.json"} </w:instrText>
       </w:r>
       <w:r>
         <w:fldChar w:fldCharType="separate"/>
@@ -7079,7 +7235,7 @@
           <w:i/>
           <w:iCs/>
         </w:rPr>
-        <w:t>123</w:t>
+        <w:t>126</w:t>
       </w:r>
       <w:r>
         <w:t>)</w:t>
@@ -7124,7 +7280,7 @@
         <w:fldChar w:fldCharType="begin"/>
       </w:r>
       <w:r>
-        <w:instrText xml:space="preserve"> ADDIN ZOTERO_ITEM CSL_CITATION {"citationID":"Bjv8Vjr7","properties":{"formattedCitation":"({\\i{}124})","plainCitation":"(124)","noteIndex":0},"citationItems":[{"id":1655,"uris":["http://zotero.org/users/13901503/items/GQC5IVSJ"],"itemData":{"id":1655,"type":"article-journal","container-title":"Nature Methods","DOI":"10.1038/nmeth.f.303","ISSN":"1548-7091, 1548-7105","issue":"5","journalAbbreviation":"Nat Methods","language":"en","license":"http://www.springer.com/tdm","page":"335-336","source":"DOI.org (Crossref)","title":"QIIME allows analysis of high-throughput community sequencing data","volume":"7","author":[{"family":"Caporaso","given":"J Gregory"},{"family":"Kuczynski","given":"Justin"},{"family":"Stombaugh","given":"Jesse"},{"family":"Bittinger","given":"Kyle"},{"family":"Bushman","given":"Frederic D"},{"family":"Costello","given":"Elizabeth K"},{"family":"Fierer","given":"Noah"},{"family":"Peña","given":"Antonio Gonzalez"},{"family":"Goodrich","given":"Julia K"},{"family":"Gordon","given":"Jeffrey I"},{"family":"Huttley","given":"Gavin A"},{"family":"Kelley","given":"Scott T"},{"family":"Knights","given":"Dan"},{"family":"Koenig","given":"Jeremy E"},{"family":"Ley","given":"Ruth E"},{"family":"Lozupone","given":"Catherine A"},{"family":"McDonald","given":"Daniel"},{"family":"Muegge","given":"Brian D"},{"family":"Pirrung","given":"Meg"},{"family":"Reeder","given":"Jens"},{"family":"Sevinsky","given":"Joel R"},{"family":"Turnbaugh","given":"Peter J"},{"family":"Walters","given":"William A"},{"family":"Widmann","given":"Jeremy"},{"family":"Yatsunenko","given":"Tanya"},{"family":"Zaneveld","given":"Jesse"},{"family":"Knight","given":"Rob"}],"issued":{"date-parts":[["2010",5]]}}}],"schema":"https://github.com/citation-style-language/schema/raw/master/csl-citation.json"} </w:instrText>
+        <w:instrText xml:space="preserve"> ADDIN ZOTERO_ITEM CSL_CITATION {"citationID":"Bjv8Vjr7","properties":{"formattedCitation":"({\\i{}127})","plainCitation":"(127)","noteIndex":0},"citationItems":[{"id":1655,"uris":["http://zotero.org/users/13901503/items/GQC5IVSJ"],"itemData":{"id":1655,"type":"article-journal","container-title":"Nature Methods","DOI":"10.1038/nmeth.f.303","ISSN":"1548-7091, 1548-7105","issue":"5","journalAbbreviation":"Nat Methods","language":"en","license":"http://www.springer.com/tdm","page":"335-336","source":"DOI.org (Crossref)","title":"QIIME allows analysis of high-throughput community sequencing data","volume":"7","author":[{"family":"Caporaso","given":"J Gregory"},{"family":"Kuczynski","given":"Justin"},{"family":"Stombaugh","given":"Jesse"},{"family":"Bittinger","given":"Kyle"},{"family":"Bushman","given":"Frederic D"},{"family":"Costello","given":"Elizabeth K"},{"family":"Fierer","given":"Noah"},{"family":"Peña","given":"Antonio Gonzalez"},{"family":"Goodrich","given":"Julia K"},{"family":"Gordon","given":"Jeffrey I"},{"family":"Huttley","given":"Gavin A"},{"family":"Kelley","given":"Scott T"},{"family":"Knights","given":"Dan"},{"family":"Koenig","given":"Jeremy E"},{"family":"Ley","given":"Ruth E"},{"family":"Lozupone","given":"Catherine A"},{"family":"McDonald","given":"Daniel"},{"family":"Muegge","given":"Brian D"},{"family":"Pirrung","given":"Meg"},{"family":"Reeder","given":"Jens"},{"family":"Sevinsky","given":"Joel R"},{"family":"Turnbaugh","given":"Peter J"},{"family":"Walters","given":"William A"},{"family":"Widmann","given":"Jeremy"},{"family":"Yatsunenko","given":"Tanya"},{"family":"Zaneveld","given":"Jesse"},{"family":"Knight","given":"Rob"}],"issued":{"date-parts":[["2010",5]]}}}],"schema":"https://github.com/citation-style-language/schema/raw/master/csl-citation.json"} </w:instrText>
       </w:r>
       <w:r>
         <w:fldChar w:fldCharType="separate"/>
@@ -7137,7 +7293,7 @@
           <w:i/>
           <w:iCs/>
         </w:rPr>
-        <w:t>124</w:t>
+        <w:t>127</w:t>
       </w:r>
       <w:r>
         <w:t>)</w:t>
@@ -7206,7 +7362,7 @@
         <w:fldChar w:fldCharType="begin"/>
       </w:r>
       <w:r>
-        <w:instrText xml:space="preserve"> ADDIN ZOTERO_ITEM CSL_CITATION {"citationID":"CHiMHSnG","properties":{"formattedCitation":"({\\i{}125})","plainCitation":"(125)","noteIndex":0},"citationItems":[{"id":1656,"uris":["http://zotero.org/users/13901503/items/5QIKX6JW"],"itemData":{"id":1656,"type":"article-journal","abstract":"DADA2 is an open-source software package that denoises and removes sequencing errors from Illumina amplicon sequence data to distinguish microbial sample sequences differing by as little as a single nucleotide.","container-title":"Nature Methods","DOI":"10.1038/nmeth.3869","ISSN":"1548-7105","issue":"7","journalAbbreviation":"Nat Methods","language":"en","license":"2016 Springer Nature America, Inc.","note":"publisher: Nature Publishing Group","page":"581-583","source":"www-nature-com.proxy.lib.umich.edu","title":"DADA2: High-resolution sample inference from Illumina amplicon data","title-short":"DADA2","volume":"13","author":[{"family":"Callahan","given":"Benjamin J."},{"family":"McMurdie","given":"Paul J."},{"family":"Rosen","given":"Michael J."},{"family":"Han","given":"Andrew W."},{"family":"Johnson","given":"Amy Jo A."},{"family":"Holmes","given":"Susan P."}],"issued":{"date-parts":[["2016",7]]}}}],"schema":"https://github.com/citation-style-language/schema/raw/master/csl-citation.json"} </w:instrText>
+        <w:instrText xml:space="preserve"> ADDIN ZOTERO_ITEM CSL_CITATION {"citationID":"CHiMHSnG","properties":{"formattedCitation":"({\\i{}128})","plainCitation":"(128)","noteIndex":0},"citationItems":[{"id":1656,"uris":["http://zotero.org/users/13901503/items/5QIKX6JW"],"itemData":{"id":1656,"type":"article-journal","abstract":"DADA2 is an open-source software package that denoises and removes sequencing errors from Illumina amplicon sequence data to distinguish microbial sample sequences differing by as little as a single nucleotide.","container-title":"Nature Methods","DOI":"10.1038/nmeth.3869","ISSN":"1548-7105","issue":"7","journalAbbreviation":"Nat Methods","language":"en","license":"2016 Springer Nature America, Inc.","note":"publisher: Nature Publishing Group","page":"581-583","source":"www-nature-com.proxy.lib.umich.edu","title":"DADA2: High-resolution sample inference from Illumina amplicon data","title-short":"DADA2","volume":"13","author":[{"family":"Callahan","given":"Benjamin J."},{"family":"McMurdie","given":"Paul J."},{"family":"Rosen","given":"Michael J."},{"family":"Han","given":"Andrew W."},{"family":"Johnson","given":"Amy Jo A."},{"family":"Holmes","given":"Susan P."}],"issued":{"date-parts":[["2016",7]]}}}],"schema":"https://github.com/citation-style-language/schema/raw/master/csl-citation.json"} </w:instrText>
       </w:r>
       <w:r>
         <w:fldChar w:fldCharType="separate"/>
@@ -7219,7 +7375,7 @@
           <w:i/>
           <w:iCs/>
         </w:rPr>
-        <w:t>125</w:t>
+        <w:t>128</w:t>
       </w:r>
       <w:r>
         <w:t>)</w:t>
@@ -7234,7 +7390,7 @@
         <w:fldChar w:fldCharType="begin"/>
       </w:r>
       <w:r>
-        <w:instrText xml:space="preserve"> ADDIN ZOTERO_ITEM CSL_CITATION {"citationID":"Nz6FGjkT","properties":{"formattedCitation":"({\\i{}126})","plainCitation":"(126)","noteIndex":0},"citationItems":[{"id":1662,"uris":["http://zotero.org/users/13901503/items/U2MLAXCJ"],"itemData":{"id":1662,"type":"article-journal","abstract":"Taxonomic classification of marker-gene sequences is an important step in microbiome analysis.","container-title":"Microbiome","DOI":"10.1186/s40168-018-0470-z","ISSN":"2049-2618","issue":"1","journalAbbreviation":"Microbiome","page":"90","source":"BioMed Central","title":"Optimizing taxonomic classification of marker-gene amplicon sequences with QIIME 2’s q2-feature-classifier plugin","volume":"6","author":[{"family":"Bokulich","given":"Nicholas A."},{"family":"Kaehler","given":"Benjamin D."},{"family":"Rideout","given":"Jai Ram"},{"family":"Dillon","given":"Matthew"},{"family":"Bolyen","given":"Evan"},{"family":"Knight","given":"Rob"},{"family":"Huttley","given":"Gavin A."},{"family":"Gregory Caporaso","given":"J."}],"issued":{"date-parts":[["2018",5,17]]}}}],"schema":"https://github.com/citation-style-language/schema/raw/master/csl-citation.json"} </w:instrText>
+        <w:instrText xml:space="preserve"> ADDIN ZOTERO_ITEM CSL_CITATION {"citationID":"Nz6FGjkT","properties":{"formattedCitation":"({\\i{}129})","plainCitation":"(129)","noteIndex":0},"citationItems":[{"id":1662,"uris":["http://zotero.org/users/13901503/items/U2MLAXCJ"],"itemData":{"id":1662,"type":"article-journal","abstract":"Taxonomic classification of marker-gene sequences is an important step in microbiome analysis.","container-title":"Microbiome","DOI":"10.1186/s40168-018-0470-z","ISSN":"2049-2618","issue":"1","journalAbbreviation":"Microbiome","page":"90","source":"BioMed Central","title":"Optimizing taxonomic classification of marker-gene amplicon sequences with QIIME 2’s q2-feature-classifier plugin","volume":"6","author":[{"family":"Bokulich","given":"Nicholas A."},{"family":"Kaehler","given":"Benjamin D."},{"family":"Rideout","given":"Jai Ram"},{"family":"Dillon","given":"Matthew"},{"family":"Bolyen","given":"Evan"},{"family":"Knight","given":"Rob"},{"family":"Huttley","given":"Gavin A."},{"family":"Gregory Caporaso","given":"J."}],"issued":{"date-parts":[["2018",5,17]]}}}],"schema":"https://github.com/citation-style-language/schema/raw/master/csl-citation.json"} </w:instrText>
       </w:r>
       <w:r>
         <w:fldChar w:fldCharType="separate"/>
@@ -7247,7 +7403,7 @@
           <w:i/>
           <w:iCs/>
         </w:rPr>
-        <w:t>126</w:t>
+        <w:t>129</w:t>
       </w:r>
       <w:r>
         <w:t>)</w:t>
@@ -7262,7 +7418,7 @@
         <w:fldChar w:fldCharType="begin"/>
       </w:r>
       <w:r>
-        <w:instrText xml:space="preserve"> ADDIN ZOTERO_ITEM CSL_CITATION {"citationID":"txLAM5mf","properties":{"formattedCitation":"({\\i{}127}, {\\i{}128})","plainCitation":"(127, 128)","noteIndex":0},"citationItems":[{"id":1658,"uris":["http://zotero.org/users/13901503/items/I2KJAM89"],"itemData":{"id":1658,"type":"article-journal","abstract":"Reference phylogenies are crucial for providing a taxonomic framework for interpretation of marker gene and metagenomic surveys, which continue to reveal novel species at a remarkable rate. Greengenes is a dedicated full-length 16S rRNA gene database that provides users with a curated taxonomy based on de novo tree inference. We developed a ‘taxonomy to tree’ approach for transferring group names from an existing taxonomy to a tree topology, and used it to apply the Greengenes, National Center for Biotechnology Information (NCBI) and cyanoDB (Cyanobacteria only) taxonomies to a de novo tree comprising 408 315 sequences. We also incorporated explicit rank information provided by the NCBI taxonomy to group names (by prefixing rank designations) for better user orientation and classification consistency. The resulting merged taxonomy improved the classification of 75% of the sequences by one or more ranks relative to the original NCBI taxonomy with the most pronounced improvements occurring in under-classified environmental sequences. We also assessed candidate phyla (divisions) currently defined by NCBI and present recommendations for consolidation of 34 redundantly named groups. All intermediate results from the pipeline, which includes tree inference, jackknifing and transfer of a donor taxonomy to a recipient tree (tax2tree) are available for download. The improved Greengenes taxonomy should provide important infrastructure for a wide range of megasequencing projects studying ecosystems on scales ranging from our own bodies (the Human Microbiome Project) to the entire planet (the Earth Microbiome Project). The implementation of the software can be obtained from http://sourceforge.net/projects/tax2tree/.","container-title":"The ISME Journal","DOI":"10.1038/ismej.2011.139","ISSN":"1751-7370","issue":"3","journalAbbreviation":"ISME J","language":"en","license":"2012 The Author(s)","note":"publisher: Nature Publishing Group","page":"610-618","source":"www-nature-com.proxy.lib.umich.edu","title":"An improved Greengenes taxonomy with explicit ranks for ecological and evolutionary analyses of bacteria and archaea","volume":"6","author":[{"family":"McDonald","given":"Daniel"},{"family":"Price","given":"Morgan N."},{"family":"Goodrich","given":"Julia"},{"family":"Nawrocki","given":"Eric P."},{"family":"DeSantis","given":"Todd Z."},{"family":"Probst","given":"Alexander"},{"family":"Andersen","given":"Gary L."},{"family":"Knight","given":"Rob"},{"family":"Hugenholtz","given":"Philip"}],"issued":{"date-parts":[["2012",3]]}}},{"id":1660,"uris":["http://zotero.org/users/13901503/items/G9YGXKGA"],"itemData":{"id":1660,"type":"article-journal","abstract":"Studies using 16S rRNA and shotgun metagenomics typically yield different results, usually attributed to PCR amplification biases. We introduce Greengenes2, a reference tree that unifies genomic and 16S rRNA databases in a consistent, integrated resource. By inserting sequences into a whole-genome phylogeny, we show that 16S rRNA and shotgun metagenomic data generated from the same samples agree in principal coordinates space, taxonomy and phenotype effect size when analyzed with the same tree.","container-title":"Nature Biotechnology","DOI":"10.1038/s41587-023-01845-1","ISSN":"1546-1696","issue":"5","journalAbbreviation":"Nat Biotechnol","language":"en","license":"2023 The Author(s)","note":"publisher: Nature Publishing Group","page":"715-718","source":"www-nature-com.proxy.lib.umich.edu","title":"Greengenes2 unifies microbial data in a single reference tree","volume":"42","author":[{"family":"McDonald","given":"Daniel"},{"family":"Jiang","given":"Yueyu"},{"family":"Balaban","given":"Metin"},{"family":"Cantrell","given":"Kalen"},{"family":"Zhu","given":"Qiyun"},{"family":"Gonzalez","given":"Antonio"},{"family":"Morton","given":"James T."},{"family":"Nicolaou","given":"Giorgia"},{"family":"Parks","given":"Donovan H."},{"family":"Karst","given":"Søren M."},{"family":"Albertsen","given":"Mads"},{"family":"Hugenholtz","given":"Philip"},{"family":"DeSantis","given":"Todd"},{"family":"Song","given":"Se Jin"},{"family":"Bartko","given":"Andrew"},{"family":"Havulinna","given":"Aki S."},{"family":"Jousilahti","given":"Pekka"},{"family":"Cheng","given":"Susan"},{"family":"Inouye","given":"Michael"},{"family":"Niiranen","given":"Teemu"},{"family":"Jain","given":"Mohit"},{"family":"Salomaa","given":"Veikko"},{"family":"Lahti","given":"Leo"},{"family":"Mirarab","given":"Siavash"},{"family":"Knight","given":"Rob"}],"issued":{"date-parts":[["2024",5]]}}}],"schema":"https://github.com/citation-style-language/schema/raw/master/csl-citation.json"} </w:instrText>
+        <w:instrText xml:space="preserve"> ADDIN ZOTERO_ITEM CSL_CITATION {"citationID":"txLAM5mf","properties":{"formattedCitation":"({\\i{}130}, {\\i{}131})","plainCitation":"(130, 131)","noteIndex":0},"citationItems":[{"id":1658,"uris":["http://zotero.org/users/13901503/items/I2KJAM89"],"itemData":{"id":1658,"type":"article-journal","abstract":"Reference phylogenies are crucial for providing a taxonomic framework for interpretation of marker gene and metagenomic surveys, which continue to reveal novel species at a remarkable rate. Greengenes is a dedicated full-length 16S rRNA gene database that provides users with a curated taxonomy based on de novo tree inference. We developed a ‘taxonomy to tree’ approach for transferring group names from an existing taxonomy to a tree topology, and used it to apply the Greengenes, National Center for Biotechnology Information (NCBI) and cyanoDB (Cyanobacteria only) taxonomies to a de novo tree comprising 408 315 sequences. We also incorporated explicit rank information provided by the NCBI taxonomy to group names (by prefixing rank designations) for better user orientation and classification consistency. The resulting merged taxonomy improved the classification of 75% of the sequences by one or more ranks relative to the original NCBI taxonomy with the most pronounced improvements occurring in under-classified environmental sequences. We also assessed candidate phyla (divisions) currently defined by NCBI and present recommendations for consolidation of 34 redundantly named groups. All intermediate results from the pipeline, which includes tree inference, jackknifing and transfer of a donor taxonomy to a recipient tree (tax2tree) are available for download. The improved Greengenes taxonomy should provide important infrastructure for a wide range of megasequencing projects studying ecosystems on scales ranging from our own bodies (the Human Microbiome Project) to the entire planet (the Earth Microbiome Project). The implementation of the software can be obtained from http://sourceforge.net/projects/tax2tree/.","container-title":"The ISME Journal","DOI":"10.1038/ismej.2011.139","ISSN":"1751-7370","issue":"3","journalAbbreviation":"ISME J","language":"en","license":"2012 The Author(s)","note":"publisher: Nature Publishing Group","page":"610-618","source":"www-nature-com.proxy.lib.umich.edu","title":"An improved Greengenes taxonomy with explicit ranks for ecological and evolutionary analyses of bacteria and archaea","volume":"6","author":[{"family":"McDonald","given":"Daniel"},{"family":"Price","given":"Morgan N."},{"family":"Goodrich","given":"Julia"},{"family":"Nawrocki","given":"Eric P."},{"family":"DeSantis","given":"Todd Z."},{"family":"Probst","given":"Alexander"},{"family":"Andersen","given":"Gary L."},{"family":"Knight","given":"Rob"},{"family":"Hugenholtz","given":"Philip"}],"issued":{"date-parts":[["2012",3]]}}},{"id":1660,"uris":["http://zotero.org/users/13901503/items/G9YGXKGA"],"itemData":{"id":1660,"type":"article-journal","abstract":"Studies using 16S rRNA and shotgun metagenomics typically yield different results, usually attributed to PCR amplification biases. We introduce Greengenes2, a reference tree that unifies genomic and 16S rRNA databases in a consistent, integrated resource. By inserting sequences into a whole-genome phylogeny, we show that 16S rRNA and shotgun metagenomic data generated from the same samples agree in principal coordinates space, taxonomy and phenotype effect size when analyzed with the same tree.","container-title":"Nature Biotechnology","DOI":"10.1038/s41587-023-01845-1","ISSN":"1546-1696","issue":"5","journalAbbreviation":"Nat Biotechnol","language":"en","license":"2023 The Author(s)","note":"publisher: Nature Publishing Group","page":"715-718","source":"www-nature-com.proxy.lib.umich.edu","title":"Greengenes2 unifies microbial data in a single reference tree","volume":"42","author":[{"family":"McDonald","given":"Daniel"},{"family":"Jiang","given":"Yueyu"},{"family":"Balaban","given":"Metin"},{"family":"Cantrell","given":"Kalen"},{"family":"Zhu","given":"Qiyun"},{"family":"Gonzalez","given":"Antonio"},{"family":"Morton","given":"James T."},{"family":"Nicolaou","given":"Giorgia"},{"family":"Parks","given":"Donovan H."},{"family":"Karst","given":"Søren M."},{"family":"Albertsen","given":"Mads"},{"family":"Hugenholtz","given":"Philip"},{"family":"DeSantis","given":"Todd"},{"family":"Song","given":"Se Jin"},{"family":"Bartko","given":"Andrew"},{"family":"Havulinna","given":"Aki S."},{"family":"Jousilahti","given":"Pekka"},{"family":"Cheng","given":"Susan"},{"family":"Inouye","given":"Michael"},{"family":"Niiranen","given":"Teemu"},{"family":"Jain","given":"Mohit"},{"family":"Salomaa","given":"Veikko"},{"family":"Lahti","given":"Leo"},{"family":"Mirarab","given":"Siavash"},{"family":"Knight","given":"Rob"}],"issued":{"date-parts":[["2024",5]]}}}],"schema":"https://github.com/citation-style-language/schema/raw/master/csl-citation.json"} </w:instrText>
       </w:r>
       <w:r>
         <w:fldChar w:fldCharType="separate"/>
@@ -7275,7 +7431,7 @@
           <w:i/>
           <w:iCs/>
         </w:rPr>
-        <w:t>127</w:t>
+        <w:t>130</w:t>
       </w:r>
       <w:r>
         <w:t xml:space="preserve">, </w:t>
@@ -7285,7 +7441,7 @@
           <w:i/>
           <w:iCs/>
         </w:rPr>
-        <w:t>128</w:t>
+        <w:t>131</w:t>
       </w:r>
       <w:r>
         <w:t>)</w:t>
@@ -7326,7 +7482,7 @@
         <w:fldChar w:fldCharType="begin"/>
       </w:r>
       <w:r>
-        <w:instrText xml:space="preserve"> ADDIN ZOTERO_ITEM CSL_CITATION {"citationID":"CBIQl7kI","properties":{"formattedCitation":"({\\i{}129})","plainCitation":"(129)","noteIndex":0},"citationItems":[{"id":1665,"uris":["http://zotero.org/users/13901503/items/4N2UFVCD"],"itemData":{"id":1665,"type":"article-journal","container-title":"R Package version 0.99","title":"qiime2R: importing QIIME2 artifacts and associated data into R sessions","author":[{"family":"Bisanz","given":"JE"}],"issued":{"date-parts":[["2018"]]}}}],"schema":"https://github.com/citation-style-language/schema/raw/master/csl-citation.json"} </w:instrText>
+        <w:instrText xml:space="preserve"> ADDIN ZOTERO_ITEM CSL_CITATION {"citationID":"CBIQl7kI","properties":{"formattedCitation":"({\\i{}132})","plainCitation":"(132)","noteIndex":0},"citationItems":[{"id":1665,"uris":["http://zotero.org/users/13901503/items/4N2UFVCD"],"itemData":{"id":1665,"type":"article-journal","container-title":"R Package version 0.99","title":"qiime2R: importing QIIME2 artifacts and associated data into R sessions","author":[{"family":"Bisanz","given":"JE"}],"issued":{"date-parts":[["2018"]]}}}],"schema":"https://github.com/citation-style-language/schema/raw/master/csl-citation.json"} </w:instrText>
       </w:r>
       <w:r>
         <w:fldChar w:fldCharType="separate"/>
@@ -7339,7 +7495,7 @@
           <w:i/>
           <w:iCs/>
         </w:rPr>
-        <w:t>129</w:t>
+        <w:t>132</w:t>
       </w:r>
       <w:r>
         <w:t>)</w:t>
@@ -7374,7 +7530,7 @@
         <w:fldChar w:fldCharType="begin"/>
       </w:r>
       <w:r>
-        <w:instrText xml:space="preserve"> ADDIN ZOTERO_ITEM CSL_CITATION {"citationID":"rEqfVqQV","properties":{"formattedCitation":"({\\i{}130})","plainCitation":"(130)","noteIndex":0},"citationItems":[{"id":1667,"uris":["http://zotero.org/users/13901503/items/RR6DYA9S"],"itemData":{"id":1667,"type":"article-journal","container-title":"PLoS ONE","DOI":"10.1371/journal.pone.0061217","ISSN":"1932-6203","issue":"4","journalAbbreviation":"PLoS ONE","language":"en","page":"e61217","source":"DOI.org (Crossref)","title":"phyloseq: An R Package for Reproducible Interactive Analysis and Graphics of Microbiome Census Data","title-short":"phyloseq","volume":"8","author":[{"family":"McMurdie","given":"Paul J."},{"family":"Holmes","given":"Susan"}],"editor":[{"family":"Watson","given":"Michael"}],"issued":{"date-parts":[["2013",4,22]]}}}],"schema":"https://github.com/citation-style-language/schema/raw/master/csl-citation.json"} </w:instrText>
+        <w:instrText xml:space="preserve"> ADDIN ZOTERO_ITEM CSL_CITATION {"citationID":"rEqfVqQV","properties":{"formattedCitation":"({\\i{}133})","plainCitation":"(133)","noteIndex":0},"citationItems":[{"id":1667,"uris":["http://zotero.org/users/13901503/items/RR6DYA9S"],"itemData":{"id":1667,"type":"article-journal","container-title":"PLoS ONE","DOI":"10.1371/journal.pone.0061217","ISSN":"1932-6203","issue":"4","journalAbbreviation":"PLoS ONE","language":"en","page":"e61217","source":"DOI.org (Crossref)","title":"phyloseq: An R Package for Reproducible Interactive Analysis and Graphics of Microbiome Census Data","title-short":"phyloseq","volume":"8","author":[{"family":"McMurdie","given":"Paul J."},{"family":"Holmes","given":"Susan"}],"editor":[{"family":"Watson","given":"Michael"}],"issued":{"date-parts":[["2013",4,22]]}}}],"schema":"https://github.com/citation-style-language/schema/raw/master/csl-citation.json"} </w:instrText>
       </w:r>
       <w:r>
         <w:fldChar w:fldCharType="separate"/>
@@ -7387,7 +7543,7 @@
           <w:i/>
           <w:iCs/>
         </w:rPr>
-        <w:t>130</w:t>
+        <w:t>133</w:t>
       </w:r>
       <w:r>
         <w:t>)</w:t>
@@ -7426,7 +7582,7 @@
         <w:fldChar w:fldCharType="begin"/>
       </w:r>
       <w:r>
-        <w:instrText xml:space="preserve"> ADDIN ZOTERO_ITEM CSL_CITATION {"citationID":"L2wCm92o","properties":{"formattedCitation":"({\\i{}131})","plainCitation":"(131)","noteIndex":0},"citationItems":[{"id":1672,"uris":["http://zotero.org/users/13901503/items/F4HJCW9M"],"itemData":{"id":1672,"type":"article-journal","abstract":"&lt;p&gt;&lt;bold&gt;Background:&lt;/bold&gt; The accuracy of microbial community detection in 16S rRNA marker-gene and metagenomic studies suffers from contamination and sequencing errors that lead to either falsely identifying microbial taxa that were not in the sample or misclassifying the taxa of DNA fragment reads. Removing contaminants and filtering rare features are two common approaches to deal with this problem. While contaminant detection methods use auxiliary sequencing process information to identify known contaminants, filtering methods remove taxa that are present in a small number of samples and have small counts in the samples where they are observed. The latter approach reduces the extreme sparsity of microbiome data and has been shown to correctly remove contaminant taxa in cultured “mock” datasets, where the true taxa compositions are known. Although filtering is frequently used, careful evaluation of its effect on the data analysis and scientific conclusions remains unreported. Here, we assess the effect of filtering on the alpha and beta diversity estimation as well as its impact on identifying taxa that discriminate between disease states.&lt;/p&gt;&lt;p&gt;&lt;bold&gt;Results:&lt;/bold&gt; The effect of filtering on microbiome data analysis is illustrated on four datasets: two mock quality control datasets where the same cultured samples with known microbial composition are processed at different labs and two disease study datasets. Results show that in microbiome quality control datasets, filtering reduces the magnitude of differences in alpha diversity and alleviates technical variability between labs while preserving the between samples similarity (beta diversity). In the disease study datasets, DESeq2 and linear discriminant analysis Effect Size (LEfSe) methods were used to identify taxa that are differentially abundant across groups of samples, and random forest models were used to rank features with the largest contribution toward disease classification. Results reveal that filtering retains significant taxa and preserves the model classification ability measured by the area under the receiver operating characteristic curve (AUC). The comparison between the filtering and the contaminant removal method shows that they have complementary effects and are advised to be used in conjunction.&lt;/p&gt;&lt;p&gt;&lt;bold&gt;Conclusions:&lt;/bold&gt; Filtering reduces the complexity of microbiome data while preserving their integrity in downstream analysis. This leads to mitigation of the classification methods' sensitivity and reduction of technical variability, allowing researchers to generate more reproducible and comparable results in microbiome data analysis.&lt;/p&gt;","container-title":"Frontiers in Microbiology","DOI":"10.3389/fmicb.2020.607325","ISSN":"1664-302X","journalAbbreviation":"Front. Microbiol.","language":"English","note":"publisher: Frontiers","source":"Frontiers","title":"Effects of Rare Microbiome Taxa Filtering on Statistical Analysis","URL":"https://www.frontiersin.org/journals/microbiology/articles/10.3389/fmicb.2020.607325/full","volume":"11","author":[{"family":"Cao","given":"Quy"},{"family":"Sun","given":"Xinxin"},{"family":"Rajesh","given":"Karun"},{"family":"Chalasani","given":"Naga"},{"family":"Gelow","given":"Kayla"},{"family":"Katz","given":"Barry"},{"family":"Shah","given":"Vijay H."},{"family":"Sanyal","given":"Arun J."},{"family":"Smirnova","given":"Ekaterina"}],"accessed":{"date-parts":[["2025",1,29]]},"issued":{"date-parts":[["2021",1,12]]}}}],"schema":"https://github.com/citation-style-language/schema/raw/master/csl-citation.json"} </w:instrText>
+        <w:instrText xml:space="preserve"> ADDIN ZOTERO_ITEM CSL_CITATION {"citationID":"L2wCm92o","properties":{"formattedCitation":"({\\i{}134})","plainCitation":"(134)","noteIndex":0},"citationItems":[{"id":1672,"uris":["http://zotero.org/users/13901503/items/F4HJCW9M"],"itemData":{"id":1672,"type":"article-journal","abstract":"&lt;p&gt;&lt;bold&gt;Background:&lt;/bold&gt; The accuracy of microbial community detection in 16S rRNA marker-gene and metagenomic studies suffers from contamination and sequencing errors that lead to either falsely identifying microbial taxa that were not in the sample or misclassifying the taxa of DNA fragment reads. Removing contaminants and filtering rare features are two common approaches to deal with this problem. While contaminant detection methods use auxiliary sequencing process information to identify known contaminants, filtering methods remove taxa that are present in a small number of samples and have small counts in the samples where they are observed. The latter approach reduces the extreme sparsity of microbiome data and has been shown to correctly remove contaminant taxa in cultured “mock” datasets, where the true taxa compositions are known. Although filtering is frequently used, careful evaluation of its effect on the data analysis and scientific conclusions remains unreported. Here, we assess the effect of filtering on the alpha and beta diversity estimation as well as its impact on identifying taxa that discriminate between disease states.&lt;/p&gt;&lt;p&gt;&lt;bold&gt;Results:&lt;/bold&gt; The effect of filtering on microbiome data analysis is illustrated on four datasets: two mock quality control datasets where the same cultured samples with known microbial composition are processed at different labs and two disease study datasets. Results show that in microbiome quality control datasets, filtering reduces the magnitude of differences in alpha diversity and alleviates technical variability between labs while preserving the between samples similarity (beta diversity). In the disease study datasets, DESeq2 and linear discriminant analysis Effect Size (LEfSe) methods were used to identify taxa that are differentially abundant across groups of samples, and random forest models were used to rank features with the largest contribution toward disease classification. Results reveal that filtering retains significant taxa and preserves the model classification ability measured by the area under the receiver operating characteristic curve (AUC). The comparison between the filtering and the contaminant removal method shows that they have complementary effects and are advised to be used in conjunction.&lt;/p&gt;&lt;p&gt;&lt;bold&gt;Conclusions:&lt;/bold&gt; Filtering reduces the complexity of microbiome data while preserving their integrity in downstream analysis. This leads to mitigation of the classification methods' sensitivity and reduction of technical variability, allowing researchers to generate more reproducible and comparable results in microbiome data analysis.&lt;/p&gt;","container-title":"Frontiers in Microbiology","DOI":"10.3389/fmicb.2020.607325","ISSN":"1664-302X","journalAbbreviation":"Front. Microbiol.","language":"English","note":"publisher: Frontiers","source":"Frontiers","title":"Effects of Rare Microbiome Taxa Filtering on Statistical Analysis","URL":"https://www.frontiersin.org/journals/microbiology/articles/10.3389/fmicb.2020.607325/full","volume":"11","author":[{"family":"Cao","given":"Quy"},{"family":"Sun","given":"Xinxin"},{"family":"Rajesh","given":"Karun"},{"family":"Chalasani","given":"Naga"},{"family":"Gelow","given":"Kayla"},{"family":"Katz","given":"Barry"},{"family":"Shah","given":"Vijay H."},{"family":"Sanyal","given":"Arun J."},{"family":"Smirnova","given":"Ekaterina"}],"accessed":{"date-parts":[["2025",1,29]]},"issued":{"date-parts":[["2021",1,12]]}}}],"schema":"https://github.com/citation-style-language/schema/raw/master/csl-citation.json"} </w:instrText>
       </w:r>
       <w:r>
         <w:fldChar w:fldCharType="separate"/>
@@ -7439,7 +7595,7 @@
           <w:i/>
           <w:iCs/>
         </w:rPr>
-        <w:t>131</w:t>
+        <w:t>134</w:t>
       </w:r>
       <w:r>
         <w:t>)</w:t>
@@ -7621,7 +7777,7 @@
         <w:fldChar w:fldCharType="begin"/>
       </w:r>
       <w:r>
-        <w:instrText xml:space="preserve"> ADDIN ZOTERO_ITEM CSL_CITATION {"citationID":"1Zg0y02O","properties":{"formattedCitation":"({\\i{}132})","plainCitation":"(132)","noteIndex":0},"citationItems":[{"id":968,"uris":["http://zotero.org/users/13901503/items/9YGIV4WL"],"itemData":{"id":968,"type":"article-journal","abstract":"Culture-independent analyses of microbial communities have progressed dramatically in the last decade, particularly due to advances in methods for biological profiling via shotgun metagenomics. Opportunities for improvement continue to accelerate, with greater access to multi-omics, microbial reference genomes, and strain-level diversity. To leverage these, we present bioBakery 3, a set of integrated, improved methods for taxonomic, strain-level, functional, and phylogenetic profiling of metagenomes newly developed to build on the largest set of reference sequences now available. Compared to current alternatives, MetaPhlAn 3 increases the accuracy of taxonomic profiling, and HUMAnN 3 improves that of functional potential and activity. These methods detected novel disease-microbiome links in applications to CRC (1262 metagenomes) and IBD (1635 metagenomes and 817 metatranscriptomes). Strain-level profiling of an additional 4077 metagenomes with StrainPhlAn 3 and PanPhlAn 3 unraveled the phylogenetic and functional structure of the common gut microbe Ruminococcus bromii, previously described by only 15 isolate genomes. With open-source implementations and cloud-deployable reproducible workflows, the bioBakery 3 platform can help researchers deepen the resolution, scale, and accuracy of multi-omic profiling for microbial community studies.","container-title":"eLife","DOI":"10.7554/eLife.65088","ISSN":"2050-084X","note":"publisher: eLife Sciences Publications, Ltd","page":"e65088","source":"eLife","title":"Integrating taxonomic, functional, and strain-level profiling of diverse microbial communities with bioBakery 3","volume":"10","author":[{"family":"Beghini","given":"Francesco"},{"family":"McIver","given":"Lauren J"},{"family":"Blanco-Míguez","given":"Aitor"},{"family":"Dubois","given":"Leonard"},{"family":"Asnicar","given":"Francesco"},{"family":"Maharjan","given":"Sagun"},{"family":"Mailyan","given":"Ana"},{"family":"Manghi","given":"Paolo"},{"family":"Scholz","given":"Matthias"},{"family":"Thomas","given":"Andrew Maltez"},{"family":"Valles-Colomer","given":"Mireia"},{"family":"Weingart","given":"George"},{"family":"Zhang","given":"Yancong"},{"family":"Zolfo","given":"Moreno"},{"family":"Huttenhower","given":"Curtis"},{"family":"Franzosa","given":"Eric A"},{"family":"Segata","given":"Nicola"}],"editor":[{"family":"Turnbaugh","given":"Peter"},{"family":"Franco","given":"Eduardo"},{"family":"Brown","given":"C Titus"}],"issued":{"date-parts":[["2021",5,4]]}}}],"schema":"https://github.com/citation-style-language/schema/raw/master/csl-citation.json"} </w:instrText>
+        <w:instrText xml:space="preserve"> ADDIN ZOTERO_ITEM CSL_CITATION {"citationID":"1Zg0y02O","properties":{"formattedCitation":"({\\i{}135})","plainCitation":"(135)","noteIndex":0},"citationItems":[{"id":968,"uris":["http://zotero.org/users/13901503/items/9YGIV4WL"],"itemData":{"id":968,"type":"article-journal","abstract":"Culture-independent analyses of microbial communities have progressed dramatically in the last decade, particularly due to advances in methods for biological profiling via shotgun metagenomics. Opportunities for improvement continue to accelerate, with greater access to multi-omics, microbial reference genomes, and strain-level diversity. To leverage these, we present bioBakery 3, a set of integrated, improved methods for taxonomic, strain-level, functional, and phylogenetic profiling of metagenomes newly developed to build on the largest set of reference sequences now available. Compared to current alternatives, MetaPhlAn 3 increases the accuracy of taxonomic profiling, and HUMAnN 3 improves that of functional potential and activity. These methods detected novel disease-microbiome links in applications to CRC (1262 metagenomes) and IBD (1635 metagenomes and 817 metatranscriptomes). Strain-level profiling of an additional 4077 metagenomes with StrainPhlAn 3 and PanPhlAn 3 unraveled the phylogenetic and functional structure of the common gut microbe Ruminococcus bromii, previously described by only 15 isolate genomes. With open-source implementations and cloud-deployable reproducible workflows, the bioBakery 3 platform can help researchers deepen the resolution, scale, and accuracy of multi-omic profiling for microbial community studies.","container-title":"eLife","DOI":"10.7554/eLife.65088","ISSN":"2050-084X","note":"publisher: eLife Sciences Publications, Ltd","page":"e65088","source":"eLife","title":"Integrating taxonomic, functional, and strain-level profiling of diverse microbial communities with bioBakery 3","volume":"10","author":[{"family":"Beghini","given":"Francesco"},{"family":"McIver","given":"Lauren J"},{"family":"Blanco-Míguez","given":"Aitor"},{"family":"Dubois","given":"Leonard"},{"family":"Asnicar","given":"Francesco"},{"family":"Maharjan","given":"Sagun"},{"family":"Mailyan","given":"Ana"},{"family":"Manghi","given":"Paolo"},{"family":"Scholz","given":"Matthias"},{"family":"Thomas","given":"Andrew Maltez"},{"family":"Valles-Colomer","given":"Mireia"},{"family":"Weingart","given":"George"},{"family":"Zhang","given":"Yancong"},{"family":"Zolfo","given":"Moreno"},{"family":"Huttenhower","given":"Curtis"},{"family":"Franzosa","given":"Eric A"},{"family":"Segata","given":"Nicola"}],"editor":[{"family":"Turnbaugh","given":"Peter"},{"family":"Franco","given":"Eduardo"},{"family":"Brown","given":"C Titus"}],"issued":{"date-parts":[["2021",5,4]]}}}],"schema":"https://github.com/citation-style-language/schema/raw/master/csl-citation.json"} </w:instrText>
       </w:r>
       <w:r>
         <w:fldChar w:fldCharType="separate"/>
@@ -7634,7 +7790,7 @@
           <w:i/>
           <w:iCs/>
         </w:rPr>
-        <w:t>132</w:t>
+        <w:t>135</w:t>
       </w:r>
       <w:r>
         <w:t>)</w:t>
@@ -7852,7 +8008,7 @@
         <w:fldChar w:fldCharType="begin"/>
       </w:r>
       <w:r>
-        <w:instrText xml:space="preserve"> ADDIN ZOTERO_ITEM CSL_CITATION {"citationID":"JR1jMbxd","properties":{"formattedCitation":"({\\i{}52}, {\\i{}133})","plainCitation":"(52, 133)","noteIndex":0},"citationItems":[{"id":1636,"uris":["http://zotero.org/users/13901503/items/5NZP9HX7"],"itemData":{"id":1636,"type":"article-journal","abstract":"Objectives Invertebrate consumption is thought to be an integral part of early hominin diets, and many modern human populations regularly consume insects and other arthropods. This study examines the response of gut microbial community structure and function to changes in diet in wild white-faced capuchins (Cebus capucinus), a primate that incorporates a large proportion of invertebrates in its diet. The goal of the study is to better understand the role of both fruit and invertebrate prey consumption on shaping primate gut microbiomes. Materials and methods Fecal samples (n = 169) and dietary data were collected over 12 months. The V3-V5 region of microbial 16S rRNA genes was amplified and sequenced. The IM-TORNADO pipeline was used to analyze sequences. Results White-faced capuchin gut bacterial communities were characterized primarily by Firmicutes (41.6%) and Proteobacteria (39.2%). There was a significant relationship between the invertebrate diet composition of individual capuchins and their gut microbiome composition. However, there was no relationship between the fruit diet composition of individual capuchins and their gut microbiome composition, even when examining multiple timescales. Discussion The results of our study indicate that there is a stronger relationship between gut microbial community structure and invertebrate diet composition than between gut microbial community structure and fruit consumption. As invertebrates and other animal prey play an important role in the diet of many primates, these results give important insight into the role of faunivory in shaping the evolution of host-microbe interactions in primates.","container-title":"American Journal of Physical Anthropology","DOI":"10.1002/ajpa.23395","ISSN":"1096-8644","issue":"3","language":"en","note":"_eprint: https://onlinelibrary.wiley.com/doi/pdf/10.1002/ajpa.23395","page":"576-588","source":"Wiley Online Library","title":"Influence of fruit and invertebrate consumption on the gut microbiota of wild white-faced capuchins (Cebus capucinus)","volume":"165","author":[{"family":"Mallott","given":"Elizabeth K."},{"family":"Amato","given":"Katherine R."},{"family":"Garber","given":"Paul A."},{"family":"Malhi","given":"Ripan S."}],"issued":{"date-parts":[["2018"]]}}},{"id":700,"uris":["http://zotero.org/users/13901503/items/HCYVY6PR"],"itemData":{"id":700,"type":"article-journal","abstract":"Research on the gut microbiota of free-ranging mammals is offering new insights into dietary ecology. However, for free-ranging primates, little information is available for how microbiomes are influenced by ecological variation through time. Primates inhabiting seasonal tropical dry forests undergo seasonally specific decreases in food abundance and water availability, which have been linked to adverse health effects. Throughout the course of a seasonal transition in 2014, we collected fecal samples from three social groups of free-ranging white-faced capuchin monkeys (Cebus capucinus imitator) in Sector Santa Rosa, Área de Conservación Guanacaste, Costa Rica. 16S rRNA sequencing data reveal that unlike other primates, the white-faced capuchin monkey gut is dominated by Bifidobacterium and Streptococcus. Linear mixed effects models indicate that abundances of these genera are associated with fluctuating availability and consumption of fruit and arthropods, whereas beta diversity clusters by rainfall season. Whole shotgun metagenomics revealed that the capuchin gut is dominated by carbohydrate-binding modules associated with digestion of plant polysaccharides and chitin, matching seasonal dietary patterns. We conclude that rainfall and diet are associated with the diversity, composition, and function of the capuchin gut microbiome. Additionally, microbial fluctuations are likely contributing to nutrient uptake and the health of wild primate populations.","container-title":"The ISME Journal","DOI":"10.1038/s41396-018-0256-0","ISSN":"1751-7362","issue":"1","journalAbbreviation":"The ISME Journal","page":"183-196","source":"Silverchair","title":"Seasonality of the gut microbiota of free-ranging white-faced capuchins in a tropical dry forest","volume":"13","author":[{"family":"Orkin","given":"Joseph D"},{"family":"Campos","given":"Fernando A"},{"family":"Myers","given":"Monica S"},{"family":"Cheves Hernandez","given":"Saul E"},{"family":"Guadamuz","given":"Adrián"},{"family":"Melin","given":"Amanda D"}],"issued":{"date-parts":[["2019",1,1]]}}}],"schema":"https://github.com/citation-style-language/schema/raw/master/csl-citation.json"} </w:instrText>
+        <w:instrText xml:space="preserve"> ADDIN ZOTERO_ITEM CSL_CITATION {"citationID":"JR1jMbxd","properties":{"formattedCitation":"({\\i{}52}, {\\i{}136})","plainCitation":"(52, 136)","noteIndex":0},"citationItems":[{"id":1636,"uris":["http://zotero.org/users/13901503/items/5NZP9HX7"],"itemData":{"id":1636,"type":"article-journal","abstract":"Objectives Invertebrate consumption is thought to be an integral part of early hominin diets, and many modern human populations regularly consume insects and other arthropods. This study examines the response of gut microbial community structure and function to changes in diet in wild white-faced capuchins (Cebus capucinus), a primate that incorporates a large proportion of invertebrates in its diet. The goal of the study is to better understand the role of both fruit and invertebrate prey consumption on shaping primate gut microbiomes. Materials and methods Fecal samples (n = 169) and dietary data were collected over 12 months. The V3-V5 region of microbial 16S rRNA genes was amplified and sequenced. The IM-TORNADO pipeline was used to analyze sequences. Results White-faced capuchin gut bacterial communities were characterized primarily by Firmicutes (41.6%) and Proteobacteria (39.2%). There was a significant relationship between the invertebrate diet composition of individual capuchins and their gut microbiome composition. However, there was no relationship between the fruit diet composition of individual capuchins and their gut microbiome composition, even when examining multiple timescales. Discussion The results of our study indicate that there is a stronger relationship between gut microbial community structure and invertebrate diet composition than between gut microbial community structure and fruit consumption. As invertebrates and other animal prey play an important role in the diet of many primates, these results give important insight into the role of faunivory in shaping the evolution of host-microbe interactions in primates.","container-title":"American Journal of Physical Anthropology","DOI":"10.1002/ajpa.23395","ISSN":"1096-8644","issue":"3","language":"en","note":"_eprint: https://onlinelibrary.wiley.com/doi/pdf/10.1002/ajpa.23395","page":"576-588","source":"Wiley Online Library","title":"Influence of fruit and invertebrate consumption on the gut microbiota of wild white-faced capuchins (Cebus capucinus)","volume":"165","author":[{"family":"Mallott","given":"Elizabeth K."},{"family":"Amato","given":"Katherine R."},{"family":"Garber","given":"Paul A."},{"family":"Malhi","given":"Ripan S."}],"issued":{"date-parts":[["2018"]]}}},{"id":700,"uris":["http://zotero.org/users/13901503/items/HCYVY6PR"],"itemData":{"id":700,"type":"article-journal","abstract":"Research on the gut microbiota of free-ranging mammals is offering new insights into dietary ecology. However, for free-ranging primates, little information is available for how microbiomes are influenced by ecological variation through time. Primates inhabiting seasonal tropical dry forests undergo seasonally specific decreases in food abundance and water availability, which have been linked to adverse health effects. Throughout the course of a seasonal transition in 2014, we collected fecal samples from three social groups of free-ranging white-faced capuchin monkeys (Cebus capucinus imitator) in Sector Santa Rosa, Área de Conservación Guanacaste, Costa Rica. 16S rRNA sequencing data reveal that unlike other primates, the white-faced capuchin monkey gut is dominated by Bifidobacterium and Streptococcus. Linear mixed effects models indicate that abundances of these genera are associated with fluctuating availability and consumption of fruit and arthropods, whereas beta diversity clusters by rainfall season. Whole shotgun metagenomics revealed that the capuchin gut is dominated by carbohydrate-binding modules associated with digestion of plant polysaccharides and chitin, matching seasonal dietary patterns. We conclude that rainfall and diet are associated with the diversity, composition, and function of the capuchin gut microbiome. Additionally, microbial fluctuations are likely contributing to nutrient uptake and the health of wild primate populations.","container-title":"The ISME Journal","DOI":"10.1038/s41396-018-0256-0","ISSN":"1751-7362","issue":"1","journalAbbreviation":"The ISME Journal","page":"183-196","source":"Silverchair","title":"Seasonality of the gut microbiota of free-ranging white-faced capuchins in a tropical dry forest","volume":"13","author":[{"family":"Orkin","given":"Joseph D"},{"family":"Campos","given":"Fernando A"},{"family":"Myers","given":"Monica S"},{"family":"Cheves Hernandez","given":"Saul E"},{"family":"Guadamuz","given":"Adrián"},{"family":"Melin","given":"Amanda D"}],"issued":{"date-parts":[["2019",1,1]]}}}],"schema":"https://github.com/citation-style-language/schema/raw/master/csl-citation.json"} </w:instrText>
       </w:r>
       <w:r>
         <w:fldChar w:fldCharType="separate"/>
@@ -7875,7 +8031,7 @@
           <w:i/>
           <w:iCs/>
         </w:rPr>
-        <w:t>133</w:t>
+        <w:t>136</w:t>
       </w:r>
       <w:r>
         <w:t>)</w:t>
@@ -7890,7 +8046,7 @@
         <w:fldChar w:fldCharType="begin"/>
       </w:r>
       <w:r>
-        <w:instrText xml:space="preserve"> ADDIN ZOTERO_ITEM CSL_CITATION {"citationID":"KgDJiC4b","properties":{"formattedCitation":"({\\i{}134})","plainCitation":"(134)","noteIndex":0},"citationItems":[{"id":1724,"uris":["http://zotero.org/users/13901503/items/VWJDBSPR"],"itemData":{"id":1724,"type":"article-journal","abstract":"The endemic Bornean tufted ground squirrel, Rheithrosciurus macrotis, has attracted great interest among biologists and the public recently. Nevertheless, we lack information about the most basic aspects of its biology. Here we present the first empirical data on the feeding ecology of tufted ground squirrels and use data from 81 sympatric mammalian and avian vertebrates to place it within a broad comparative context. Rheithrosciurus macrotis is a seed predator and shows much more extreme ecological specialisation than any other vertebrate, feeding on a far smaller subset of available plant foods and demonstrating a greater reliance on a single plant species—Canarium decumanum. Our results suggest that R. macrotis plays an important, previously unknown role in the ecology of Bornean lowland forests and highlight how much we have yet to learn about the fauna inhabiting some of the most diverse, and most severely threatened, ecosystems on the planet.","container-title":"Raffles Bulletin of Zoology","DOI":"10.26107/RBZ-2021-0067","ISSN":"0217-2445","language":"en","note":"publisher: Lee Kong Chian Natural History Museum","page":"497506","source":"DOI.org (Datacite)","title":"Extreme ecological specialisation in a rainforest mammal, the Bornean tufted ground squirrel, Rheithrosciurus macrotis Gray, 1857","volume":"69","author":[{"family":"Marshall","given":"Andrew J."},{"family":"Meijaard","given":"Erik"},{"family":"Leighton","given":"Mark"}],"issued":{"date-parts":[["2021"]]}}}],"schema":"https://github.com/citation-style-language/schema/raw/master/csl-citation.json"} </w:instrText>
+        <w:instrText xml:space="preserve"> ADDIN ZOTERO_ITEM CSL_CITATION {"citationID":"KgDJiC4b","properties":{"formattedCitation":"({\\i{}137})","plainCitation":"(137)","noteIndex":0},"citationItems":[{"id":1724,"uris":["http://zotero.org/users/13901503/items/VWJDBSPR"],"itemData":{"id":1724,"type":"article-journal","abstract":"The endemic Bornean tufted ground squirrel, Rheithrosciurus macrotis, has attracted great interest among biologists and the public recently. Nevertheless, we lack information about the most basic aspects of its biology. Here we present the first empirical data on the feeding ecology of tufted ground squirrels and use data from 81 sympatric mammalian and avian vertebrates to place it within a broad comparative context. Rheithrosciurus macrotis is a seed predator and shows much more extreme ecological specialisation than any other vertebrate, feeding on a far smaller subset of available plant foods and demonstrating a greater reliance on a single plant species—Canarium decumanum. Our results suggest that R. macrotis plays an important, previously unknown role in the ecology of Bornean lowland forests and highlight how much we have yet to learn about the fauna inhabiting some of the most diverse, and most severely threatened, ecosystems on the planet.","container-title":"Raffles Bulletin of Zoology","DOI":"10.26107/RBZ-2021-0067","ISSN":"0217-2445","language":"en","note":"publisher: Lee Kong Chian Natural History Museum","page":"497506","source":"DOI.org (Datacite)","title":"Extreme ecological specialisation in a rainforest mammal, the Bornean tufted ground squirrel, Rheithrosciurus macrotis Gray, 1857","volume":"69","author":[{"family":"Marshall","given":"Andrew J."},{"family":"Meijaard","given":"Erik"},{"family":"Leighton","given":"Mark"}],"issued":{"date-parts":[["2021"]]}}}],"schema":"https://github.com/citation-style-language/schema/raw/master/csl-citation.json"} </w:instrText>
       </w:r>
       <w:r>
         <w:fldChar w:fldCharType="separate"/>
@@ -7903,7 +8059,7 @@
           <w:i/>
           <w:iCs/>
         </w:rPr>
-        <w:t>134</w:t>
+        <w:t>137</w:t>
       </w:r>
       <w:r>
         <w:t>)</w:t>
@@ -7983,7 +8139,7 @@
         <w:fldChar w:fldCharType="begin"/>
       </w:r>
       <w:r>
-        <w:instrText xml:space="preserve"> ADDIN ZOTERO_ITEM CSL_CITATION {"citationID":"rslhHr6V","properties":{"formattedCitation":"({\\i{}135})","plainCitation":"(135)","noteIndex":0},"citationItems":[{"id":1678,"uris":["http://zotero.org/users/13901503/items/MSZDHDQF"],"itemData":{"id":1678,"type":"article-journal","abstract":"The singular value decomposition and its interpretation as a linear biplot have proved to be a powerful tool for analysing many forms of multivariate data. Here we adapt biplot methodology to the specific case of compositional data consisting of positive vectors each of which is constrained to have unit sum. These relative variation biplots have properties relating to the special features of compositional data: the study of ratios, subcompositions and models of compositional relationships. The methodology is applied to a data set consisting of six-part colour compositions in 22 abstract paintings, showing how the singular value decomposition can achieve an accurate biplot of the colour ratios and how possible models interrelating the colours can be diagnosed.","container-title":"Journal of the Royal Statistical Society Series C: Applied Statistics","DOI":"10.1111/1467-9876.00275","ISSN":"0035-9254","issue":"4","journalAbbreviation":"Journal of the Royal Statistical Society Series C: Applied Statistics","page":"375-392","source":"Silverchair","title":"Biplots of Compositional Data","volume":"51","author":[{"family":"Aitchison","given":"John"},{"family":"Greenacre","given":"Michael"}],"issued":{"date-parts":[["2002",10,1]]}}}],"schema":"https://github.com/citation-style-language/schema/raw/master/csl-citation.json"} </w:instrText>
+        <w:instrText xml:space="preserve"> ADDIN ZOTERO_ITEM CSL_CITATION {"citationID":"rslhHr6V","properties":{"formattedCitation":"({\\i{}138})","plainCitation":"(138)","noteIndex":0},"citationItems":[{"id":1678,"uris":["http://zotero.org/users/13901503/items/MSZDHDQF"],"itemData":{"id":1678,"type":"article-journal","abstract":"The singular value decomposition and its interpretation as a linear biplot have proved to be a powerful tool for analysing many forms of multivariate data. Here we adapt biplot methodology to the specific case of compositional data consisting of positive vectors each of which is constrained to have unit sum. These relative variation biplots have properties relating to the special features of compositional data: the study of ratios, subcompositions and models of compositional relationships. The methodology is applied to a data set consisting of six-part colour compositions in 22 abstract paintings, showing how the singular value decomposition can achieve an accurate biplot of the colour ratios and how possible models interrelating the colours can be diagnosed.","container-title":"Journal of the Royal Statistical Society Series C: Applied Statistics","DOI":"10.1111/1467-9876.00275","ISSN":"0035-9254","issue":"4","journalAbbreviation":"Journal of the Royal Statistical Society Series C: Applied Statistics","page":"375-392","source":"Silverchair","title":"Biplots of Compositional Data","volume":"51","author":[{"family":"Aitchison","given":"John"},{"family":"Greenacre","given":"Michael"}],"issued":{"date-parts":[["2002",10,1]]}}}],"schema":"https://github.com/citation-style-language/schema/raw/master/csl-citation.json"} </w:instrText>
       </w:r>
       <w:r>
         <w:fldChar w:fldCharType="separate"/>
@@ -7996,7 +8152,7 @@
           <w:i/>
           <w:iCs/>
         </w:rPr>
-        <w:t>135</w:t>
+        <w:t>138</w:t>
       </w:r>
       <w:r>
         <w:t>)</w:t>
@@ -8056,7 +8212,7 @@
         <w:fldChar w:fldCharType="begin"/>
       </w:r>
       <w:r>
-        <w:instrText xml:space="preserve"> ADDIN ZOTERO_ITEM CSL_CITATION {"citationID":"CcTblRTP","properties":{"formattedCitation":"({\\i{}136})","plainCitation":"(136)","noteIndex":0},"citationItems":[{"id":1676,"uris":["http://zotero.org/users/13901503/items/B9HUBEW5"],"itemData":{"id":1676,"type":"article-journal","abstract":"zCompositions is an R package for the imputation of left-censored data under a compositional approach. It is pertinent when the analyst assumes that the relevant information is contained on the relative variation structure of the data. For instance, in cases where the experimental data are simultaneously measured in amounts related to a same total weight or volume. The approach is used in fields like geochemistry of waters or sedimentary rocks, environmental studies related to air pollution, physicochemical analysis of glass fragments in forensic science, and among many others. In these fields, rounded zeros and nondetects are usually regarded as left-censored data that hamper any subsequent data analysis. The implemented methods consider aspects of relevance for a compositional approach such as scale invariance, subcompositional coherence or preserving the multivariate relative structure of the data. Based on solid statistical frameworks, it comprises the ability to deal with single and varying censoring thresholds, consistent treatment of closed and non-closed data, exploratory tools, multiple imputation, MCMC, robust and non-parametric alternatives, and recent proposals for count data. Key methodological aspects, new contributions, computational implementation and the practical application of the approach are discussed.","container-title":"Chemometrics and Intelligent Laboratory Systems","DOI":"10.1016/j.chemolab.2015.02.019","ISSN":"0169-7439","journalAbbreviation":"Chemometrics and Intelligent Laboratory Systems","page":"85-96","source":"ScienceDirect","title":"zCompositions — R package for multivariate imputation of left-censored data under a compositional approach","volume":"143","author":[{"family":"Palarea-Albaladejo","given":"Javier"},{"family":"Martín-Fernández","given":"Josep Antoni"}],"issued":{"date-parts":[["2015",4,15]]}}}],"schema":"https://github.com/citation-style-language/schema/raw/master/csl-citation.json"} </w:instrText>
+        <w:instrText xml:space="preserve"> ADDIN ZOTERO_ITEM CSL_CITATION {"citationID":"CcTblRTP","properties":{"formattedCitation":"({\\i{}139})","plainCitation":"(139)","noteIndex":0},"citationItems":[{"id":1676,"uris":["http://zotero.org/users/13901503/items/B9HUBEW5"],"itemData":{"id":1676,"type":"article-journal","abstract":"zCompositions is an R package for the imputation of left-censored data under a compositional approach. It is pertinent when the analyst assumes that the relevant information is contained on the relative variation structure of the data. For instance, in cases where the experimental data are simultaneously measured in amounts related to a same total weight or volume. The approach is used in fields like geochemistry of waters or sedimentary rocks, environmental studies related to air pollution, physicochemical analysis of glass fragments in forensic science, and among many others. In these fields, rounded zeros and nondetects are usually regarded as left-censored data that hamper any subsequent data analysis. The implemented methods consider aspects of relevance for a compositional approach such as scale invariance, subcompositional coherence or preserving the multivariate relative structure of the data. Based on solid statistical frameworks, it comprises the ability to deal with single and varying censoring thresholds, consistent treatment of closed and non-closed data, exploratory tools, multiple imputation, MCMC, robust and non-parametric alternatives, and recent proposals for count data. Key methodological aspects, new contributions, computational implementation and the practical application of the approach are discussed.","container-title":"Chemometrics and Intelligent Laboratory Systems","DOI":"10.1016/j.chemolab.2015.02.019","ISSN":"0169-7439","journalAbbreviation":"Chemometrics and Intelligent Laboratory Systems","page":"85-96","source":"ScienceDirect","title":"zCompositions — R package for multivariate imputation of left-censored data under a compositional approach","volume":"143","author":[{"family":"Palarea-Albaladejo","given":"Javier"},{"family":"Martín-Fernández","given":"Josep Antoni"}],"issued":{"date-parts":[["2015",4,15]]}}}],"schema":"https://github.com/citation-style-language/schema/raw/master/csl-citation.json"} </w:instrText>
       </w:r>
       <w:r>
         <w:fldChar w:fldCharType="separate"/>
@@ -8069,7 +8225,7 @@
           <w:i/>
           <w:iCs/>
         </w:rPr>
-        <w:t>136</w:t>
+        <w:t>139</w:t>
       </w:r>
       <w:r>
         <w:t>)</w:t>
@@ -8087,7 +8243,7 @@
         <w:fldChar w:fldCharType="begin"/>
       </w:r>
       <w:r>
-        <w:instrText xml:space="preserve"> ADDIN ZOTERO_ITEM CSL_CITATION {"citationID":"RU0uFdYd","properties":{"formattedCitation":"({\\i{}137})","plainCitation":"(137)","noteIndex":0},"citationItems":[{"id":1387,"uris":["http://zotero.org/users/13901503/items/7MG3GNU9"],"itemData":{"id":1387,"type":"article-journal","abstract":"A workshop held at the 2015 annual meeting of the Canadian Society of Microbiologists highlighted compositional data analysis methods and the importance of exploratory data analysis for the analysis of microbiome data sets generated by high-throughput DNA sequencing. A summary of the content of that workshop, a review of new methods of analysis, and information on the importance of careful analyses are presented herein. The workshop focussed on explaining the rationale behind the use of compositional data analysis, and a demonstration of these methods for the examination of 2 microbiome data sets. A clear understanding of bioinformatics methodologies and the type of data being analyzed is essential, given the growing number of studies uncovering the critical role of the microbiome in health and disease and the need to understand alterations to its composition and function following intervention with fecal transplant, probiotics, diet, and pharmaceutical agents.","container-title":"Canadian Journal of Microbiology","DOI":"10.1139/cjm-2015-0821","ISSN":"0008-4166, 1480-3275","issue":"8","journalAbbreviation":"Can. J. Microbiol.","language":"en","license":"http://www.nrcresearchpress.com/page/about/CorporateTextAndDataMining","page":"692-703","source":"DOI.org (Crossref)","title":"Compositional analysis: a valid approach to analyze microbiome high-throughput sequencing data","title-short":"Compositional analysis","volume":"62","author":[{"family":"Gloor","given":"Gregory B."},{"family":"Reid","given":"Gregor"}],"issued":{"date-parts":[["2016",8]]}}}],"schema":"https://github.com/citation-style-language/schema/raw/master/csl-citation.json"} </w:instrText>
+        <w:instrText xml:space="preserve"> ADDIN ZOTERO_ITEM CSL_CITATION {"citationID":"RU0uFdYd","properties":{"formattedCitation":"({\\i{}140})","plainCitation":"(140)","noteIndex":0},"citationItems":[{"id":1387,"uris":["http://zotero.org/users/13901503/items/7MG3GNU9"],"itemData":{"id":1387,"type":"article-journal","abstract":"A workshop held at the 2015 annual meeting of the Canadian Society of Microbiologists highlighted compositional data analysis methods and the importance of exploratory data analysis for the analysis of microbiome data sets generated by high-throughput DNA sequencing. A summary of the content of that workshop, a review of new methods of analysis, and information on the importance of careful analyses are presented herein. The workshop focussed on explaining the rationale behind the use of compositional data analysis, and a demonstration of these methods for the examination of 2 microbiome data sets. A clear understanding of bioinformatics methodologies and the type of data being analyzed is essential, given the growing number of studies uncovering the critical role of the microbiome in health and disease and the need to understand alterations to its composition and function following intervention with fecal transplant, probiotics, diet, and pharmaceutical agents.","container-title":"Canadian Journal of Microbiology","DOI":"10.1139/cjm-2015-0821","ISSN":"0008-4166, 1480-3275","issue":"8","journalAbbreviation":"Can. J. Microbiol.","language":"en","license":"http://www.nrcresearchpress.com/page/about/CorporateTextAndDataMining","page":"692-703","source":"DOI.org (Crossref)","title":"Compositional analysis: a valid approach to analyze microbiome high-throughput sequencing data","title-short":"Compositional analysis","volume":"62","author":[{"family":"Gloor","given":"Gregory B."},{"family":"Reid","given":"Gregor"}],"issued":{"date-parts":[["2016",8]]}}}],"schema":"https://github.com/citation-style-language/schema/raw/master/csl-citation.json"} </w:instrText>
       </w:r>
       <w:r>
         <w:fldChar w:fldCharType="separate"/>
@@ -8100,7 +8256,7 @@
           <w:i/>
           <w:iCs/>
         </w:rPr>
-        <w:t>137</w:t>
+        <w:t>140</w:t>
       </w:r>
       <w:r>
         <w:t>)</w:t>
@@ -8143,7 +8299,7 @@
         <w:fldChar w:fldCharType="begin"/>
       </w:r>
       <w:r>
-        <w:instrText xml:space="preserve"> ADDIN ZOTERO_ITEM CSL_CITATION {"citationID":"eI5jWKxN","properties":{"formattedCitation":"({\\i{}138})","plainCitation":"(138)","noteIndex":0},"citationItems":[{"id":785,"uris":["http://zotero.org/users/13901503/items/MWL4M2Q4"],"itemData":{"id":785,"type":"article-journal","abstract":"&lt;p&gt;Datasets collected by high-throughput sequencing (HTS) of 16S rRNA gene amplimers, metagenomes or metatranscriptomes are commonplace and being used to study human disease states, ecological differences between sites, and the built environment. There is increasing awareness that microbiome datasets generated by HTS are compositional because they have an arbitrary total imposed by the instrument. However, many investigators are either unaware of this or assume specific properties of the compositional data. The purpose of this review is to alert investigators to the dangers inherent in ignoring the compositional nature of the data, and point out that HTS datasets derived from microbiome studies can and should be treated as compositions at all stages of analysis. We briefly introduce compositional data, illustrate the pathologies that occur when compositional data are analyzed inappropriately, and finally give guidance and point to resources and examples for the analysis of microbiome datasets using compositional data analysis.&lt;/p&gt;","container-title":"Frontiers in Microbiology","DOI":"10.3389/fmicb.2017.02224","ISSN":"1664-302X","journalAbbreviation":"Front. Microbiol.","language":"English","note":"publisher: Frontiers","source":"Frontiers","title":"Microbiome Datasets Are Compositional: And This Is Not Optional","title-short":"Microbiome Datasets Are Compositional","URL":"https://www-frontiersin-org.proxy.lib.umich.edu/journals/microbiology/articles/10.3389/fmicb.2017.02224/full","volume":"8","author":[{"family":"Gloor","given":"Gregory B."},{"family":"Macklaim","given":"Jean M."},{"family":"Pawlowsky-Glahn","given":"Vera"},{"family":"Egozcue","given":"Juan J."}],"accessed":{"date-parts":[["2024",6,10]]},"issued":{"date-parts":[["2017",11,15]]}}}],"schema":"https://github.com/citation-style-language/schema/raw/master/csl-citation.json"} </w:instrText>
+        <w:instrText xml:space="preserve"> ADDIN ZOTERO_ITEM CSL_CITATION {"citationID":"eI5jWKxN","properties":{"formattedCitation":"({\\i{}141})","plainCitation":"(141)","noteIndex":0},"citationItems":[{"id":785,"uris":["http://zotero.org/users/13901503/items/MWL4M2Q4"],"itemData":{"id":785,"type":"article-journal","abstract":"&lt;p&gt;Datasets collected by high-throughput sequencing (HTS) of 16S rRNA gene amplimers, metagenomes or metatranscriptomes are commonplace and being used to study human disease states, ecological differences between sites, and the built environment. There is increasing awareness that microbiome datasets generated by HTS are compositional because they have an arbitrary total imposed by the instrument. However, many investigators are either unaware of this or assume specific properties of the compositional data. The purpose of this review is to alert investigators to the dangers inherent in ignoring the compositional nature of the data, and point out that HTS datasets derived from microbiome studies can and should be treated as compositions at all stages of analysis. We briefly introduce compositional data, illustrate the pathologies that occur when compositional data are analyzed inappropriately, and finally give guidance and point to resources and examples for the analysis of microbiome datasets using compositional data analysis.&lt;/p&gt;","container-title":"Frontiers in Microbiology","DOI":"10.3389/fmicb.2017.02224","ISSN":"1664-302X","journalAbbreviation":"Front. Microbiol.","language":"English","note":"publisher: Frontiers","source":"Frontiers","title":"Microbiome Datasets Are Compositional: And This Is Not Optional","title-short":"Microbiome Datasets Are Compositional","URL":"https://www-frontiersin-org.proxy.lib.umich.edu/journals/microbiology/articles/10.3389/fmicb.2017.02224/full","volume":"8","author":[{"family":"Gloor","given":"Gregory B."},{"family":"Macklaim","given":"Jean M."},{"family":"Pawlowsky-Glahn","given":"Vera"},{"family":"Egozcue","given":"Juan J."}],"accessed":{"date-parts":[["2024",6,10]]},"issued":{"date-parts":[["2017",11,15]]}}}],"schema":"https://github.com/citation-style-language/schema/raw/master/csl-citation.json"} </w:instrText>
       </w:r>
       <w:r>
         <w:fldChar w:fldCharType="separate"/>
@@ -8156,7 +8312,7 @@
           <w:i/>
           <w:iCs/>
         </w:rPr>
-        <w:t>138</w:t>
+        <w:t>141</w:t>
       </w:r>
       <w:r>
         <w:t>)</w:t>
@@ -8199,7 +8355,7 @@
         <w:fldChar w:fldCharType="begin"/>
       </w:r>
       <w:r>
-        <w:instrText xml:space="preserve"> ADDIN ZOTERO_ITEM CSL_CITATION {"citationID":"9MopvbYc","properties":{"formattedCitation":"({\\i{}139}, {\\i{}140})","plainCitation":"(139, 140)","noteIndex":0},"citationItems":[{"id":1693,"uris":["http://zotero.org/users/13901503/items/5WE7IHKN"],"itemData":{"id":1693,"type":"chapter","container-title":"Selected Papers of Hirotugu Akaike","event-place":"New York, NY","ISBN":"978-1-4612-7248-9","note":"collection-title: Springer Series in Statistics\nDOI: 10.1007/978-1-4612-1694-0_15","page":"199-213","publisher":"Springer New York","publisher-place":"New York, NY","source":"DOI.org (Crossref)","title":"Information Theory and an Extension of the Maximum Likelihood Principle","URL":"http://link.springer.com/10.1007/978-1-4612-1694-0_15","editor":[{"family":"Parzen","given":"Emanuel"},{"family":"Tanabe","given":"Kunio"},{"family":"Kitagawa","given":"Genshiro"}],"author":[{"family":"Akaike","given":"Hirotogu"}],"accessed":{"date-parts":[["2025",1,29]]},"issued":{"date-parts":[["1998"]]}}},{"id":1695,"uris":["http://zotero.org/users/13901503/items/R3CVDMMF"],"itemData":{"id":1695,"type":"article-journal","abstract":"A bias correction to the Akaike information criterion, AIC, is derived for regression and autoregressive time series models. The correction is of particular use when the sample size is small, or when the number of fitted parameters is a moderate to large fraction of the sample size. The corrected method, called AICC, is asymptotically efficient if the true model is infinite dimensional. Furthermore, when the true model is of finite dimension, AICC is found to provide better model order choices than any other asymptotically efficient method. Applications to nonstationary autoregressive and mixed autoregressive moving average time series models are also discussed.","language":"en","source":"Zotero","title":"Regression and time series model selection in small samples","author":[{"family":"Hurvich","given":"Clifford M"},{"family":"Tsai","given":"Chih-Ling"}]}}],"schema":"https://github.com/citation-style-language/schema/raw/master/csl-citation.json"} </w:instrText>
+        <w:instrText xml:space="preserve"> ADDIN ZOTERO_ITEM CSL_CITATION {"citationID":"9MopvbYc","properties":{"formattedCitation":"({\\i{}142}, {\\i{}143})","plainCitation":"(142, 143)","noteIndex":0},"citationItems":[{"id":1693,"uris":["http://zotero.org/users/13901503/items/5WE7IHKN"],"itemData":{"id":1693,"type":"chapter","container-title":"Selected Papers of Hirotugu Akaike","event-place":"New York, NY","ISBN":"978-1-4612-7248-9","note":"collection-title: Springer Series in Statistics\nDOI: 10.1007/978-1-4612-1694-0_15","page":"199-213","publisher":"Springer New York","publisher-place":"New York, NY","source":"DOI.org (Crossref)","title":"Information Theory and an Extension of the Maximum Likelihood Principle","URL":"http://link.springer.com/10.1007/978-1-4612-1694-0_15","editor":[{"family":"Parzen","given":"Emanuel"},{"family":"Tanabe","given":"Kunio"},{"family":"Kitagawa","given":"Genshiro"}],"author":[{"family":"Akaike","given":"Hirotogu"}],"accessed":{"date-parts":[["2025",1,29]]},"issued":{"date-parts":[["1998"]]}}},{"id":1695,"uris":["http://zotero.org/users/13901503/items/R3CVDMMF"],"itemData":{"id":1695,"type":"article-journal","abstract":"A bias correction to the Akaike information criterion, AIC, is derived for regression and autoregressive time series models. The correction is of particular use when the sample size is small, or when the number of fitted parameters is a moderate to large fraction of the sample size. The corrected method, called AICC, is asymptotically efficient if the true model is infinite dimensional. Furthermore, when the true model is of finite dimension, AICC is found to provide better model order choices than any other asymptotically efficient method. Applications to nonstationary autoregressive and mixed autoregressive moving average time series models are also discussed.","language":"en","source":"Zotero","title":"Regression and time series model selection in small samples","author":[{"family":"Hurvich","given":"Clifford M"},{"family":"Tsai","given":"Chih-Ling"}]}}],"schema":"https://github.com/citation-style-language/schema/raw/master/csl-citation.json"} </w:instrText>
       </w:r>
       <w:r>
         <w:fldChar w:fldCharType="separate"/>
@@ -8212,7 +8368,7 @@
           <w:i/>
           <w:iCs/>
         </w:rPr>
-        <w:t>139</w:t>
+        <w:t>142</w:t>
       </w:r>
       <w:r>
         <w:t xml:space="preserve">, </w:t>
@@ -8222,7 +8378,7 @@
           <w:i/>
           <w:iCs/>
         </w:rPr>
-        <w:t>140</w:t>
+        <w:t>143</w:t>
       </w:r>
       <w:r>
         <w:t>)</w:t>
@@ -8299,7 +8455,7 @@
         <w:fldChar w:fldCharType="begin"/>
       </w:r>
       <w:r>
-        <w:instrText xml:space="preserve"> ADDIN ZOTERO_ITEM CSL_CITATION {"citationID":"POfAwNZ4","properties":{"formattedCitation":"({\\i{}141})","plainCitation":"(141)","noteIndex":0},"citationItems":[{"id":788,"uris":["http://zotero.org/users/13901503/items/M7YBHN37"],"itemData":{"id":788,"type":"article-journal","abstract":"Current practice in the normalization of microbiome count data is inefficient in the statistical sense. For apparently historical reasons, the common approach is either to use simple proportions (which does not address heteroscedasticity) or to use rarefying of counts, even though both of these approaches are inappropriate for detection of differentially abundant species. Well-established statistical theory is available that simultaneously accounts for library size differences and biological variability using an appropriate mixture model. Moreover, specific implementations for DNA sequencing read count data (based on a Negative Binomial model for instance) are already available in RNA-Seq focused R packages such as edgeR and DESeq. Here we summarize the supporting statistical theory and use simulations and empirical data to demonstrate substantial improvements provided by a relevant mixture model framework over simple proportions or rarefying. We show how both proportions and rarefied counts result in a high rate of false positives in tests for species that are differentially abundant across sample classes. Regarding microbiome sample-wise clustering, we also show that the rarefying procedure often discards samples that can be accurately clustered by alternative methods. We further compare different Negative Binomial methods with a recently-described zero-inflated Gaussian mixture, implemented in a package called metagenomeSeq. We find that metagenomeSeq performs well when there is an adequate number of biological replicates, but it nevertheless tends toward a higher false positive rate. Based on these results and well-established statistical theory, we advocate that investigators avoid rarefying altogether. We have provided microbiome-specific extensions to these tools in the R package, phyloseq.","container-title":"PLOS Computational Biology","DOI":"10.1371/journal.pcbi.1003531","ISSN":"1553-7358","issue":"4","journalAbbreviation":"PLOS Computational Biology","language":"en","note":"publisher: Public Library of Science","page":"e1003531","source":"PLoS Journals","title":"Waste Not, Want Not: Why Rarefying Microbiome Data Is Inadmissible","title-short":"Waste Not, Want Not","volume":"10","author":[{"family":"McMurdie","given":"Paul J."},{"family":"Holmes","given":"Susan"}],"issued":{"date-parts":[["2014",4,3]]}}}],"schema":"https://github.com/citation-style-language/schema/raw/master/csl-citation.json"} </w:instrText>
+        <w:instrText xml:space="preserve"> ADDIN ZOTERO_ITEM CSL_CITATION {"citationID":"POfAwNZ4","properties":{"formattedCitation":"({\\i{}144})","plainCitation":"(144)","noteIndex":0},"citationItems":[{"id":788,"uris":["http://zotero.org/users/13901503/items/M7YBHN37"],"itemData":{"id":788,"type":"article-journal","abstract":"Current practice in the normalization of microbiome count data is inefficient in the statistical sense. For apparently historical reasons, the common approach is either to use simple proportions (which does not address heteroscedasticity) or to use rarefying of counts, even though both of these approaches are inappropriate for detection of differentially abundant species. Well-established statistical theory is available that simultaneously accounts for library size differences and biological variability using an appropriate mixture model. Moreover, specific implementations for DNA sequencing read count data (based on a Negative Binomial model for instance) are already available in RNA-Seq focused R packages such as edgeR and DESeq. Here we summarize the supporting statistical theory and use simulations and empirical data to demonstrate substantial improvements provided by a relevant mixture model framework over simple proportions or rarefying. We show how both proportions and rarefied counts result in a high rate of false positives in tests for species that are differentially abundant across sample classes. Regarding microbiome sample-wise clustering, we also show that the rarefying procedure often discards samples that can be accurately clustered by alternative methods. We further compare different Negative Binomial methods with a recently-described zero-inflated Gaussian mixture, implemented in a package called metagenomeSeq. We find that metagenomeSeq performs well when there is an adequate number of biological replicates, but it nevertheless tends toward a higher false positive rate. Based on these results and well-established statistical theory, we advocate that investigators avoid rarefying altogether. We have provided microbiome-specific extensions to these tools in the R package, phyloseq.","container-title":"PLOS Computational Biology","DOI":"10.1371/journal.pcbi.1003531","ISSN":"1553-7358","issue":"4","journalAbbreviation":"PLOS Computational Biology","language":"en","note":"publisher: Public Library of Science","page":"e1003531","source":"PLoS Journals","title":"Waste Not, Want Not: Why Rarefying Microbiome Data Is Inadmissible","title-short":"Waste Not, Want Not","volume":"10","author":[{"family":"McMurdie","given":"Paul J."},{"family":"Holmes","given":"Susan"}],"issued":{"date-parts":[["2014",4,3]]}}}],"schema":"https://github.com/citation-style-language/schema/raw/master/csl-citation.json"} </w:instrText>
       </w:r>
       <w:r>
         <w:fldChar w:fldCharType="separate"/>
@@ -8312,7 +8468,7 @@
           <w:i/>
           <w:iCs/>
         </w:rPr>
-        <w:t>141</w:t>
+        <w:t>144</w:t>
       </w:r>
       <w:r>
         <w:t>)</w:t>
@@ -8335,7 +8491,7 @@
         <w:fldChar w:fldCharType="begin"/>
       </w:r>
       <w:r>
-        <w:instrText xml:space="preserve"> ADDIN ZOTERO_ITEM CSL_CITATION {"citationID":"gCjcBlAp","properties":{"formattedCitation":"({\\i{}142}, {\\i{}143})","plainCitation":"(142, 143)","noteIndex":0},"citationItems":[{"id":1696,"uris":["http://zotero.org/users/13901503/items/QCC5VYTU"],"itemData":{"id":1696,"type":"article-journal","abstract":"This paper presents a review and critique of statistical null hypothesis testing in ecological studies in general, and wildlife studies in particular, and describes an alternative. Our review of Ecology and the Journal of Wildlife Management found the use of null hypothesis testing to be pervasive. The estimated number of P-values appearing within articles of Ecology exceeded 8,000 in 1991 and has exceeded 3,000 in each year since 1984, whereas the estimated number of P-values in the Journal of Wildlife Management exceeded 8,000 in 1997 and has exceeded 3,000 in each year since 1994. We estimated that 47% (SE = 3.9%) of the P-values in the Journal of Wildlife Management lacked estimates of means or effect sizes or even the sign of the difference in means or other parameters. We find that null hypothesis testing is uninformative when no estimates of means or effect size and their precision are given. Contrary to common dogma, tests of statistical null hypotheses have relatively little utility in science and are not a fundamental aspect of the scientific method. We recommend their use be reduced in favor of more informative approaches. Towards this objective, we describe a relatively new paradigm of data analysis based on Kullback-Leibler information. This paradigm is an extension of likelihood theory and, when used correctly, avoids many of the fundamental limitations and common misuses of null hypothesis testing. Information-theoretic methods focus on providing a strength of evidence for an a priori set of alternative hypotheses, rather than a statistical test of a null hypothesis. This paradigm allows the following types of evidence for the alternative hypotheses: the rank of each hypothesis, expressed as a model; an estimate of the formal likelihood of each model, given the data; a measure of precision that incorporates model selection uncertainty; and simple methods to allow the use of the set of alternative models in making formal inference. We provide an example of the information-theoretic approach using data on the effect of lead on survival in spectacled eider ducks (Somateria fischeri). Regardless of the analysis paradigm used, we strongly recommend inferences based on a priori considerations be clearly separated from those resulting from some form of data dredging.","container-title":"The Journal of Wildlife Management","DOI":"10.2307/3803199","ISSN":"0022-541X","issue":"4","note":"publisher: [Wiley, Wildlife Society]","page":"912-923","source":"JSTOR","title":"Null Hypothesis Testing: Problems, Prevalence, and an Alternative","title-short":"Null Hypothesis Testing","volume":"64","author":[{"family":"Anderson","given":"David R."},{"family":"Burnham","given":"Kenneth P."},{"family":"Thompson","given":"William L."}],"issued":{"date-parts":[["2000"]]}}},{"id":1043,"uris":["http://zotero.org/users/13901503/items/MUQFF6P5"],"itemData":{"id":1043,"type":"article-journal","abstract":"We briefly outline the information-theoretic (I-T) approaches to valid inference including a review of some simple methods for making formal inference from all the hypotheses in the model set (multimodel inference). The I-T approaches can replace the usual t tests and ANOVA tables that are so inferentially limited, but still commonly used. The I-T methods are easy to compute and understand and provide formal measures of the strength of evidence for both the null and alternative hypotheses, given the data. We give an example to highlight the importance of deriving alternative hypotheses and representing these as probability models. Fifteen technical issues are addressed to clarify various points that have appeared incorrectly in the recent literature. We offer several remarks regarding the future of empirical science and data analysis under an I-T framework.","container-title":"Behavioral Ecology and Sociobiology","DOI":"10.1007/s00265-010-1029-6","ISSN":"1432-0762","issue":"1","journalAbbreviation":"Behav Ecol Sociobiol","language":"en","page":"23-35","source":"Springer Link","title":"AIC model selection and multimodel inference in behavioral ecology: some background, observations, and comparisons","title-short":"AIC model selection and multimodel inference in behavioral ecology","volume":"65","author":[{"family":"Burnham","given":"Kenneth P."},{"family":"Anderson","given":"David R."},{"family":"Huyvaert","given":"Kathryn P."}],"issued":{"date-parts":[["2011",1,1]]}}}],"schema":"https://github.com/citation-style-language/schema/raw/master/csl-citation.json"} </w:instrText>
+        <w:instrText xml:space="preserve"> ADDIN ZOTERO_ITEM CSL_CITATION {"citationID":"gCjcBlAp","properties":{"formattedCitation":"({\\i{}145}, {\\i{}146})","plainCitation":"(145, 146)","noteIndex":0},"citationItems":[{"id":1696,"uris":["http://zotero.org/users/13901503/items/QCC5VYTU"],"itemData":{"id":1696,"type":"article-journal","abstract":"This paper presents a review and critique of statistical null hypothesis testing in ecological studies in general, and wildlife studies in particular, and describes an alternative. Our review of Ecology and the Journal of Wildlife Management found the use of null hypothesis testing to be pervasive. The estimated number of P-values appearing within articles of Ecology exceeded 8,000 in 1991 and has exceeded 3,000 in each year since 1984, whereas the estimated number of P-values in the Journal of Wildlife Management exceeded 8,000 in 1997 and has exceeded 3,000 in each year since 1994. We estimated that 47% (SE = 3.9%) of the P-values in the Journal of Wildlife Management lacked estimates of means or effect sizes or even the sign of the difference in means or other parameters. We find that null hypothesis testing is uninformative when no estimates of means or effect size and their precision are given. Contrary to common dogma, tests of statistical null hypotheses have relatively little utility in science and are not a fundamental aspect of the scientific method. We recommend their use be reduced in favor of more informative approaches. Towards this objective, we describe a relatively new paradigm of data analysis based on Kullback-Leibler information. This paradigm is an extension of likelihood theory and, when used correctly, avoids many of the fundamental limitations and common misuses of null hypothesis testing. Information-theoretic methods focus on providing a strength of evidence for an a priori set of alternative hypotheses, rather than a statistical test of a null hypothesis. This paradigm allows the following types of evidence for the alternative hypotheses: the rank of each hypothesis, expressed as a model; an estimate of the formal likelihood of each model, given the data; a measure of precision that incorporates model selection uncertainty; and simple methods to allow the use of the set of alternative models in making formal inference. We provide an example of the information-theoretic approach using data on the effect of lead on survival in spectacled eider ducks (Somateria fischeri). Regardless of the analysis paradigm used, we strongly recommend inferences based on a priori considerations be clearly separated from those resulting from some form of data dredging.","container-title":"The Journal of Wildlife Management","DOI":"10.2307/3803199","ISSN":"0022-541X","issue":"4","note":"publisher: [Wiley, Wildlife Society]","page":"912-923","source":"JSTOR","title":"Null Hypothesis Testing: Problems, Prevalence, and an Alternative","title-short":"Null Hypothesis Testing","volume":"64","author":[{"family":"Anderson","given":"David R."},{"family":"Burnham","given":"Kenneth P."},{"family":"Thompson","given":"William L."}],"issued":{"date-parts":[["2000"]]}}},{"id":1043,"uris":["http://zotero.org/users/13901503/items/MUQFF6P5"],"itemData":{"id":1043,"type":"article-journal","abstract":"We briefly outline the information-theoretic (I-T) approaches to valid inference including a review of some simple methods for making formal inference from all the hypotheses in the model set (multimodel inference). The I-T approaches can replace the usual t tests and ANOVA tables that are so inferentially limited, but still commonly used. The I-T methods are easy to compute and understand and provide formal measures of the strength of evidence for both the null and alternative hypotheses, given the data. We give an example to highlight the importance of deriving alternative hypotheses and representing these as probability models. Fifteen technical issues are addressed to clarify various points that have appeared incorrectly in the recent literature. We offer several remarks regarding the future of empirical science and data analysis under an I-T framework.","container-title":"Behavioral Ecology and Sociobiology","DOI":"10.1007/s00265-010-1029-6","ISSN":"1432-0762","issue":"1","journalAbbreviation":"Behav Ecol Sociobiol","language":"en","page":"23-35","source":"Springer Link","title":"AIC model selection and multimodel inference in behavioral ecology: some background, observations, and comparisons","title-short":"AIC model selection and multimodel inference in behavioral ecology","volume":"65","author":[{"family":"Burnham","given":"Kenneth P."},{"family":"Anderson","given":"David R."},{"family":"Huyvaert","given":"Kathryn P."}],"issued":{"date-parts":[["2011",1,1]]}}}],"schema":"https://github.com/citation-style-language/schema/raw/master/csl-citation.json"} </w:instrText>
       </w:r>
       <w:r>
         <w:fldChar w:fldCharType="separate"/>
@@ -8348,7 +8504,7 @@
           <w:i/>
           <w:iCs/>
         </w:rPr>
-        <w:t>142</w:t>
+        <w:t>145</w:t>
       </w:r>
       <w:r>
         <w:t xml:space="preserve">, </w:t>
@@ -8358,7 +8514,7 @@
           <w:i/>
           <w:iCs/>
         </w:rPr>
-        <w:t>143</w:t>
+        <w:t>146</w:t>
       </w:r>
       <w:r>
         <w:t>)</w:t>
@@ -8432,7 +8588,7 @@
         <w:fldChar w:fldCharType="begin"/>
       </w:r>
       <w:r>
-        <w:instrText xml:space="preserve"> ADDIN ZOTERO_ITEM CSL_CITATION {"citationID":"rVFSfUFA","properties":{"formattedCitation":"({\\i{}144})","plainCitation":"(144)","noteIndex":0},"citationItems":[{"id":1248,"uris":["http://zotero.org/users/13901503/items/ATW2MVB6"],"itemData":{"id":1248,"type":"article-journal","abstract":"&lt;p&gt;The metagenomics sequencing data provide valuable resources for investigating the associations between the microbiome and host environmental/clinical factors and the dynamic changes of microbial abundance over time. The distinct properties of microbiome measurements include varied total sequence reads across samples, over-dispersion and zero-inflation. Additionally, microbiome studies usually collect samples longitudinally, which introduces time-dependent and correlation structures among the samples and thus further complicates the analysis and interpretation of microbiome count data. In this article, we propose negative binomial mixed models (NBMMs) for longitudinal microbiome studies. The proposed NBMMs can efficiently handle over-dispersion and varying total reads, and can account for the dynamic trend and correlation among longitudinal samples. We develop an efficient and stable algorithm to fit the NBMMs. We evaluate and demonstrate the NBMMs method via extensive simulation studies and application to a longitudinal microbiome data. The results show that the proposed method has desirable properties and outperform the previously used methods in terms of flexible framework for modeling correlation structures and detecting dynamic effects. We have developed an R package NBZIMM to implement the proposed method, which is freely available from the public GitHub repository &lt;ext-link ext-link-type=\"uri\" xlink:href=\"http://github.com//nyiuab//NBZIMM\" xmlns:xlink=\"http://www.w3.org/1999/xlink\"&gt;http://github.com//nyiuab//NBZIMM&lt;/ext-link&gt; and provides a useful tool for analyzing longitudinal microbiome data.&lt;/p&gt;","container-title":"Frontiers in Microbiology","DOI":"10.3389/fmicb.2018.01683","ISSN":"1664-302X","journalAbbreviation":"Front. Microbiol.","language":"English","note":"publisher: Frontiers","source":"Frontiers","title":"Negative Binomial Mixed Models for Analyzing Longitudinal Microbiome Data","URL":"https://www.frontiersin.org/journals/microbiology/articles/10.3389/fmicb.2018.01683/full","volume":"9","author":[{"family":"Zhang","given":"Xinyan"},{"family":"Pei","given":"Yu-Fang"},{"family":"Zhang","given":"Lei"},{"family":"Guo","given":"Boyi"},{"family":"Pendegraft","given":"Amanda H."},{"family":"Zhuang","given":"Wenzhuo"},{"family":"Yi","given":"Nengjun"}],"accessed":{"date-parts":[["2024",11,14]]},"issued":{"date-parts":[["2018",7,26]]}}}],"schema":"https://github.com/citation-style-language/schema/raw/master/csl-citation.json"} </w:instrText>
+        <w:instrText xml:space="preserve"> ADDIN ZOTERO_ITEM CSL_CITATION {"citationID":"rVFSfUFA","properties":{"formattedCitation":"({\\i{}147})","plainCitation":"(147)","noteIndex":0},"citationItems":[{"id":1248,"uris":["http://zotero.org/users/13901503/items/ATW2MVB6"],"itemData":{"id":1248,"type":"article-journal","abstract":"&lt;p&gt;The metagenomics sequencing data provide valuable resources for investigating the associations between the microbiome and host environmental/clinical factors and the dynamic changes of microbial abundance over time. The distinct properties of microbiome measurements include varied total sequence reads across samples, over-dispersion and zero-inflation. Additionally, microbiome studies usually collect samples longitudinally, which introduces time-dependent and correlation structures among the samples and thus further complicates the analysis and interpretation of microbiome count data. In this article, we propose negative binomial mixed models (NBMMs) for longitudinal microbiome studies. The proposed NBMMs can efficiently handle over-dispersion and varying total reads, and can account for the dynamic trend and correlation among longitudinal samples. We develop an efficient and stable algorithm to fit the NBMMs. We evaluate and demonstrate the NBMMs method via extensive simulation studies and application to a longitudinal microbiome data. The results show that the proposed method has desirable properties and outperform the previously used methods in terms of flexible framework for modeling correlation structures and detecting dynamic effects. We have developed an R package NBZIMM to implement the proposed method, which is freely available from the public GitHub repository &lt;ext-link ext-link-type=\"uri\" xlink:href=\"http://github.com//nyiuab//NBZIMM\" xmlns:xlink=\"http://www.w3.org/1999/xlink\"&gt;http://github.com//nyiuab//NBZIMM&lt;/ext-link&gt; and provides a useful tool for analyzing longitudinal microbiome data.&lt;/p&gt;","container-title":"Frontiers in Microbiology","DOI":"10.3389/fmicb.2018.01683","ISSN":"1664-302X","journalAbbreviation":"Front. Microbiol.","language":"English","note":"publisher: Frontiers","source":"Frontiers","title":"Negative Binomial Mixed Models for Analyzing Longitudinal Microbiome Data","URL":"https://www.frontiersin.org/journals/microbiology/articles/10.3389/fmicb.2018.01683/full","volume":"9","author":[{"family":"Zhang","given":"Xinyan"},{"family":"Pei","given":"Yu-Fang"},{"family":"Zhang","given":"Lei"},{"family":"Guo","given":"Boyi"},{"family":"Pendegraft","given":"Amanda H."},{"family":"Zhuang","given":"Wenzhuo"},{"family":"Yi","given":"Nengjun"}],"accessed":{"date-parts":[["2024",11,14]]},"issued":{"date-parts":[["2018",7,26]]}}}],"schema":"https://github.com/citation-style-language/schema/raw/master/csl-citation.json"} </w:instrText>
       </w:r>
       <w:r>
         <w:fldChar w:fldCharType="separate"/>
@@ -8445,7 +8601,7 @@
           <w:i/>
           <w:iCs/>
         </w:rPr>
-        <w:t>144</w:t>
+        <w:t>147</w:t>
       </w:r>
       <w:r>
         <w:t>)</w:t>
@@ -9042,7 +9198,7 @@
                     <pic:cNvPicPr/>
                   </pic:nvPicPr>
                   <pic:blipFill>
-                    <a:blip r:embed="rId10"/>
+                    <a:blip r:embed="rId6"/>
                     <a:stretch>
                       <a:fillRect/>
                     </a:stretch>
@@ -9118,10 +9274,7 @@
         <w:t>components</w:t>
       </w:r>
       <w:r>
-        <w:t xml:space="preserve"> </w:t>
-      </w:r>
-      <w:r>
-        <w:t>1-</w:t>
+        <w:t xml:space="preserve"> 1-</w:t>
       </w:r>
       <w:r>
         <w:t>3</w:t>
@@ -9250,7 +9403,7 @@
                     <pic:cNvPicPr/>
                   </pic:nvPicPr>
                   <pic:blipFill>
-                    <a:blip r:embed="rId11"/>
+                    <a:blip r:embed="rId7"/>
                     <a:stretch>
                       <a:fillRect/>
                     </a:stretch>
@@ -9359,6 +9512,7 @@
         <w:rPr>
           <w:b/>
           <w:bCs/>
+          <w:noProof/>
         </w:rPr>
         <w:lastRenderedPageBreak/>
         <w:drawing>
@@ -9399,7 +9553,7 @@
                     </pic:cNvPicPr>
                   </pic:nvPicPr>
                   <pic:blipFill>
-                    <a:blip r:embed="rId12"/>
+                    <a:blip r:embed="rId8"/>
                     <a:stretch>
                       <a:fillRect/>
                     </a:stretch>
@@ -9496,6 +9650,7 @@
         <w:rPr>
           <w:b/>
           <w:bCs/>
+          <w:noProof/>
         </w:rPr>
         <w:drawing>
           <wp:anchor distT="0" distB="0" distL="114300" distR="114300" simplePos="0" relativeHeight="251671552" behindDoc="0" locked="0" layoutInCell="1" allowOverlap="1" wp14:anchorId="0F406441" wp14:editId="62BAF041">
@@ -9535,7 +9690,7 @@
                     </pic:cNvPicPr>
                   </pic:nvPicPr>
                   <pic:blipFill>
-                    <a:blip r:embed="rId13"/>
+                    <a:blip r:embed="rId9"/>
                     <a:stretch>
                       <a:fillRect/>
                     </a:stretch>
@@ -9629,6 +9784,9 @@
         <w:t xml:space="preserve">). Taxa highlighted in the results and discussion are labeled on the right side of each row. A complete list of all taxa included in the plots is available </w:t>
       </w:r>
       <w:r>
+        <w:rPr>
+          <w:noProof/>
+        </w:rPr>
         <w:drawing>
           <wp:anchor distT="0" distB="0" distL="114300" distR="114300" simplePos="0" relativeHeight="251672576" behindDoc="0" locked="0" layoutInCell="1" allowOverlap="1" wp14:anchorId="7885292A" wp14:editId="2B84E274">
             <wp:simplePos x="0" y="0"/>
@@ -9667,7 +9825,7 @@
                     </pic:cNvPicPr>
                   </pic:nvPicPr>
                   <pic:blipFill>
-                    <a:blip r:embed="rId14"/>
+                    <a:blip r:embed="rId10"/>
                     <a:stretch>
                       <a:fillRect/>
                     </a:stretch>
@@ -9839,7 +9997,7 @@
                     </pic:cNvPicPr>
                   </pic:nvPicPr>
                   <pic:blipFill>
-                    <a:blip r:embed="rId15"/>
+                    <a:blip r:embed="rId11"/>
                     <a:stretch>
                       <a:fillRect/>
                     </a:stretch>
@@ -9941,7 +10099,7 @@
                     <pic:cNvPicPr/>
                   </pic:nvPicPr>
                   <pic:blipFill>
-                    <a:blip r:embed="rId16"/>
+                    <a:blip r:embed="rId12"/>
                     <a:stretch>
                       <a:fillRect/>
                     </a:stretch>
@@ -10600,7 +10758,7 @@
                     <pic:cNvPicPr/>
                   </pic:nvPicPr>
                   <pic:blipFill>
-                    <a:blip r:embed="rId17"/>
+                    <a:blip r:embed="rId13"/>
                     <a:stretch>
                       <a:fillRect/>
                     </a:stretch>
@@ -10691,10 +10849,7 @@
         <w:t>components</w:t>
       </w:r>
       <w:r>
-        <w:t xml:space="preserve"> </w:t>
-      </w:r>
-      <w:r>
-        <w:t>1-</w:t>
+        <w:t xml:space="preserve"> 1-</w:t>
       </w:r>
       <w:r>
         <w:t>3</w:t>
@@ -11166,7 +11321,7 @@
                     <pic:cNvPicPr/>
                   </pic:nvPicPr>
                   <pic:blipFill>
-                    <a:blip r:embed="rId18"/>
+                    <a:blip r:embed="rId14"/>
                     <a:stretch>
                       <a:fillRect/>
                     </a:stretch>
@@ -11270,7 +11425,7 @@
                     <pic:cNvPicPr/>
                   </pic:nvPicPr>
                   <pic:blipFill>
-                    <a:blip r:embed="rId19"/>
+                    <a:blip r:embed="rId15"/>
                     <a:stretch>
                       <a:fillRect/>
                     </a:stretch>
@@ -11360,10 +11515,7 @@
         <w:t>were used for analysis</w:t>
       </w:r>
       <w:r>
-        <w:t xml:space="preserve"> because they explain &gt;5% of the variation</w:t>
-      </w:r>
-      <w:r>
-        <w:t>.</w:t>
+        <w:t xml:space="preserve"> because they explain &gt;5% of the variation.</w:t>
       </w:r>
     </w:p>
     <w:p/>
@@ -14455,51 +14607,27 @@
       </w:r>
       <w:r>
         <w:tab/>
-        <w:t xml:space="preserve">M. Kilstrup, K. Hammer, P. </w:t>
-      </w:r>
-      <w:proofErr w:type="spellStart"/>
-      <w:r>
-        <w:t>Ruhdal</w:t>
-      </w:r>
-      <w:proofErr w:type="spellEnd"/>
-      <w:r>
-        <w:t xml:space="preserve"> Jensen, J. Martinussen, Nucleotide metabolism and its control in lactic acid bacteria. </w:t>
-      </w:r>
-      <w:r>
-        <w:rPr>
-          <w:i/>
-          <w:iCs/>
-        </w:rPr>
-        <w:t xml:space="preserve">FEMS </w:t>
-      </w:r>
-      <w:proofErr w:type="spellStart"/>
-      <w:r>
-        <w:rPr>
-          <w:i/>
-          <w:iCs/>
-        </w:rPr>
-        <w:t>Microbiol</w:t>
-      </w:r>
-      <w:proofErr w:type="spellEnd"/>
-      <w:r>
-        <w:rPr>
-          <w:i/>
-          <w:iCs/>
-        </w:rPr>
-        <w:t xml:space="preserve"> Rev</w:t>
-      </w:r>
-      <w:r>
-        <w:t xml:space="preserve"> </w:t>
-      </w:r>
-      <w:r>
-        <w:rPr>
-          <w:b/>
-          <w:bCs/>
-        </w:rPr>
-        <w:t>29</w:t>
-      </w:r>
-      <w:r>
-        <w:t>, 555–590 (2005).</w:t>
+        <w:t xml:space="preserve">S. Dhungana, A. L. and Crumbliss, Coordination Chemistry and Redox Processes in Siderophore-Mediated Iron Transport. </w:t>
+      </w:r>
+      <w:r>
+        <w:rPr>
+          <w:i/>
+          <w:iCs/>
+        </w:rPr>
+        <w:t>Geomicrobiology Journal</w:t>
+      </w:r>
+      <w:r>
+        <w:t xml:space="preserve"> </w:t>
+      </w:r>
+      <w:r>
+        <w:rPr>
+          <w:b/>
+          <w:bCs/>
+        </w:rPr>
+        <w:t>22</w:t>
+      </w:r>
+      <w:r>
+        <w:t>, 87–98 (2005).</w:t>
       </w:r>
     </w:p>
     <w:p>
@@ -14512,6 +14640,144 @@
       </w:r>
       <w:r>
         <w:tab/>
+        <w:t>W. Ying, NAD</w:t>
+      </w:r>
+      <w:r>
+        <w:rPr>
+          <w:vertAlign w:val="superscript"/>
+        </w:rPr>
+        <w:t>+</w:t>
+      </w:r>
+      <w:r>
+        <w:t xml:space="preserve"> /NADH and NADP</w:t>
+      </w:r>
+      <w:r>
+        <w:rPr>
+          <w:vertAlign w:val="superscript"/>
+        </w:rPr>
+        <w:t>+</w:t>
+      </w:r>
+      <w:r>
+        <w:t xml:space="preserve"> /NADPH in Cellular Functions and Cell Death: Regulation and Biological Consequences. </w:t>
+      </w:r>
+      <w:r>
+        <w:rPr>
+          <w:i/>
+          <w:iCs/>
+        </w:rPr>
+        <w:t>Antioxidants &amp; Redox Signaling</w:t>
+      </w:r>
+      <w:r>
+        <w:t xml:space="preserve"> </w:t>
+      </w:r>
+      <w:r>
+        <w:rPr>
+          <w:b/>
+          <w:bCs/>
+        </w:rPr>
+        <w:t>10</w:t>
+      </w:r>
+      <w:r>
+        <w:t>, 179–206 (2008).</w:t>
+      </w:r>
+    </w:p>
+    <w:p>
+      <w:pPr>
+        <w:pStyle w:val="Bibliography"/>
+      </w:pPr>
+      <w:r>
+        <w:t xml:space="preserve">72. </w:t>
+      </w:r>
+      <w:r>
+        <w:tab/>
+        <w:t xml:space="preserve">M. P. Kalapos, Methylglyoxal in living organisms: Chemistry, biochemistry, toxicology and biological implications. </w:t>
+      </w:r>
+      <w:r>
+        <w:rPr>
+          <w:i/>
+          <w:iCs/>
+        </w:rPr>
+        <w:t>Toxicology Letters</w:t>
+      </w:r>
+      <w:r>
+        <w:t xml:space="preserve"> </w:t>
+      </w:r>
+      <w:r>
+        <w:rPr>
+          <w:b/>
+          <w:bCs/>
+        </w:rPr>
+        <w:t>110</w:t>
+      </w:r>
+      <w:r>
+        <w:t>, 145–175 (1999).</w:t>
+      </w:r>
+    </w:p>
+    <w:p>
+      <w:pPr>
+        <w:pStyle w:val="Bibliography"/>
+      </w:pPr>
+      <w:r>
+        <w:t xml:space="preserve">73. </w:t>
+      </w:r>
+      <w:r>
+        <w:tab/>
+        <w:t xml:space="preserve">M. Kilstrup, K. Hammer, P. </w:t>
+      </w:r>
+      <w:proofErr w:type="spellStart"/>
+      <w:r>
+        <w:t>Ruhdal</w:t>
+      </w:r>
+      <w:proofErr w:type="spellEnd"/>
+      <w:r>
+        <w:t xml:space="preserve"> Jensen, J. Martinussen, Nucleotide metabolism and its control in lactic acid bacteria. </w:t>
+      </w:r>
+      <w:r>
+        <w:rPr>
+          <w:i/>
+          <w:iCs/>
+        </w:rPr>
+        <w:t xml:space="preserve">FEMS </w:t>
+      </w:r>
+      <w:proofErr w:type="spellStart"/>
+      <w:r>
+        <w:rPr>
+          <w:i/>
+          <w:iCs/>
+        </w:rPr>
+        <w:t>Microbiol</w:t>
+      </w:r>
+      <w:proofErr w:type="spellEnd"/>
+      <w:r>
+        <w:rPr>
+          <w:i/>
+          <w:iCs/>
+        </w:rPr>
+        <w:t xml:space="preserve"> Rev</w:t>
+      </w:r>
+      <w:r>
+        <w:t xml:space="preserve"> </w:t>
+      </w:r>
+      <w:r>
+        <w:rPr>
+          <w:b/>
+          <w:bCs/>
+        </w:rPr>
+        <w:t>29</w:t>
+      </w:r>
+      <w:r>
+        <w:t>, 555–590 (2005).</w:t>
+      </w:r>
+    </w:p>
+    <w:p>
+      <w:pPr>
+        <w:pStyle w:val="Bibliography"/>
+      </w:pPr>
+      <w:r>
+        <w:t xml:space="preserve">74. </w:t>
+      </w:r>
+      <w:r>
+        <w:tab/>
         <w:t xml:space="preserve">A. N. Lane, T. W.-M. Fan, Regulation of mammalian nucleotide metabolism and biosynthesis. </w:t>
       </w:r>
       <w:r>
@@ -14540,7 +14806,47 @@
         <w:pStyle w:val="Bibliography"/>
       </w:pPr>
       <w:r>
-        <w:t xml:space="preserve">72. </w:t>
+        <w:t xml:space="preserve">75. </w:t>
+      </w:r>
+      <w:r>
+        <w:tab/>
+        <w:t xml:space="preserve">M. Vinayak, C. Pathak, </w:t>
+      </w:r>
+      <w:proofErr w:type="spellStart"/>
+      <w:r>
+        <w:t>Queuosine</w:t>
+      </w:r>
+      <w:proofErr w:type="spellEnd"/>
+      <w:r>
+        <w:t xml:space="preserve"> modification of tRNA: its divergent role in cellular machinery. </w:t>
+      </w:r>
+      <w:r>
+        <w:rPr>
+          <w:i/>
+          <w:iCs/>
+        </w:rPr>
+        <w:t>Bioscience Reports</w:t>
+      </w:r>
+      <w:r>
+        <w:t xml:space="preserve"> </w:t>
+      </w:r>
+      <w:r>
+        <w:rPr>
+          <w:b/>
+          <w:bCs/>
+        </w:rPr>
+        <w:t>30</w:t>
+      </w:r>
+      <w:r>
+        <w:t>, 135–148 (2009).</w:t>
+      </w:r>
+    </w:p>
+    <w:p>
+      <w:pPr>
+        <w:pStyle w:val="Bibliography"/>
+      </w:pPr>
+      <w:r>
+        <w:t xml:space="preserve">76. </w:t>
       </w:r>
       <w:r>
         <w:tab/>
@@ -14581,7 +14887,7 @@
         <w:pStyle w:val="Bibliography"/>
       </w:pPr>
       <w:r>
-        <w:t xml:space="preserve">73. </w:t>
+        <w:t xml:space="preserve">77. </w:t>
       </w:r>
       <w:r>
         <w:tab/>
@@ -14638,7 +14944,7 @@
         <w:pStyle w:val="Bibliography"/>
       </w:pPr>
       <w:r>
-        <w:t xml:space="preserve">74. </w:t>
+        <w:t xml:space="preserve">78. </w:t>
       </w:r>
       <w:r>
         <w:tab/>
@@ -14670,7 +14976,7 @@
         <w:pStyle w:val="Bibliography"/>
       </w:pPr>
       <w:r>
-        <w:t xml:space="preserve">75. </w:t>
+        <w:t xml:space="preserve">79. </w:t>
       </w:r>
       <w:r>
         <w:tab/>
@@ -14710,7 +15016,7 @@
         <w:pStyle w:val="Bibliography"/>
       </w:pPr>
       <w:r>
-        <w:t xml:space="preserve">76. </w:t>
+        <w:t xml:space="preserve">80. </w:t>
       </w:r>
       <w:r>
         <w:tab/>
@@ -14774,7 +15080,7 @@
         <w:pStyle w:val="Bibliography"/>
       </w:pPr>
       <w:r>
-        <w:t xml:space="preserve">77. </w:t>
+        <w:t xml:space="preserve">81. </w:t>
       </w:r>
       <w:r>
         <w:tab/>
@@ -14806,7 +15112,7 @@
         <w:pStyle w:val="Bibliography"/>
       </w:pPr>
       <w:r>
-        <w:t xml:space="preserve">78. </w:t>
+        <w:t xml:space="preserve">82. </w:t>
       </w:r>
       <w:r>
         <w:tab/>
@@ -14847,7 +15153,7 @@
         <w:pStyle w:val="Bibliography"/>
       </w:pPr>
       <w:r>
-        <w:t xml:space="preserve">79. </w:t>
+        <w:t xml:space="preserve">83. </w:t>
       </w:r>
       <w:r>
         <w:tab/>
@@ -14887,7 +15193,7 @@
         <w:pStyle w:val="Bibliography"/>
       </w:pPr>
       <w:r>
-        <w:t xml:space="preserve">80. </w:t>
+        <w:t xml:space="preserve">84. </w:t>
       </w:r>
       <w:r>
         <w:tab/>
@@ -14951,7 +15257,8 @@
         <w:pStyle w:val="Bibliography"/>
       </w:pPr>
       <w:r>
-        <w:t xml:space="preserve">81. </w:t>
+        <w:lastRenderedPageBreak/>
+        <w:t xml:space="preserve">85. </w:t>
       </w:r>
       <w:r>
         <w:tab/>
@@ -14999,7 +15306,7 @@
         <w:pStyle w:val="Bibliography"/>
       </w:pPr>
       <w:r>
-        <w:t xml:space="preserve">82. </w:t>
+        <w:t xml:space="preserve">86. </w:t>
       </w:r>
       <w:r>
         <w:tab/>
@@ -15031,7 +15338,7 @@
         <w:pStyle w:val="Bibliography"/>
       </w:pPr>
       <w:r>
-        <w:t xml:space="preserve">83. </w:t>
+        <w:t xml:space="preserve">87. </w:t>
       </w:r>
       <w:r>
         <w:tab/>
@@ -15071,7 +15378,7 @@
         <w:pStyle w:val="Bibliography"/>
       </w:pPr>
       <w:r>
-        <w:t xml:space="preserve">84. </w:t>
+        <w:t xml:space="preserve">88. </w:t>
       </w:r>
       <w:r>
         <w:tab/>
@@ -15147,11 +15454,7 @@
       </w:r>
       <w:proofErr w:type="spellEnd"/>
       <w:r>
-        <w:t xml:space="preserve">, The Possible </w:t>
-      </w:r>
-      <w:r>
-        <w:lastRenderedPageBreak/>
-        <w:t xml:space="preserve">Role of Helicobacter pylori in Gastric Cancer and Its Management. </w:t>
+        <w:t xml:space="preserve">, The Possible Role of Helicobacter pylori in Gastric Cancer and Its Management. </w:t>
       </w:r>
       <w:r>
         <w:rPr>
@@ -15179,7 +15482,7 @@
         <w:pStyle w:val="Bibliography"/>
       </w:pPr>
       <w:r>
-        <w:t xml:space="preserve">85. </w:t>
+        <w:t xml:space="preserve">89. </w:t>
       </w:r>
       <w:r>
         <w:tab/>
@@ -15219,7 +15522,7 @@
         <w:pStyle w:val="Bibliography"/>
       </w:pPr>
       <w:r>
-        <w:t xml:space="preserve">86. </w:t>
+        <w:t xml:space="preserve">90. </w:t>
       </w:r>
       <w:r>
         <w:tab/>
@@ -15251,7 +15554,7 @@
         <w:pStyle w:val="Bibliography"/>
       </w:pPr>
       <w:r>
-        <w:t xml:space="preserve">87. </w:t>
+        <w:t xml:space="preserve">91. </w:t>
       </w:r>
       <w:r>
         <w:tab/>
@@ -15283,7 +15586,7 @@
         <w:pStyle w:val="Bibliography"/>
       </w:pPr>
       <w:r>
-        <w:t xml:space="preserve">88. </w:t>
+        <w:t xml:space="preserve">92. </w:t>
       </w:r>
       <w:r>
         <w:tab/>
@@ -15323,7 +15626,7 @@
         <w:pStyle w:val="Bibliography"/>
       </w:pPr>
       <w:r>
-        <w:t xml:space="preserve">89. </w:t>
+        <w:t xml:space="preserve">93. </w:t>
       </w:r>
       <w:r>
         <w:tab/>
@@ -15355,7 +15658,7 @@
         <w:pStyle w:val="Bibliography"/>
       </w:pPr>
       <w:r>
-        <w:t xml:space="preserve">90. </w:t>
+        <w:t xml:space="preserve">94. </w:t>
       </w:r>
       <w:r>
         <w:tab/>
@@ -15387,57 +15690,7 @@
         <w:pStyle w:val="Bibliography"/>
       </w:pPr>
       <w:r>
-        <w:t xml:space="preserve">91. </w:t>
-      </w:r>
-      <w:r>
-        <w:tab/>
-        <w:t>W. Ying, NAD</w:t>
-      </w:r>
-      <w:r>
-        <w:rPr>
-          <w:vertAlign w:val="superscript"/>
-        </w:rPr>
-        <w:t>+</w:t>
-      </w:r>
-      <w:r>
-        <w:t xml:space="preserve"> /NADH and NADP</w:t>
-      </w:r>
-      <w:r>
-        <w:rPr>
-          <w:vertAlign w:val="superscript"/>
-        </w:rPr>
-        <w:t>+</w:t>
-      </w:r>
-      <w:r>
-        <w:t xml:space="preserve"> /NADPH in Cellular Functions and Cell Death: Regulation and Biological Consequences. </w:t>
-      </w:r>
-      <w:r>
-        <w:rPr>
-          <w:i/>
-          <w:iCs/>
-        </w:rPr>
-        <w:t>Antioxidants &amp; Redox Signaling</w:t>
-      </w:r>
-      <w:r>
-        <w:t xml:space="preserve"> </w:t>
-      </w:r>
-      <w:r>
-        <w:rPr>
-          <w:b/>
-          <w:bCs/>
-        </w:rPr>
-        <w:t>10</w:t>
-      </w:r>
-      <w:r>
-        <w:t>, 179–206 (2008).</w:t>
-      </w:r>
-    </w:p>
-    <w:p>
-      <w:pPr>
-        <w:pStyle w:val="Bibliography"/>
-      </w:pPr>
-      <w:r>
-        <w:t xml:space="preserve">92. </w:t>
+        <w:t xml:space="preserve">95. </w:t>
       </w:r>
       <w:r>
         <w:tab/>
@@ -15478,7 +15731,7 @@
         <w:pStyle w:val="Bibliography"/>
       </w:pPr>
       <w:r>
-        <w:t xml:space="preserve">93. </w:t>
+        <w:t xml:space="preserve">96. </w:t>
       </w:r>
       <w:r>
         <w:tab/>
@@ -15534,7 +15787,7 @@
         <w:pStyle w:val="Bibliography"/>
       </w:pPr>
       <w:r>
-        <w:t xml:space="preserve">94. </w:t>
+        <w:t xml:space="preserve">97. </w:t>
       </w:r>
       <w:r>
         <w:tab/>
@@ -15566,7 +15819,8 @@
         <w:pStyle w:val="Bibliography"/>
       </w:pPr>
       <w:r>
-        <w:t xml:space="preserve">95. </w:t>
+        <w:lastRenderedPageBreak/>
+        <w:t xml:space="preserve">98. </w:t>
       </w:r>
       <w:r>
         <w:tab/>
@@ -15622,7 +15876,7 @@
         <w:pStyle w:val="Bibliography"/>
       </w:pPr>
       <w:r>
-        <w:t xml:space="preserve">96. </w:t>
+        <w:t xml:space="preserve">99. </w:t>
       </w:r>
       <w:r>
         <w:tab/>
@@ -15662,7 +15916,7 @@
         <w:pStyle w:val="Bibliography"/>
       </w:pPr>
       <w:r>
-        <w:t xml:space="preserve">97. </w:t>
+        <w:t xml:space="preserve">100. </w:t>
       </w:r>
       <w:r>
         <w:tab/>
@@ -15694,8 +15948,7 @@
         <w:pStyle w:val="Bibliography"/>
       </w:pPr>
       <w:r>
-        <w:lastRenderedPageBreak/>
-        <w:t xml:space="preserve">98. </w:t>
+        <w:t xml:space="preserve">101. </w:t>
       </w:r>
       <w:r>
         <w:tab/>
@@ -15743,7 +15996,7 @@
         <w:pStyle w:val="Bibliography"/>
       </w:pPr>
       <w:r>
-        <w:t xml:space="preserve">99. </w:t>
+        <w:t xml:space="preserve">102. </w:t>
       </w:r>
       <w:r>
         <w:tab/>
@@ -15775,7 +16028,7 @@
         <w:pStyle w:val="Bibliography"/>
       </w:pPr>
       <w:r>
-        <w:t xml:space="preserve">100. </w:t>
+        <w:t xml:space="preserve">103. </w:t>
       </w:r>
       <w:r>
         <w:tab/>
@@ -15815,7 +16068,7 @@
         <w:pStyle w:val="Bibliography"/>
       </w:pPr>
       <w:r>
-        <w:t xml:space="preserve">101. </w:t>
+        <w:t xml:space="preserve">104. </w:t>
       </w:r>
       <w:r>
         <w:tab/>
@@ -15855,7 +16108,7 @@
         <w:pStyle w:val="Bibliography"/>
       </w:pPr>
       <w:r>
-        <w:t xml:space="preserve">102. </w:t>
+        <w:t xml:space="preserve">105. </w:t>
       </w:r>
       <w:r>
         <w:tab/>
@@ -15935,7 +16188,7 @@
         <w:pStyle w:val="Bibliography"/>
       </w:pPr>
       <w:r>
-        <w:t xml:space="preserve">103. </w:t>
+        <w:t xml:space="preserve">106. </w:t>
       </w:r>
       <w:r>
         <w:tab/>
@@ -15986,7 +16239,7 @@
         <w:pStyle w:val="Bibliography"/>
       </w:pPr>
       <w:r>
-        <w:t xml:space="preserve">104. </w:t>
+        <w:t xml:space="preserve">107. </w:t>
       </w:r>
       <w:r>
         <w:tab/>
@@ -16018,7 +16271,7 @@
         <w:pStyle w:val="Bibliography"/>
       </w:pPr>
       <w:r>
-        <w:t xml:space="preserve">105. </w:t>
+        <w:t xml:space="preserve">108. </w:t>
       </w:r>
       <w:r>
         <w:tab/>
@@ -16050,7 +16303,7 @@
         <w:pStyle w:val="Bibliography"/>
       </w:pPr>
       <w:r>
-        <w:t xml:space="preserve">106. </w:t>
+        <w:t xml:space="preserve">109. </w:t>
       </w:r>
       <w:r>
         <w:tab/>
@@ -16122,7 +16375,8 @@
         <w:pStyle w:val="Bibliography"/>
       </w:pPr>
       <w:r>
-        <w:t xml:space="preserve">107. </w:t>
+        <w:lastRenderedPageBreak/>
+        <w:t xml:space="preserve">110. </w:t>
       </w:r>
       <w:r>
         <w:tab/>
@@ -16154,7 +16408,7 @@
         <w:pStyle w:val="Bibliography"/>
       </w:pPr>
       <w:r>
-        <w:t xml:space="preserve">108. </w:t>
+        <w:t xml:space="preserve">111. </w:t>
       </w:r>
       <w:r>
         <w:tab/>
@@ -16186,7 +16440,7 @@
         <w:pStyle w:val="Bibliography"/>
       </w:pPr>
       <w:r>
-        <w:t xml:space="preserve">109. </w:t>
+        <w:t xml:space="preserve">112. </w:t>
       </w:r>
       <w:r>
         <w:tab/>
@@ -16226,8 +16480,7 @@
         <w:pStyle w:val="Bibliography"/>
       </w:pPr>
       <w:r>
-        <w:lastRenderedPageBreak/>
-        <w:t xml:space="preserve">110. </w:t>
+        <w:t xml:space="preserve">113. </w:t>
       </w:r>
       <w:r>
         <w:tab/>
@@ -16275,7 +16528,7 @@
         <w:pStyle w:val="Bibliography"/>
       </w:pPr>
       <w:r>
-        <w:t xml:space="preserve">111. </w:t>
+        <w:t xml:space="preserve">114. </w:t>
       </w:r>
       <w:r>
         <w:tab/>
@@ -16339,7 +16592,7 @@
         <w:pStyle w:val="Bibliography"/>
       </w:pPr>
       <w:r>
-        <w:t xml:space="preserve">112. </w:t>
+        <w:t xml:space="preserve">115. </w:t>
       </w:r>
       <w:r>
         <w:tab/>
@@ -16379,7 +16632,7 @@
         <w:pStyle w:val="Bibliography"/>
       </w:pPr>
       <w:r>
-        <w:t xml:space="preserve">113. </w:t>
+        <w:t xml:space="preserve">116. </w:t>
       </w:r>
       <w:r>
         <w:tab/>
@@ -16419,7 +16672,7 @@
         <w:pStyle w:val="Bibliography"/>
       </w:pPr>
       <w:r>
-        <w:t xml:space="preserve">114. </w:t>
+        <w:t xml:space="preserve">117. </w:t>
       </w:r>
       <w:r>
         <w:tab/>
@@ -16459,7 +16712,7 @@
         <w:pStyle w:val="Bibliography"/>
       </w:pPr>
       <w:r>
-        <w:t xml:space="preserve">115. </w:t>
+        <w:t xml:space="preserve">118. </w:t>
       </w:r>
       <w:r>
         <w:tab/>
@@ -16491,7 +16744,7 @@
         <w:pStyle w:val="Bibliography"/>
       </w:pPr>
       <w:r>
-        <w:t xml:space="preserve">116. </w:t>
+        <w:t xml:space="preserve">119. </w:t>
       </w:r>
       <w:r>
         <w:tab/>
@@ -16523,7 +16776,8 @@
         <w:pStyle w:val="Bibliography"/>
       </w:pPr>
       <w:r>
-        <w:t xml:space="preserve">117. </w:t>
+        <w:lastRenderedPageBreak/>
+        <w:t xml:space="preserve">120. </w:t>
       </w:r>
       <w:r>
         <w:tab/>
@@ -16580,7 +16834,7 @@
         <w:pStyle w:val="Bibliography"/>
       </w:pPr>
       <w:r>
-        <w:t xml:space="preserve">118. </w:t>
+        <w:t xml:space="preserve">121. </w:t>
       </w:r>
       <w:r>
         <w:tab/>
@@ -16612,7 +16866,7 @@
         <w:pStyle w:val="Bibliography"/>
       </w:pPr>
       <w:r>
-        <w:t xml:space="preserve">119. </w:t>
+        <w:t xml:space="preserve">122. </w:t>
       </w:r>
       <w:r>
         <w:tab/>
@@ -16670,8 +16924,7 @@
         <w:pStyle w:val="Bibliography"/>
       </w:pPr>
       <w:r>
-        <w:lastRenderedPageBreak/>
-        <w:t xml:space="preserve">120. </w:t>
+        <w:t xml:space="preserve">123. </w:t>
       </w:r>
       <w:r>
         <w:tab/>
@@ -16719,7 +16972,7 @@
         <w:pStyle w:val="Bibliography"/>
       </w:pPr>
       <w:r>
-        <w:t xml:space="preserve">121. </w:t>
+        <w:t xml:space="preserve">124. </w:t>
       </w:r>
       <w:r>
         <w:tab/>
@@ -16751,7 +17004,7 @@
         <w:pStyle w:val="Bibliography"/>
       </w:pPr>
       <w:r>
-        <w:t xml:space="preserve">122. </w:t>
+        <w:t xml:space="preserve">125. </w:t>
       </w:r>
       <w:r>
         <w:tab/>
@@ -16800,7 +17053,7 @@
         <w:pStyle w:val="Bibliography"/>
       </w:pPr>
       <w:r>
-        <w:t xml:space="preserve">123. </w:t>
+        <w:t xml:space="preserve">126. </w:t>
       </w:r>
       <w:r>
         <w:tab/>
@@ -16832,7 +17085,7 @@
         <w:pStyle w:val="Bibliography"/>
       </w:pPr>
       <w:r>
-        <w:t xml:space="preserve">124. </w:t>
+        <w:t xml:space="preserve">127. </w:t>
       </w:r>
       <w:r>
         <w:tab/>
@@ -16896,7 +17149,7 @@
         <w:pStyle w:val="Bibliography"/>
       </w:pPr>
       <w:r>
-        <w:t xml:space="preserve">125. </w:t>
+        <w:t xml:space="preserve">128. </w:t>
       </w:r>
       <w:r>
         <w:tab/>
@@ -16928,7 +17181,7 @@
         <w:pStyle w:val="Bibliography"/>
       </w:pPr>
       <w:r>
-        <w:t xml:space="preserve">126. </w:t>
+        <w:t xml:space="preserve">129. </w:t>
       </w:r>
       <w:r>
         <w:tab/>
@@ -16984,7 +17237,7 @@
         <w:pStyle w:val="Bibliography"/>
       </w:pPr>
       <w:r>
-        <w:t xml:space="preserve">127. </w:t>
+        <w:t xml:space="preserve">130. </w:t>
       </w:r>
       <w:r>
         <w:tab/>
@@ -17032,7 +17285,8 @@
         <w:pStyle w:val="Bibliography"/>
       </w:pPr>
       <w:r>
-        <w:t xml:space="preserve">128. </w:t>
+        <w:lastRenderedPageBreak/>
+        <w:t xml:space="preserve">131. </w:t>
       </w:r>
       <w:r>
         <w:tab/>
@@ -17105,7 +17359,7 @@
         <w:pStyle w:val="Bibliography"/>
       </w:pPr>
       <w:r>
-        <w:t xml:space="preserve">129. </w:t>
+        <w:t xml:space="preserve">132. </w:t>
       </w:r>
       <w:r>
         <w:tab/>
@@ -17127,7 +17381,7 @@
         <w:pStyle w:val="Bibliography"/>
       </w:pPr>
       <w:r>
-        <w:t xml:space="preserve">130. </w:t>
+        <w:t xml:space="preserve">133. </w:t>
       </w:r>
       <w:r>
         <w:tab/>
@@ -17176,8 +17430,7 @@
         <w:pStyle w:val="Bibliography"/>
       </w:pPr>
       <w:r>
-        <w:lastRenderedPageBreak/>
-        <w:t xml:space="preserve">131. </w:t>
+        <w:t xml:space="preserve">134. </w:t>
       </w:r>
       <w:r>
         <w:tab/>
@@ -17225,7 +17478,7 @@
         <w:pStyle w:val="Bibliography"/>
       </w:pPr>
       <w:r>
-        <w:t xml:space="preserve">132. </w:t>
+        <w:t xml:space="preserve">135. </w:t>
       </w:r>
       <w:r>
         <w:tab/>
@@ -17315,7 +17568,7 @@
         <w:pStyle w:val="Bibliography"/>
       </w:pPr>
       <w:r>
-        <w:t xml:space="preserve">133. </w:t>
+        <w:t xml:space="preserve">136. </w:t>
       </w:r>
       <w:r>
         <w:tab/>
@@ -17347,7 +17600,7 @@
         <w:pStyle w:val="Bibliography"/>
       </w:pPr>
       <w:r>
-        <w:t xml:space="preserve">134. </w:t>
+        <w:t xml:space="preserve">137. </w:t>
       </w:r>
       <w:r>
         <w:tab/>
@@ -17403,7 +17656,7 @@
         <w:pStyle w:val="Bibliography"/>
       </w:pPr>
       <w:r>
-        <w:t xml:space="preserve">135. </w:t>
+        <w:t xml:space="preserve">138. </w:t>
       </w:r>
       <w:r>
         <w:tab/>
@@ -17435,7 +17688,7 @@
         <w:pStyle w:val="Bibliography"/>
       </w:pPr>
       <w:r>
-        <w:t xml:space="preserve">136. </w:t>
+        <w:t xml:space="preserve">139. </w:t>
       </w:r>
       <w:r>
         <w:tab/>
@@ -17483,7 +17736,7 @@
         <w:pStyle w:val="Bibliography"/>
       </w:pPr>
       <w:r>
-        <w:t xml:space="preserve">137. </w:t>
+        <w:t xml:space="preserve">140. </w:t>
       </w:r>
       <w:r>
         <w:tab/>
@@ -17531,7 +17784,7 @@
         <w:pStyle w:val="Bibliography"/>
       </w:pPr>
       <w:r>
-        <w:t xml:space="preserve">138. </w:t>
+        <w:t xml:space="preserve">141. </w:t>
       </w:r>
       <w:r>
         <w:tab/>
@@ -17603,7 +17856,7 @@
         <w:pStyle w:val="Bibliography"/>
       </w:pPr>
       <w:r>
-        <w:t xml:space="preserve">139. </w:t>
+        <w:t xml:space="preserve">142. </w:t>
       </w:r>
       <w:r>
         <w:tab/>
@@ -17659,7 +17912,8 @@
         <w:pStyle w:val="Bibliography"/>
       </w:pPr>
       <w:r>
-        <w:t xml:space="preserve">140. </w:t>
+        <w:lastRenderedPageBreak/>
+        <w:t xml:space="preserve">143. </w:t>
       </w:r>
       <w:r>
         <w:tab/>
@@ -17679,7 +17933,7 @@
         <w:pStyle w:val="Bibliography"/>
       </w:pPr>
       <w:r>
-        <w:t xml:space="preserve">141. </w:t>
+        <w:t xml:space="preserve">144. </w:t>
       </w:r>
       <w:r>
         <w:tab/>
@@ -17711,7 +17965,7 @@
         <w:pStyle w:val="Bibliography"/>
       </w:pPr>
       <w:r>
-        <w:t xml:space="preserve">142. </w:t>
+        <w:t xml:space="preserve">145. </w:t>
       </w:r>
       <w:r>
         <w:tab/>
@@ -17743,7 +17997,7 @@
         <w:pStyle w:val="Bibliography"/>
       </w:pPr>
       <w:r>
-        <w:t xml:space="preserve">143. </w:t>
+        <w:t xml:space="preserve">146. </w:t>
       </w:r>
       <w:r>
         <w:tab/>
@@ -17825,8 +18079,7 @@
         <w:pStyle w:val="Bibliography"/>
       </w:pPr>
       <w:r>
-        <w:lastRenderedPageBreak/>
-        <w:t xml:space="preserve">144. </w:t>
+        <w:t xml:space="preserve">147. </w:t>
       </w:r>
       <w:r>
         <w:tab/>
@@ -17890,66 +18143,6 @@
     </w:sectPr>
   </w:body>
 </w:document>
-</file>
-
-<file path=word/comments.xml><?xml version="1.0" encoding="utf-8"?>
-<w:comments xmlns:wpc="http://schemas.microsoft.com/office/word/2010/wordprocessingCanvas" xmlns:cx="http://schemas.microsoft.com/office/drawing/2014/chartex" xmlns:cx1="http://schemas.microsoft.com/office/drawing/2015/9/8/chartex" xmlns:cx2="http://schemas.microsoft.com/office/drawing/2015/10/21/chartex" xmlns:cx3="http://schemas.microsoft.com/office/drawing/2016/5/9/chartex" xmlns:cx4="http://schemas.microsoft.com/office/drawing/2016/5/10/chartex" xmlns:cx5="http://schemas.microsoft.com/office/drawing/2016/5/11/chartex" xmlns:cx6="http://schemas.microsoft.com/office/drawing/2016/5/12/chartex" xmlns:cx7="http://schemas.microsoft.com/office/drawing/2016/5/13/chartex" xmlns:cx8="http://schemas.microsoft.com/office/drawing/2016/5/14/chartex" xmlns:mc="http://schemas.openxmlformats.org/markup-compatibility/2006" xmlns:aink="http://schemas.microsoft.com/office/drawing/2016/ink" xmlns:am3d="http://schemas.microsoft.com/office/drawing/2017/model3d" xmlns:o="urn:schemas-microsoft-com:office:office" xmlns:oel="http://schemas.microsoft.com/office/2019/extlst" xmlns:r="http://schemas.openxmlformats.org/officeDocument/2006/relationships" xmlns:m="http://schemas.openxmlformats.org/officeDocument/2006/math" xmlns:v="urn:schemas-microsoft-com:vml" xmlns:wp14="http://schemas.microsoft.com/office/word/2010/wordprocessingDrawing" xmlns:wp="http://schemas.openxmlformats.org/drawingml/2006/wordprocessingDrawing" xmlns:w10="urn:schemas-microsoft-com:office:word" xmlns:w="http://schemas.openxmlformats.org/wordprocessingml/2006/main" xmlns:w14="http://schemas.microsoft.com/office/word/2010/wordml" xmlns:w15="http://schemas.microsoft.com/office/word/2012/wordml" xmlns:w16cex="http://schemas.microsoft.com/office/word/2018/wordml/cex" xmlns:w16cid="http://schemas.microsoft.com/office/word/2016/wordml/cid" xmlns:w16="http://schemas.microsoft.com/office/word/2018/wordml" xmlns:w16du="http://schemas.microsoft.com/office/word/2023/wordml/word16du" xmlns:w16sdtdh="http://schemas.microsoft.com/office/word/2020/wordml/sdtdatahash" xmlns:w16sdtfl="http://schemas.microsoft.com/office/word/2024/wordml/sdtformatlock" xmlns:w16se="http://schemas.microsoft.com/office/word/2015/wordml/symex" xmlns:wpg="http://schemas.microsoft.com/office/word/2010/wordprocessingGroup" xmlns:wpi="http://schemas.microsoft.com/office/word/2010/wordprocessingInk" xmlns:wne="http://schemas.microsoft.com/office/word/2006/wordml" xmlns:wps="http://schemas.microsoft.com/office/word/2010/wordprocessingShape" mc:Ignorable="w14 w15 w16se w16cid w16 w16cex w16sdtdh w16sdtfl w16du wp14">
-  <w:comment w:id="1" w:author="Beehner, Jacinta" w:date="2025-07-16T13:09:00Z" w:initials="JB">
-    <w:p>
-      <w:r>
-        <w:rPr>
-          <w:rStyle w:val="CommentReference"/>
-        </w:rPr>
-        <w:annotationRef/>
-      </w:r>
-      <w:r>
-        <w:rPr>
-          <w:sz w:val="20"/>
-          <w:szCs w:val="20"/>
-        </w:rPr>
-        <w:t>A good rule of thumb is to always use past tense in your results, and then you can switch to present tense when you discuss general rules that apply  in the discussion.</w:t>
-      </w:r>
-    </w:p>
-  </w:comment>
-  <w:comment w:id="2" w:author="Beehner, Jacinta" w:date="2025-07-16T13:10:00Z" w:initials="JB">
-    <w:p>
-      <w:r>
-        <w:rPr>
-          <w:rStyle w:val="CommentReference"/>
-        </w:rPr>
-        <w:annotationRef/>
-      </w:r>
-      <w:r>
-        <w:rPr>
-          <w:sz w:val="20"/>
-          <w:szCs w:val="20"/>
-        </w:rPr>
-        <w:t>Suggest is the only verb that is okay to use as present tense.</w:t>
-      </w:r>
-    </w:p>
-  </w:comment>
-</w:comments>
-</file>
-
-<file path=word/commentsExtended.xml><?xml version="1.0" encoding="utf-8"?>
-<w15:commentsEx xmlns:wpc="http://schemas.microsoft.com/office/word/2010/wordprocessingCanvas" xmlns:cx="http://schemas.microsoft.com/office/drawing/2014/chartex" xmlns:cx1="http://schemas.microsoft.com/office/drawing/2015/9/8/chartex" xmlns:cx2="http://schemas.microsoft.com/office/drawing/2015/10/21/chartex" xmlns:cx3="http://schemas.microsoft.com/office/drawing/2016/5/9/chartex" xmlns:cx4="http://schemas.microsoft.com/office/drawing/2016/5/10/chartex" xmlns:cx5="http://schemas.microsoft.com/office/drawing/2016/5/11/chartex" xmlns:cx6="http://schemas.microsoft.com/office/drawing/2016/5/12/chartex" xmlns:cx7="http://schemas.microsoft.com/office/drawing/2016/5/13/chartex" xmlns:cx8="http://schemas.microsoft.com/office/drawing/2016/5/14/chartex" xmlns:mc="http://schemas.openxmlformats.org/markup-compatibility/2006" xmlns:aink="http://schemas.microsoft.com/office/drawing/2016/ink" xmlns:am3d="http://schemas.microsoft.com/office/drawing/2017/model3d" xmlns:o="urn:schemas-microsoft-com:office:office" xmlns:oel="http://schemas.microsoft.com/office/2019/extlst" xmlns:r="http://schemas.openxmlformats.org/officeDocument/2006/relationships" xmlns:m="http://schemas.openxmlformats.org/officeDocument/2006/math" xmlns:v="urn:schemas-microsoft-com:vml" xmlns:wp14="http://schemas.microsoft.com/office/word/2010/wordprocessingDrawing" xmlns:wp="http://schemas.openxmlformats.org/drawingml/2006/wordprocessingDrawing" xmlns:w10="urn:schemas-microsoft-com:office:word" xmlns:w="http://schemas.openxmlformats.org/wordprocessingml/2006/main" xmlns:w14="http://schemas.microsoft.com/office/word/2010/wordml" xmlns:w15="http://schemas.microsoft.com/office/word/2012/wordml" xmlns:w16cex="http://schemas.microsoft.com/office/word/2018/wordml/cex" xmlns:w16cid="http://schemas.microsoft.com/office/word/2016/wordml/cid" xmlns:w16="http://schemas.microsoft.com/office/word/2018/wordml" xmlns:w16du="http://schemas.microsoft.com/office/word/2023/wordml/word16du" xmlns:w16sdtdh="http://schemas.microsoft.com/office/word/2020/wordml/sdtdatahash" xmlns:w16sdtfl="http://schemas.microsoft.com/office/word/2024/wordml/sdtformatlock" xmlns:w16se="http://schemas.microsoft.com/office/word/2015/wordml/symex" xmlns:wpg="http://schemas.microsoft.com/office/word/2010/wordprocessingGroup" xmlns:wpi="http://schemas.microsoft.com/office/word/2010/wordprocessingInk" xmlns:wne="http://schemas.microsoft.com/office/word/2006/wordml" xmlns:wps="http://schemas.microsoft.com/office/word/2010/wordprocessingShape" mc:Ignorable="w14 w15 w16se w16cid w16 w16cex w16sdtdh w16sdtfl w16du wp14">
-  <w15:commentEx w15:paraId="6C36E614" w15:done="0"/>
-  <w15:commentEx w15:paraId="64C8CA46" w15:done="0"/>
-</w15:commentsEx>
-</file>
-
-<file path=word/commentsExtensible.xml><?xml version="1.0" encoding="utf-8"?>
-<w16cex:commentsExtensible xmlns:wpc="http://schemas.microsoft.com/office/word/2010/wordprocessingCanvas" xmlns:cx="http://schemas.microsoft.com/office/drawing/2014/chartex" xmlns:cx1="http://schemas.microsoft.com/office/drawing/2015/9/8/chartex" xmlns:cx2="http://schemas.microsoft.com/office/drawing/2015/10/21/chartex" xmlns:cx3="http://schemas.microsoft.com/office/drawing/2016/5/9/chartex" xmlns:cx4="http://schemas.microsoft.com/office/drawing/2016/5/10/chartex" xmlns:cx5="http://schemas.microsoft.com/office/drawing/2016/5/11/chartex" xmlns:cx6="http://schemas.microsoft.com/office/drawing/2016/5/12/chartex" xmlns:cx7="http://schemas.microsoft.com/office/drawing/2016/5/13/chartex" xmlns:cx8="http://schemas.microsoft.com/office/drawing/2016/5/14/chartex" xmlns:cr="http://schemas.microsoft.com/office/comments/2020/reactions" xmlns:mc="http://schemas.openxmlformats.org/markup-compatibility/2006" xmlns:aink="http://schemas.microsoft.com/office/drawing/2016/ink" xmlns:am3d="http://schemas.microsoft.com/office/drawing/2017/model3d" xmlns:o="urn:schemas-microsoft-com:office:office" xmlns:oel="http://schemas.microsoft.com/office/2019/extlst" xmlns:r="http://schemas.openxmlformats.org/officeDocument/2006/relationships" xmlns:m="http://schemas.openxmlformats.org/officeDocument/2006/math" xmlns:v="urn:schemas-microsoft-com:vml" xmlns:wp14="http://schemas.microsoft.com/office/word/2010/wordprocessingDrawing" xmlns:wp="http://schemas.openxmlformats.org/drawingml/2006/wordprocessingDrawing" xmlns:w10="urn:schemas-microsoft-com:office:word" xmlns:w="http://schemas.openxmlformats.org/wordprocessingml/2006/main" xmlns:w14="http://schemas.microsoft.com/office/word/2010/wordml" xmlns:w15="http://schemas.microsoft.com/office/word/2012/wordml" xmlns:w16cex="http://schemas.microsoft.com/office/word/2018/wordml/cex" xmlns:w16cid="http://schemas.microsoft.com/office/word/2016/wordml/cid" xmlns:w16="http://schemas.microsoft.com/office/word/2018/wordml" xmlns:w16du="http://schemas.microsoft.com/office/word/2023/wordml/word16du" xmlns:w16sdtdh="http://schemas.microsoft.com/office/word/2020/wordml/sdtdatahash" xmlns:w16sdtfl="http://schemas.microsoft.com/office/word/2024/wordml/sdtformatlock" xmlns:w16se="http://schemas.microsoft.com/office/word/2015/wordml/symex" xmlns:wpg="http://schemas.microsoft.com/office/word/2010/wordprocessingGroup" xmlns:wpi="http://schemas.microsoft.com/office/word/2010/wordprocessingInk" xmlns:wne="http://schemas.microsoft.com/office/word/2006/wordml" xmlns:wps="http://schemas.microsoft.com/office/word/2010/wordprocessingShape" mc:Ignorable="w14 w15 w16se w16cid w16 w16cex w16sdtdh w16sdtfl cr w16du wp14">
-  <w16cex:commentExtensible w16cex:durableId="32507383" w16cex:dateUtc="2025-07-16T17:09:00Z"/>
-  <w16cex:commentExtensible w16cex:durableId="7D5FA96C" w16cex:dateUtc="2025-07-16T17:10:00Z"/>
-</w16cex:commentsExtensible>
-</file>
-
-<file path=word/commentsIds.xml><?xml version="1.0" encoding="utf-8"?>
-<w16cid:commentsIds xmlns:wpc="http://schemas.microsoft.com/office/word/2010/wordprocessingCanvas" xmlns:cx="http://schemas.microsoft.com/office/drawing/2014/chartex" xmlns:cx1="http://schemas.microsoft.com/office/drawing/2015/9/8/chartex" xmlns:cx2="http://schemas.microsoft.com/office/drawing/2015/10/21/chartex" xmlns:cx3="http://schemas.microsoft.com/office/drawing/2016/5/9/chartex" xmlns:cx4="http://schemas.microsoft.com/office/drawing/2016/5/10/chartex" xmlns:cx5="http://schemas.microsoft.com/office/drawing/2016/5/11/chartex" xmlns:cx6="http://schemas.microsoft.com/office/drawing/2016/5/12/chartex" xmlns:cx7="http://schemas.microsoft.com/office/drawing/2016/5/13/chartex" xmlns:cx8="http://schemas.microsoft.com/office/drawing/2016/5/14/chartex" xmlns:mc="http://schemas.openxmlformats.org/markup-compatibility/2006" xmlns:aink="http://schemas.microsoft.com/office/drawing/2016/ink" xmlns:am3d="http://schemas.microsoft.com/office/drawing/2017/model3d" xmlns:o="urn:schemas-microsoft-com:office:office" xmlns:oel="http://schemas.microsoft.com/office/2019/extlst" xmlns:r="http://schemas.openxmlformats.org/officeDocument/2006/relationships" xmlns:m="http://schemas.openxmlformats.org/officeDocument/2006/math" xmlns:v="urn:schemas-microsoft-com:vml" xmlns:wp14="http://schemas.microsoft.com/office/word/2010/wordprocessingDrawing" xmlns:wp="http://schemas.openxmlformats.org/drawingml/2006/wordprocessingDrawing" xmlns:w10="urn:schemas-microsoft-com:office:word" xmlns:w="http://schemas.openxmlformats.org/wordprocessingml/2006/main" xmlns:w14="http://schemas.microsoft.com/office/word/2010/wordml" xmlns:w15="http://schemas.microsoft.com/office/word/2012/wordml" xmlns:w16cex="http://schemas.microsoft.com/office/word/2018/wordml/cex" xmlns:w16cid="http://schemas.microsoft.com/office/word/2016/wordml/cid" xmlns:w16="http://schemas.microsoft.com/office/word/2018/wordml" xmlns:w16du="http://schemas.microsoft.com/office/word/2023/wordml/word16du" xmlns:w16sdtdh="http://schemas.microsoft.com/office/word/2020/wordml/sdtdatahash" xmlns:w16sdtfl="http://schemas.microsoft.com/office/word/2024/wordml/sdtformatlock" xmlns:w16se="http://schemas.microsoft.com/office/word/2015/wordml/symex" xmlns:wpg="http://schemas.microsoft.com/office/word/2010/wordprocessingGroup" xmlns:wpi="http://schemas.microsoft.com/office/word/2010/wordprocessingInk" xmlns:wne="http://schemas.microsoft.com/office/word/2006/wordml" xmlns:wps="http://schemas.microsoft.com/office/word/2010/wordprocessingShape" mc:Ignorable="w14 w15 w16se w16cid w16 w16cex w16sdtdh w16sdtfl w16du wp14">
-  <w16cid:commentId w16cid:paraId="6C36E614" w16cid:durableId="32507383"/>
-  <w16cid:commentId w16cid:paraId="64C8CA46" w16cid:durableId="7D5FA96C"/>
-</w16cid:commentsIds>
 </file>
 
 <file path=word/numbering.xml><?xml version="1.0" encoding="utf-8"?>
@@ -18303,14 +18496,6 @@
     <w:abstractNumId w:val="0"/>
   </w:num>
 </w:numbering>
-</file>
-
-<file path=word/people.xml><?xml version="1.0" encoding="utf-8"?>
-<w15:people xmlns:wpc="http://schemas.microsoft.com/office/word/2010/wordprocessingCanvas" xmlns:cx="http://schemas.microsoft.com/office/drawing/2014/chartex" xmlns:cx1="http://schemas.microsoft.com/office/drawing/2015/9/8/chartex" xmlns:cx2="http://schemas.microsoft.com/office/drawing/2015/10/21/chartex" xmlns:cx3="http://schemas.microsoft.com/office/drawing/2016/5/9/chartex" xmlns:cx4="http://schemas.microsoft.com/office/drawing/2016/5/10/chartex" xmlns:cx5="http://schemas.microsoft.com/office/drawing/2016/5/11/chartex" xmlns:cx6="http://schemas.microsoft.com/office/drawing/2016/5/12/chartex" xmlns:cx7="http://schemas.microsoft.com/office/drawing/2016/5/13/chartex" xmlns:cx8="http://schemas.microsoft.com/office/drawing/2016/5/14/chartex" xmlns:mc="http://schemas.openxmlformats.org/markup-compatibility/2006" xmlns:aink="http://schemas.microsoft.com/office/drawing/2016/ink" xmlns:am3d="http://schemas.microsoft.com/office/drawing/2017/model3d" xmlns:o="urn:schemas-microsoft-com:office:office" xmlns:oel="http://schemas.microsoft.com/office/2019/extlst" xmlns:r="http://schemas.openxmlformats.org/officeDocument/2006/relationships" xmlns:m="http://schemas.openxmlformats.org/officeDocument/2006/math" xmlns:v="urn:schemas-microsoft-com:vml" xmlns:wp14="http://schemas.microsoft.com/office/word/2010/wordprocessingDrawing" xmlns:wp="http://schemas.openxmlformats.org/drawingml/2006/wordprocessingDrawing" xmlns:w10="urn:schemas-microsoft-com:office:word" xmlns:w="http://schemas.openxmlformats.org/wordprocessingml/2006/main" xmlns:w14="http://schemas.microsoft.com/office/word/2010/wordml" xmlns:w15="http://schemas.microsoft.com/office/word/2012/wordml" xmlns:w16cex="http://schemas.microsoft.com/office/word/2018/wordml/cex" xmlns:w16cid="http://schemas.microsoft.com/office/word/2016/wordml/cid" xmlns:w16="http://schemas.microsoft.com/office/word/2018/wordml" xmlns:w16du="http://schemas.microsoft.com/office/word/2023/wordml/word16du" xmlns:w16sdtdh="http://schemas.microsoft.com/office/word/2020/wordml/sdtdatahash" xmlns:w16sdtfl="http://schemas.microsoft.com/office/word/2024/wordml/sdtformatlock" xmlns:w16se="http://schemas.microsoft.com/office/word/2015/wordml/symex" xmlns:wpg="http://schemas.microsoft.com/office/word/2010/wordprocessingGroup" xmlns:wpi="http://schemas.microsoft.com/office/word/2010/wordprocessingInk" xmlns:wne="http://schemas.microsoft.com/office/word/2006/wordml" xmlns:wps="http://schemas.microsoft.com/office/word/2010/wordprocessingShape" mc:Ignorable="w14 w15 w16se w16cid w16 w16cex w16sdtdh w16sdtfl w16du wp14">
-  <w15:person w15:author="Beehner, Jacinta">
-    <w15:presenceInfo w15:providerId="AD" w15:userId="S::jbeehner@umich.edu::e0cb1dd4-a38a-46fe-96a9-cb6ed8067d48"/>
-  </w15:person>
-</w15:people>
 </file>
 
 <file path=word/styles.xml><?xml version="1.0" encoding="utf-8"?>
@@ -18943,6 +19128,7 @@
   <w:style w:type="character" w:default="1" w:styleId="DefaultParagraphFont">
     <w:name w:val="Default Paragraph Font"/>
     <w:uiPriority w:val="1"/>
+    <w:semiHidden/>
     <w:unhideWhenUsed/>
   </w:style>
   <w:style w:type="table" w:default="1" w:styleId="TableNormal">
@@ -19332,6 +19518,32 @@
       <w:ind w:left="624" w:hanging="624"/>
     </w:pPr>
   </w:style>
+  <w:style w:type="paragraph" w:styleId="CommentText">
+    <w:name w:val="annotation text"/>
+    <w:basedOn w:val="Normal"/>
+    <w:link w:val="CommentTextChar"/>
+    <w:uiPriority w:val="99"/>
+    <w:semiHidden/>
+    <w:unhideWhenUsed/>
+    <w:rPr>
+      <w:sz w:val="20"/>
+      <w:szCs w:val="20"/>
+    </w:rPr>
+  </w:style>
+  <w:style w:type="character" w:customStyle="1" w:styleId="CommentTextChar">
+    <w:name w:val="Comment Text Char"/>
+    <w:basedOn w:val="DefaultParagraphFont"/>
+    <w:link w:val="CommentText"/>
+    <w:uiPriority w:val="99"/>
+    <w:semiHidden/>
+    <w:rPr>
+      <w:rFonts w:ascii="Times New Roman" w:eastAsia="Times New Roman" w:hAnsi="Times New Roman" w:cs="Times New Roman"/>
+      <w:kern w:val="0"/>
+      <w:sz w:val="20"/>
+      <w:szCs w:val="20"/>
+      <w14:ligatures w14:val="none"/>
+    </w:rPr>
+  </w:style>
 </w:styles>
 </file>
 

</xml_diff>